<commit_message>
Coauthor Word draft regenerated from the final PDF
Co-Authored-By: Claude Fable 5.1 <noreply@anthropic.com>
</commit_message>
<xml_diff>
--- a/paper/mpda/CTSpinoPelvic1K_coauthor_draft.docx
+++ b/paper/mpda/CTSpinoPelvic1K_coauthor_draft.docx
@@ -819,10 +819,10 @@
         <mc:AlternateContent>
           <mc:Choice Requires="wpg">
             <w:drawing>
-              <wp:inline distT="0" distB="0" distL="0" distR="0" wp14:anchorId="2F6E9C8A" wp14:editId="417836AB">
+              <wp:inline distT="0" distB="0" distL="0" distR="0" wp14:anchorId="432112D8" wp14:editId="66DCC215">
                 <wp:extent cx="5921401" cy="2047825"/>
                 <wp:effectExtent l="0" t="0" r="0" b="0"/>
-                <wp:docPr id="30733" name="Group 30733"/>
+                <wp:docPr id="31073" name="Group 31073"/>
                 <wp:cNvGraphicFramePr/>
                 <a:graphic xmlns:a="http://schemas.openxmlformats.org/drawingml/2006/main">
                   <a:graphicData uri="http://schemas.microsoft.com/office/word/2010/wordprocessingGroup">
@@ -927,7 +927,7 @@
                         <wps:bodyPr/>
                       </wps:wsp>
                       <wps:wsp>
-                        <wps:cNvPr id="4805" name="Rectangle 4805"/>
+                        <wps:cNvPr id="4891" name="Rectangle 4891"/>
                         <wps:cNvSpPr/>
                         <wps:spPr>
                           <a:xfrm>
@@ -963,7 +963,7 @@
                         </wps:bodyPr>
                       </wps:wsp>
                       <wps:wsp>
-                        <wps:cNvPr id="4802" name="Rectangle 4802"/>
+                        <wps:cNvPr id="4890" name="Rectangle 4890"/>
                         <wps:cNvSpPr/>
                         <wps:spPr>
                           <a:xfrm>
@@ -999,7 +999,7 @@
                         </wps:bodyPr>
                       </wps:wsp>
                       <wps:wsp>
-                        <wps:cNvPr id="4796" name="Rectangle 4796"/>
+                        <wps:cNvPr id="4889" name="Rectangle 4889"/>
                         <wps:cNvSpPr/>
                         <wps:spPr>
                           <a:xfrm>
@@ -1035,7 +1035,7 @@
                         </wps:bodyPr>
                       </wps:wsp>
                       <wps:wsp>
-                        <wps:cNvPr id="4792" name="Rectangle 4792"/>
+                        <wps:cNvPr id="4888" name="Rectangle 4888"/>
                         <wps:cNvSpPr/>
                         <wps:spPr>
                           <a:xfrm>
@@ -1071,7 +1071,7 @@
                         </wps:bodyPr>
                       </wps:wsp>
                       <wps:wsp>
-                        <wps:cNvPr id="4780" name="Rectangle 4780"/>
+                        <wps:cNvPr id="4886" name="Rectangle 4886"/>
                         <wps:cNvSpPr/>
                         <wps:spPr>
                           <a:xfrm>
@@ -1107,7 +1107,7 @@
                         </wps:bodyPr>
                       </wps:wsp>
                       <wps:wsp>
-                        <wps:cNvPr id="4773" name="Rectangle 4773"/>
+                        <wps:cNvPr id="4885" name="Rectangle 4885"/>
                         <wps:cNvSpPr/>
                         <wps:spPr>
                           <a:xfrm>
@@ -1143,7 +1143,7 @@
                         </wps:bodyPr>
                       </wps:wsp>
                       <wps:wsp>
-                        <wps:cNvPr id="4765" name="Rectangle 4765"/>
+                        <wps:cNvPr id="4884" name="Rectangle 4884"/>
                         <wps:cNvSpPr/>
                         <wps:spPr>
                           <a:xfrm>
@@ -1179,7 +1179,7 @@
                         </wps:bodyPr>
                       </wps:wsp>
                       <wps:wsp>
-                        <wps:cNvPr id="4787" name="Rectangle 4787"/>
+                        <wps:cNvPr id="4887" name="Rectangle 4887"/>
                         <wps:cNvSpPr/>
                         <wps:spPr>
                           <a:xfrm>
@@ -1215,7 +1215,7 @@
                         </wps:bodyPr>
                       </wps:wsp>
                       <wps:wsp>
-                        <wps:cNvPr id="4761" name="Rectangle 4761"/>
+                        <wps:cNvPr id="4883" name="Rectangle 4883"/>
                         <wps:cNvSpPr/>
                         <wps:spPr>
                           <a:xfrm>
@@ -3379,7 +3379,7 @@
           </mc:Choice>
           <mc:Fallback xmlns:a="http://schemas.openxmlformats.org/drawingml/2006/main">
             <w:pict>
-              <v:group id="Group 30733" style="width:466.252pt;height:161.246pt;mso-position-horizontal-relative:char;mso-position-vertical-relative:line" coordsize="59214,20478">
+              <v:group id="Group 31073" style="width:466.252pt;height:161.246pt;mso-position-horizontal-relative:char;mso-position-vertical-relative:line" coordsize="59214,20478">
                 <v:shape id="Shape 288" style="position:absolute;width:59214;height:0;left:0;top:0;" coordsize="5921401,0" path="m0,0l5921401,0">
                   <v:stroke weight="0.398pt" endcap="flat" joinstyle="miter" miterlimit="10" on="true" color="#000000"/>
                   <v:fill on="false" color="#000000" opacity="0"/>
@@ -3388,7 +3388,7 @@
                   <v:stroke weight="0.398pt" endcap="flat" joinstyle="miter" miterlimit="10" on="true" color="#000000"/>
                   <v:fill on="false" color="#000000" opacity="0"/>
                 </v:shape>
-                <v:rect id="Rectangle 4805" style="position:absolute;width:16761;height:1636;left:46175;top:1546;" filled="f" stroked="f">
+                <v:rect id="Rectangle 4891" style="position:absolute;width:16761;height:1636;left:46175;top:1546;" filled="f" stroked="f">
                   <v:textbox inset="0,0,0,0">
                     <w:txbxContent>
                       <w:p>
@@ -3408,7 +3408,7 @@
                     </w:txbxContent>
                   </v:textbox>
                 </v:rect>
-                <v:rect id="Rectangle 4802" style="position:absolute;width:3618;height:1636;left:41825;top:1546;" filled="f" stroked="f">
+                <v:rect id="Rectangle 4890" style="position:absolute;width:3618;height:1636;left:41825;top:1546;" filled="f" stroked="f">
                   <v:textbox inset="0,0,0,0">
                     <w:txbxContent>
                       <w:p>
@@ -3428,7 +3428,7 @@
                     </w:txbxContent>
                   </v:textbox>
                 </v:rect>
-                <v:rect id="Rectangle 4796" style="position:absolute;width:4744;height:1636;left:36823;top:1546;" filled="f" stroked="f">
+                <v:rect id="Rectangle 4889" style="position:absolute;width:4744;height:1636;left:36823;top:1546;" filled="f" stroked="f">
                   <v:textbox inset="0,0,0,0">
                     <w:txbxContent>
                       <w:p>
@@ -3448,7 +3448,7 @@
                     </w:txbxContent>
                   </v:textbox>
                 </v:rect>
-                <v:rect id="Rectangle 4792" style="position:absolute;width:1945;height:1636;left:33296;top:1546;" filled="f" stroked="f">
+                <v:rect id="Rectangle 4888" style="position:absolute;width:1945;height:1636;left:33296;top:1546;" filled="f" stroked="f">
                   <v:textbox inset="0,0,0,0">
                     <w:txbxContent>
                       <w:p>
@@ -3468,7 +3468,7 @@
                     </w:txbxContent>
                   </v:textbox>
                 </v:rect>
-                <v:rect id="Rectangle 4780" style="position:absolute;width:2072;height:1636;left:24089;top:1546;" filled="f" stroked="f">
+                <v:rect id="Rectangle 4886" style="position:absolute;width:2072;height:1636;left:24089;top:1546;" filled="f" stroked="f">
                   <v:textbox inset="0,0,0,0">
                     <w:txbxContent>
                       <w:p>
@@ -3488,7 +3488,7 @@
                     </w:txbxContent>
                   </v:textbox>
                 </v:rect>
-                <v:rect id="Rectangle 4773" style="position:absolute;width:4964;height:1636;left:18423;top:1546;" filled="f" stroked="f">
+                <v:rect id="Rectangle 4885" style="position:absolute;width:4964;height:1636;left:18423;top:1546;" filled="f" stroked="f">
                   <v:textbox inset="0,0,0,0">
                     <w:txbxContent>
                       <w:p>
@@ -3508,7 +3508,7 @@
                     </w:txbxContent>
                   </v:textbox>
                 </v:rect>
-                <v:rect id="Rectangle 4765" style="position:absolute;width:4514;height:1636;left:12787;top:1546;" filled="f" stroked="f">
+                <v:rect id="Rectangle 4884" style="position:absolute;width:4514;height:1636;left:12787;top:1546;" filled="f" stroked="f">
                   <v:textbox inset="0,0,0,0">
                     <w:txbxContent>
                       <w:p>
@@ -3528,7 +3528,7 @@
                     </w:txbxContent>
                   </v:textbox>
                 </v:rect>
-                <v:rect id="Rectangle 4787" style="position:absolute;width:6045;height:1636;left:27175;top:1546;" filled="f" stroked="f">
+                <v:rect id="Rectangle 4887" style="position:absolute;width:6045;height:1636;left:27175;top:1546;" filled="f" stroked="f">
                   <v:textbox inset="0,0,0,0">
                     <w:txbxContent>
                       <w:p>
@@ -3548,7 +3548,7 @@
                     </w:txbxContent>
                   </v:textbox>
                 </v:rect>
-                <v:rect id="Rectangle 4761" style="position:absolute;width:8087;height:1636;left:0;top:1546;" filled="f" stroked="f">
+                <v:rect id="Rectangle 4883" style="position:absolute;width:8087;height:1636;left:0;top:1546;" filled="f" stroked="f">
                   <v:textbox inset="0,0,0,0">
                     <w:txbxContent>
                       <w:p>
@@ -4180,7 +4180,7 @@
           <w:noProof/>
         </w:rPr>
         <w:drawing>
-          <wp:inline distT="0" distB="0" distL="0" distR="0" wp14:anchorId="3BD62479" wp14:editId="21421472">
+          <wp:inline distT="0" distB="0" distL="0" distR="0" wp14:anchorId="3E0E82C2" wp14:editId="4DBB323B">
             <wp:extent cx="2880360" cy="5105401"/>
             <wp:effectExtent l="0" t="0" r="0" b="0"/>
             <wp:docPr id="35844" name="Picture 35844"/>
@@ -4907,10 +4907,10 @@
         <mc:AlternateContent>
           <mc:Choice Requires="wpg">
             <w:drawing>
-              <wp:inline distT="0" distB="0" distL="0" distR="0" wp14:anchorId="7F170EC2" wp14:editId="329E3545">
+              <wp:inline distT="0" distB="0" distL="0" distR="0" wp14:anchorId="2182CE89" wp14:editId="323A3417">
                 <wp:extent cx="1357466" cy="1270317"/>
                 <wp:effectExtent l="0" t="0" r="0" b="0"/>
-                <wp:docPr id="31666" name="Group 31666"/>
+                <wp:docPr id="31080" name="Group 31080"/>
                 <wp:cNvGraphicFramePr/>
                 <a:graphic xmlns:a="http://schemas.openxmlformats.org/drawingml/2006/main">
                   <a:graphicData uri="http://schemas.microsoft.com/office/word/2010/wordprocessingGroup">
@@ -4998,7 +4998,7 @@
                         <wps:bodyPr/>
                       </wps:wsp>
                       <wps:wsp>
-                        <wps:cNvPr id="4836" name="Rectangle 4836"/>
+                        <wps:cNvPr id="5046" name="Rectangle 5046"/>
                         <wps:cNvSpPr/>
                         <wps:spPr>
                           <a:xfrm>
@@ -5035,7 +5035,7 @@
                         </wps:bodyPr>
                       </wps:wsp>
                       <wps:wsp>
-                        <wps:cNvPr id="4840" name="Rectangle 4840"/>
+                        <wps:cNvPr id="5049" name="Rectangle 5049"/>
                         <wps:cNvSpPr/>
                         <wps:spPr>
                           <a:xfrm>
@@ -5072,7 +5072,7 @@
                         </wps:bodyPr>
                       </wps:wsp>
                       <wps:wsp>
-                        <wps:cNvPr id="31460" name="Rectangle 31460"/>
+                        <wps:cNvPr id="30033" name="Rectangle 30033"/>
                         <wps:cNvSpPr/>
                         <wps:spPr>
                           <a:xfrm>
@@ -5109,7 +5109,7 @@
                         </wps:bodyPr>
                       </wps:wsp>
                       <wps:wsp>
-                        <wps:cNvPr id="31461" name="Rectangle 31461"/>
+                        <wps:cNvPr id="30034" name="Rectangle 30034"/>
                         <wps:cNvSpPr/>
                         <wps:spPr>
                           <a:xfrm>
@@ -5146,7 +5146,7 @@
                         </wps:bodyPr>
                       </wps:wsp>
                       <wps:wsp>
-                        <wps:cNvPr id="4849" name="Rectangle 4849"/>
+                        <wps:cNvPr id="5054" name="Rectangle 5054"/>
                         <wps:cNvSpPr/>
                         <wps:spPr>
                           <a:xfrm>
@@ -5183,7 +5183,7 @@
                         </wps:bodyPr>
                       </wps:wsp>
                       <wps:wsp>
-                        <wps:cNvPr id="4852" name="Rectangle 4852"/>
+                        <wps:cNvPr id="5058" name="Rectangle 5058"/>
                         <wps:cNvSpPr/>
                         <wps:spPr>
                           <a:xfrm>
@@ -5227,7 +5227,7 @@
           </mc:Choice>
           <mc:Fallback xmlns:a="http://schemas.openxmlformats.org/drawingml/2006/main">
             <w:pict>
-              <v:group id="Group 31666" style="width:106.887pt;height:100.025pt;mso-position-horizontal-relative:char;mso-position-vertical-relative:line" coordsize="13574,12703">
+              <v:group id="Group 31080" style="width:106.887pt;height:100.025pt;mso-position-horizontal-relative:char;mso-position-vertical-relative:line" coordsize="13574,12703">
                 <v:shape id="Picture 35846" style="position:absolute;width:9357;height:10942;left:4204;top:-20;" filled="f">
                   <v:imagedata r:id="rId11"/>
                 </v:shape>
@@ -5235,7 +5235,7 @@
                   <v:stroke weight="0.79004pt" endcap="flat" joinstyle="miter" miterlimit="10" on="true" color="#d64541"/>
                   <v:fill on="true" color="#d64541"/>
                 </v:shape>
-                <v:rect id="Rectangle 4836" style="position:absolute;width:225;height:1384;left:4084;top:11662;" filled="f" stroked="f">
+                <v:rect id="Rectangle 5046" style="position:absolute;width:225;height:1384;left:4084;top:11662;" filled="f" stroked="f">
                   <v:textbox inset="0,0,0,0">
                     <w:txbxContent>
                       <w:p>
@@ -5255,7 +5255,7 @@
                     </w:txbxContent>
                   </v:textbox>
                 </v:rect>
-                <v:rect id="Rectangle 4840" style="position:absolute;width:563;height:1384;left:5694;top:11662;" filled="f" stroked="f">
+                <v:rect id="Rectangle 5049" style="position:absolute;width:563;height:1384;left:5694;top:11662;" filled="f" stroked="f">
                   <v:textbox inset="0,0,0,0">
                     <w:txbxContent>
                       <w:p>
@@ -5275,7 +5275,7 @@
                     </w:txbxContent>
                   </v:textbox>
                 </v:rect>
-                <v:rect id="Rectangle 31460" style="position:absolute;width:281;height:1384;left:6796;top:11662;" filled="f" stroked="f">
+                <v:rect id="Rectangle 30033" style="position:absolute;width:281;height:1384;left:6796;top:11662;" filled="f" stroked="f">
                   <v:textbox inset="0,0,0,0">
                     <w:txbxContent>
                       <w:p>
@@ -5295,7 +5295,7 @@
                     </w:txbxContent>
                   </v:textbox>
                 </v:rect>
-                <v:rect id="Rectangle 31461" style="position:absolute;width:1521;height:1384;left:7220;top:11662;" filled="f" stroked="f">
+                <v:rect id="Rectangle 30034" style="position:absolute;width:1521;height:1384;left:7220;top:11662;" filled="f" stroked="f">
                   <v:textbox inset="0,0,0,0">
                     <w:txbxContent>
                       <w:p>
@@ -5315,7 +5315,7 @@
                     </w:txbxContent>
                   </v:textbox>
                 </v:rect>
-                <v:rect id="Rectangle 4849" style="position:absolute;width:225;height:1384;left:9847;top:11662;" filled="f" stroked="f">
+                <v:rect id="Rectangle 5054" style="position:absolute;width:225;height:1384;left:9847;top:11662;" filled="f" stroked="f">
                   <v:textbox inset="0,0,0,0">
                     <w:txbxContent>
                       <w:p>
@@ -5335,7 +5335,7 @@
                     </w:txbxContent>
                   </v:textbox>
                 </v:rect>
-                <v:rect id="Rectangle 4852" style="position:absolute;width:1352;height:1384;left:12220;top:11662;" filled="f" stroked="f">
+                <v:rect id="Rectangle 5058" style="position:absolute;width:1352;height:1384;left:12220;top:11662;" filled="f" stroked="f">
                   <v:textbox inset="0,0,0,0">
                     <w:txbxContent>
                       <w:p>
@@ -5377,10 +5377,10 @@
         <mc:AlternateContent>
           <mc:Choice Requires="wpg">
             <w:drawing>
-              <wp:inline distT="0" distB="0" distL="0" distR="0" wp14:anchorId="7A6E573A" wp14:editId="761550FD">
+              <wp:inline distT="0" distB="0" distL="0" distR="0" wp14:anchorId="7DED136B" wp14:editId="0B0EF180">
                 <wp:extent cx="935000" cy="1270317"/>
                 <wp:effectExtent l="0" t="0" r="0" b="0"/>
-                <wp:docPr id="31667" name="Group 31667"/>
+                <wp:docPr id="31081" name="Group 31081"/>
                 <wp:cNvGraphicFramePr/>
                 <a:graphic xmlns:a="http://schemas.openxmlformats.org/drawingml/2006/main">
                   <a:graphicData uri="http://schemas.microsoft.com/office/word/2010/wordprocessingGroup">
@@ -5416,7 +5416,7 @@
                         </pic:spPr>
                       </pic:pic>
                       <wps:wsp>
-                        <wps:cNvPr id="4856" name="Rectangle 4856"/>
+                        <wps:cNvPr id="5062" name="Rectangle 5062"/>
                         <wps:cNvSpPr/>
                         <wps:spPr>
                           <a:xfrm>
@@ -5505,7 +5505,7 @@
                         <wps:bodyPr/>
                       </wps:wsp>
                       <wps:wsp>
-                        <wps:cNvPr id="4857" name="Rectangle 4857"/>
+                        <wps:cNvPr id="5069" name="Rectangle 5069"/>
                         <wps:cNvSpPr/>
                         <wps:spPr>
                           <a:xfrm>
@@ -5542,7 +5542,7 @@
                         </wps:bodyPr>
                       </wps:wsp>
                       <wps:wsp>
-                        <wps:cNvPr id="4858" name="Rectangle 4858"/>
+                        <wps:cNvPr id="5070" name="Rectangle 5070"/>
                         <wps:cNvSpPr/>
                         <wps:spPr>
                           <a:xfrm>
@@ -5586,11 +5586,11 @@
           </mc:Choice>
           <mc:Fallback xmlns:a="http://schemas.openxmlformats.org/drawingml/2006/main">
             <w:pict>
-              <v:group id="Group 31667" style="width:73.622pt;height:100.025pt;mso-position-horizontal-relative:char;mso-position-vertical-relative:line" coordsize="9350,12703">
+              <v:group id="Group 31081" style="width:73.622pt;height:100.025pt;mso-position-horizontal-relative:char;mso-position-vertical-relative:line" coordsize="9350,12703">
                 <v:shape id="Picture 35847" style="position:absolute;width:9387;height:10942;left:-34;top:-20;" filled="f">
                   <v:imagedata r:id="rId13"/>
                 </v:shape>
-                <v:rect id="Rectangle 4856" style="position:absolute;width:225;height:1384;left:2121;top:11662;" filled="f" stroked="f">
+                <v:rect id="Rectangle 5062" style="position:absolute;width:225;height:1384;left:2121;top:11662;" filled="f" stroked="f">
                   <v:textbox inset="0,0,0,0">
                     <w:txbxContent>
                       <w:p>
@@ -5614,7 +5614,7 @@
                   <v:stroke weight="0.79004pt" endcap="flat" joinstyle="miter" miterlimit="10" on="true" color="#e8b044"/>
                   <v:fill on="true" color="#e8b044"/>
                 </v:shape>
-                <v:rect id="Rectangle 4857" style="position:absolute;width:563;height:1384;left:6645;top:11662;" filled="f" stroked="f">
+                <v:rect id="Rectangle 5069" style="position:absolute;width:563;height:1384;left:6645;top:11662;" filled="f" stroked="f">
                   <v:textbox inset="0,0,0,0">
                     <w:txbxContent>
                       <w:p>
@@ -5634,7 +5634,7 @@
                     </w:txbxContent>
                   </v:textbox>
                 </v:rect>
-                <v:rect id="Rectangle 4858" style="position:absolute;width:225;height:1384;left:7959;top:11662;" filled="f" stroked="f">
+                <v:rect id="Rectangle 5070" style="position:absolute;width:225;height:1384;left:7959;top:11662;" filled="f" stroked="f">
                   <v:textbox inset="0,0,0,0">
                     <w:txbxContent>
                       <w:p>
@@ -5675,10 +5675,10 @@
         <mc:AlternateContent>
           <mc:Choice Requires="wpg">
             <w:drawing>
-              <wp:inline distT="0" distB="0" distL="0" distR="0" wp14:anchorId="2AD1031B" wp14:editId="2F70ECC4">
+              <wp:inline distT="0" distB="0" distL="0" distR="0" wp14:anchorId="57537844" wp14:editId="3839AE75">
                 <wp:extent cx="2247082" cy="1270317"/>
                 <wp:effectExtent l="0" t="0" r="0" b="0"/>
-                <wp:docPr id="31668" name="Group 31668"/>
+                <wp:docPr id="31082" name="Group 31082"/>
                 <wp:cNvGraphicFramePr/>
                 <a:graphic xmlns:a="http://schemas.openxmlformats.org/drawingml/2006/main">
                   <a:graphicData uri="http://schemas.microsoft.com/office/word/2010/wordprocessingGroup">
@@ -5735,7 +5735,7 @@
                         </pic:spPr>
                       </pic:pic>
                       <wps:wsp>
-                        <wps:cNvPr id="4859" name="Rectangle 4859"/>
+                        <wps:cNvPr id="5072" name="Rectangle 5072"/>
                         <wps:cNvSpPr/>
                         <wps:spPr>
                           <a:xfrm>
@@ -5772,7 +5772,7 @@
                         </wps:bodyPr>
                       </wps:wsp>
                       <wps:wsp>
-                        <wps:cNvPr id="4860" name="Rectangle 4860"/>
+                        <wps:cNvPr id="5076" name="Rectangle 5076"/>
                         <wps:cNvSpPr/>
                         <wps:spPr>
                           <a:xfrm>
@@ -5861,7 +5861,7 @@
                         <wps:bodyPr/>
                       </wps:wsp>
                       <wps:wsp>
-                        <wps:cNvPr id="4861" name="Rectangle 4861"/>
+                        <wps:cNvPr id="5079" name="Rectangle 5079"/>
                         <wps:cNvSpPr/>
                         <wps:spPr>
                           <a:xfrm>
@@ -5898,7 +5898,7 @@
                         </wps:bodyPr>
                       </wps:wsp>
                       <wps:wsp>
-                        <wps:cNvPr id="4862" name="Rectangle 4862"/>
+                        <wps:cNvPr id="5081" name="Rectangle 5081"/>
                         <wps:cNvSpPr/>
                         <wps:spPr>
                           <a:xfrm>
@@ -5935,7 +5935,7 @@
                         </wps:bodyPr>
                       </wps:wsp>
                       <wps:wsp>
-                        <wps:cNvPr id="4863" name="Rectangle 4863"/>
+                        <wps:cNvPr id="5082" name="Rectangle 5082"/>
                         <wps:cNvSpPr/>
                         <wps:spPr>
                           <a:xfrm>
@@ -5972,7 +5972,7 @@
                         </wps:bodyPr>
                       </wps:wsp>
                       <wps:wsp>
-                        <wps:cNvPr id="4864" name="Rectangle 4864"/>
+                        <wps:cNvPr id="5089" name="Rectangle 5089"/>
                         <wps:cNvSpPr/>
                         <wps:spPr>
                           <a:xfrm>
@@ -6016,14 +6016,14 @@
           </mc:Choice>
           <mc:Fallback xmlns:a="http://schemas.openxmlformats.org/drawingml/2006/main">
             <w:pict>
-              <v:group id="Group 31668" style="width:176.936pt;height:100.025pt;mso-position-horizontal-relative:char;mso-position-vertical-relative:line" coordsize="22470,12703">
+              <v:group id="Group 31082" style="width:176.936pt;height:100.025pt;mso-position-horizontal-relative:char;mso-position-vertical-relative:line" coordsize="22470,12703">
                 <v:shape id="Picture 35848" style="position:absolute;width:9387;height:10942;left:-38;top:-20;" filled="f">
                   <v:imagedata r:id="rId16"/>
                 </v:shape>
                 <v:shape id="Picture 35849" style="position:absolute;width:9387;height:10942;left:13078;top:-20;" filled="f">
                   <v:imagedata r:id="rId17"/>
                 </v:shape>
-                <v:rect id="Rectangle 4859" style="position:absolute;width:732;height:1384;left:4629;top:11662;" filled="f" stroked="f">
+                <v:rect id="Rectangle 5072" style="position:absolute;width:732;height:1384;left:4629;top:11662;" filled="f" stroked="f">
                   <v:textbox inset="0,0,0,0">
                     <w:txbxContent>
                       <w:p>
@@ -6043,7 +6043,7 @@
                     </w:txbxContent>
                   </v:textbox>
                 </v:rect>
-                <v:rect id="Rectangle 4860" style="position:absolute;width:563;height:1384;left:6875;top:11662;" filled="f" stroked="f">
+                <v:rect id="Rectangle 5076" style="position:absolute;width:563;height:1384;left:6875;top:11662;" filled="f" stroked="f">
                   <v:textbox inset="0,0,0,0">
                     <w:txbxContent>
                       <w:p>
@@ -6067,7 +6067,7 @@
                   <v:stroke weight="0.79004pt" endcap="flat" joinstyle="miter" miterlimit="10" on="true" color="#306ebe"/>
                   <v:fill on="true" color="#306ebe"/>
                 </v:shape>
-                <v:rect id="Rectangle 4861" style="position:absolute;width:225;height:1384;left:14144;top:11662;" filled="f" stroked="f">
+                <v:rect id="Rectangle 5079" style="position:absolute;width:225;height:1384;left:14144;top:11662;" filled="f" stroked="f">
                   <v:textbox inset="0,0,0,0">
                     <w:txbxContent>
                       <w:p>
@@ -6087,7 +6087,7 @@
                     </w:txbxContent>
                   </v:textbox>
                 </v:rect>
-                <v:rect id="Rectangle 4862" style="position:absolute;width:563;height:1384;left:15754;top:11662;" filled="f" stroked="f">
+                <v:rect id="Rectangle 5081" style="position:absolute;width:563;height:1384;left:15754;top:11662;" filled="f" stroked="f">
                   <v:textbox inset="0,0,0,0">
                     <w:txbxContent>
                       <w:p>
@@ -6107,7 +6107,7 @@
                     </w:txbxContent>
                   </v:textbox>
                 </v:rect>
-                <v:rect id="Rectangle 4863" style="position:absolute;width:281;height:1384;left:16856;top:11662;" filled="f" stroked="f">
+                <v:rect id="Rectangle 5082" style="position:absolute;width:281;height:1384;left:16856;top:11662;" filled="f" stroked="f">
                   <v:textbox inset="0,0,0,0">
                     <w:txbxContent>
                       <w:p>
@@ -6127,7 +6127,7 @@
                     </w:txbxContent>
                   </v:textbox>
                 </v:rect>
-                <v:rect id="Rectangle 4864" style="position:absolute;width:281;height:1384;left:18213;top:11662;" filled="f" stroked="f">
+                <v:rect id="Rectangle 5089" style="position:absolute;width:281;height:1384;left:18213;top:11662;" filled="f" stroked="f">
                   <v:textbox inset="0,0,0,0">
                     <w:txbxContent>
                       <w:p>
@@ -6238,10 +6238,10 @@
         <mc:AlternateContent>
           <mc:Choice Requires="wpg">
             <w:drawing>
-              <wp:inline distT="0" distB="0" distL="0" distR="0" wp14:anchorId="1A37D965" wp14:editId="6B9BC863">
+              <wp:inline distT="0" distB="0" distL="0" distR="0" wp14:anchorId="17E68B9C" wp14:editId="02868FA1">
                 <wp:extent cx="46876" cy="5055"/>
                 <wp:effectExtent l="0" t="0" r="0" b="0"/>
-                <wp:docPr id="31669" name="Group 31669"/>
+                <wp:docPr id="31083" name="Group 31083"/>
                 <wp:cNvGraphicFramePr/>
                 <a:graphic xmlns:a="http://schemas.openxmlformats.org/drawingml/2006/main">
                   <a:graphicData uri="http://schemas.microsoft.com/office/word/2010/wordprocessingGroup">
@@ -6308,7 +6308,7 @@
           </mc:Choice>
           <mc:Fallback xmlns:a="http://schemas.openxmlformats.org/drawingml/2006/main">
             <w:pict>
-              <v:group id="Group 31669" style="width:3.69101pt;height:0.398pt;mso-position-horizontal-relative:char;mso-position-vertical-relative:line" coordsize="468,50">
+              <v:group id="Group 31083" style="width:3.69101pt;height:0.398pt;mso-position-horizontal-relative:char;mso-position-vertical-relative:line" coordsize="468,50">
                 <v:shape id="Shape 756" style="position:absolute;width:468;height:0;left:0;top:0;" coordsize="46876,0" path="m0,0l46876,0">
                   <v:stroke weight="0.398pt" endcap="flat" joinstyle="miter" miterlimit="10" on="true" color="#000000"/>
                   <v:fill on="false" color="#000000" opacity="0"/>
@@ -6333,10 +6333,10 @@
         <mc:AlternateContent>
           <mc:Choice Requires="wpg">
             <w:drawing>
-              <wp:inline distT="0" distB="0" distL="0" distR="0" wp14:anchorId="52636FDB" wp14:editId="4BC701FE">
+              <wp:inline distT="0" distB="0" distL="0" distR="0" wp14:anchorId="7F40D08D" wp14:editId="748DB2D9">
                 <wp:extent cx="46875" cy="5055"/>
                 <wp:effectExtent l="0" t="0" r="0" b="0"/>
-                <wp:docPr id="31670" name="Group 31670"/>
+                <wp:docPr id="31084" name="Group 31084"/>
                 <wp:cNvGraphicFramePr/>
                 <a:graphic xmlns:a="http://schemas.openxmlformats.org/drawingml/2006/main">
                   <a:graphicData uri="http://schemas.microsoft.com/office/word/2010/wordprocessingGroup">
@@ -6403,7 +6403,7 @@
           </mc:Choice>
           <mc:Fallback xmlns:a="http://schemas.openxmlformats.org/drawingml/2006/main">
             <w:pict>
-              <v:group id="Group 31670" style="width:3.69098pt;height:0.398pt;mso-position-horizontal-relative:char;mso-position-vertical-relative:line" coordsize="468,50">
+              <v:group id="Group 31084" style="width:3.69098pt;height:0.398pt;mso-position-horizontal-relative:char;mso-position-vertical-relative:line" coordsize="468,50">
                 <v:shape id="Shape 758" style="position:absolute;width:468;height:0;left:0;top:0;" coordsize="46875,0" path="m0,0l46875,0">
                   <v:stroke weight="0.398pt" endcap="flat" joinstyle="miter" miterlimit="10" on="true" color="#000000"/>
                   <v:fill on="false" color="#000000" opacity="0"/>
@@ -6651,10 +6651,10 @@
         <mc:AlternateContent>
           <mc:Choice Requires="wpg">
             <w:drawing>
-              <wp:inline distT="0" distB="0" distL="0" distR="0" wp14:anchorId="2CA45A85" wp14:editId="383173B6">
+              <wp:inline distT="0" distB="0" distL="0" distR="0" wp14:anchorId="7B1328E3" wp14:editId="2914889F">
                 <wp:extent cx="46876" cy="5055"/>
                 <wp:effectExtent l="0" t="0" r="0" b="0"/>
-                <wp:docPr id="34443" name="Group 34443"/>
+                <wp:docPr id="30097" name="Group 30097"/>
                 <wp:cNvGraphicFramePr/>
                 <a:graphic xmlns:a="http://schemas.openxmlformats.org/drawingml/2006/main">
                   <a:graphicData uri="http://schemas.microsoft.com/office/word/2010/wordprocessingGroup">
@@ -6721,7 +6721,7 @@
           </mc:Choice>
           <mc:Fallback xmlns:a="http://schemas.openxmlformats.org/drawingml/2006/main">
             <w:pict>
-              <v:group id="Group 34443" style="width:3.69099pt;height:0.398pt;mso-position-horizontal-relative:char;mso-position-vertical-relative:line" coordsize="468,50">
+              <v:group id="Group 30097" style="width:3.69099pt;height:0.398pt;mso-position-horizontal-relative:char;mso-position-vertical-relative:line" coordsize="468,50">
                 <v:shape id="Shape 840" style="position:absolute;width:468;height:0;left:0;top:0;" coordsize="46876,0" path="m0,0l46876,0">
                   <v:stroke weight="0.398pt" endcap="flat" joinstyle="miter" miterlimit="10" on="true" color="#000000"/>
                   <v:fill on="false" color="#000000" opacity="0"/>
@@ -7176,7 +7176,7 @@
                 <w:noProof/>
               </w:rPr>
               <w:drawing>
-                <wp:inline distT="0" distB="0" distL="0" distR="0" wp14:anchorId="5C30ED53" wp14:editId="5C0D6BAF">
+                <wp:inline distT="0" distB="0" distL="0" distR="0" wp14:anchorId="13CA14DB" wp14:editId="4A8EC7E9">
                   <wp:extent cx="48768" cy="320040"/>
                   <wp:effectExtent l="0" t="0" r="0" b="0"/>
                   <wp:docPr id="35850" name="Picture 35850"/>
@@ -7596,7 +7596,7 @@
           <w:noProof/>
         </w:rPr>
         <w:drawing>
-          <wp:inline distT="0" distB="0" distL="0" distR="0" wp14:anchorId="09E8ECF2" wp14:editId="47D6C79F">
+          <wp:inline distT="0" distB="0" distL="0" distR="0" wp14:anchorId="629811E1" wp14:editId="7EF2D594">
             <wp:extent cx="5751576" cy="954024"/>
             <wp:effectExtent l="0" t="0" r="0" b="0"/>
             <wp:docPr id="35851" name="Picture 35851"/>
@@ -9037,7 +9037,7 @@
           <w:noProof/>
         </w:rPr>
         <w:drawing>
-          <wp:inline distT="0" distB="0" distL="0" distR="0" wp14:anchorId="15B4F216" wp14:editId="59B7E8DE">
+          <wp:inline distT="0" distB="0" distL="0" distR="0" wp14:anchorId="44F87DBC" wp14:editId="0BFC6F97">
             <wp:extent cx="5535169" cy="1453896"/>
             <wp:effectExtent l="0" t="0" r="0" b="0"/>
             <wp:docPr id="35853" name="Picture 35853"/>
@@ -9253,7 +9253,7 @@
           <w:noProof/>
         </w:rPr>
         <w:drawing>
-          <wp:inline distT="0" distB="0" distL="0" distR="0" wp14:anchorId="7F6D734C" wp14:editId="24ED24F8">
+          <wp:inline distT="0" distB="0" distL="0" distR="0" wp14:anchorId="6E51A29C" wp14:editId="4CD821B3">
             <wp:extent cx="5812537" cy="1173480"/>
             <wp:effectExtent l="0" t="0" r="0" b="0"/>
             <wp:docPr id="35855" name="Picture 35855"/>
@@ -9505,7 +9505,7 @@
         <mc:AlternateContent>
           <mc:Choice Requires="wpg">
             <w:drawing>
-              <wp:inline distT="0" distB="0" distL="0" distR="0" wp14:anchorId="38B00966" wp14:editId="54655696">
+              <wp:inline distT="0" distB="0" distL="0" distR="0" wp14:anchorId="1A91A094" wp14:editId="5FCA0B5B">
                 <wp:extent cx="3832153" cy="871728"/>
                 <wp:effectExtent l="0" t="0" r="0" b="0"/>
                 <wp:docPr id="35901" name="Group 35901"/>
@@ -14692,7 +14692,7 @@
           <w:noProof/>
         </w:rPr>
         <w:drawing>
-          <wp:inline distT="0" distB="0" distL="0" distR="0" wp14:anchorId="4EB78BBD" wp14:editId="7278A3EE">
+          <wp:inline distT="0" distB="0" distL="0" distR="0" wp14:anchorId="652287BC" wp14:editId="78BE23CA">
             <wp:extent cx="3840480" cy="1228344"/>
             <wp:effectExtent l="0" t="0" r="0" b="0"/>
             <wp:docPr id="35861" name="Picture 35861"/>
@@ -14762,7 +14762,7 @@
           <w:noProof/>
         </w:rPr>
         <w:drawing>
-          <wp:inline distT="0" distB="0" distL="0" distR="0" wp14:anchorId="1935CC3D" wp14:editId="3FE8ED7E">
+          <wp:inline distT="0" distB="0" distL="0" distR="0" wp14:anchorId="316FFD30" wp14:editId="3050D735">
             <wp:extent cx="1773936" cy="871728"/>
             <wp:effectExtent l="0" t="0" r="0" b="0"/>
             <wp:docPr id="35859" name="Picture 35859"/>
@@ -14883,7 +14883,7 @@
           <w:noProof/>
         </w:rPr>
         <w:drawing>
-          <wp:inline distT="0" distB="0" distL="0" distR="0" wp14:anchorId="65EBD07D" wp14:editId="22AA43D2">
+          <wp:inline distT="0" distB="0" distL="0" distR="0" wp14:anchorId="285CCBA5" wp14:editId="0AFD460C">
             <wp:extent cx="1773936" cy="871728"/>
             <wp:effectExtent l="0" t="0" r="0" b="0"/>
             <wp:docPr id="35863" name="Picture 35863"/>
@@ -15157,7 +15157,7 @@
         <mc:AlternateContent>
           <mc:Choice Requires="wpg">
             <w:drawing>
-              <wp:inline distT="0" distB="0" distL="0" distR="0" wp14:anchorId="78F8A527" wp14:editId="75E4CF83">
+              <wp:inline distT="0" distB="0" distL="0" distR="0" wp14:anchorId="3174EA51" wp14:editId="6D4DE27D">
                 <wp:extent cx="5911765" cy="1399032"/>
                 <wp:effectExtent l="0" t="0" r="0" b="0"/>
                 <wp:docPr id="35910" name="Group 35910"/>

</xml_diff>

<commit_message>
"lumbar case" is "lumbar surgical case" throughout; abstract at 299 words; all outputs rebuilt
Co-Authored-By: Claude Fable 5.1 <noreply@anthropic.com>
</commit_message>
<xml_diff>
--- a/paper/mpda/CTSpinoPelvic1K_coauthor_draft.docx
+++ b/paper/mpda/CTSpinoPelvic1K_coauthor_draft.docx
@@ -199,7 +199,7 @@
         <w:t>1</w:t>
       </w:r>
       <w:r>
-        <w:t>; however, a lumbar case is planned on a lumbar study</w:t>
+        <w:t>; however, a lumbar surgical case is planned on a lumbar study</w:t>
       </w:r>
       <w:r>
         <w:rPr>
@@ -232,17 +232,8 @@
         <w:t>4</w:t>
       </w:r>
       <w:r>
-        <w:t>. CTSpinoPelvic1K asks whether local morphology resolves that ambiguity without the count. Two public label sets already covered this imaging, CTSpine1K’s vertebrae and CTPelvic1K’s pelvis, on the same colonography patients, never joined; this release joins them on one series and annotates the bones neither had. It provides 802 CT records, per-level ribs and femora, lumbar levels anchored on the lowest rib-bearing vertebra and S1, and classes for L6, T13, a separate S1 and lumbar ribs, so anomalies are reco</w:t>
-      </w:r>
-      <w:r>
-        <w:t>rded as</w:t>
-      </w:r>
-    </w:p>
-    <w:p>
-      <w:pPr>
-        <w:spacing w:after="135" w:line="259" w:lineRule="auto"/>
-        <w:ind w:right="865"/>
-      </w:pPr>
+        <w:t xml:space="preserve">. CTSpinoPelvic1K asks whether local morphology resolves that ambiguity without the count. Two public label sets covered this imaging, CTSpine1K’s vertebrae and CTPelvic1K’s pelvis, on the same colonography patients, never joined; this release joins them on one series and annotates the bones neither had. It provides 802 CT records, per-level ribs and femora, lumbar levels anchored on the lowest rib-bearing vertebra and S1, and classes for L6, T13, a separate S1 and lumbar ribs, so anomalies are recorded as </w:t>
+      </w:r>
       <w:r>
         <w:t>themselves.</w:t>
       </w:r>
@@ -554,7 +545,7 @@
         <w:ind w:left="-15" w:right="865" w:firstLine="299"/>
       </w:pPr>
       <w:r>
-        <w:t>The project began with a surgeon’s question, whether a vertebra can be named from the anatomy in front of the reader, on the images a lumbar case is actually planned on. By guideline those are lumbar studies</w:t>
+        <w:t>The project began with a surgeon’s question, whether a vertebra can be named from the anatomy in front of the reader, on the images a lumbar surgical case is actually planned on. By guideline those are lumbar studies</w:t>
       </w:r>
       <w:r>
         <w:rPr>
@@ -819,10 +810,10 @@
         <mc:AlternateContent>
           <mc:Choice Requires="wpg">
             <w:drawing>
-              <wp:inline distT="0" distB="0" distL="0" distR="0" wp14:anchorId="432112D8" wp14:editId="66DCC215">
+              <wp:inline distT="0" distB="0" distL="0" distR="0" wp14:anchorId="5F45AB5E" wp14:editId="0ECC2851">
                 <wp:extent cx="5921401" cy="2047825"/>
                 <wp:effectExtent l="0" t="0" r="0" b="0"/>
-                <wp:docPr id="31073" name="Group 31073"/>
+                <wp:docPr id="31202" name="Group 31202"/>
                 <wp:cNvGraphicFramePr/>
                 <a:graphic xmlns:a="http://schemas.openxmlformats.org/drawingml/2006/main">
                   <a:graphicData uri="http://schemas.microsoft.com/office/word/2010/wordprocessingGroup">
@@ -837,7 +828,7 @@
                         </a:xfrm>
                       </wpg:grpSpPr>
                       <wps:wsp>
-                        <wps:cNvPr id="288" name="Shape 288"/>
+                        <wps:cNvPr id="287" name="Shape 287"/>
                         <wps:cNvSpPr/>
                         <wps:spPr>
                           <a:xfrm>
@@ -882,7 +873,7 @@
                         <wps:bodyPr/>
                       </wps:wsp>
                       <wps:wsp>
-                        <wps:cNvPr id="289" name="Shape 289"/>
+                        <wps:cNvPr id="288" name="Shape 288"/>
                         <wps:cNvSpPr/>
                         <wps:spPr>
                           <a:xfrm>
@@ -927,7 +918,7 @@
                         <wps:bodyPr/>
                       </wps:wsp>
                       <wps:wsp>
-                        <wps:cNvPr id="4891" name="Rectangle 4891"/>
+                        <wps:cNvPr id="5060" name="Rectangle 5060"/>
                         <wps:cNvSpPr/>
                         <wps:spPr>
                           <a:xfrm>
@@ -963,7 +954,7 @@
                         </wps:bodyPr>
                       </wps:wsp>
                       <wps:wsp>
-                        <wps:cNvPr id="4890" name="Rectangle 4890"/>
+                        <wps:cNvPr id="5059" name="Rectangle 5059"/>
                         <wps:cNvSpPr/>
                         <wps:spPr>
                           <a:xfrm>
@@ -999,7 +990,7 @@
                         </wps:bodyPr>
                       </wps:wsp>
                       <wps:wsp>
-                        <wps:cNvPr id="4889" name="Rectangle 4889"/>
+                        <wps:cNvPr id="5058" name="Rectangle 5058"/>
                         <wps:cNvSpPr/>
                         <wps:spPr>
                           <a:xfrm>
@@ -1035,7 +1026,7 @@
                         </wps:bodyPr>
                       </wps:wsp>
                       <wps:wsp>
-                        <wps:cNvPr id="4888" name="Rectangle 4888"/>
+                        <wps:cNvPr id="5057" name="Rectangle 5057"/>
                         <wps:cNvSpPr/>
                         <wps:spPr>
                           <a:xfrm>
@@ -1071,7 +1062,7 @@
                         </wps:bodyPr>
                       </wps:wsp>
                       <wps:wsp>
-                        <wps:cNvPr id="4886" name="Rectangle 4886"/>
+                        <wps:cNvPr id="5055" name="Rectangle 5055"/>
                         <wps:cNvSpPr/>
                         <wps:spPr>
                           <a:xfrm>
@@ -1107,7 +1098,7 @@
                         </wps:bodyPr>
                       </wps:wsp>
                       <wps:wsp>
-                        <wps:cNvPr id="4885" name="Rectangle 4885"/>
+                        <wps:cNvPr id="5054" name="Rectangle 5054"/>
                         <wps:cNvSpPr/>
                         <wps:spPr>
                           <a:xfrm>
@@ -1143,7 +1134,7 @@
                         </wps:bodyPr>
                       </wps:wsp>
                       <wps:wsp>
-                        <wps:cNvPr id="4884" name="Rectangle 4884"/>
+                        <wps:cNvPr id="5053" name="Rectangle 5053"/>
                         <wps:cNvSpPr/>
                         <wps:spPr>
                           <a:xfrm>
@@ -1179,7 +1170,7 @@
                         </wps:bodyPr>
                       </wps:wsp>
                       <wps:wsp>
-                        <wps:cNvPr id="4887" name="Rectangle 4887"/>
+                        <wps:cNvPr id="5056" name="Rectangle 5056"/>
                         <wps:cNvSpPr/>
                         <wps:spPr>
                           <a:xfrm>
@@ -1215,7 +1206,7 @@
                         </wps:bodyPr>
                       </wps:wsp>
                       <wps:wsp>
-                        <wps:cNvPr id="4883" name="Rectangle 4883"/>
+                        <wps:cNvPr id="5052" name="Rectangle 5052"/>
                         <wps:cNvSpPr/>
                         <wps:spPr>
                           <a:xfrm>
@@ -1251,7 +1242,7 @@
                         </wps:bodyPr>
                       </wps:wsp>
                       <wps:wsp>
-                        <wps:cNvPr id="291" name="Shape 291"/>
+                        <wps:cNvPr id="290" name="Shape 290"/>
                         <wps:cNvSpPr/>
                         <wps:spPr>
                           <a:xfrm>
@@ -1296,7 +1287,7 @@
                         <wps:bodyPr/>
                       </wps:wsp>
                       <wps:wsp>
-                        <wps:cNvPr id="292" name="Rectangle 292"/>
+                        <wps:cNvPr id="291" name="Rectangle 291"/>
                         <wps:cNvSpPr/>
                         <wps:spPr>
                           <a:xfrm>
@@ -1332,7 +1323,7 @@
                         </wps:bodyPr>
                       </wps:wsp>
                       <wps:wsp>
-                        <wps:cNvPr id="293" name="Rectangle 293"/>
+                        <wps:cNvPr id="292" name="Rectangle 292"/>
                         <wps:cNvSpPr/>
                         <wps:spPr>
                           <a:xfrm>
@@ -1369,7 +1360,7 @@
                         </wps:bodyPr>
                       </wps:wsp>
                       <wps:wsp>
-                        <wps:cNvPr id="294" name="Rectangle 294"/>
+                        <wps:cNvPr id="293" name="Rectangle 293"/>
                         <wps:cNvSpPr/>
                         <wps:spPr>
                           <a:xfrm>
@@ -1405,7 +1396,7 @@
                         </wps:bodyPr>
                       </wps:wsp>
                       <wps:wsp>
-                        <wps:cNvPr id="36439" name="Shape 36439"/>
+                        <wps:cNvPr id="36392" name="Shape 36392"/>
                         <wps:cNvSpPr/>
                         <wps:spPr>
                           <a:xfrm>
@@ -1459,7 +1450,7 @@
                         <wps:bodyPr/>
                       </wps:wsp>
                       <wps:wsp>
-                        <wps:cNvPr id="36440" name="Shape 36440"/>
+                        <wps:cNvPr id="36393" name="Shape 36393"/>
                         <wps:cNvSpPr/>
                         <wps:spPr>
                           <a:xfrm>
@@ -1513,7 +1504,7 @@
                         <wps:bodyPr/>
                       </wps:wsp>
                       <wps:wsp>
-                        <wps:cNvPr id="297" name="Rectangle 297"/>
+                        <wps:cNvPr id="296" name="Rectangle 296"/>
                         <wps:cNvSpPr/>
                         <wps:spPr>
                           <a:xfrm>
@@ -1549,7 +1540,7 @@
                         </wps:bodyPr>
                       </wps:wsp>
                       <wps:wsp>
-                        <wps:cNvPr id="298" name="Rectangle 298"/>
+                        <wps:cNvPr id="297" name="Rectangle 297"/>
                         <wps:cNvSpPr/>
                         <wps:spPr>
                           <a:xfrm>
@@ -1586,7 +1577,7 @@
                         </wps:bodyPr>
                       </wps:wsp>
                       <wps:wsp>
-                        <wps:cNvPr id="299" name="Rectangle 299"/>
+                        <wps:cNvPr id="298" name="Rectangle 298"/>
                         <wps:cNvSpPr/>
                         <wps:spPr>
                           <a:xfrm>
@@ -1622,7 +1613,7 @@
                         </wps:bodyPr>
                       </wps:wsp>
                       <wps:wsp>
-                        <wps:cNvPr id="36441" name="Shape 36441"/>
+                        <wps:cNvPr id="36394" name="Shape 36394"/>
                         <wps:cNvSpPr/>
                         <wps:spPr>
                           <a:xfrm>
@@ -1676,7 +1667,7 @@
                         <wps:bodyPr/>
                       </wps:wsp>
                       <wps:wsp>
-                        <wps:cNvPr id="36442" name="Shape 36442"/>
+                        <wps:cNvPr id="36395" name="Shape 36395"/>
                         <wps:cNvSpPr/>
                         <wps:spPr>
                           <a:xfrm>
@@ -1730,7 +1721,7 @@
                         <wps:bodyPr/>
                       </wps:wsp>
                       <wps:wsp>
-                        <wps:cNvPr id="302" name="Rectangle 302"/>
+                        <wps:cNvPr id="301" name="Rectangle 301"/>
                         <wps:cNvSpPr/>
                         <wps:spPr>
                           <a:xfrm>
@@ -1766,7 +1757,7 @@
                         </wps:bodyPr>
                       </wps:wsp>
                       <wps:wsp>
-                        <wps:cNvPr id="303" name="Rectangle 303"/>
+                        <wps:cNvPr id="302" name="Rectangle 302"/>
                         <wps:cNvSpPr/>
                         <wps:spPr>
                           <a:xfrm>
@@ -1803,7 +1794,7 @@
                         </wps:bodyPr>
                       </wps:wsp>
                       <wps:wsp>
-                        <wps:cNvPr id="304" name="Rectangle 304"/>
+                        <wps:cNvPr id="303" name="Rectangle 303"/>
                         <wps:cNvSpPr/>
                         <wps:spPr>
                           <a:xfrm>
@@ -1839,7 +1830,7 @@
                         </wps:bodyPr>
                       </wps:wsp>
                       <wps:wsp>
-                        <wps:cNvPr id="36443" name="Shape 36443"/>
+                        <wps:cNvPr id="36396" name="Shape 36396"/>
                         <wps:cNvSpPr/>
                         <wps:spPr>
                           <a:xfrm>
@@ -1893,7 +1884,7 @@
                         <wps:bodyPr/>
                       </wps:wsp>
                       <wps:wsp>
-                        <wps:cNvPr id="36444" name="Shape 36444"/>
+                        <wps:cNvPr id="36397" name="Shape 36397"/>
                         <wps:cNvSpPr/>
                         <wps:spPr>
                           <a:xfrm>
@@ -1947,7 +1938,7 @@
                         <wps:bodyPr/>
                       </wps:wsp>
                       <wps:wsp>
-                        <wps:cNvPr id="307" name="Shape 307"/>
+                        <wps:cNvPr id="306" name="Shape 306"/>
                         <wps:cNvSpPr/>
                         <wps:spPr>
                           <a:xfrm>
@@ -1967,6 +1958,51 @@
                                 </a:moveTo>
                                 <a:lnTo>
                                   <a:pt x="457937" y="0"/>
+                                </a:lnTo>
+                              </a:path>
+                            </a:pathLst>
+                          </a:custGeom>
+                          <a:ln w="6325" cap="flat">
+                            <a:miter lim="127000"/>
+                          </a:ln>
+                        </wps:spPr>
+                        <wps:style>
+                          <a:lnRef idx="1">
+                            <a:srgbClr val="000000"/>
+                          </a:lnRef>
+                          <a:fillRef idx="0">
+                            <a:srgbClr val="000000">
+                              <a:alpha val="0"/>
+                            </a:srgbClr>
+                          </a:fillRef>
+                          <a:effectRef idx="0">
+                            <a:scrgbClr r="0" g="0" b="0"/>
+                          </a:effectRef>
+                          <a:fontRef idx="none"/>
+                        </wps:style>
+                        <wps:bodyPr/>
+                      </wps:wsp>
+                      <wps:wsp>
+                        <wps:cNvPr id="307" name="Shape 307"/>
+                        <wps:cNvSpPr/>
+                        <wps:spPr>
+                          <a:xfrm>
+                            <a:off x="5466626" y="970941"/>
+                            <a:ext cx="0" cy="149492"/>
+                          </a:xfrm>
+                          <a:custGeom>
+                            <a:avLst/>
+                            <a:gdLst/>
+                            <a:ahLst/>
+                            <a:cxnLst/>
+                            <a:rect l="0" t="0" r="0" b="0"/>
+                            <a:pathLst>
+                              <a:path h="149492">
+                                <a:moveTo>
+                                  <a:pt x="0" y="149492"/>
+                                </a:moveTo>
+                                <a:lnTo>
+                                  <a:pt x="0" y="0"/>
                                 </a:lnTo>
                               </a:path>
                             </a:pathLst>
@@ -1996,7 +2032,7 @@
                         <wps:cNvSpPr/>
                         <wps:spPr>
                           <a:xfrm>
-                            <a:off x="5466626" y="970941"/>
+                            <a:off x="5918226" y="970941"/>
                             <a:ext cx="0" cy="149492"/>
                           </a:xfrm>
                           <a:custGeom>
@@ -2041,8 +2077,8 @@
                         <wps:cNvSpPr/>
                         <wps:spPr>
                           <a:xfrm>
-                            <a:off x="5918226" y="970941"/>
-                            <a:ext cx="0" cy="149492"/>
+                            <a:off x="5463464" y="1120432"/>
+                            <a:ext cx="457937" cy="0"/>
                           </a:xfrm>
                           <a:custGeom>
                             <a:avLst/>
@@ -2051,12 +2087,12 @@
                             <a:cxnLst/>
                             <a:rect l="0" t="0" r="0" b="0"/>
                             <a:pathLst>
-                              <a:path h="149492">
+                              <a:path w="457937">
                                 <a:moveTo>
-                                  <a:pt x="0" y="149492"/>
+                                  <a:pt x="0" y="0"/>
                                 </a:moveTo>
                                 <a:lnTo>
-                                  <a:pt x="0" y="0"/>
+                                  <a:pt x="457937" y="0"/>
                                 </a:lnTo>
                               </a:path>
                             </a:pathLst>
@@ -2082,52 +2118,7 @@
                         <wps:bodyPr/>
                       </wps:wsp>
                       <wps:wsp>
-                        <wps:cNvPr id="310" name="Shape 310"/>
-                        <wps:cNvSpPr/>
-                        <wps:spPr>
-                          <a:xfrm>
-                            <a:off x="5463464" y="1120432"/>
-                            <a:ext cx="457937" cy="0"/>
-                          </a:xfrm>
-                          <a:custGeom>
-                            <a:avLst/>
-                            <a:gdLst/>
-                            <a:ahLst/>
-                            <a:cxnLst/>
-                            <a:rect l="0" t="0" r="0" b="0"/>
-                            <a:pathLst>
-                              <a:path w="457937">
-                                <a:moveTo>
-                                  <a:pt x="0" y="0"/>
-                                </a:moveTo>
-                                <a:lnTo>
-                                  <a:pt x="457937" y="0"/>
-                                </a:lnTo>
-                              </a:path>
-                            </a:pathLst>
-                          </a:custGeom>
-                          <a:ln w="6325" cap="flat">
-                            <a:miter lim="127000"/>
-                          </a:ln>
-                        </wps:spPr>
-                        <wps:style>
-                          <a:lnRef idx="1">
-                            <a:srgbClr val="000000"/>
-                          </a:lnRef>
-                          <a:fillRef idx="0">
-                            <a:srgbClr val="000000">
-                              <a:alpha val="0"/>
-                            </a:srgbClr>
-                          </a:fillRef>
-                          <a:effectRef idx="0">
-                            <a:scrgbClr r="0" g="0" b="0"/>
-                          </a:effectRef>
-                          <a:fontRef idx="none"/>
-                        </wps:style>
-                        <wps:bodyPr/>
-                      </wps:wsp>
-                      <wps:wsp>
-                        <wps:cNvPr id="311" name="Rectangle 311"/>
+                        <wps:cNvPr id="310" name="Rectangle 310"/>
                         <wps:cNvSpPr/>
                         <wps:spPr>
                           <a:xfrm>
@@ -2163,7 +2154,7 @@
                         </wps:bodyPr>
                       </wps:wsp>
                       <wps:wsp>
-                        <wps:cNvPr id="312" name="Rectangle 312"/>
+                        <wps:cNvPr id="311" name="Rectangle 311"/>
                         <wps:cNvSpPr/>
                         <wps:spPr>
                           <a:xfrm>
@@ -2200,7 +2191,7 @@
                         </wps:bodyPr>
                       </wps:wsp>
                       <wps:wsp>
-                        <wps:cNvPr id="313" name="Rectangle 313"/>
+                        <wps:cNvPr id="312" name="Rectangle 312"/>
                         <wps:cNvSpPr/>
                         <wps:spPr>
                           <a:xfrm>
@@ -2236,7 +2227,7 @@
                         </wps:bodyPr>
                       </wps:wsp>
                       <wps:wsp>
-                        <wps:cNvPr id="36445" name="Shape 36445"/>
+                        <wps:cNvPr id="36398" name="Shape 36398"/>
                         <wps:cNvSpPr/>
                         <wps:spPr>
                           <a:xfrm>
@@ -2290,7 +2281,7 @@
                         <wps:bodyPr/>
                       </wps:wsp>
                       <wps:wsp>
-                        <wps:cNvPr id="315" name="Rectangle 315"/>
+                        <wps:cNvPr id="314" name="Rectangle 314"/>
                         <wps:cNvSpPr/>
                         <wps:spPr>
                           <a:xfrm>
@@ -2326,7 +2317,7 @@
                         </wps:bodyPr>
                       </wps:wsp>
                       <wps:wsp>
-                        <wps:cNvPr id="316" name="Rectangle 316"/>
+                        <wps:cNvPr id="315" name="Rectangle 315"/>
                         <wps:cNvSpPr/>
                         <wps:spPr>
                           <a:xfrm>
@@ -2363,7 +2354,7 @@
                         </wps:bodyPr>
                       </wps:wsp>
                       <wps:wsp>
-                        <wps:cNvPr id="317" name="Rectangle 317"/>
+                        <wps:cNvPr id="316" name="Rectangle 316"/>
                         <wps:cNvSpPr/>
                         <wps:spPr>
                           <a:xfrm>
@@ -2399,7 +2390,7 @@
                         </wps:bodyPr>
                       </wps:wsp>
                       <wps:wsp>
-                        <wps:cNvPr id="36446" name="Shape 36446"/>
+                        <wps:cNvPr id="36399" name="Shape 36399"/>
                         <wps:cNvSpPr/>
                         <wps:spPr>
                           <a:xfrm>
@@ -2453,7 +2444,7 @@
                         <wps:bodyPr/>
                       </wps:wsp>
                       <wps:wsp>
-                        <wps:cNvPr id="36447" name="Shape 36447"/>
+                        <wps:cNvPr id="36400" name="Shape 36400"/>
                         <wps:cNvSpPr/>
                         <wps:spPr>
                           <a:xfrm>
@@ -2507,7 +2498,7 @@
                         <wps:bodyPr/>
                       </wps:wsp>
                       <wps:wsp>
-                        <wps:cNvPr id="36448" name="Shape 36448"/>
+                        <wps:cNvPr id="36401" name="Shape 36401"/>
                         <wps:cNvSpPr/>
                         <wps:spPr>
                           <a:xfrm>
@@ -2561,7 +2552,7 @@
                         <wps:bodyPr/>
                       </wps:wsp>
                       <wps:wsp>
-                        <wps:cNvPr id="36449" name="Shape 36449"/>
+                        <wps:cNvPr id="36402" name="Shape 36402"/>
                         <wps:cNvSpPr/>
                         <wps:spPr>
                           <a:xfrm>
@@ -2615,7 +2606,7 @@
                         <wps:bodyPr/>
                       </wps:wsp>
                       <wps:wsp>
-                        <wps:cNvPr id="36450" name="Shape 36450"/>
+                        <wps:cNvPr id="36403" name="Shape 36403"/>
                         <wps:cNvSpPr/>
                         <wps:spPr>
                           <a:xfrm>
@@ -2669,7 +2660,7 @@
                         <wps:bodyPr/>
                       </wps:wsp>
                       <wps:wsp>
-                        <wps:cNvPr id="36451" name="Shape 36451"/>
+                        <wps:cNvPr id="36404" name="Shape 36404"/>
                         <wps:cNvSpPr/>
                         <wps:spPr>
                           <a:xfrm>
@@ -2723,7 +2714,7 @@
                         <wps:bodyPr/>
                       </wps:wsp>
                       <wps:wsp>
-                        <wps:cNvPr id="324" name="Rectangle 324"/>
+                        <wps:cNvPr id="323" name="Rectangle 323"/>
                         <wps:cNvSpPr/>
                         <wps:spPr>
                           <a:xfrm>
@@ -2760,7 +2751,7 @@
                         </wps:bodyPr>
                       </wps:wsp>
                       <wps:wsp>
-                        <wps:cNvPr id="325" name="Rectangle 325"/>
+                        <wps:cNvPr id="324" name="Rectangle 324"/>
                         <wps:cNvSpPr/>
                         <wps:spPr>
                           <a:xfrm>
@@ -2796,7 +2787,7 @@
                         </wps:bodyPr>
                       </wps:wsp>
                       <wps:wsp>
-                        <wps:cNvPr id="36452" name="Shape 36452"/>
+                        <wps:cNvPr id="36405" name="Shape 36405"/>
                         <wps:cNvSpPr/>
                         <wps:spPr>
                           <a:xfrm>
@@ -2850,7 +2841,7 @@
                         <wps:bodyPr/>
                       </wps:wsp>
                       <wps:wsp>
-                        <wps:cNvPr id="36453" name="Shape 36453"/>
+                        <wps:cNvPr id="36406" name="Shape 36406"/>
                         <wps:cNvSpPr/>
                         <wps:spPr>
                           <a:xfrm>
@@ -2904,7 +2895,7 @@
                         <wps:bodyPr/>
                       </wps:wsp>
                       <wps:wsp>
-                        <wps:cNvPr id="36454" name="Shape 36454"/>
+                        <wps:cNvPr id="36407" name="Shape 36407"/>
                         <wps:cNvSpPr/>
                         <wps:spPr>
                           <a:xfrm>
@@ -2958,7 +2949,7 @@
                         <wps:bodyPr/>
                       </wps:wsp>
                       <wps:wsp>
-                        <wps:cNvPr id="36455" name="Shape 36455"/>
+                        <wps:cNvPr id="36408" name="Shape 36408"/>
                         <wps:cNvSpPr/>
                         <wps:spPr>
                           <a:xfrm>
@@ -3012,7 +3003,7 @@
                         <wps:bodyPr/>
                       </wps:wsp>
                       <wps:wsp>
-                        <wps:cNvPr id="36456" name="Shape 36456"/>
+                        <wps:cNvPr id="36409" name="Shape 36409"/>
                         <wps:cNvSpPr/>
                         <wps:spPr>
                           <a:xfrm>
@@ -3066,7 +3057,7 @@
                         <wps:bodyPr/>
                       </wps:wsp>
                       <wps:wsp>
-                        <wps:cNvPr id="36457" name="Shape 36457"/>
+                        <wps:cNvPr id="36410" name="Shape 36410"/>
                         <wps:cNvSpPr/>
                         <wps:spPr>
                           <a:xfrm>
@@ -3120,7 +3111,7 @@
                         <wps:bodyPr/>
                       </wps:wsp>
                       <wps:wsp>
-                        <wps:cNvPr id="36458" name="Shape 36458"/>
+                        <wps:cNvPr id="36411" name="Shape 36411"/>
                         <wps:cNvSpPr/>
                         <wps:spPr>
                           <a:xfrm>
@@ -3174,7 +3165,7 @@
                         <wps:bodyPr/>
                       </wps:wsp>
                       <wps:wsp>
-                        <wps:cNvPr id="36459" name="Shape 36459"/>
+                        <wps:cNvPr id="36412" name="Shape 36412"/>
                         <wps:cNvSpPr/>
                         <wps:spPr>
                           <a:xfrm>
@@ -3228,7 +3219,7 @@
                         <wps:bodyPr/>
                       </wps:wsp>
                       <wps:wsp>
-                        <wps:cNvPr id="36460" name="Shape 36460"/>
+                        <wps:cNvPr id="36413" name="Shape 36413"/>
                         <wps:cNvSpPr/>
                         <wps:spPr>
                           <a:xfrm>
@@ -3282,7 +3273,7 @@
                         <wps:bodyPr/>
                       </wps:wsp>
                       <wps:wsp>
-                        <wps:cNvPr id="335" name="Shape 335"/>
+                        <wps:cNvPr id="334" name="Shape 334"/>
                         <wps:cNvSpPr/>
                         <wps:spPr>
                           <a:xfrm>
@@ -3327,7 +3318,7 @@
                         <wps:bodyPr/>
                       </wps:wsp>
                       <wps:wsp>
-                        <wps:cNvPr id="336" name="Shape 336"/>
+                        <wps:cNvPr id="335" name="Shape 335"/>
                         <wps:cNvSpPr/>
                         <wps:spPr>
                           <a:xfrm>
@@ -3379,16 +3370,16 @@
           </mc:Choice>
           <mc:Fallback xmlns:a="http://schemas.openxmlformats.org/drawingml/2006/main">
             <w:pict>
-              <v:group id="Group 31073" style="width:466.252pt;height:161.246pt;mso-position-horizontal-relative:char;mso-position-vertical-relative:line" coordsize="59214,20478">
-                <v:shape id="Shape 288" style="position:absolute;width:59214;height:0;left:0;top:0;" coordsize="5921401,0" path="m0,0l5921401,0">
+              <v:group id="Group 31202" style="width:466.252pt;height:161.246pt;mso-position-horizontal-relative:char;mso-position-vertical-relative:line" coordsize="59214,20478">
+                <v:shape id="Shape 287" style="position:absolute;width:59214;height:0;left:0;top:0;" coordsize="5921401,0" path="m0,0l5921401,0">
                   <v:stroke weight="0.398pt" endcap="flat" joinstyle="miter" miterlimit="10" on="true" color="#000000"/>
                   <v:fill on="false" color="#000000" opacity="0"/>
                 </v:shape>
-                <v:shape id="Shape 289" style="position:absolute;width:59214;height:0;left:0;top:303;" coordsize="5921401,0" path="m0,0l5921401,0">
+                <v:shape id="Shape 288" style="position:absolute;width:59214;height:0;left:0;top:303;" coordsize="5921401,0" path="m0,0l5921401,0">
                   <v:stroke weight="0.398pt" endcap="flat" joinstyle="miter" miterlimit="10" on="true" color="#000000"/>
                   <v:fill on="false" color="#000000" opacity="0"/>
                 </v:shape>
-                <v:rect id="Rectangle 4891" style="position:absolute;width:16761;height:1636;left:46175;top:1546;" filled="f" stroked="f">
+                <v:rect id="Rectangle 5060" style="position:absolute;width:16761;height:1636;left:46175;top:1546;" filled="f" stroked="f">
                   <v:textbox inset="0,0,0,0">
                     <w:txbxContent>
                       <w:p>
@@ -3408,7 +3399,7 @@
                     </w:txbxContent>
                   </v:textbox>
                 </v:rect>
-                <v:rect id="Rectangle 4890" style="position:absolute;width:3618;height:1636;left:41825;top:1546;" filled="f" stroked="f">
+                <v:rect id="Rectangle 5059" style="position:absolute;width:3618;height:1636;left:41825;top:1546;" filled="f" stroked="f">
                   <v:textbox inset="0,0,0,0">
                     <w:txbxContent>
                       <w:p>
@@ -3428,7 +3419,7 @@
                     </w:txbxContent>
                   </v:textbox>
                 </v:rect>
-                <v:rect id="Rectangle 4889" style="position:absolute;width:4744;height:1636;left:36823;top:1546;" filled="f" stroked="f">
+                <v:rect id="Rectangle 5058" style="position:absolute;width:4744;height:1636;left:36823;top:1546;" filled="f" stroked="f">
                   <v:textbox inset="0,0,0,0">
                     <w:txbxContent>
                       <w:p>
@@ -3448,7 +3439,7 @@
                     </w:txbxContent>
                   </v:textbox>
                 </v:rect>
-                <v:rect id="Rectangle 4888" style="position:absolute;width:1945;height:1636;left:33296;top:1546;" filled="f" stroked="f">
+                <v:rect id="Rectangle 5057" style="position:absolute;width:1945;height:1636;left:33296;top:1546;" filled="f" stroked="f">
                   <v:textbox inset="0,0,0,0">
                     <w:txbxContent>
                       <w:p>
@@ -3468,7 +3459,7 @@
                     </w:txbxContent>
                   </v:textbox>
                 </v:rect>
-                <v:rect id="Rectangle 4886" style="position:absolute;width:2072;height:1636;left:24089;top:1546;" filled="f" stroked="f">
+                <v:rect id="Rectangle 5055" style="position:absolute;width:2072;height:1636;left:24089;top:1546;" filled="f" stroked="f">
                   <v:textbox inset="0,0,0,0">
                     <w:txbxContent>
                       <w:p>
@@ -3488,7 +3479,7 @@
                     </w:txbxContent>
                   </v:textbox>
                 </v:rect>
-                <v:rect id="Rectangle 4885" style="position:absolute;width:4964;height:1636;left:18423;top:1546;" filled="f" stroked="f">
+                <v:rect id="Rectangle 5054" style="position:absolute;width:4964;height:1636;left:18423;top:1546;" filled="f" stroked="f">
                   <v:textbox inset="0,0,0,0">
                     <w:txbxContent>
                       <w:p>
@@ -3508,7 +3499,7 @@
                     </w:txbxContent>
                   </v:textbox>
                 </v:rect>
-                <v:rect id="Rectangle 4884" style="position:absolute;width:4514;height:1636;left:12787;top:1546;" filled="f" stroked="f">
+                <v:rect id="Rectangle 5053" style="position:absolute;width:4514;height:1636;left:12787;top:1546;" filled="f" stroked="f">
                   <v:textbox inset="0,0,0,0">
                     <w:txbxContent>
                       <w:p>
@@ -3528,7 +3519,7 @@
                     </w:txbxContent>
                   </v:textbox>
                 </v:rect>
-                <v:rect id="Rectangle 4887" style="position:absolute;width:6045;height:1636;left:27175;top:1546;" filled="f" stroked="f">
+                <v:rect id="Rectangle 5056" style="position:absolute;width:6045;height:1636;left:27175;top:1546;" filled="f" stroked="f">
                   <v:textbox inset="0,0,0,0">
                     <w:txbxContent>
                       <w:p>
@@ -3548,7 +3539,7 @@
                     </w:txbxContent>
                   </v:textbox>
                 </v:rect>
-                <v:rect id="Rectangle 4883" style="position:absolute;width:8087;height:1636;left:0;top:1546;" filled="f" stroked="f">
+                <v:rect id="Rectangle 5052" style="position:absolute;width:8087;height:1636;left:0;top:1546;" filled="f" stroked="f">
                   <v:textbox inset="0,0,0,0">
                     <w:txbxContent>
                       <w:p>
@@ -3568,11 +3559,11 @@
                     </w:txbxContent>
                   </v:textbox>
                 </v:rect>
-                <v:shape id="Shape 291" style="position:absolute;width:59214;height:0;left:0;top:3359;" coordsize="5921401,0" path="m0,0l5921401,0">
+                <v:shape id="Shape 290" style="position:absolute;width:59214;height:0;left:0;top:3359;" coordsize="5921401,0" path="m0,0l5921401,0">
                   <v:stroke weight="0.398pt" endcap="flat" joinstyle="miter" miterlimit="10" on="true" color="#000000"/>
                   <v:fill on="false" color="#000000" opacity="0"/>
                 </v:shape>
-                <v:rect id="Rectangle 292" style="position:absolute;width:9418;height:1636;left:0;top:4349;" filled="f" stroked="f">
+                <v:rect id="Rectangle 291" style="position:absolute;width:9418;height:1636;left:0;top:4349;" filled="f" stroked="f">
                   <v:textbox inset="0,0,0,0">
                     <w:txbxContent>
                       <w:p>
@@ -3592,7 +3583,7 @@
                     </w:txbxContent>
                   </v:textbox>
                 </v:rect>
-                <v:rect id="Rectangle 293" style="position:absolute;width:715;height:1195;left:7081;top:4105;" filled="f" stroked="f">
+                <v:rect id="Rectangle 292" style="position:absolute;width:715;height:1195;left:7081;top:4105;" filled="f" stroked="f">
                   <v:textbox inset="0,0,0,0">
                     <w:txbxContent>
                       <w:p>
@@ -3613,7 +3604,7 @@
                     </w:txbxContent>
                   </v:textbox>
                 </v:rect>
-                <v:rect id="Rectangle 294" style="position:absolute;width:4197;height:1636;left:13025;top:4349;" filled="f" stroked="f">
+                <v:rect id="Rectangle 293" style="position:absolute;width:4197;height:1636;left:13025;top:4349;" filled="f" stroked="f">
                   <v:textbox inset="0,0,0,0">
                     <w:txbxContent>
                       <w:p>
@@ -3633,15 +3624,15 @@
                     </w:txbxContent>
                   </v:textbox>
                 </v:rect>
-                <v:shape id="Shape 36461" style="position:absolute;width:4579;height:1849;left:17999;top:3998;" coordsize="457937,184925" path="m0,0l457937,0l457937,184925l0,184925l0,0">
+                <v:shape id="Shape 36414" style="position:absolute;width:4579;height:1849;left:17999;top:3998;" coordsize="457937,184925" path="m0,0l457937,0l457937,184925l0,184925l0,0">
                   <v:stroke weight="0pt" endcap="flat" joinstyle="miter" miterlimit="10" on="false" color="#000000" opacity="0"/>
                   <v:fill on="true" color="#000000"/>
                 </v:shape>
-                <v:shape id="Shape 36462" style="position:absolute;width:4579;height:1849;left:22579;top:3998;" coordsize="457937,184925" path="m0,0l457937,0l457937,184925l0,184925l0,0">
+                <v:shape id="Shape 36415" style="position:absolute;width:4579;height:1849;left:22579;top:3998;" coordsize="457937,184925" path="m0,0l457937,0l457937,184925l0,184925l0,0">
                   <v:stroke weight="0pt" endcap="flat" joinstyle="miter" miterlimit="10" on="false" color="#000000" opacity="0"/>
                   <v:fill on="true" color="#000000"/>
                 </v:shape>
-                <v:rect id="Rectangle 297" style="position:absolute;width:9852;height:1636;left:0;top:7101;" filled="f" stroked="f">
+                <v:rect id="Rectangle 296" style="position:absolute;width:9852;height:1636;left:0;top:7101;" filled="f" stroked="f">
                   <v:textbox inset="0,0,0,0">
                     <w:txbxContent>
                       <w:p>
@@ -3661,7 +3652,7 @@
                     </w:txbxContent>
                   </v:textbox>
                 </v:rect>
-                <v:rect id="Rectangle 298" style="position:absolute;width:715;height:1195;left:7408;top:6857;" filled="f" stroked="f">
+                <v:rect id="Rectangle 297" style="position:absolute;width:715;height:1195;left:7408;top:6857;" filled="f" stroked="f">
                   <v:textbox inset="0,0,0,0">
                     <w:txbxContent>
                       <w:p>
@@ -3682,7 +3673,7 @@
                     </w:txbxContent>
                   </v:textbox>
                 </v:rect>
-                <v:rect id="Rectangle 299" style="position:absolute;width:4197;height:1636;left:13025;top:7101;" filled="f" stroked="f">
+                <v:rect id="Rectangle 298" style="position:absolute;width:4197;height:1636;left:13025;top:7101;" filled="f" stroked="f">
                   <v:textbox inset="0,0,0,0">
                     <w:txbxContent>
                       <w:p>
@@ -3702,15 +3693,15 @@
                     </w:txbxContent>
                   </v:textbox>
                 </v:rect>
-                <v:shape id="Shape 36463" style="position:absolute;width:4579;height:1849;left:27158;top:6750;" coordsize="457937,184925" path="m0,0l457937,0l457937,184925l0,184925l0,0">
+                <v:shape id="Shape 36416" style="position:absolute;width:4579;height:1849;left:27158;top:6750;" coordsize="457937,184925" path="m0,0l457937,0l457937,184925l0,184925l0,0">
                   <v:stroke weight="0pt" endcap="flat" joinstyle="miter" miterlimit="10" on="false" color="#000000" opacity="0"/>
                   <v:fill on="true" color="#000000"/>
                 </v:shape>
-                <v:shape id="Shape 36464" style="position:absolute;width:4579;height:1849;left:36317;top:6750;" coordsize="457936,184925" path="m0,0l457936,0l457936,184925l0,184925l0,0">
+                <v:shape id="Shape 36417" style="position:absolute;width:4579;height:1849;left:36317;top:6750;" coordsize="457936,184925" path="m0,0l457936,0l457936,184925l0,184925l0,0">
                   <v:stroke weight="0pt" endcap="flat" joinstyle="miter" miterlimit="10" on="false" color="#000000" opacity="0"/>
                   <v:fill on="true" color="#000000"/>
                 </v:shape>
-                <v:rect id="Rectangle 302" style="position:absolute;width:4612;height:1636;left:0;top:9853;" filled="f" stroked="f">
+                <v:rect id="Rectangle 301" style="position:absolute;width:4612;height:1636;left:0;top:9853;" filled="f" stroked="f">
                   <v:textbox inset="0,0,0,0">
                     <w:txbxContent>
                       <w:p>
@@ -3730,7 +3721,7 @@
                     </w:txbxContent>
                   </v:textbox>
                 </v:rect>
-                <v:rect id="Rectangle 303" style="position:absolute;width:1430;height:1195;left:3467;top:9609;" filled="f" stroked="f">
+                <v:rect id="Rectangle 302" style="position:absolute;width:1430;height:1195;left:3467;top:9609;" filled="f" stroked="f">
                   <v:textbox inset="0,0,0,0">
                     <w:txbxContent>
                       <w:p>
@@ -3751,7 +3742,7 @@
                     </w:txbxContent>
                   </v:textbox>
                 </v:rect>
-                <v:rect id="Rectangle 304" style="position:absolute;width:2763;height:1636;left:14103;top:9853;" filled="f" stroked="f">
+                <v:rect id="Rectangle 303" style="position:absolute;width:2763;height:1636;left:14103;top:9853;" filled="f" stroked="f">
                   <v:textbox inset="0,0,0,0">
                     <w:txbxContent>
                       <w:p>
@@ -3771,31 +3762,31 @@
                     </w:txbxContent>
                   </v:textbox>
                 </v:rect>
-                <v:shape id="Shape 36465" style="position:absolute;width:4579;height:1849;left:17999;top:9502;" coordsize="457937,184925" path="m0,0l457937,0l457937,184925l0,184925l0,0">
+                <v:shape id="Shape 36418" style="position:absolute;width:4579;height:1849;left:17999;top:9502;" coordsize="457937,184925" path="m0,0l457937,0l457937,184925l0,184925l0,0">
                   <v:stroke weight="0pt" endcap="flat" joinstyle="miter" miterlimit="10" on="false" color="#000000" opacity="0"/>
                   <v:fill on="true" color="#000000"/>
                 </v:shape>
-                <v:shape id="Shape 36466" style="position:absolute;width:4579;height:1849;left:22579;top:9502;" coordsize="457937,184925" path="m0,0l457937,0l457937,184925l0,184925l0,0">
+                <v:shape id="Shape 36419" style="position:absolute;width:4579;height:1849;left:22579;top:9502;" coordsize="457937,184925" path="m0,0l457937,0l457937,184925l0,184925l0,0">
                   <v:stroke weight="0pt" endcap="flat" joinstyle="miter" miterlimit="10" on="false" color="#000000" opacity="0"/>
                   <v:fill on="true" color="#000000"/>
                 </v:shape>
-                <v:shape id="Shape 307" style="position:absolute;width:4579;height:0;left:54634;top:9709;" coordsize="457937,0" path="m0,0l457937,0">
+                <v:shape id="Shape 306" style="position:absolute;width:4579;height:0;left:54634;top:9709;" coordsize="457937,0" path="m0,0l457937,0">
                   <v:stroke weight="0.498pt" endcap="flat" joinstyle="miter" miterlimit="10" on="true" color="#000000"/>
                   <v:fill on="false" color="#000000" opacity="0"/>
                 </v:shape>
-                <v:shape id="Shape 308" style="position:absolute;width:0;height:1494;left:54666;top:9709;" coordsize="0,149492" path="m0,149492l0,0">
+                <v:shape id="Shape 307" style="position:absolute;width:0;height:1494;left:54666;top:9709;" coordsize="0,149492" path="m0,149492l0,0">
                   <v:stroke weight="0.498pt" endcap="flat" joinstyle="miter" miterlimit="10" on="true" color="#000000"/>
                   <v:fill on="false" color="#000000" opacity="0"/>
                 </v:shape>
-                <v:shape id="Shape 309" style="position:absolute;width:0;height:1494;left:59182;top:9709;" coordsize="0,149492" path="m0,149492l0,0">
+                <v:shape id="Shape 308" style="position:absolute;width:0;height:1494;left:59182;top:9709;" coordsize="0,149492" path="m0,149492l0,0">
                   <v:stroke weight="0.498pt" endcap="flat" joinstyle="miter" miterlimit="10" on="true" color="#000000"/>
                   <v:fill on="false" color="#000000" opacity="0"/>
                 </v:shape>
-                <v:shape id="Shape 310" style="position:absolute;width:4579;height:0;left:54634;top:11204;" coordsize="457937,0" path="m0,0l457937,0">
+                <v:shape id="Shape 309" style="position:absolute;width:4579;height:0;left:54634;top:11204;" coordsize="457937,0" path="m0,0l457937,0">
                   <v:stroke weight="0.498pt" endcap="flat" joinstyle="miter" miterlimit="10" on="true" color="#000000"/>
                   <v:fill on="false" color="#000000" opacity="0"/>
                 </v:shape>
-                <v:rect id="Rectangle 311" style="position:absolute;width:8163;height:1636;left:0;top:12605;" filled="f" stroked="f">
+                <v:rect id="Rectangle 310" style="position:absolute;width:8163;height:1636;left:0;top:12605;" filled="f" stroked="f">
                   <v:textbox inset="0,0,0,0">
                     <w:txbxContent>
                       <w:p>
@@ -3815,7 +3806,7 @@
                     </w:txbxContent>
                   </v:textbox>
                 </v:rect>
-                <v:rect id="Rectangle 312" style="position:absolute;width:1430;height:1195;left:6138;top:12361;" filled="f" stroked="f">
+                <v:rect id="Rectangle 311" style="position:absolute;width:1430;height:1195;left:6138;top:12361;" filled="f" stroked="f">
                   <v:textbox inset="0,0,0,0">
                     <w:txbxContent>
                       <w:p>
@@ -3836,7 +3827,7 @@
                     </w:txbxContent>
                   </v:textbox>
                 </v:rect>
-                <v:rect id="Rectangle 313" style="position:absolute;width:2763;height:1636;left:14103;top:12605;" filled="f" stroked="f">
+                <v:rect id="Rectangle 312" style="position:absolute;width:2763;height:1636;left:14103;top:12605;" filled="f" stroked="f">
                   <v:textbox inset="0,0,0,0">
                     <w:txbxContent>
                       <w:p>
@@ -3856,11 +3847,11 @@
                     </w:txbxContent>
                   </v:textbox>
                 </v:rect>
-                <v:shape id="Shape 36467" style="position:absolute;width:4579;height:1849;left:40896;top:12254;" coordsize="457936,184925" path="m0,0l457936,0l457936,184925l0,184925l0,0">
+                <v:shape id="Shape 36420" style="position:absolute;width:4579;height:1849;left:40896;top:12254;" coordsize="457936,184925" path="m0,0l457936,0l457936,184925l0,184925l0,0">
                   <v:stroke weight="0pt" endcap="flat" joinstyle="miter" miterlimit="10" on="false" color="#000000" opacity="0"/>
                   <v:fill on="true" color="#000000"/>
                 </v:shape>
-                <v:rect id="Rectangle 315" style="position:absolute;width:14337;height:1636;left:0;top:15357;" filled="f" stroked="f">
+                <v:rect id="Rectangle 314" style="position:absolute;width:14337;height:1636;left:0;top:15357;" filled="f" stroked="f">
                   <v:textbox inset="0,0,0,0">
                     <w:txbxContent>
                       <w:p>
@@ -3880,7 +3871,7 @@
                     </w:txbxContent>
                   </v:textbox>
                 </v:rect>
-                <v:rect id="Rectangle 316" style="position:absolute;width:1430;height:1195;left:10779;top:15113;" filled="f" stroked="f">
+                <v:rect id="Rectangle 315" style="position:absolute;width:1430;height:1195;left:10779;top:15113;" filled="f" stroked="f">
                   <v:textbox inset="0,0,0,0">
                     <w:txbxContent>
                       <w:p>
@@ -3901,7 +3892,7 @@
                     </w:txbxContent>
                   </v:textbox>
                 </v:rect>
-                <v:rect id="Rectangle 317" style="position:absolute;width:4197;height:1636;left:13025;top:15357;" filled="f" stroked="f">
+                <v:rect id="Rectangle 316" style="position:absolute;width:4197;height:1636;left:13025;top:15357;" filled="f" stroked="f">
                   <v:textbox inset="0,0,0,0">
                     <w:txbxContent>
                       <w:p>
@@ -3921,31 +3912,31 @@
                     </w:txbxContent>
                   </v:textbox>
                 </v:rect>
-                <v:shape id="Shape 36468" style="position:absolute;width:4579;height:1849;left:17999;top:15006;" coordsize="457937,184925" path="m0,0l457937,0l457937,184925l0,184925l0,0">
+                <v:shape id="Shape 36421" style="position:absolute;width:4579;height:1849;left:17999;top:15006;" coordsize="457937,184925" path="m0,0l457937,0l457937,184925l0,184925l0,0">
                   <v:stroke weight="0pt" endcap="flat" joinstyle="miter" miterlimit="10" on="false" color="#000000" opacity="0"/>
                   <v:fill on="true" color="#000000"/>
                 </v:shape>
-                <v:shape id="Shape 36469" style="position:absolute;width:4579;height:1849;left:27158;top:15006;" coordsize="457937,184925" path="m0,0l457937,0l457937,184925l0,184925l0,0">
+                <v:shape id="Shape 36422" style="position:absolute;width:4579;height:1849;left:27158;top:15006;" coordsize="457937,184925" path="m0,0l457937,0l457937,184925l0,184925l0,0">
                   <v:stroke weight="0pt" endcap="flat" joinstyle="miter" miterlimit="10" on="false" color="#000000" opacity="0"/>
                   <v:fill on="true" color="#000000"/>
                 </v:shape>
-                <v:shape id="Shape 36470" style="position:absolute;width:4579;height:1849;left:31737;top:15006;" coordsize="457937,184925" path="m0,0l457937,0l457937,184925l0,184925l0,0">
+                <v:shape id="Shape 36423" style="position:absolute;width:4579;height:1849;left:31737;top:15006;" coordsize="457937,184925" path="m0,0l457937,0l457937,184925l0,184925l0,0">
                   <v:stroke weight="0pt" endcap="flat" joinstyle="miter" miterlimit="10" on="false" color="#000000" opacity="0"/>
                   <v:fill on="true" color="#000000"/>
                 </v:shape>
-                <v:shape id="Shape 36471" style="position:absolute;width:4579;height:1849;left:36317;top:15006;" coordsize="457936,184925" path="m0,0l457936,0l457936,184925l0,184925l0,0">
+                <v:shape id="Shape 36424" style="position:absolute;width:4579;height:1849;left:36317;top:15006;" coordsize="457936,184925" path="m0,0l457936,0l457936,184925l0,184925l0,0">
                   <v:stroke weight="0pt" endcap="flat" joinstyle="miter" miterlimit="10" on="false" color="#000000" opacity="0"/>
                   <v:fill on="true" color="#000000"/>
                 </v:shape>
-                <v:shape id="Shape 36472" style="position:absolute;width:4579;height:1849;left:40896;top:15006;" coordsize="457936,184925" path="m0,0l457936,0l457936,184925l0,184925l0,0">
+                <v:shape id="Shape 36425" style="position:absolute;width:4579;height:1849;left:40896;top:15006;" coordsize="457936,184925" path="m0,0l457936,0l457936,184925l0,184925l0,0">
                   <v:stroke weight="0pt" endcap="flat" joinstyle="miter" miterlimit="10" on="false" color="#000000" opacity="0"/>
                   <v:fill on="true" color="#000000"/>
                 </v:shape>
-                <v:shape id="Shape 36473" style="position:absolute;width:4579;height:1849;left:50055;top:15006;" coordsize="457936,184925" path="m0,0l457936,0l457936,184925l0,184925l0,0">
+                <v:shape id="Shape 36426" style="position:absolute;width:4579;height:1849;left:50055;top:15006;" coordsize="457936,184925" path="m0,0l457936,0l457936,184925l0,184925l0,0">
                   <v:stroke weight="0pt" endcap="flat" joinstyle="miter" miterlimit="10" on="false" color="#000000" opacity="0"/>
                   <v:fill on="true" color="#000000"/>
                 </v:shape>
-                <v:rect id="Rectangle 324" style="position:absolute;width:16503;height:1636;left:0;top:18109;" filled="f" stroked="f">
+                <v:rect id="Rectangle 323" style="position:absolute;width:16503;height:1636;left:0;top:18109;" filled="f" stroked="f">
                   <v:textbox inset="0,0,0,0">
                     <w:txbxContent>
                       <w:p>
@@ -3966,7 +3957,7 @@
                     </w:txbxContent>
                   </v:textbox>
                 </v:rect>
-                <v:rect id="Rectangle 325" style="position:absolute;width:2763;height:1636;left:14102;top:18109;" filled="f" stroked="f">
+                <v:rect id="Rectangle 324" style="position:absolute;width:2763;height:1636;left:14102;top:18109;" filled="f" stroked="f">
                   <v:textbox inset="0,0,0,0">
                     <w:txbxContent>
                       <w:p>
@@ -3986,47 +3977,47 @@
                     </w:txbxContent>
                   </v:textbox>
                 </v:rect>
-                <v:shape id="Shape 36474" style="position:absolute;width:4579;height:1849;left:17999;top:17758;" coordsize="457937,184925" path="m0,0l457937,0l457937,184925l0,184925l0,0">
+                <v:shape id="Shape 36427" style="position:absolute;width:4579;height:1849;left:17999;top:17758;" coordsize="457937,184925" path="m0,0l457937,0l457937,184925l0,184925l0,0">
                   <v:stroke weight="0pt" endcap="flat" joinstyle="miter" miterlimit="10" on="false" color="#000000" opacity="0"/>
                   <v:fill on="true" color="#000000"/>
                 </v:shape>
-                <v:shape id="Shape 36475" style="position:absolute;width:4579;height:1849;left:22579;top:17758;" coordsize="457937,184925" path="m0,0l457937,0l457937,184925l0,184925l0,0">
+                <v:shape id="Shape 36428" style="position:absolute;width:4579;height:1849;left:22579;top:17758;" coordsize="457937,184925" path="m0,0l457937,0l457937,184925l0,184925l0,0">
                   <v:stroke weight="0pt" endcap="flat" joinstyle="miter" miterlimit="10" on="false" color="#000000" opacity="0"/>
                   <v:fill on="true" color="#000000"/>
                 </v:shape>
-                <v:shape id="Shape 36476" style="position:absolute;width:4579;height:1849;left:27158;top:17758;" coordsize="457937,184925" path="m0,0l457937,0l457937,184925l0,184925l0,0">
+                <v:shape id="Shape 36429" style="position:absolute;width:4579;height:1849;left:27158;top:17758;" coordsize="457937,184925" path="m0,0l457937,0l457937,184925l0,184925l0,0">
                   <v:stroke weight="0pt" endcap="flat" joinstyle="miter" miterlimit="10" on="false" color="#000000" opacity="0"/>
                   <v:fill on="true" color="#000000"/>
                 </v:shape>
-                <v:shape id="Shape 36477" style="position:absolute;width:4579;height:1849;left:31737;top:17758;" coordsize="457937,184925" path="m0,0l457937,0l457937,184925l0,184925l0,0">
+                <v:shape id="Shape 36430" style="position:absolute;width:4579;height:1849;left:31737;top:17758;" coordsize="457937,184925" path="m0,0l457937,0l457937,184925l0,184925l0,0">
                   <v:stroke weight="0pt" endcap="flat" joinstyle="miter" miterlimit="10" on="false" color="#000000" opacity="0"/>
                   <v:fill on="true" color="#000000"/>
                 </v:shape>
-                <v:shape id="Shape 36478" style="position:absolute;width:4579;height:1849;left:36317;top:17758;" coordsize="457936,184925" path="m0,0l457936,0l457936,184925l0,184925l0,0">
+                <v:shape id="Shape 36431" style="position:absolute;width:4579;height:1849;left:36317;top:17758;" coordsize="457936,184925" path="m0,0l457936,0l457936,184925l0,184925l0,0">
                   <v:stroke weight="0pt" endcap="flat" joinstyle="miter" miterlimit="10" on="false" color="#000000" opacity="0"/>
                   <v:fill on="true" color="#000000"/>
                 </v:shape>
-                <v:shape id="Shape 36479" style="position:absolute;width:4579;height:1849;left:40896;top:17758;" coordsize="457936,184925" path="m0,0l457936,0l457936,184925l0,184925l0,0">
+                <v:shape id="Shape 36432" style="position:absolute;width:4579;height:1849;left:40896;top:17758;" coordsize="457936,184925" path="m0,0l457936,0l457936,184925l0,184925l0,0">
                   <v:stroke weight="0pt" endcap="flat" joinstyle="miter" miterlimit="10" on="false" color="#000000" opacity="0"/>
                   <v:fill on="true" color="#000000"/>
                 </v:shape>
-                <v:shape id="Shape 36480" style="position:absolute;width:4579;height:1849;left:45475;top:17758;" coordsize="457936,184925" path="m0,0l457936,0l457936,184925l0,184925l0,0">
+                <v:shape id="Shape 36433" style="position:absolute;width:4579;height:1849;left:45475;top:17758;" coordsize="457936,184925" path="m0,0l457936,0l457936,184925l0,184925l0,0">
                   <v:stroke weight="0pt" endcap="flat" joinstyle="miter" miterlimit="10" on="false" color="#000000" opacity="0"/>
                   <v:fill on="true" color="#000000"/>
                 </v:shape>
-                <v:shape id="Shape 36481" style="position:absolute;width:4579;height:1849;left:50055;top:17758;" coordsize="457936,184925" path="m0,0l457936,0l457936,184925l0,184925l0,0">
+                <v:shape id="Shape 36434" style="position:absolute;width:4579;height:1849;left:50055;top:17758;" coordsize="457936,184925" path="m0,0l457936,0l457936,184925l0,184925l0,0">
                   <v:stroke weight="0pt" endcap="flat" joinstyle="miter" miterlimit="10" on="false" color="#000000" opacity="0"/>
                   <v:fill on="true" color="#000000"/>
                 </v:shape>
-                <v:shape id="Shape 36482" style="position:absolute;width:4579;height:1849;left:54634;top:17758;" coordsize="457937,184925" path="m0,0l457937,0l457937,184925l0,184925l0,0">
+                <v:shape id="Shape 36435" style="position:absolute;width:4579;height:1849;left:54634;top:17758;" coordsize="457937,184925" path="m0,0l457937,0l457937,184925l0,184925l0,0">
                   <v:stroke weight="0pt" endcap="flat" joinstyle="miter" miterlimit="10" on="false" color="#000000" opacity="0"/>
                   <v:fill on="true" color="#000000"/>
                 </v:shape>
-                <v:shape id="Shape 335" style="position:absolute;width:59214;height:0;left:0;top:20174;" coordsize="5921401,0" path="m0,0l5921401,0">
+                <v:shape id="Shape 334" style="position:absolute;width:59214;height:0;left:0;top:20174;" coordsize="5921401,0" path="m0,0l5921401,0">
                   <v:stroke weight="0.398pt" endcap="flat" joinstyle="miter" miterlimit="10" on="true" color="#000000"/>
                   <v:fill on="false" color="#000000" opacity="0"/>
                 </v:shape>
-                <v:shape id="Shape 336" style="position:absolute;width:59214;height:0;left:0;top:20478;" coordsize="5921401,0" path="m0,0l5921401,0">
+                <v:shape id="Shape 335" style="position:absolute;width:59214;height:0;left:0;top:20478;" coordsize="5921401,0" path="m0,0l5921401,0">
                   <v:stroke weight="0.398pt" endcap="flat" joinstyle="miter" miterlimit="10" on="true" color="#000000"/>
                   <v:fill on="false" color="#000000" opacity="0"/>
                 </v:shape>
@@ -4180,16 +4171,16 @@
           <w:noProof/>
         </w:rPr>
         <w:drawing>
-          <wp:inline distT="0" distB="0" distL="0" distR="0" wp14:anchorId="3E0E82C2" wp14:editId="4DBB323B">
+          <wp:inline distT="0" distB="0" distL="0" distR="0" wp14:anchorId="493365DF" wp14:editId="53D7E990">
             <wp:extent cx="2880360" cy="5105401"/>
             <wp:effectExtent l="0" t="0" r="0" b="0"/>
-            <wp:docPr id="35844" name="Picture 35844"/>
+            <wp:docPr id="35799" name="Picture 35799"/>
             <wp:cNvGraphicFramePr/>
             <a:graphic xmlns:a="http://schemas.openxmlformats.org/drawingml/2006/main">
               <a:graphicData uri="http://schemas.openxmlformats.org/drawingml/2006/picture">
                 <pic:pic xmlns:pic="http://schemas.openxmlformats.org/drawingml/2006/picture">
                   <pic:nvPicPr>
-                    <pic:cNvPr id="35844" name="Picture 35844"/>
+                    <pic:cNvPr id="35799" name="Picture 35799"/>
                     <pic:cNvPicPr/>
                   </pic:nvPicPr>
                   <pic:blipFill>
@@ -4907,10 +4898,10 @@
         <mc:AlternateContent>
           <mc:Choice Requires="wpg">
             <w:drawing>
-              <wp:inline distT="0" distB="0" distL="0" distR="0" wp14:anchorId="2182CE89" wp14:editId="323A3417">
+              <wp:inline distT="0" distB="0" distL="0" distR="0" wp14:anchorId="1D281314" wp14:editId="2570B0F9">
                 <wp:extent cx="1357466" cy="1270317"/>
                 <wp:effectExtent l="0" t="0" r="0" b="0"/>
-                <wp:docPr id="31080" name="Group 31080"/>
+                <wp:docPr id="31188" name="Group 31188"/>
                 <wp:cNvGraphicFramePr/>
                 <a:graphic xmlns:a="http://schemas.openxmlformats.org/drawingml/2006/main">
                   <a:graphicData uri="http://schemas.microsoft.com/office/word/2010/wordprocessingGroup">
@@ -4926,7 +4917,7 @@
                       </wpg:grpSpPr>
                       <pic:pic xmlns:pic="http://schemas.openxmlformats.org/drawingml/2006/picture">
                         <pic:nvPicPr>
-                          <pic:cNvPr id="35846" name="Picture 35846"/>
+                          <pic:cNvPr id="35801" name="Picture 35801"/>
                           <pic:cNvPicPr/>
                         </pic:nvPicPr>
                         <pic:blipFill>
@@ -4946,7 +4937,7 @@
                         </pic:spPr>
                       </pic:pic>
                       <wps:wsp>
-                        <wps:cNvPr id="36483" name="Shape 36483"/>
+                        <wps:cNvPr id="36436" name="Shape 36436"/>
                         <wps:cNvSpPr/>
                         <wps:spPr>
                           <a:xfrm>
@@ -4998,7 +4989,7 @@
                         <wps:bodyPr/>
                       </wps:wsp>
                       <wps:wsp>
-                        <wps:cNvPr id="5046" name="Rectangle 5046"/>
+                        <wps:cNvPr id="4999" name="Rectangle 4999"/>
                         <wps:cNvSpPr/>
                         <wps:spPr>
                           <a:xfrm>
@@ -5035,7 +5026,7 @@
                         </wps:bodyPr>
                       </wps:wsp>
                       <wps:wsp>
-                        <wps:cNvPr id="5049" name="Rectangle 5049"/>
+                        <wps:cNvPr id="5001" name="Rectangle 5001"/>
                         <wps:cNvSpPr/>
                         <wps:spPr>
                           <a:xfrm>
@@ -5072,7 +5063,7 @@
                         </wps:bodyPr>
                       </wps:wsp>
                       <wps:wsp>
-                        <wps:cNvPr id="30033" name="Rectangle 30033"/>
+                        <wps:cNvPr id="30166" name="Rectangle 30166"/>
                         <wps:cNvSpPr/>
                         <wps:spPr>
                           <a:xfrm>
@@ -5109,7 +5100,7 @@
                         </wps:bodyPr>
                       </wps:wsp>
                       <wps:wsp>
-                        <wps:cNvPr id="30034" name="Rectangle 30034"/>
+                        <wps:cNvPr id="30167" name="Rectangle 30167"/>
                         <wps:cNvSpPr/>
                         <wps:spPr>
                           <a:xfrm>
@@ -5146,7 +5137,7 @@
                         </wps:bodyPr>
                       </wps:wsp>
                       <wps:wsp>
-                        <wps:cNvPr id="5054" name="Rectangle 5054"/>
+                        <wps:cNvPr id="5005" name="Rectangle 5005"/>
                         <wps:cNvSpPr/>
                         <wps:spPr>
                           <a:xfrm>
@@ -5183,7 +5174,7 @@
                         </wps:bodyPr>
                       </wps:wsp>
                       <wps:wsp>
-                        <wps:cNvPr id="5058" name="Rectangle 5058"/>
+                        <wps:cNvPr id="5007" name="Rectangle 5007"/>
                         <wps:cNvSpPr/>
                         <wps:spPr>
                           <a:xfrm>
@@ -5227,15 +5218,15 @@
           </mc:Choice>
           <mc:Fallback xmlns:a="http://schemas.openxmlformats.org/drawingml/2006/main">
             <w:pict>
-              <v:group id="Group 31080" style="width:106.887pt;height:100.025pt;mso-position-horizontal-relative:char;mso-position-vertical-relative:line" coordsize="13574,12703">
-                <v:shape id="Picture 35846" style="position:absolute;width:9357;height:10942;left:4204;top:-20;" filled="f">
+              <v:group id="Group 31188" style="width:106.887pt;height:100.025pt;mso-position-horizontal-relative:char;mso-position-vertical-relative:line" coordsize="13574,12703">
+                <v:shape id="Picture 35801" style="position:absolute;width:9357;height:10942;left:4204;top:-20;" filled="f">
                   <v:imagedata r:id="rId11"/>
                 </v:shape>
-                <v:shape id="Shape 36484" style="position:absolute;width:1525;height:533;left:0;top:11921;" coordsize="152509,53378" path="m0,0l152509,0l152509,53378l0,53378l0,0">
+                <v:shape id="Shape 36437" style="position:absolute;width:1525;height:533;left:0;top:11921;" coordsize="152509,53378" path="m0,0l152509,0l152509,53378l0,53378l0,0">
                   <v:stroke weight="0.79004pt" endcap="flat" joinstyle="miter" miterlimit="10" on="true" color="#d64541"/>
                   <v:fill on="true" color="#d64541"/>
                 </v:shape>
-                <v:rect id="Rectangle 5046" style="position:absolute;width:225;height:1384;left:4084;top:11662;" filled="f" stroked="f">
+                <v:rect id="Rectangle 4999" style="position:absolute;width:225;height:1384;left:4084;top:11662;" filled="f" stroked="f">
                   <v:textbox inset="0,0,0,0">
                     <w:txbxContent>
                       <w:p>
@@ -5255,7 +5246,7 @@
                     </w:txbxContent>
                   </v:textbox>
                 </v:rect>
-                <v:rect id="Rectangle 5049" style="position:absolute;width:563;height:1384;left:5694;top:11662;" filled="f" stroked="f">
+                <v:rect id="Rectangle 5001" style="position:absolute;width:563;height:1384;left:5694;top:11662;" filled="f" stroked="f">
                   <v:textbox inset="0,0,0,0">
                     <w:txbxContent>
                       <w:p>
@@ -5275,7 +5266,7 @@
                     </w:txbxContent>
                   </v:textbox>
                 </v:rect>
-                <v:rect id="Rectangle 30033" style="position:absolute;width:281;height:1384;left:6796;top:11662;" filled="f" stroked="f">
+                <v:rect id="Rectangle 30166" style="position:absolute;width:281;height:1384;left:6796;top:11662;" filled="f" stroked="f">
                   <v:textbox inset="0,0,0,0">
                     <w:txbxContent>
                       <w:p>
@@ -5295,7 +5286,7 @@
                     </w:txbxContent>
                   </v:textbox>
                 </v:rect>
-                <v:rect id="Rectangle 30034" style="position:absolute;width:1521;height:1384;left:7220;top:11662;" filled="f" stroked="f">
+                <v:rect id="Rectangle 30167" style="position:absolute;width:1521;height:1384;left:7220;top:11662;" filled="f" stroked="f">
                   <v:textbox inset="0,0,0,0">
                     <w:txbxContent>
                       <w:p>
@@ -5315,7 +5306,7 @@
                     </w:txbxContent>
                   </v:textbox>
                 </v:rect>
-                <v:rect id="Rectangle 5054" style="position:absolute;width:225;height:1384;left:9847;top:11662;" filled="f" stroked="f">
+                <v:rect id="Rectangle 5005" style="position:absolute;width:225;height:1384;left:9847;top:11662;" filled="f" stroked="f">
                   <v:textbox inset="0,0,0,0">
                     <w:txbxContent>
                       <w:p>
@@ -5335,7 +5326,7 @@
                     </w:txbxContent>
                   </v:textbox>
                 </v:rect>
-                <v:rect id="Rectangle 5058" style="position:absolute;width:1352;height:1384;left:12220;top:11662;" filled="f" stroked="f">
+                <v:rect id="Rectangle 5007" style="position:absolute;width:1352;height:1384;left:12220;top:11662;" filled="f" stroked="f">
                   <v:textbox inset="0,0,0,0">
                     <w:txbxContent>
                       <w:p>
@@ -5377,10 +5368,10 @@
         <mc:AlternateContent>
           <mc:Choice Requires="wpg">
             <w:drawing>
-              <wp:inline distT="0" distB="0" distL="0" distR="0" wp14:anchorId="7DED136B" wp14:editId="0B0EF180">
+              <wp:inline distT="0" distB="0" distL="0" distR="0" wp14:anchorId="6F41F79A" wp14:editId="50C4C329">
                 <wp:extent cx="935000" cy="1270317"/>
                 <wp:effectExtent l="0" t="0" r="0" b="0"/>
-                <wp:docPr id="31081" name="Group 31081"/>
+                <wp:docPr id="31189" name="Group 31189"/>
                 <wp:cNvGraphicFramePr/>
                 <a:graphic xmlns:a="http://schemas.openxmlformats.org/drawingml/2006/main">
                   <a:graphicData uri="http://schemas.microsoft.com/office/word/2010/wordprocessingGroup">
@@ -5396,7 +5387,7 @@
                       </wpg:grpSpPr>
                       <pic:pic xmlns:pic="http://schemas.openxmlformats.org/drawingml/2006/picture">
                         <pic:nvPicPr>
-                          <pic:cNvPr id="35847" name="Picture 35847"/>
+                          <pic:cNvPr id="35802" name="Picture 35802"/>
                           <pic:cNvPicPr/>
                         </pic:nvPicPr>
                         <pic:blipFill>
@@ -5416,7 +5407,7 @@
                         </pic:spPr>
                       </pic:pic>
                       <wps:wsp>
-                        <wps:cNvPr id="5062" name="Rectangle 5062"/>
+                        <wps:cNvPr id="5009" name="Rectangle 5009"/>
                         <wps:cNvSpPr/>
                         <wps:spPr>
                           <a:xfrm>
@@ -5453,7 +5444,7 @@
                         </wps:bodyPr>
                       </wps:wsp>
                       <wps:wsp>
-                        <wps:cNvPr id="36485" name="Shape 36485"/>
+                        <wps:cNvPr id="36438" name="Shape 36438"/>
                         <wps:cNvSpPr/>
                         <wps:spPr>
                           <a:xfrm>
@@ -5505,7 +5496,7 @@
                         <wps:bodyPr/>
                       </wps:wsp>
                       <wps:wsp>
-                        <wps:cNvPr id="5069" name="Rectangle 5069"/>
+                        <wps:cNvPr id="5010" name="Rectangle 5010"/>
                         <wps:cNvSpPr/>
                         <wps:spPr>
                           <a:xfrm>
@@ -5542,7 +5533,7 @@
                         </wps:bodyPr>
                       </wps:wsp>
                       <wps:wsp>
-                        <wps:cNvPr id="5070" name="Rectangle 5070"/>
+                        <wps:cNvPr id="5011" name="Rectangle 5011"/>
                         <wps:cNvSpPr/>
                         <wps:spPr>
                           <a:xfrm>
@@ -5586,11 +5577,11 @@
           </mc:Choice>
           <mc:Fallback xmlns:a="http://schemas.openxmlformats.org/drawingml/2006/main">
             <w:pict>
-              <v:group id="Group 31081" style="width:73.622pt;height:100.025pt;mso-position-horizontal-relative:char;mso-position-vertical-relative:line" coordsize="9350,12703">
-                <v:shape id="Picture 35847" style="position:absolute;width:9387;height:10942;left:-34;top:-20;" filled="f">
+              <v:group id="Group 31189" style="width:73.622pt;height:100.025pt;mso-position-horizontal-relative:char;mso-position-vertical-relative:line" coordsize="9350,12703">
+                <v:shape id="Picture 35802" style="position:absolute;width:9387;height:10942;left:-34;top:-20;" filled="f">
                   <v:imagedata r:id="rId13"/>
                 </v:shape>
-                <v:rect id="Rectangle 5062" style="position:absolute;width:225;height:1384;left:2121;top:11662;" filled="f" stroked="f">
+                <v:rect id="Rectangle 5009" style="position:absolute;width:225;height:1384;left:2121;top:11662;" filled="f" stroked="f">
                   <v:textbox inset="0,0,0,0">
                     <w:txbxContent>
                       <w:p>
@@ -5610,11 +5601,11 @@
                     </w:txbxContent>
                   </v:textbox>
                 </v:rect>
-                <v:shape id="Shape 36486" style="position:absolute;width:1525;height:533;left:4298;top:11921;" coordsize="152509,53378" path="m0,0l152509,0l152509,53378l0,53378l0,0">
+                <v:shape id="Shape 36439" style="position:absolute;width:1525;height:533;left:4298;top:11921;" coordsize="152509,53378" path="m0,0l152509,0l152509,53378l0,53378l0,0">
                   <v:stroke weight="0.79004pt" endcap="flat" joinstyle="miter" miterlimit="10" on="true" color="#e8b044"/>
                   <v:fill on="true" color="#e8b044"/>
                 </v:shape>
-                <v:rect id="Rectangle 5069" style="position:absolute;width:563;height:1384;left:6645;top:11662;" filled="f" stroked="f">
+                <v:rect id="Rectangle 5010" style="position:absolute;width:563;height:1384;left:6645;top:11662;" filled="f" stroked="f">
                   <v:textbox inset="0,0,0,0">
                     <w:txbxContent>
                       <w:p>
@@ -5634,7 +5625,7 @@
                     </w:txbxContent>
                   </v:textbox>
                 </v:rect>
-                <v:rect id="Rectangle 5070" style="position:absolute;width:225;height:1384;left:7959;top:11662;" filled="f" stroked="f">
+                <v:rect id="Rectangle 5011" style="position:absolute;width:225;height:1384;left:7959;top:11662;" filled="f" stroked="f">
                   <v:textbox inset="0,0,0,0">
                     <w:txbxContent>
                       <w:p>
@@ -5675,10 +5666,10 @@
         <mc:AlternateContent>
           <mc:Choice Requires="wpg">
             <w:drawing>
-              <wp:inline distT="0" distB="0" distL="0" distR="0" wp14:anchorId="57537844" wp14:editId="3839AE75">
+              <wp:inline distT="0" distB="0" distL="0" distR="0" wp14:anchorId="277FCB3F" wp14:editId="6CA4F112">
                 <wp:extent cx="2247082" cy="1270317"/>
                 <wp:effectExtent l="0" t="0" r="0" b="0"/>
-                <wp:docPr id="31082" name="Group 31082"/>
+                <wp:docPr id="31190" name="Group 31190"/>
                 <wp:cNvGraphicFramePr/>
                 <a:graphic xmlns:a="http://schemas.openxmlformats.org/drawingml/2006/main">
                   <a:graphicData uri="http://schemas.microsoft.com/office/word/2010/wordprocessingGroup">
@@ -5694,7 +5685,7 @@
                       </wpg:grpSpPr>
                       <pic:pic xmlns:pic="http://schemas.openxmlformats.org/drawingml/2006/picture">
                         <pic:nvPicPr>
-                          <pic:cNvPr id="35848" name="Picture 35848"/>
+                          <pic:cNvPr id="35803" name="Picture 35803"/>
                           <pic:cNvPicPr/>
                         </pic:nvPicPr>
                         <pic:blipFill>
@@ -5715,7 +5706,7 @@
                       </pic:pic>
                       <pic:pic xmlns:pic="http://schemas.openxmlformats.org/drawingml/2006/picture">
                         <pic:nvPicPr>
-                          <pic:cNvPr id="35849" name="Picture 35849"/>
+                          <pic:cNvPr id="35804" name="Picture 35804"/>
                           <pic:cNvPicPr/>
                         </pic:nvPicPr>
                         <pic:blipFill>
@@ -5735,7 +5726,7 @@
                         </pic:spPr>
                       </pic:pic>
                       <wps:wsp>
-                        <wps:cNvPr id="5072" name="Rectangle 5072"/>
+                        <wps:cNvPr id="5012" name="Rectangle 5012"/>
                         <wps:cNvSpPr/>
                         <wps:spPr>
                           <a:xfrm>
@@ -5772,7 +5763,7 @@
                         </wps:bodyPr>
                       </wps:wsp>
                       <wps:wsp>
-                        <wps:cNvPr id="5076" name="Rectangle 5076"/>
+                        <wps:cNvPr id="5013" name="Rectangle 5013"/>
                         <wps:cNvSpPr/>
                         <wps:spPr>
                           <a:xfrm>
@@ -5809,7 +5800,7 @@
                         </wps:bodyPr>
                       </wps:wsp>
                       <wps:wsp>
-                        <wps:cNvPr id="36487" name="Shape 36487"/>
+                        <wps:cNvPr id="36440" name="Shape 36440"/>
                         <wps:cNvSpPr/>
                         <wps:spPr>
                           <a:xfrm>
@@ -5861,7 +5852,7 @@
                         <wps:bodyPr/>
                       </wps:wsp>
                       <wps:wsp>
-                        <wps:cNvPr id="5079" name="Rectangle 5079"/>
+                        <wps:cNvPr id="5014" name="Rectangle 5014"/>
                         <wps:cNvSpPr/>
                         <wps:spPr>
                           <a:xfrm>
@@ -5898,7 +5889,7 @@
                         </wps:bodyPr>
                       </wps:wsp>
                       <wps:wsp>
-                        <wps:cNvPr id="5081" name="Rectangle 5081"/>
+                        <wps:cNvPr id="5015" name="Rectangle 5015"/>
                         <wps:cNvSpPr/>
                         <wps:spPr>
                           <a:xfrm>
@@ -5935,7 +5926,7 @@
                         </wps:bodyPr>
                       </wps:wsp>
                       <wps:wsp>
-                        <wps:cNvPr id="5082" name="Rectangle 5082"/>
+                        <wps:cNvPr id="5016" name="Rectangle 5016"/>
                         <wps:cNvSpPr/>
                         <wps:spPr>
                           <a:xfrm>
@@ -5972,7 +5963,7 @@
                         </wps:bodyPr>
                       </wps:wsp>
                       <wps:wsp>
-                        <wps:cNvPr id="5089" name="Rectangle 5089"/>
+                        <wps:cNvPr id="5018" name="Rectangle 5018"/>
                         <wps:cNvSpPr/>
                         <wps:spPr>
                           <a:xfrm>
@@ -6016,14 +6007,14 @@
           </mc:Choice>
           <mc:Fallback xmlns:a="http://schemas.openxmlformats.org/drawingml/2006/main">
             <w:pict>
-              <v:group id="Group 31082" style="width:176.936pt;height:100.025pt;mso-position-horizontal-relative:char;mso-position-vertical-relative:line" coordsize="22470,12703">
-                <v:shape id="Picture 35848" style="position:absolute;width:9387;height:10942;left:-38;top:-20;" filled="f">
+              <v:group id="Group 31190" style="width:176.936pt;height:100.025pt;mso-position-horizontal-relative:char;mso-position-vertical-relative:line" coordsize="22470,12703">
+                <v:shape id="Picture 35803" style="position:absolute;width:9387;height:10942;left:-38;top:-20;" filled="f">
                   <v:imagedata r:id="rId16"/>
                 </v:shape>
-                <v:shape id="Picture 35849" style="position:absolute;width:9387;height:10942;left:13078;top:-20;" filled="f">
+                <v:shape id="Picture 35804" style="position:absolute;width:9387;height:10942;left:13078;top:-20;" filled="f">
                   <v:imagedata r:id="rId17"/>
                 </v:shape>
-                <v:rect id="Rectangle 5072" style="position:absolute;width:732;height:1384;left:4629;top:11662;" filled="f" stroked="f">
+                <v:rect id="Rectangle 5012" style="position:absolute;width:732;height:1384;left:4629;top:11662;" filled="f" stroked="f">
                   <v:textbox inset="0,0,0,0">
                     <w:txbxContent>
                       <w:p>
@@ -6043,7 +6034,7 @@
                     </w:txbxContent>
                   </v:textbox>
                 </v:rect>
-                <v:rect id="Rectangle 5076" style="position:absolute;width:563;height:1384;left:6875;top:11662;" filled="f" stroked="f">
+                <v:rect id="Rectangle 5013" style="position:absolute;width:563;height:1384;left:6875;top:11662;" filled="f" stroked="f">
                   <v:textbox inset="0,0,0,0">
                     <w:txbxContent>
                       <w:p>
@@ -6063,11 +6054,11 @@
                     </w:txbxContent>
                   </v:textbox>
                 </v:rect>
-                <v:shape id="Shape 36488" style="position:absolute;width:1525;height:533;left:9931;top:11921;" coordsize="152509,53378" path="m0,0l152509,0l152509,53378l0,53378l0,0">
+                <v:shape id="Shape 36441" style="position:absolute;width:1525;height:533;left:9931;top:11921;" coordsize="152509,53378" path="m0,0l152509,0l152509,53378l0,53378l0,0">
                   <v:stroke weight="0.79004pt" endcap="flat" joinstyle="miter" miterlimit="10" on="true" color="#306ebe"/>
                   <v:fill on="true" color="#306ebe"/>
                 </v:shape>
-                <v:rect id="Rectangle 5079" style="position:absolute;width:225;height:1384;left:14144;top:11662;" filled="f" stroked="f">
+                <v:rect id="Rectangle 5014" style="position:absolute;width:225;height:1384;left:14144;top:11662;" filled="f" stroked="f">
                   <v:textbox inset="0,0,0,0">
                     <w:txbxContent>
                       <w:p>
@@ -6087,7 +6078,7 @@
                     </w:txbxContent>
                   </v:textbox>
                 </v:rect>
-                <v:rect id="Rectangle 5081" style="position:absolute;width:563;height:1384;left:15754;top:11662;" filled="f" stroked="f">
+                <v:rect id="Rectangle 5015" style="position:absolute;width:563;height:1384;left:15754;top:11662;" filled="f" stroked="f">
                   <v:textbox inset="0,0,0,0">
                     <w:txbxContent>
                       <w:p>
@@ -6107,7 +6098,7 @@
                     </w:txbxContent>
                   </v:textbox>
                 </v:rect>
-                <v:rect id="Rectangle 5082" style="position:absolute;width:281;height:1384;left:16856;top:11662;" filled="f" stroked="f">
+                <v:rect id="Rectangle 5016" style="position:absolute;width:281;height:1384;left:16856;top:11662;" filled="f" stroked="f">
                   <v:textbox inset="0,0,0,0">
                     <w:txbxContent>
                       <w:p>
@@ -6127,7 +6118,7 @@
                     </w:txbxContent>
                   </v:textbox>
                 </v:rect>
-                <v:rect id="Rectangle 5089" style="position:absolute;width:281;height:1384;left:18213;top:11662;" filled="f" stroked="f">
+                <v:rect id="Rectangle 5018" style="position:absolute;width:281;height:1384;left:18213;top:11662;" filled="f" stroked="f">
                   <v:textbox inset="0,0,0,0">
                     <w:txbxContent>
                       <w:p>
@@ -6238,10 +6229,10 @@
         <mc:AlternateContent>
           <mc:Choice Requires="wpg">
             <w:drawing>
-              <wp:inline distT="0" distB="0" distL="0" distR="0" wp14:anchorId="17E68B9C" wp14:editId="02868FA1">
+              <wp:inline distT="0" distB="0" distL="0" distR="0" wp14:anchorId="0EC140CB" wp14:editId="26DF6BF6">
                 <wp:extent cx="46876" cy="5055"/>
                 <wp:effectExtent l="0" t="0" r="0" b="0"/>
-                <wp:docPr id="31083" name="Group 31083"/>
+                <wp:docPr id="31191" name="Group 31191"/>
                 <wp:cNvGraphicFramePr/>
                 <a:graphic xmlns:a="http://schemas.openxmlformats.org/drawingml/2006/main">
                   <a:graphicData uri="http://schemas.microsoft.com/office/word/2010/wordprocessingGroup">
@@ -6256,7 +6247,7 @@
                         </a:xfrm>
                       </wpg:grpSpPr>
                       <wps:wsp>
-                        <wps:cNvPr id="756" name="Shape 756"/>
+                        <wps:cNvPr id="755" name="Shape 755"/>
                         <wps:cNvSpPr/>
                         <wps:spPr>
                           <a:xfrm>
@@ -6308,8 +6299,8 @@
           </mc:Choice>
           <mc:Fallback xmlns:a="http://schemas.openxmlformats.org/drawingml/2006/main">
             <w:pict>
-              <v:group id="Group 31083" style="width:3.69101pt;height:0.398pt;mso-position-horizontal-relative:char;mso-position-vertical-relative:line" coordsize="468,50">
-                <v:shape id="Shape 756" style="position:absolute;width:468;height:0;left:0;top:0;" coordsize="46876,0" path="m0,0l46876,0">
+              <v:group id="Group 31191" style="width:3.69101pt;height:0.398pt;mso-position-horizontal-relative:char;mso-position-vertical-relative:line" coordsize="468,50">
+                <v:shape id="Shape 755" style="position:absolute;width:468;height:0;left:0;top:0;" coordsize="46876,0" path="m0,0l46876,0">
                   <v:stroke weight="0.398pt" endcap="flat" joinstyle="miter" miterlimit="10" on="true" color="#000000"/>
                   <v:fill on="false" color="#000000" opacity="0"/>
                 </v:shape>
@@ -6333,10 +6324,10 @@
         <mc:AlternateContent>
           <mc:Choice Requires="wpg">
             <w:drawing>
-              <wp:inline distT="0" distB="0" distL="0" distR="0" wp14:anchorId="7F40D08D" wp14:editId="748DB2D9">
+              <wp:inline distT="0" distB="0" distL="0" distR="0" wp14:anchorId="643D8964" wp14:editId="27CCB70B">
                 <wp:extent cx="46875" cy="5055"/>
                 <wp:effectExtent l="0" t="0" r="0" b="0"/>
-                <wp:docPr id="31084" name="Group 31084"/>
+                <wp:docPr id="31192" name="Group 31192"/>
                 <wp:cNvGraphicFramePr/>
                 <a:graphic xmlns:a="http://schemas.openxmlformats.org/drawingml/2006/main">
                   <a:graphicData uri="http://schemas.microsoft.com/office/word/2010/wordprocessingGroup">
@@ -6351,7 +6342,7 @@
                         </a:xfrm>
                       </wpg:grpSpPr>
                       <wps:wsp>
-                        <wps:cNvPr id="758" name="Shape 758"/>
+                        <wps:cNvPr id="757" name="Shape 757"/>
                         <wps:cNvSpPr/>
                         <wps:spPr>
                           <a:xfrm>
@@ -6403,8 +6394,8 @@
           </mc:Choice>
           <mc:Fallback xmlns:a="http://schemas.openxmlformats.org/drawingml/2006/main">
             <w:pict>
-              <v:group id="Group 31084" style="width:3.69098pt;height:0.398pt;mso-position-horizontal-relative:char;mso-position-vertical-relative:line" coordsize="468,50">
-                <v:shape id="Shape 758" style="position:absolute;width:468;height:0;left:0;top:0;" coordsize="46875,0" path="m0,0l46875,0">
+              <v:group id="Group 31192" style="width:3.69098pt;height:0.398pt;mso-position-horizontal-relative:char;mso-position-vertical-relative:line" coordsize="468,50">
+                <v:shape id="Shape 757" style="position:absolute;width:468;height:0;left:0;top:0;" coordsize="46875,0" path="m0,0l46875,0">
                   <v:stroke weight="0.398pt" endcap="flat" joinstyle="miter" miterlimit="10" on="true" color="#000000"/>
                   <v:fill on="false" color="#000000" opacity="0"/>
                 </v:shape>
@@ -6651,10 +6642,10 @@
         <mc:AlternateContent>
           <mc:Choice Requires="wpg">
             <w:drawing>
-              <wp:inline distT="0" distB="0" distL="0" distR="0" wp14:anchorId="7B1328E3" wp14:editId="2914889F">
+              <wp:inline distT="0" distB="0" distL="0" distR="0" wp14:anchorId="7396E22E" wp14:editId="7E6FFFF5">
                 <wp:extent cx="46876" cy="5055"/>
                 <wp:effectExtent l="0" t="0" r="0" b="0"/>
-                <wp:docPr id="30097" name="Group 30097"/>
+                <wp:docPr id="30164" name="Group 30164"/>
                 <wp:cNvGraphicFramePr/>
                 <a:graphic xmlns:a="http://schemas.openxmlformats.org/drawingml/2006/main">
                   <a:graphicData uri="http://schemas.microsoft.com/office/word/2010/wordprocessingGroup">
@@ -6669,7 +6660,7 @@
                         </a:xfrm>
                       </wpg:grpSpPr>
                       <wps:wsp>
-                        <wps:cNvPr id="840" name="Shape 840"/>
+                        <wps:cNvPr id="839" name="Shape 839"/>
                         <wps:cNvSpPr/>
                         <wps:spPr>
                           <a:xfrm>
@@ -6721,8 +6712,8 @@
           </mc:Choice>
           <mc:Fallback xmlns:a="http://schemas.openxmlformats.org/drawingml/2006/main">
             <w:pict>
-              <v:group id="Group 30097" style="width:3.69099pt;height:0.398pt;mso-position-horizontal-relative:char;mso-position-vertical-relative:line" coordsize="468,50">
-                <v:shape id="Shape 840" style="position:absolute;width:468;height:0;left:0;top:0;" coordsize="46876,0" path="m0,0l46876,0">
+              <v:group id="Group 30164" style="width:3.69099pt;height:0.398pt;mso-position-horizontal-relative:char;mso-position-vertical-relative:line" coordsize="468,50">
+                <v:shape id="Shape 839" style="position:absolute;width:468;height:0;left:0;top:0;" coordsize="46876,0" path="m0,0l46876,0">
                   <v:stroke weight="0.398pt" endcap="flat" joinstyle="miter" miterlimit="10" on="true" color="#000000"/>
                   <v:fill on="false" color="#000000" opacity="0"/>
                 </v:shape>
@@ -7176,16 +7167,16 @@
                 <w:noProof/>
               </w:rPr>
               <w:drawing>
-                <wp:inline distT="0" distB="0" distL="0" distR="0" wp14:anchorId="13CA14DB" wp14:editId="4A8EC7E9">
+                <wp:inline distT="0" distB="0" distL="0" distR="0" wp14:anchorId="29BB66F2" wp14:editId="15691F05">
                   <wp:extent cx="48768" cy="320040"/>
                   <wp:effectExtent l="0" t="0" r="0" b="0"/>
-                  <wp:docPr id="35850" name="Picture 35850"/>
+                  <wp:docPr id="35805" name="Picture 35805"/>
                   <wp:cNvGraphicFramePr/>
                   <a:graphic xmlns:a="http://schemas.openxmlformats.org/drawingml/2006/main">
                     <a:graphicData uri="http://schemas.openxmlformats.org/drawingml/2006/picture">
                       <pic:pic xmlns:pic="http://schemas.openxmlformats.org/drawingml/2006/picture">
                         <pic:nvPicPr>
-                          <pic:cNvPr id="35850" name="Picture 35850"/>
+                          <pic:cNvPr id="35805" name="Picture 35805"/>
                           <pic:cNvPicPr/>
                         </pic:nvPicPr>
                         <pic:blipFill>
@@ -7596,16 +7587,16 @@
           <w:noProof/>
         </w:rPr>
         <w:drawing>
-          <wp:inline distT="0" distB="0" distL="0" distR="0" wp14:anchorId="629811E1" wp14:editId="7EF2D594">
+          <wp:inline distT="0" distB="0" distL="0" distR="0" wp14:anchorId="7CD7B2C4" wp14:editId="79F212FE">
             <wp:extent cx="5751576" cy="954024"/>
             <wp:effectExtent l="0" t="0" r="0" b="0"/>
-            <wp:docPr id="35851" name="Picture 35851"/>
+            <wp:docPr id="35806" name="Picture 35806"/>
             <wp:cNvGraphicFramePr/>
             <a:graphic xmlns:a="http://schemas.openxmlformats.org/drawingml/2006/main">
               <a:graphicData uri="http://schemas.openxmlformats.org/drawingml/2006/picture">
                 <pic:pic xmlns:pic="http://schemas.openxmlformats.org/drawingml/2006/picture">
                   <pic:nvPicPr>
-                    <pic:cNvPr id="35851" name="Picture 35851"/>
+                    <pic:cNvPr id="35806" name="Picture 35806"/>
                     <pic:cNvPicPr/>
                   </pic:nvPicPr>
                   <pic:blipFill>
@@ -9037,16 +9028,16 @@
           <w:noProof/>
         </w:rPr>
         <w:drawing>
-          <wp:inline distT="0" distB="0" distL="0" distR="0" wp14:anchorId="44F87DBC" wp14:editId="0BFC6F97">
+          <wp:inline distT="0" distB="0" distL="0" distR="0" wp14:anchorId="56CF9BF9" wp14:editId="759F897A">
             <wp:extent cx="5535169" cy="1453896"/>
             <wp:effectExtent l="0" t="0" r="0" b="0"/>
-            <wp:docPr id="35853" name="Picture 35853"/>
+            <wp:docPr id="35808" name="Picture 35808"/>
             <wp:cNvGraphicFramePr/>
             <a:graphic xmlns:a="http://schemas.openxmlformats.org/drawingml/2006/main">
               <a:graphicData uri="http://schemas.openxmlformats.org/drawingml/2006/picture">
                 <pic:pic xmlns:pic="http://schemas.openxmlformats.org/drawingml/2006/picture">
                   <pic:nvPicPr>
-                    <pic:cNvPr id="35853" name="Picture 35853"/>
+                    <pic:cNvPr id="35808" name="Picture 35808"/>
                     <pic:cNvPicPr/>
                   </pic:nvPicPr>
                   <pic:blipFill>
@@ -9253,16 +9244,16 @@
           <w:noProof/>
         </w:rPr>
         <w:drawing>
-          <wp:inline distT="0" distB="0" distL="0" distR="0" wp14:anchorId="6E51A29C" wp14:editId="4CD821B3">
+          <wp:inline distT="0" distB="0" distL="0" distR="0" wp14:anchorId="046A0E5A" wp14:editId="73B53E13">
             <wp:extent cx="5812537" cy="1173480"/>
             <wp:effectExtent l="0" t="0" r="0" b="0"/>
-            <wp:docPr id="35855" name="Picture 35855"/>
+            <wp:docPr id="35810" name="Picture 35810"/>
             <wp:cNvGraphicFramePr/>
             <a:graphic xmlns:a="http://schemas.openxmlformats.org/drawingml/2006/main">
               <a:graphicData uri="http://schemas.openxmlformats.org/drawingml/2006/picture">
                 <pic:pic xmlns:pic="http://schemas.openxmlformats.org/drawingml/2006/picture">
                   <pic:nvPicPr>
-                    <pic:cNvPr id="35855" name="Picture 35855"/>
+                    <pic:cNvPr id="35810" name="Picture 35810"/>
                     <pic:cNvPicPr/>
                   </pic:nvPicPr>
                   <pic:blipFill>
@@ -9377,10 +9368,10 @@
         <w:t>I</w:t>
       </w:r>
       <w:r>
-        <w:t xml:space="preserve">), so this release is the closest available stand-in for the view a lumbar case is planned on. It holds the T12-to-S1 span with the lowest ribs and the pelvis, 377 of its 802 records were acquired prone, the position of posterior lumbar surgery, and it carries classes for the anomalies that make level identification fail. It is a screening population at colonography dose with standard soft-tissue kernels, not a surgical series, and it supports method development for level identification and instrumentation </w:t>
-      </w:r>
-      <w:r>
-        <w:t>geometry, not validation of a planning decision.</w:t>
+        <w:t>), so this release is the closest available stand-in for the view a lumbar surgical case is planned on. It holds the T12-to-S1 span with the lowest ribs and the pelvis, 377 of its 802 records were acquired prone, the position of posterior lumbar surgery, and it carries classes for the anomalies that make level identification fail. It is a screening population at colonography dose with standard soft-tissue kernels, not a surgical series, and it supports method development for level identification and instrum</w:t>
+      </w:r>
+      <w:r>
+        <w:t>entation geometry, not validation of a planning decision.</w:t>
       </w:r>
     </w:p>
     <w:p>
@@ -9505,10 +9496,10 @@
         <mc:AlternateContent>
           <mc:Choice Requires="wpg">
             <w:drawing>
-              <wp:inline distT="0" distB="0" distL="0" distR="0" wp14:anchorId="1A91A094" wp14:editId="5FCA0B5B">
+              <wp:inline distT="0" distB="0" distL="0" distR="0" wp14:anchorId="0B1B65A1" wp14:editId="35167561">
                 <wp:extent cx="3832153" cy="871728"/>
                 <wp:effectExtent l="0" t="0" r="0" b="0"/>
-                <wp:docPr id="35901" name="Group 35901"/>
+                <wp:docPr id="35856" name="Group 35856"/>
                 <wp:cNvGraphicFramePr/>
                 <a:graphic xmlns:a="http://schemas.openxmlformats.org/drawingml/2006/main">
                   <a:graphicData uri="http://schemas.microsoft.com/office/word/2010/wordprocessingGroup">
@@ -9524,7 +9515,7 @@
                       </wpg:grpSpPr>
                       <pic:pic xmlns:pic="http://schemas.openxmlformats.org/drawingml/2006/picture">
                         <pic:nvPicPr>
-                          <pic:cNvPr id="35857" name="Picture 35857"/>
+                          <pic:cNvPr id="35812" name="Picture 35812"/>
                           <pic:cNvPicPr/>
                         </pic:nvPicPr>
                         <pic:blipFill>
@@ -9544,7 +9535,7 @@
                         </pic:spPr>
                       </pic:pic>
                       <wps:wsp>
-                        <wps:cNvPr id="3564" name="Shape 3564"/>
+                        <wps:cNvPr id="3563" name="Shape 3563"/>
                         <wps:cNvSpPr/>
                         <wps:spPr>
                           <a:xfrm>
@@ -9589,7 +9580,7 @@
                         <wps:bodyPr/>
                       </wps:wsp>
                       <wps:wsp>
-                        <wps:cNvPr id="3565" name="Shape 3565"/>
+                        <wps:cNvPr id="3564" name="Shape 3564"/>
                         <wps:cNvSpPr/>
                         <wps:spPr>
                           <a:xfrm>
@@ -9633,7 +9624,7 @@
                         <wps:bodyPr/>
                       </wps:wsp>
                       <wps:wsp>
-                        <wps:cNvPr id="3567" name="Shape 3567"/>
+                        <wps:cNvPr id="3566" name="Shape 3566"/>
                         <wps:cNvSpPr/>
                         <wps:spPr>
                           <a:xfrm>
@@ -9678,7 +9669,7 @@
                         <wps:bodyPr/>
                       </wps:wsp>
                       <wps:wsp>
-                        <wps:cNvPr id="3568" name="Shape 3568"/>
+                        <wps:cNvPr id="3567" name="Shape 3567"/>
                         <wps:cNvSpPr/>
                         <wps:spPr>
                           <a:xfrm>
@@ -9722,7 +9713,7 @@
                         <wps:bodyPr/>
                       </wps:wsp>
                       <wps:wsp>
-                        <wps:cNvPr id="3570" name="Shape 3570"/>
+                        <wps:cNvPr id="3569" name="Shape 3569"/>
                         <wps:cNvSpPr/>
                         <wps:spPr>
                           <a:xfrm>
@@ -9767,7 +9758,7 @@
                         <wps:bodyPr/>
                       </wps:wsp>
                       <wps:wsp>
-                        <wps:cNvPr id="3571" name="Shape 3571"/>
+                        <wps:cNvPr id="3570" name="Shape 3570"/>
                         <wps:cNvSpPr/>
                         <wps:spPr>
                           <a:xfrm>
@@ -9811,7 +9802,7 @@
                         <wps:bodyPr/>
                       </wps:wsp>
                       <wps:wsp>
-                        <wps:cNvPr id="3573" name="Shape 3573"/>
+                        <wps:cNvPr id="3572" name="Shape 3572"/>
                         <wps:cNvSpPr/>
                         <wps:spPr>
                           <a:xfrm>
@@ -9856,7 +9847,7 @@
                         <wps:bodyPr/>
                       </wps:wsp>
                       <wps:wsp>
-                        <wps:cNvPr id="3574" name="Shape 3574"/>
+                        <wps:cNvPr id="3573" name="Shape 3573"/>
                         <wps:cNvSpPr/>
                         <wps:spPr>
                           <a:xfrm>
@@ -9900,11 +9891,55 @@
                         <wps:bodyPr/>
                       </wps:wsp>
                       <wps:wsp>
+                        <wps:cNvPr id="3575" name="Shape 3575"/>
+                        <wps:cNvSpPr/>
+                        <wps:spPr>
+                          <a:xfrm>
+                            <a:off x="2431940" y="805721"/>
+                            <a:ext cx="0" cy="23452"/>
+                          </a:xfrm>
+                          <a:custGeom>
+                            <a:avLst/>
+                            <a:gdLst/>
+                            <a:ahLst/>
+                            <a:cxnLst/>
+                            <a:rect l="0" t="0" r="0" b="0"/>
+                            <a:pathLst>
+                              <a:path h="23452">
+                                <a:moveTo>
+                                  <a:pt x="0" y="23452"/>
+                                </a:moveTo>
+                                <a:lnTo>
+                                  <a:pt x="0" y="0"/>
+                                </a:lnTo>
+                                <a:close/>
+                              </a:path>
+                            </a:pathLst>
+                          </a:custGeom>
+                          <a:ln w="8208" cap="flat">
+                            <a:round/>
+                          </a:ln>
+                        </wps:spPr>
+                        <wps:style>
+                          <a:lnRef idx="1">
+                            <a:srgbClr val="000000"/>
+                          </a:lnRef>
+                          <a:fillRef idx="1">
+                            <a:srgbClr val="000000"/>
+                          </a:fillRef>
+                          <a:effectRef idx="0">
+                            <a:scrgbClr r="0" g="0" b="0"/>
+                          </a:effectRef>
+                          <a:fontRef idx="none"/>
+                        </wps:style>
+                        <wps:bodyPr/>
+                      </wps:wsp>
+                      <wps:wsp>
                         <wps:cNvPr id="3576" name="Shape 3576"/>
                         <wps:cNvSpPr/>
                         <wps:spPr>
                           <a:xfrm>
-                            <a:off x="2431940" y="805721"/>
+                            <a:off x="2513082" y="805721"/>
                             <a:ext cx="0" cy="23452"/>
                           </a:xfrm>
                           <a:custGeom>
@@ -9948,7 +9983,7 @@
                         <wps:cNvSpPr/>
                         <wps:spPr>
                           <a:xfrm>
-                            <a:off x="2513082" y="805721"/>
+                            <a:off x="2594224" y="805721"/>
                             <a:ext cx="0" cy="23452"/>
                           </a:xfrm>
                           <a:custGeom>
@@ -9992,7 +10027,7 @@
                         <wps:cNvSpPr/>
                         <wps:spPr>
                           <a:xfrm>
-                            <a:off x="2594224" y="805721"/>
+                            <a:off x="2675366" y="805721"/>
                             <a:ext cx="0" cy="23452"/>
                           </a:xfrm>
                           <a:custGeom>
@@ -10036,7 +10071,7 @@
                         <wps:cNvSpPr/>
                         <wps:spPr>
                           <a:xfrm>
-                            <a:off x="2675366" y="805721"/>
+                            <a:off x="2837649" y="805721"/>
                             <a:ext cx="0" cy="23452"/>
                           </a:xfrm>
                           <a:custGeom>
@@ -10080,7 +10115,7 @@
                         <wps:cNvSpPr/>
                         <wps:spPr>
                           <a:xfrm>
-                            <a:off x="2837649" y="805721"/>
+                            <a:off x="2918791" y="805721"/>
                             <a:ext cx="0" cy="23452"/>
                           </a:xfrm>
                           <a:custGeom>
@@ -10124,7 +10159,7 @@
                         <wps:cNvSpPr/>
                         <wps:spPr>
                           <a:xfrm>
-                            <a:off x="2918791" y="805721"/>
+                            <a:off x="2999933" y="805721"/>
                             <a:ext cx="0" cy="23452"/>
                           </a:xfrm>
                           <a:custGeom>
@@ -10168,7 +10203,7 @@
                         <wps:cNvSpPr/>
                         <wps:spPr>
                           <a:xfrm>
-                            <a:off x="2999933" y="805721"/>
+                            <a:off x="3081074" y="805721"/>
                             <a:ext cx="0" cy="23452"/>
                           </a:xfrm>
                           <a:custGeom>
@@ -10212,7 +10247,7 @@
                         <wps:cNvSpPr/>
                         <wps:spPr>
                           <a:xfrm>
-                            <a:off x="3081074" y="805721"/>
+                            <a:off x="3243358" y="805721"/>
                             <a:ext cx="0" cy="23452"/>
                           </a:xfrm>
                           <a:custGeom>
@@ -10256,7 +10291,7 @@
                         <wps:cNvSpPr/>
                         <wps:spPr>
                           <a:xfrm>
-                            <a:off x="3243358" y="805721"/>
+                            <a:off x="3324500" y="805721"/>
                             <a:ext cx="0" cy="23452"/>
                           </a:xfrm>
                           <a:custGeom>
@@ -10300,7 +10335,7 @@
                         <wps:cNvSpPr/>
                         <wps:spPr>
                           <a:xfrm>
-                            <a:off x="3324500" y="805721"/>
+                            <a:off x="3405642" y="805721"/>
                             <a:ext cx="0" cy="23452"/>
                           </a:xfrm>
                           <a:custGeom>
@@ -10344,7 +10379,7 @@
                         <wps:cNvSpPr/>
                         <wps:spPr>
                           <a:xfrm>
-                            <a:off x="3405642" y="805721"/>
+                            <a:off x="3486783" y="805721"/>
                             <a:ext cx="0" cy="23452"/>
                           </a:xfrm>
                           <a:custGeom>
@@ -10388,7 +10423,7 @@
                         <wps:cNvSpPr/>
                         <wps:spPr>
                           <a:xfrm>
-                            <a:off x="3486783" y="805721"/>
+                            <a:off x="3649067" y="805721"/>
                             <a:ext cx="0" cy="23452"/>
                           </a:xfrm>
                           <a:custGeom>
@@ -10432,7 +10467,7 @@
                         <wps:cNvSpPr/>
                         <wps:spPr>
                           <a:xfrm>
-                            <a:off x="3649067" y="805721"/>
+                            <a:off x="3730209" y="805721"/>
                             <a:ext cx="0" cy="23452"/>
                           </a:xfrm>
                           <a:custGeom>
@@ -10476,7 +10511,7 @@
                         <wps:cNvSpPr/>
                         <wps:spPr>
                           <a:xfrm>
-                            <a:off x="3730209" y="805721"/>
+                            <a:off x="3811350" y="805721"/>
                             <a:ext cx="0" cy="23452"/>
                           </a:xfrm>
                           <a:custGeom>
@@ -10516,51 +10551,7 @@
                         <wps:bodyPr/>
                       </wps:wsp>
                       <wps:wsp>
-                        <wps:cNvPr id="3590" name="Shape 3590"/>
-                        <wps:cNvSpPr/>
-                        <wps:spPr>
-                          <a:xfrm>
-                            <a:off x="3811350" y="805721"/>
-                            <a:ext cx="0" cy="23452"/>
-                          </a:xfrm>
-                          <a:custGeom>
-                            <a:avLst/>
-                            <a:gdLst/>
-                            <a:ahLst/>
-                            <a:cxnLst/>
-                            <a:rect l="0" t="0" r="0" b="0"/>
-                            <a:pathLst>
-                              <a:path h="23452">
-                                <a:moveTo>
-                                  <a:pt x="0" y="23452"/>
-                                </a:moveTo>
-                                <a:lnTo>
-                                  <a:pt x="0" y="0"/>
-                                </a:lnTo>
-                                <a:close/>
-                              </a:path>
-                            </a:pathLst>
-                          </a:custGeom>
-                          <a:ln w="8208" cap="flat">
-                            <a:round/>
-                          </a:ln>
-                        </wps:spPr>
-                        <wps:style>
-                          <a:lnRef idx="1">
-                            <a:srgbClr val="000000"/>
-                          </a:lnRef>
-                          <a:fillRef idx="1">
-                            <a:srgbClr val="000000"/>
-                          </a:fillRef>
-                          <a:effectRef idx="0">
-                            <a:scrgbClr r="0" g="0" b="0"/>
-                          </a:effectRef>
-                          <a:fontRef idx="none"/>
-                        </wps:style>
-                        <wps:bodyPr/>
-                      </wps:wsp>
-                      <wps:wsp>
-                        <wps:cNvPr id="3592" name="Shape 3592"/>
+                        <wps:cNvPr id="3591" name="Shape 3591"/>
                         <wps:cNvSpPr/>
                         <wps:spPr>
                           <a:xfrm>
@@ -10605,7 +10596,7 @@
                         <wps:bodyPr/>
                       </wps:wsp>
                       <wps:wsp>
-                        <wps:cNvPr id="3593" name="Shape 3593"/>
+                        <wps:cNvPr id="3592" name="Shape 3592"/>
                         <wps:cNvSpPr/>
                         <wps:spPr>
                           <a:xfrm>
@@ -10649,7 +10640,7 @@
                         <wps:bodyPr/>
                       </wps:wsp>
                       <wps:wsp>
-                        <wps:cNvPr id="3595" name="Shape 3595"/>
+                        <wps:cNvPr id="3594" name="Shape 3594"/>
                         <wps:cNvSpPr/>
                         <wps:spPr>
                           <a:xfrm>
@@ -10694,7 +10685,7 @@
                         <wps:bodyPr/>
                       </wps:wsp>
                       <wps:wsp>
-                        <wps:cNvPr id="3596" name="Shape 3596"/>
+                        <wps:cNvPr id="3595" name="Shape 3595"/>
                         <wps:cNvSpPr/>
                         <wps:spPr>
                           <a:xfrm>
@@ -10738,7 +10729,7 @@
                         <wps:bodyPr/>
                       </wps:wsp>
                       <wps:wsp>
-                        <wps:cNvPr id="3598" name="Shape 3598"/>
+                        <wps:cNvPr id="3597" name="Shape 3597"/>
                         <wps:cNvSpPr/>
                         <wps:spPr>
                           <a:xfrm>
@@ -10783,7 +10774,7 @@
                         <wps:bodyPr/>
                       </wps:wsp>
                       <wps:wsp>
-                        <wps:cNvPr id="3599" name="Shape 3599"/>
+                        <wps:cNvPr id="3598" name="Shape 3598"/>
                         <wps:cNvSpPr/>
                         <wps:spPr>
                           <a:xfrm>
@@ -10827,7 +10818,7 @@
                         <wps:bodyPr/>
                       </wps:wsp>
                       <wps:wsp>
-                        <wps:cNvPr id="3601" name="Shape 3601"/>
+                        <wps:cNvPr id="3600" name="Shape 3600"/>
                         <wps:cNvSpPr/>
                         <wps:spPr>
                           <a:xfrm>
@@ -10872,7 +10863,7 @@
                         <wps:bodyPr/>
                       </wps:wsp>
                       <wps:wsp>
-                        <wps:cNvPr id="3602" name="Shape 3602"/>
+                        <wps:cNvPr id="3601" name="Shape 3601"/>
                         <wps:cNvSpPr/>
                         <wps:spPr>
                           <a:xfrm>
@@ -10916,7 +10907,7 @@
                         <wps:bodyPr/>
                       </wps:wsp>
                       <wps:wsp>
-                        <wps:cNvPr id="3604" name="Shape 3604"/>
+                        <wps:cNvPr id="3603" name="Shape 3603"/>
                         <wps:cNvSpPr/>
                         <wps:spPr>
                           <a:xfrm>
@@ -10961,7 +10952,7 @@
                         <wps:bodyPr/>
                       </wps:wsp>
                       <wps:wsp>
-                        <wps:cNvPr id="3605" name="Shape 3605"/>
+                        <wps:cNvPr id="3604" name="Shape 3604"/>
                         <wps:cNvSpPr/>
                         <wps:spPr>
                           <a:xfrm>
@@ -11005,7 +10996,7 @@
                         <wps:bodyPr/>
                       </wps:wsp>
                       <wps:wsp>
-                        <wps:cNvPr id="3607" name="Shape 3607"/>
+                        <wps:cNvPr id="3606" name="Shape 3606"/>
                         <wps:cNvSpPr/>
                         <wps:spPr>
                           <a:xfrm>
@@ -11050,7 +11041,7 @@
                         <wps:bodyPr/>
                       </wps:wsp>
                       <wps:wsp>
-                        <wps:cNvPr id="3608" name="Shape 3608"/>
+                        <wps:cNvPr id="3607" name="Shape 3607"/>
                         <wps:cNvSpPr/>
                         <wps:spPr>
                           <a:xfrm>
@@ -11094,7 +11085,7 @@
                         <wps:bodyPr/>
                       </wps:wsp>
                       <wps:wsp>
-                        <wps:cNvPr id="3610" name="Shape 3610"/>
+                        <wps:cNvPr id="3609" name="Shape 3609"/>
                         <wps:cNvSpPr/>
                         <wps:spPr>
                           <a:xfrm>
@@ -11139,7 +11130,7 @@
                         <wps:bodyPr/>
                       </wps:wsp>
                       <wps:wsp>
-                        <wps:cNvPr id="3611" name="Shape 3611"/>
+                        <wps:cNvPr id="3610" name="Shape 3610"/>
                         <wps:cNvSpPr/>
                         <wps:spPr>
                           <a:xfrm>
@@ -11183,11 +11174,55 @@
                         <wps:bodyPr/>
                       </wps:wsp>
                       <wps:wsp>
+                        <wps:cNvPr id="3612" name="Shape 3612"/>
+                        <wps:cNvSpPr/>
+                        <wps:spPr>
+                          <a:xfrm>
+                            <a:off x="2303422" y="829173"/>
+                            <a:ext cx="23451" cy="0"/>
+                          </a:xfrm>
+                          <a:custGeom>
+                            <a:avLst/>
+                            <a:gdLst/>
+                            <a:ahLst/>
+                            <a:cxnLst/>
+                            <a:rect l="0" t="0" r="0" b="0"/>
+                            <a:pathLst>
+                              <a:path w="23451">
+                                <a:moveTo>
+                                  <a:pt x="23451" y="0"/>
+                                </a:moveTo>
+                                <a:lnTo>
+                                  <a:pt x="0" y="0"/>
+                                </a:lnTo>
+                                <a:close/>
+                              </a:path>
+                            </a:pathLst>
+                          </a:custGeom>
+                          <a:ln w="8208" cap="flat">
+                            <a:round/>
+                          </a:ln>
+                        </wps:spPr>
+                        <wps:style>
+                          <a:lnRef idx="1">
+                            <a:srgbClr val="000000"/>
+                          </a:lnRef>
+                          <a:fillRef idx="1">
+                            <a:srgbClr val="000000"/>
+                          </a:fillRef>
+                          <a:effectRef idx="0">
+                            <a:scrgbClr r="0" g="0" b="0"/>
+                          </a:effectRef>
+                          <a:fontRef idx="none"/>
+                        </wps:style>
+                        <wps:bodyPr/>
+                      </wps:wsp>
+                      <wps:wsp>
                         <wps:cNvPr id="3613" name="Shape 3613"/>
                         <wps:cNvSpPr/>
                         <wps:spPr>
                           <a:xfrm>
-                            <a:off x="2303422" y="829173"/>
+                            <a:off x="2303422" y="806454"/>
                             <a:ext cx="23451" cy="0"/>
                           </a:xfrm>
                           <a:custGeom>
@@ -11231,7 +11266,7 @@
                         <wps:cNvSpPr/>
                         <wps:spPr>
                           <a:xfrm>
-                            <a:off x="2303422" y="806454"/>
+                            <a:off x="2303422" y="783735"/>
                             <a:ext cx="23451" cy="0"/>
                           </a:xfrm>
                           <a:custGeom>
@@ -11275,7 +11310,7 @@
                         <wps:cNvSpPr/>
                         <wps:spPr>
                           <a:xfrm>
-                            <a:off x="2303422" y="783735"/>
+                            <a:off x="2303422" y="738296"/>
                             <a:ext cx="23451" cy="0"/>
                           </a:xfrm>
                           <a:custGeom>
@@ -11319,7 +11354,7 @@
                         <wps:cNvSpPr/>
                         <wps:spPr>
                           <a:xfrm>
-                            <a:off x="2303422" y="738296"/>
+                            <a:off x="2303422" y="715577"/>
                             <a:ext cx="23451" cy="0"/>
                           </a:xfrm>
                           <a:custGeom>
@@ -11363,7 +11398,7 @@
                         <wps:cNvSpPr/>
                         <wps:spPr>
                           <a:xfrm>
-                            <a:off x="2303422" y="715577"/>
+                            <a:off x="2303422" y="692858"/>
                             <a:ext cx="23451" cy="0"/>
                           </a:xfrm>
                           <a:custGeom>
@@ -11407,7 +11442,7 @@
                         <wps:cNvSpPr/>
                         <wps:spPr>
                           <a:xfrm>
-                            <a:off x="2303422" y="692858"/>
+                            <a:off x="2303422" y="670139"/>
                             <a:ext cx="23451" cy="0"/>
                           </a:xfrm>
                           <a:custGeom>
@@ -11451,7 +11486,7 @@
                         <wps:cNvSpPr/>
                         <wps:spPr>
                           <a:xfrm>
-                            <a:off x="2303422" y="670139"/>
+                            <a:off x="2303422" y="624701"/>
                             <a:ext cx="23451" cy="0"/>
                           </a:xfrm>
                           <a:custGeom>
@@ -11495,7 +11530,7 @@
                         <wps:cNvSpPr/>
                         <wps:spPr>
                           <a:xfrm>
-                            <a:off x="2303422" y="624701"/>
+                            <a:off x="2303422" y="601982"/>
                             <a:ext cx="23451" cy="0"/>
                           </a:xfrm>
                           <a:custGeom>
@@ -11539,7 +11574,7 @@
                         <wps:cNvSpPr/>
                         <wps:spPr>
                           <a:xfrm>
-                            <a:off x="2303422" y="601982"/>
+                            <a:off x="2303422" y="579263"/>
                             <a:ext cx="23451" cy="0"/>
                           </a:xfrm>
                           <a:custGeom>
@@ -11583,7 +11618,7 @@
                         <wps:cNvSpPr/>
                         <wps:spPr>
                           <a:xfrm>
-                            <a:off x="2303422" y="579263"/>
+                            <a:off x="2303422" y="556544"/>
                             <a:ext cx="23451" cy="0"/>
                           </a:xfrm>
                           <a:custGeom>
@@ -11627,7 +11662,7 @@
                         <wps:cNvSpPr/>
                         <wps:spPr>
                           <a:xfrm>
-                            <a:off x="2303422" y="556544"/>
+                            <a:off x="2303422" y="511105"/>
                             <a:ext cx="23451" cy="0"/>
                           </a:xfrm>
                           <a:custGeom>
@@ -11671,7 +11706,7 @@
                         <wps:cNvSpPr/>
                         <wps:spPr>
                           <a:xfrm>
-                            <a:off x="2303422" y="511105"/>
+                            <a:off x="2303422" y="488386"/>
                             <a:ext cx="23451" cy="0"/>
                           </a:xfrm>
                           <a:custGeom>
@@ -11715,7 +11750,7 @@
                         <wps:cNvSpPr/>
                         <wps:spPr>
                           <a:xfrm>
-                            <a:off x="2303422" y="488386"/>
+                            <a:off x="2303422" y="465667"/>
                             <a:ext cx="23451" cy="0"/>
                           </a:xfrm>
                           <a:custGeom>
@@ -11759,7 +11794,7 @@
                         <wps:cNvSpPr/>
                         <wps:spPr>
                           <a:xfrm>
-                            <a:off x="2303422" y="465667"/>
+                            <a:off x="2303422" y="442948"/>
                             <a:ext cx="23451" cy="0"/>
                           </a:xfrm>
                           <a:custGeom>
@@ -11803,7 +11838,7 @@
                         <wps:cNvSpPr/>
                         <wps:spPr>
                           <a:xfrm>
-                            <a:off x="2303422" y="442948"/>
+                            <a:off x="2303422" y="397510"/>
                             <a:ext cx="23451" cy="0"/>
                           </a:xfrm>
                           <a:custGeom>
@@ -11847,7 +11882,7 @@
                         <wps:cNvSpPr/>
                         <wps:spPr>
                           <a:xfrm>
-                            <a:off x="2303422" y="397510"/>
+                            <a:off x="2303422" y="374791"/>
                             <a:ext cx="23451" cy="0"/>
                           </a:xfrm>
                           <a:custGeom>
@@ -11891,7 +11926,7 @@
                         <wps:cNvSpPr/>
                         <wps:spPr>
                           <a:xfrm>
-                            <a:off x="2303422" y="374791"/>
+                            <a:off x="2303422" y="352072"/>
                             <a:ext cx="23451" cy="0"/>
                           </a:xfrm>
                           <a:custGeom>
@@ -11935,7 +11970,7 @@
                         <wps:cNvSpPr/>
                         <wps:spPr>
                           <a:xfrm>
-                            <a:off x="2303422" y="352072"/>
+                            <a:off x="2303422" y="329352"/>
                             <a:ext cx="23451" cy="0"/>
                           </a:xfrm>
                           <a:custGeom>
@@ -11979,7 +12014,7 @@
                         <wps:cNvSpPr/>
                         <wps:spPr>
                           <a:xfrm>
-                            <a:off x="2303422" y="329352"/>
+                            <a:off x="2303422" y="283914"/>
                             <a:ext cx="23451" cy="0"/>
                           </a:xfrm>
                           <a:custGeom>
@@ -12023,7 +12058,7 @@
                         <wps:cNvSpPr/>
                         <wps:spPr>
                           <a:xfrm>
-                            <a:off x="2303422" y="283914"/>
+                            <a:off x="2303422" y="261195"/>
                             <a:ext cx="23451" cy="0"/>
                           </a:xfrm>
                           <a:custGeom>
@@ -12067,7 +12102,7 @@
                         <wps:cNvSpPr/>
                         <wps:spPr>
                           <a:xfrm>
-                            <a:off x="2303422" y="261195"/>
+                            <a:off x="2303422" y="238476"/>
                             <a:ext cx="23451" cy="0"/>
                           </a:xfrm>
                           <a:custGeom>
@@ -12111,7 +12146,7 @@
                         <wps:cNvSpPr/>
                         <wps:spPr>
                           <a:xfrm>
-                            <a:off x="2303422" y="238476"/>
+                            <a:off x="2303422" y="215757"/>
                             <a:ext cx="23451" cy="0"/>
                           </a:xfrm>
                           <a:custGeom>
@@ -12155,7 +12190,7 @@
                         <wps:cNvSpPr/>
                         <wps:spPr>
                           <a:xfrm>
-                            <a:off x="2303422" y="215757"/>
+                            <a:off x="2303422" y="170319"/>
                             <a:ext cx="23451" cy="0"/>
                           </a:xfrm>
                           <a:custGeom>
@@ -12199,7 +12234,7 @@
                         <wps:cNvSpPr/>
                         <wps:spPr>
                           <a:xfrm>
-                            <a:off x="2303422" y="170319"/>
+                            <a:off x="2303422" y="147600"/>
                             <a:ext cx="23451" cy="0"/>
                           </a:xfrm>
                           <a:custGeom>
@@ -12243,7 +12278,7 @@
                         <wps:cNvSpPr/>
                         <wps:spPr>
                           <a:xfrm>
-                            <a:off x="2303422" y="147600"/>
+                            <a:off x="2303422" y="124881"/>
                             <a:ext cx="23451" cy="0"/>
                           </a:xfrm>
                           <a:custGeom>
@@ -12287,7 +12322,7 @@
                         <wps:cNvSpPr/>
                         <wps:spPr>
                           <a:xfrm>
-                            <a:off x="2303422" y="124881"/>
+                            <a:off x="2303422" y="102162"/>
                             <a:ext cx="23451" cy="0"/>
                           </a:xfrm>
                           <a:custGeom>
@@ -12331,7 +12366,7 @@
                         <wps:cNvSpPr/>
                         <wps:spPr>
                           <a:xfrm>
-                            <a:off x="2303422" y="102162"/>
+                            <a:off x="2303422" y="56723"/>
                             <a:ext cx="23451" cy="0"/>
                           </a:xfrm>
                           <a:custGeom>
@@ -12375,7 +12410,7 @@
                         <wps:cNvSpPr/>
                         <wps:spPr>
                           <a:xfrm>
-                            <a:off x="2303422" y="56723"/>
+                            <a:off x="2303422" y="34004"/>
                             <a:ext cx="23451" cy="0"/>
                           </a:xfrm>
                           <a:custGeom>
@@ -12419,7 +12454,7 @@
                         <wps:cNvSpPr/>
                         <wps:spPr>
                           <a:xfrm>
-                            <a:off x="2303422" y="34004"/>
+                            <a:off x="2303422" y="11285"/>
                             <a:ext cx="23451" cy="0"/>
                           </a:xfrm>
                           <a:custGeom>
@@ -12463,8 +12498,8 @@
                         <wps:cNvSpPr/>
                         <wps:spPr>
                           <a:xfrm>
-                            <a:off x="2303422" y="11285"/>
-                            <a:ext cx="23451" cy="0"/>
+                            <a:off x="2372910" y="79442"/>
+                            <a:ext cx="599029" cy="0"/>
                           </a:xfrm>
                           <a:custGeom>
                             <a:avLst/>
@@ -12473,27 +12508,28 @@
                             <a:cxnLst/>
                             <a:rect l="0" t="0" r="0" b="0"/>
                             <a:pathLst>
-                              <a:path w="23451">
+                              <a:path w="599029">
                                 <a:moveTo>
-                                  <a:pt x="23451" y="0"/>
+                                  <a:pt x="0" y="0"/>
                                 </a:moveTo>
                                 <a:lnTo>
-                                  <a:pt x="0" y="0"/>
-                                </a:lnTo>
-                                <a:close/>
+                                  <a:pt x="599029" y="0"/>
+                                </a:lnTo>
                               </a:path>
                             </a:pathLst>
                           </a:custGeom>
-                          <a:ln w="8208" cap="flat">
+                          <a:ln w="8384" cap="flat">
                             <a:round/>
                           </a:ln>
                         </wps:spPr>
                         <wps:style>
                           <a:lnRef idx="1">
-                            <a:srgbClr val="000000"/>
+                            <a:srgbClr val="1C6B73"/>
                           </a:lnRef>
-                          <a:fillRef idx="1">
-                            <a:srgbClr val="000000"/>
+                          <a:fillRef idx="0">
+                            <a:srgbClr val="000000">
+                              <a:alpha val="0"/>
+                            </a:srgbClr>
                           </a:fillRef>
                           <a:effectRef idx="0">
                             <a:scrgbClr r="0" g="0" b="0"/>
@@ -12507,8 +12543,8 @@
                         <wps:cNvSpPr/>
                         <wps:spPr>
                           <a:xfrm>
-                            <a:off x="2372910" y="79442"/>
-                            <a:ext cx="599029" cy="0"/>
+                            <a:off x="2472511" y="193038"/>
+                            <a:ext cx="636963" cy="0"/>
                           </a:xfrm>
                           <a:custGeom>
                             <a:avLst/>
@@ -12517,12 +12553,12 @@
                             <a:cxnLst/>
                             <a:rect l="0" t="0" r="0" b="0"/>
                             <a:pathLst>
-                              <a:path w="599029">
+                              <a:path w="636963">
                                 <a:moveTo>
                                   <a:pt x="0" y="0"/>
                                 </a:moveTo>
                                 <a:lnTo>
-                                  <a:pt x="599029" y="0"/>
+                                  <a:pt x="636963" y="0"/>
                                 </a:lnTo>
                               </a:path>
                             </a:pathLst>
@@ -12552,8 +12588,8 @@
                         <wps:cNvSpPr/>
                         <wps:spPr>
                           <a:xfrm>
-                            <a:off x="2472511" y="193038"/>
-                            <a:ext cx="636963" cy="0"/>
+                            <a:off x="2533368" y="306634"/>
+                            <a:ext cx="592334" cy="0"/>
                           </a:xfrm>
                           <a:custGeom>
                             <a:avLst/>
@@ -12562,12 +12598,12 @@
                             <a:cxnLst/>
                             <a:rect l="0" t="0" r="0" b="0"/>
                             <a:pathLst>
-                              <a:path w="636963">
+                              <a:path w="592334">
                                 <a:moveTo>
                                   <a:pt x="0" y="0"/>
                                 </a:moveTo>
                                 <a:lnTo>
-                                  <a:pt x="636963" y="0"/>
+                                  <a:pt x="592334" y="0"/>
                                 </a:lnTo>
                               </a:path>
                             </a:pathLst>
@@ -12597,8 +12633,8 @@
                         <wps:cNvSpPr/>
                         <wps:spPr>
                           <a:xfrm>
-                            <a:off x="2533368" y="306634"/>
-                            <a:ext cx="592334" cy="0"/>
+                            <a:off x="2598281" y="420229"/>
+                            <a:ext cx="576107" cy="0"/>
                           </a:xfrm>
                           <a:custGeom>
                             <a:avLst/>
@@ -12607,12 +12643,12 @@
                             <a:cxnLst/>
                             <a:rect l="0" t="0" r="0" b="0"/>
                             <a:pathLst>
-                              <a:path w="592334">
+                              <a:path w="576107">
                                 <a:moveTo>
                                   <a:pt x="0" y="0"/>
                                 </a:moveTo>
                                 <a:lnTo>
-                                  <a:pt x="592334" y="0"/>
+                                  <a:pt x="576107" y="0"/>
                                 </a:lnTo>
                               </a:path>
                             </a:pathLst>
@@ -12642,8 +12678,8 @@
                         <wps:cNvSpPr/>
                         <wps:spPr>
                           <a:xfrm>
-                            <a:off x="2598281" y="420229"/>
-                            <a:ext cx="576107" cy="0"/>
+                            <a:off x="2642909" y="533824"/>
+                            <a:ext cx="645077" cy="0"/>
                           </a:xfrm>
                           <a:custGeom>
                             <a:avLst/>
@@ -12652,12 +12688,12 @@
                             <a:cxnLst/>
                             <a:rect l="0" t="0" r="0" b="0"/>
                             <a:pathLst>
-                              <a:path w="576107">
+                              <a:path w="645077">
                                 <a:moveTo>
                                   <a:pt x="0" y="0"/>
                                 </a:moveTo>
                                 <a:lnTo>
-                                  <a:pt x="576107" y="0"/>
+                                  <a:pt x="645077" y="0"/>
                                 </a:lnTo>
                               </a:path>
                             </a:pathLst>
@@ -12687,8 +12723,8 @@
                         <wps:cNvSpPr/>
                         <wps:spPr>
                           <a:xfrm>
-                            <a:off x="2642909" y="533824"/>
-                            <a:ext cx="645077" cy="0"/>
+                            <a:off x="2719994" y="647420"/>
+                            <a:ext cx="685648" cy="0"/>
                           </a:xfrm>
                           <a:custGeom>
                             <a:avLst/>
@@ -12697,12 +12733,12 @@
                             <a:cxnLst/>
                             <a:rect l="0" t="0" r="0" b="0"/>
                             <a:pathLst>
-                              <a:path w="645077">
+                              <a:path w="685648">
                                 <a:moveTo>
                                   <a:pt x="0" y="0"/>
                                 </a:moveTo>
                                 <a:lnTo>
-                                  <a:pt x="645077" y="0"/>
+                                  <a:pt x="685648" y="0"/>
                                 </a:lnTo>
                               </a:path>
                             </a:pathLst>
@@ -12732,8 +12768,8 @@
                         <wps:cNvSpPr/>
                         <wps:spPr>
                           <a:xfrm>
-                            <a:off x="2719994" y="647420"/>
-                            <a:ext cx="685648" cy="0"/>
+                            <a:off x="2771113" y="761016"/>
+                            <a:ext cx="991552" cy="0"/>
                           </a:xfrm>
                           <a:custGeom>
                             <a:avLst/>
@@ -12742,12 +12778,12 @@
                             <a:cxnLst/>
                             <a:rect l="0" t="0" r="0" b="0"/>
                             <a:pathLst>
-                              <a:path w="685648">
+                              <a:path w="991552">
                                 <a:moveTo>
                                   <a:pt x="0" y="0"/>
                                 </a:moveTo>
                                 <a:lnTo>
-                                  <a:pt x="685648" y="0"/>
+                                  <a:pt x="991552" y="0"/>
                                 </a:lnTo>
                               </a:path>
                             </a:pathLst>
@@ -12777,8 +12813,8 @@
                         <wps:cNvSpPr/>
                         <wps:spPr>
                           <a:xfrm>
-                            <a:off x="2771113" y="761016"/>
-                            <a:ext cx="991552" cy="0"/>
+                            <a:off x="2303422" y="11285"/>
+                            <a:ext cx="0" cy="817888"/>
                           </a:xfrm>
                           <a:custGeom>
                             <a:avLst/>
@@ -12787,23 +12823,23 @@
                             <a:cxnLst/>
                             <a:rect l="0" t="0" r="0" b="0"/>
                             <a:pathLst>
-                              <a:path w="991552">
+                              <a:path h="817888">
                                 <a:moveTo>
+                                  <a:pt x="0" y="817888"/>
+                                </a:moveTo>
+                                <a:lnTo>
                                   <a:pt x="0" y="0"/>
-                                </a:moveTo>
-                                <a:lnTo>
-                                  <a:pt x="991552" y="0"/>
                                 </a:lnTo>
                               </a:path>
                             </a:pathLst>
                           </a:custGeom>
-                          <a:ln w="8384" cap="flat">
-                            <a:round/>
+                          <a:ln w="12899" cap="sq">
+                            <a:miter lim="127000"/>
                           </a:ln>
                         </wps:spPr>
                         <wps:style>
                           <a:lnRef idx="1">
-                            <a:srgbClr val="1C6B73"/>
+                            <a:srgbClr val="000000"/>
                           </a:lnRef>
                           <a:fillRef idx="0">
                             <a:srgbClr val="000000">
@@ -12822,8 +12858,8 @@
                         <wps:cNvSpPr/>
                         <wps:spPr>
                           <a:xfrm>
-                            <a:off x="2303422" y="11285"/>
-                            <a:ext cx="0" cy="817888"/>
+                            <a:off x="2303422" y="829173"/>
+                            <a:ext cx="1528731" cy="0"/>
                           </a:xfrm>
                           <a:custGeom>
                             <a:avLst/>
@@ -12832,12 +12868,12 @@
                             <a:cxnLst/>
                             <a:rect l="0" t="0" r="0" b="0"/>
                             <a:pathLst>
-                              <a:path h="817888">
+                              <a:path w="1528731">
                                 <a:moveTo>
-                                  <a:pt x="0" y="817888"/>
+                                  <a:pt x="0" y="0"/>
                                 </a:moveTo>
                                 <a:lnTo>
-                                  <a:pt x="0" y="0"/>
+                                  <a:pt x="1528731" y="0"/>
                                 </a:lnTo>
                               </a:path>
                             </a:pathLst>
@@ -12867,8 +12903,8 @@
                         <wps:cNvSpPr/>
                         <wps:spPr>
                           <a:xfrm>
-                            <a:off x="2303422" y="829173"/>
-                            <a:ext cx="1528731" cy="0"/>
+                            <a:off x="2533368" y="79442"/>
+                            <a:ext cx="259653" cy="0"/>
                           </a:xfrm>
                           <a:custGeom>
                             <a:avLst/>
@@ -12877,23 +12913,25 @@
                             <a:cxnLst/>
                             <a:rect l="0" t="0" r="0" b="0"/>
                             <a:pathLst>
-                              <a:path w="1528731">
+                              <a:path w="259653">
                                 <a:moveTo>
                                   <a:pt x="0" y="0"/>
                                 </a:moveTo>
                                 <a:lnTo>
-                                  <a:pt x="1528731" y="0"/>
+                                  <a:pt x="259653" y="0"/>
                                 </a:lnTo>
                               </a:path>
                             </a:pathLst>
                           </a:custGeom>
-                          <a:ln w="12899" cap="sq">
-                            <a:miter lim="127000"/>
+                          <a:ln w="39634" cap="flat">
+                            <a:round/>
                           </a:ln>
                         </wps:spPr>
                         <wps:style>
                           <a:lnRef idx="1">
-                            <a:srgbClr val="000000"/>
+                            <a:srgbClr val="1C6B73">
+                              <a:alpha val="45098"/>
+                            </a:srgbClr>
                           </a:lnRef>
                           <a:fillRef idx="0">
                             <a:srgbClr val="000000">
@@ -12912,8 +12950,8 @@
                         <wps:cNvSpPr/>
                         <wps:spPr>
                           <a:xfrm>
-                            <a:off x="2533368" y="79442"/>
-                            <a:ext cx="259653" cy="0"/>
+                            <a:off x="2626681" y="193038"/>
+                            <a:ext cx="279939" cy="0"/>
                           </a:xfrm>
                           <a:custGeom>
                             <a:avLst/>
@@ -12922,12 +12960,12 @@
                             <a:cxnLst/>
                             <a:rect l="0" t="0" r="0" b="0"/>
                             <a:pathLst>
-                              <a:path w="259653">
+                              <a:path w="279939">
                                 <a:moveTo>
                                   <a:pt x="0" y="0"/>
                                 </a:moveTo>
                                 <a:lnTo>
-                                  <a:pt x="259653" y="0"/>
+                                  <a:pt x="279939" y="0"/>
                                 </a:lnTo>
                               </a:path>
                             </a:pathLst>
@@ -12959,8 +12997,8 @@
                         <wps:cNvSpPr/>
                         <wps:spPr>
                           <a:xfrm>
-                            <a:off x="2626681" y="193038"/>
-                            <a:ext cx="279939" cy="0"/>
+                            <a:off x="2659137" y="306634"/>
+                            <a:ext cx="271825" cy="0"/>
                           </a:xfrm>
                           <a:custGeom>
                             <a:avLst/>
@@ -12969,12 +13007,12 @@
                             <a:cxnLst/>
                             <a:rect l="0" t="0" r="0" b="0"/>
                             <a:pathLst>
-                              <a:path w="279939">
+                              <a:path w="271825">
                                 <a:moveTo>
                                   <a:pt x="0" y="0"/>
                                 </a:moveTo>
                                 <a:lnTo>
-                                  <a:pt x="279939" y="0"/>
+                                  <a:pt x="271825" y="0"/>
                                 </a:lnTo>
                               </a:path>
                             </a:pathLst>
@@ -13006,7 +13044,7 @@
                         <wps:cNvSpPr/>
                         <wps:spPr>
                           <a:xfrm>
-                            <a:off x="2659137" y="306634"/>
+                            <a:off x="2711880" y="420229"/>
                             <a:ext cx="271825" cy="0"/>
                           </a:xfrm>
                           <a:custGeom>
@@ -13053,8 +13091,8 @@
                         <wps:cNvSpPr/>
                         <wps:spPr>
                           <a:xfrm>
-                            <a:off x="2711880" y="420229"/>
-                            <a:ext cx="271825" cy="0"/>
+                            <a:off x="2788964" y="533824"/>
+                            <a:ext cx="304282" cy="0"/>
                           </a:xfrm>
                           <a:custGeom>
                             <a:avLst/>
@@ -13063,12 +13101,12 @@
                             <a:cxnLst/>
                             <a:rect l="0" t="0" r="0" b="0"/>
                             <a:pathLst>
-                              <a:path w="271825">
+                              <a:path w="304282">
                                 <a:moveTo>
                                   <a:pt x="0" y="0"/>
                                 </a:moveTo>
                                 <a:lnTo>
-                                  <a:pt x="271825" y="0"/>
+                                  <a:pt x="304282" y="0"/>
                                 </a:lnTo>
                               </a:path>
                             </a:pathLst>
@@ -13100,8 +13138,8 @@
                         <wps:cNvSpPr/>
                         <wps:spPr>
                           <a:xfrm>
-                            <a:off x="2788964" y="533824"/>
-                            <a:ext cx="304282" cy="0"/>
+                            <a:off x="2906620" y="647420"/>
+                            <a:ext cx="279939" cy="0"/>
                           </a:xfrm>
                           <a:custGeom>
                             <a:avLst/>
@@ -13110,12 +13148,12 @@
                             <a:cxnLst/>
                             <a:rect l="0" t="0" r="0" b="0"/>
                             <a:pathLst>
-                              <a:path w="304282">
+                              <a:path w="279939">
                                 <a:moveTo>
                                   <a:pt x="0" y="0"/>
                                 </a:moveTo>
                                 <a:lnTo>
-                                  <a:pt x="304282" y="0"/>
+                                  <a:pt x="279939" y="0"/>
                                 </a:lnTo>
                               </a:path>
                             </a:pathLst>
@@ -13147,8 +13185,8 @@
                         <wps:cNvSpPr/>
                         <wps:spPr>
                           <a:xfrm>
-                            <a:off x="2906620" y="647420"/>
-                            <a:ext cx="279939" cy="0"/>
+                            <a:off x="3020218" y="761016"/>
+                            <a:ext cx="385423" cy="0"/>
                           </a:xfrm>
                           <a:custGeom>
                             <a:avLst/>
@@ -13157,12 +13195,12 @@
                             <a:cxnLst/>
                             <a:rect l="0" t="0" r="0" b="0"/>
                             <a:pathLst>
-                              <a:path w="279939">
+                              <a:path w="385423">
                                 <a:moveTo>
                                   <a:pt x="0" y="0"/>
                                 </a:moveTo>
                                 <a:lnTo>
-                                  <a:pt x="279939" y="0"/>
+                                  <a:pt x="385423" y="0"/>
                                 </a:lnTo>
                               </a:path>
                             </a:pathLst>
@@ -13190,59 +13228,50 @@
                         <wps:bodyPr/>
                       </wps:wsp>
                       <wps:wsp>
-                        <wps:cNvPr id="3658" name="Shape 3658"/>
+                        <wps:cNvPr id="3658" name="Rectangle 3658"/>
                         <wps:cNvSpPr/>
                         <wps:spPr>
                           <a:xfrm>
-                            <a:off x="3020218" y="761016"/>
-                            <a:ext cx="385423" cy="0"/>
-                          </a:xfrm>
-                          <a:custGeom>
-                            <a:avLst/>
-                            <a:gdLst/>
-                            <a:ahLst/>
-                            <a:cxnLst/>
-                            <a:rect l="0" t="0" r="0" b="0"/>
-                            <a:pathLst>
-                              <a:path w="385423">
-                                <a:moveTo>
-                                  <a:pt x="0" y="0"/>
-                                </a:moveTo>
-                                <a:lnTo>
-                                  <a:pt x="385423" y="0"/>
-                                </a:lnTo>
-                              </a:path>
-                            </a:pathLst>
-                          </a:custGeom>
-                          <a:ln w="39634" cap="flat">
-                            <a:round/>
+                            <a:off x="3716778" y="30601"/>
+                            <a:ext cx="47691" cy="117082"/>
+                          </a:xfrm>
+                          <a:prstGeom prst="rect">
+                            <a:avLst/>
+                          </a:prstGeom>
+                          <a:ln>
+                            <a:noFill/>
                           </a:ln>
                         </wps:spPr>
-                        <wps:style>
-                          <a:lnRef idx="1">
-                            <a:srgbClr val="1C6B73">
-                              <a:alpha val="45098"/>
-                            </a:srgbClr>
-                          </a:lnRef>
-                          <a:fillRef idx="0">
-                            <a:srgbClr val="000000">
-                              <a:alpha val="0"/>
-                            </a:srgbClr>
-                          </a:fillRef>
-                          <a:effectRef idx="0">
-                            <a:scrgbClr r="0" g="0" b="0"/>
-                          </a:effectRef>
-                          <a:fontRef idx="none"/>
-                        </wps:style>
-                        <wps:bodyPr/>
+                        <wps:txbx>
+                          <w:txbxContent>
+                            <w:p>
+                              <w:pPr>
+                                <w:spacing w:after="160" w:line="259" w:lineRule="auto"/>
+                                <w:ind w:left="0" w:firstLine="0"/>
+                                <w:jc w:val="left"/>
+                              </w:pPr>
+                              <w:r>
+                                <w:rPr>
+                                  <w:rFonts w:ascii="Arial" w:eastAsia="Arial" w:hAnsi="Arial" w:cs="Arial"/>
+                                  <w:color w:val="8C9199"/>
+                                  <w:sz w:val="10"/>
+                                </w:rPr>
+                                <w:t>7</w:t>
+                              </w:r>
+                            </w:p>
+                          </w:txbxContent>
+                        </wps:txbx>
+                        <wps:bodyPr horzOverflow="overflow" vert="horz" lIns="0" tIns="0" rIns="0" bIns="0" rtlCol="0">
+                          <a:noAutofit/>
+                        </wps:bodyPr>
                       </wps:wsp>
                       <wps:wsp>
                         <wps:cNvPr id="3659" name="Rectangle 3659"/>
                         <wps:cNvSpPr/>
                         <wps:spPr>
                           <a:xfrm>
-                            <a:off x="3716778" y="30601"/>
-                            <a:ext cx="47691" cy="117082"/>
+                            <a:off x="3716778" y="144197"/>
+                            <a:ext cx="47691" cy="117083"/>
                           </a:xfrm>
                           <a:prstGeom prst="rect">
                             <a:avLst/>
@@ -13279,7 +13308,7 @@
                         <wps:cNvSpPr/>
                         <wps:spPr>
                           <a:xfrm>
-                            <a:off x="3716778" y="144197"/>
+                            <a:off x="3716778" y="257792"/>
                             <a:ext cx="47691" cy="117083"/>
                           </a:xfrm>
                           <a:prstGeom prst="rect">
@@ -13317,7 +13346,7 @@
                         <wps:cNvSpPr/>
                         <wps:spPr>
                           <a:xfrm>
-                            <a:off x="3716778" y="257792"/>
+                            <a:off x="3716778" y="371387"/>
                             <a:ext cx="47691" cy="117083"/>
                           </a:xfrm>
                           <a:prstGeom prst="rect">
@@ -13355,8 +13384,84 @@
                         <wps:cNvSpPr/>
                         <wps:spPr>
                           <a:xfrm>
-                            <a:off x="3716778" y="371387"/>
-                            <a:ext cx="47691" cy="117083"/>
+                            <a:off x="3716778" y="484983"/>
+                            <a:ext cx="143073" cy="117082"/>
+                          </a:xfrm>
+                          <a:prstGeom prst="rect">
+                            <a:avLst/>
+                          </a:prstGeom>
+                          <a:ln>
+                            <a:noFill/>
+                          </a:ln>
+                        </wps:spPr>
+                        <wps:txbx>
+                          <w:txbxContent>
+                            <w:p>
+                              <w:pPr>
+                                <w:spacing w:after="160" w:line="259" w:lineRule="auto"/>
+                                <w:ind w:left="0" w:firstLine="0"/>
+                                <w:jc w:val="left"/>
+                              </w:pPr>
+                              <w:r>
+                                <w:rPr>
+                                  <w:rFonts w:ascii="Arial" w:eastAsia="Arial" w:hAnsi="Arial" w:cs="Arial"/>
+                                  <w:color w:val="8C9199"/>
+                                  <w:sz w:val="10"/>
+                                </w:rPr>
+                                <w:t>77</w:t>
+                              </w:r>
+                            </w:p>
+                          </w:txbxContent>
+                        </wps:txbx>
+                        <wps:bodyPr horzOverflow="overflow" vert="horz" lIns="0" tIns="0" rIns="0" bIns="0" rtlCol="0">
+                          <a:noAutofit/>
+                        </wps:bodyPr>
+                      </wps:wsp>
+                      <wps:wsp>
+                        <wps:cNvPr id="3663" name="Rectangle 3663"/>
+                        <wps:cNvSpPr/>
+                        <wps:spPr>
+                          <a:xfrm>
+                            <a:off x="3716778" y="598578"/>
+                            <a:ext cx="143073" cy="117082"/>
+                          </a:xfrm>
+                          <a:prstGeom prst="rect">
+                            <a:avLst/>
+                          </a:prstGeom>
+                          <a:ln>
+                            <a:noFill/>
+                          </a:ln>
+                        </wps:spPr>
+                        <wps:txbx>
+                          <w:txbxContent>
+                            <w:p>
+                              <w:pPr>
+                                <w:spacing w:after="160" w:line="259" w:lineRule="auto"/>
+                                <w:ind w:left="0" w:firstLine="0"/>
+                                <w:jc w:val="left"/>
+                              </w:pPr>
+                              <w:r>
+                                <w:rPr>
+                                  <w:rFonts w:ascii="Arial" w:eastAsia="Arial" w:hAnsi="Arial" w:cs="Arial"/>
+                                  <w:color w:val="8C9199"/>
+                                  <w:sz w:val="10"/>
+                                </w:rPr>
+                                <w:t>78</w:t>
+                              </w:r>
+                            </w:p>
+                          </w:txbxContent>
+                        </wps:txbx>
+                        <wps:bodyPr horzOverflow="overflow" vert="horz" lIns="0" tIns="0" rIns="0" bIns="0" rtlCol="0">
+                          <a:noAutofit/>
+                        </wps:bodyPr>
+                      </wps:wsp>
+                      <wps:wsp>
+                        <wps:cNvPr id="3664" name="Rectangle 3664"/>
+                        <wps:cNvSpPr/>
+                        <wps:spPr>
+                          <a:xfrm>
+                            <a:off x="3716778" y="712174"/>
+                            <a:ext cx="47691" cy="117082"/>
                           </a:xfrm>
                           <a:prstGeom prst="rect">
                             <a:avLst/>
@@ -13389,121 +13494,7 @@
                         </wps:bodyPr>
                       </wps:wsp>
                       <wps:wsp>
-                        <wps:cNvPr id="3663" name="Rectangle 3663"/>
-                        <wps:cNvSpPr/>
-                        <wps:spPr>
-                          <a:xfrm>
-                            <a:off x="3716778" y="484983"/>
-                            <a:ext cx="143073" cy="117082"/>
-                          </a:xfrm>
-                          <a:prstGeom prst="rect">
-                            <a:avLst/>
-                          </a:prstGeom>
-                          <a:ln>
-                            <a:noFill/>
-                          </a:ln>
-                        </wps:spPr>
-                        <wps:txbx>
-                          <w:txbxContent>
-                            <w:p>
-                              <w:pPr>
-                                <w:spacing w:after="160" w:line="259" w:lineRule="auto"/>
-                                <w:ind w:left="0" w:firstLine="0"/>
-                                <w:jc w:val="left"/>
-                              </w:pPr>
-                              <w:r>
-                                <w:rPr>
-                                  <w:rFonts w:ascii="Arial" w:eastAsia="Arial" w:hAnsi="Arial" w:cs="Arial"/>
-                                  <w:color w:val="8C9199"/>
-                                  <w:sz w:val="10"/>
-                                </w:rPr>
-                                <w:t>77</w:t>
-                              </w:r>
-                            </w:p>
-                          </w:txbxContent>
-                        </wps:txbx>
-                        <wps:bodyPr horzOverflow="overflow" vert="horz" lIns="0" tIns="0" rIns="0" bIns="0" rtlCol="0">
-                          <a:noAutofit/>
-                        </wps:bodyPr>
-                      </wps:wsp>
-                      <wps:wsp>
-                        <wps:cNvPr id="3664" name="Rectangle 3664"/>
-                        <wps:cNvSpPr/>
-                        <wps:spPr>
-                          <a:xfrm>
-                            <a:off x="3716778" y="598578"/>
-                            <a:ext cx="143073" cy="117082"/>
-                          </a:xfrm>
-                          <a:prstGeom prst="rect">
-                            <a:avLst/>
-                          </a:prstGeom>
-                          <a:ln>
-                            <a:noFill/>
-                          </a:ln>
-                        </wps:spPr>
-                        <wps:txbx>
-                          <w:txbxContent>
-                            <w:p>
-                              <w:pPr>
-                                <w:spacing w:after="160" w:line="259" w:lineRule="auto"/>
-                                <w:ind w:left="0" w:firstLine="0"/>
-                                <w:jc w:val="left"/>
-                              </w:pPr>
-                              <w:r>
-                                <w:rPr>
-                                  <w:rFonts w:ascii="Arial" w:eastAsia="Arial" w:hAnsi="Arial" w:cs="Arial"/>
-                                  <w:color w:val="8C9199"/>
-                                  <w:sz w:val="10"/>
-                                </w:rPr>
-                                <w:t>78</w:t>
-                              </w:r>
-                            </w:p>
-                          </w:txbxContent>
-                        </wps:txbx>
-                        <wps:bodyPr horzOverflow="overflow" vert="horz" lIns="0" tIns="0" rIns="0" bIns="0" rtlCol="0">
-                          <a:noAutofit/>
-                        </wps:bodyPr>
-                      </wps:wsp>
-                      <wps:wsp>
-                        <wps:cNvPr id="3665" name="Rectangle 3665"/>
-                        <wps:cNvSpPr/>
-                        <wps:spPr>
-                          <a:xfrm>
-                            <a:off x="3716778" y="712174"/>
-                            <a:ext cx="47691" cy="117082"/>
-                          </a:xfrm>
-                          <a:prstGeom prst="rect">
-                            <a:avLst/>
-                          </a:prstGeom>
-                          <a:ln>
-                            <a:noFill/>
-                          </a:ln>
-                        </wps:spPr>
-                        <wps:txbx>
-                          <w:txbxContent>
-                            <w:p>
-                              <w:pPr>
-                                <w:spacing w:after="160" w:line="259" w:lineRule="auto"/>
-                                <w:ind w:left="0" w:firstLine="0"/>
-                                <w:jc w:val="left"/>
-                              </w:pPr>
-                              <w:r>
-                                <w:rPr>
-                                  <w:rFonts w:ascii="Arial" w:eastAsia="Arial" w:hAnsi="Arial" w:cs="Arial"/>
-                                  <w:color w:val="8C9199"/>
-                                  <w:sz w:val="10"/>
-                                </w:rPr>
-                                <w:t>7</w:t>
-                              </w:r>
-                            </w:p>
-                          </w:txbxContent>
-                        </wps:txbx>
-                        <wps:bodyPr horzOverflow="overflow" vert="horz" lIns="0" tIns="0" rIns="0" bIns="0" rtlCol="0">
-                          <a:noAutofit/>
-                        </wps:bodyPr>
-                      </wps:wsp>
-                      <wps:wsp>
-                        <wps:cNvPr id="3667" name="Shape 3667"/>
+                        <wps:cNvPr id="3666" name="Shape 3666"/>
                         <wps:cNvSpPr/>
                         <wps:spPr>
                           <a:xfrm>
@@ -13584,7 +13575,7 @@
                         <wps:bodyPr/>
                       </wps:wsp>
                       <wps:wsp>
-                        <wps:cNvPr id="3668" name="Shape 3668"/>
+                        <wps:cNvPr id="3667" name="Shape 3667"/>
                         <wps:cNvSpPr/>
                         <wps:spPr>
                           <a:xfrm>
@@ -13665,7 +13656,7 @@
                         <wps:bodyPr/>
                       </wps:wsp>
                       <wps:wsp>
-                        <wps:cNvPr id="3669" name="Shape 3669"/>
+                        <wps:cNvPr id="3668" name="Shape 3668"/>
                         <wps:cNvSpPr/>
                         <wps:spPr>
                           <a:xfrm>
@@ -13746,7 +13737,7 @@
                         <wps:bodyPr/>
                       </wps:wsp>
                       <wps:wsp>
-                        <wps:cNvPr id="3670" name="Shape 3670"/>
+                        <wps:cNvPr id="3669" name="Shape 3669"/>
                         <wps:cNvSpPr/>
                         <wps:spPr>
                           <a:xfrm>
@@ -13827,7 +13818,7 @@
                         <wps:bodyPr/>
                       </wps:wsp>
                       <wps:wsp>
-                        <wps:cNvPr id="3671" name="Shape 3671"/>
+                        <wps:cNvPr id="3670" name="Shape 3670"/>
                         <wps:cNvSpPr/>
                         <wps:spPr>
                           <a:xfrm>
@@ -13908,7 +13899,7 @@
                         <wps:bodyPr/>
                       </wps:wsp>
                       <wps:wsp>
-                        <wps:cNvPr id="3672" name="Shape 3672"/>
+                        <wps:cNvPr id="3671" name="Shape 3671"/>
                         <wps:cNvSpPr/>
                         <wps:spPr>
                           <a:xfrm>
@@ -13989,7 +13980,7 @@
                         <wps:bodyPr/>
                       </wps:wsp>
                       <wps:wsp>
-                        <wps:cNvPr id="3673" name="Shape 3673"/>
+                        <wps:cNvPr id="3672" name="Shape 3672"/>
                         <wps:cNvSpPr/>
                         <wps:spPr>
                           <a:xfrm>
@@ -14077,343 +14068,343 @@
           </mc:Choice>
           <mc:Fallback xmlns:a="http://schemas.openxmlformats.org/drawingml/2006/main">
             <w:pict>
-              <v:group id="Group 35901" style="width:301.744pt;height:68.64pt;mso-position-horizontal-relative:char;mso-position-vertical-relative:line" coordsize="38321,8717">
-                <v:shape id="Picture 35857" style="position:absolute;width:20817;height:8717;left:0;top:0;" filled="f">
+              <v:group id="Group 35856" style="width:301.744pt;height:68.64pt;mso-position-horizontal-relative:char;mso-position-vertical-relative:line" coordsize="38321,8717">
+                <v:shape id="Picture 35812" style="position:absolute;width:20817;height:8717;left:0;top:0;" filled="f">
                   <v:imagedata r:id="rId31"/>
                 </v:shape>
-                <v:shape id="Shape 3564" style="position:absolute;width:0;height:8178;left:23507;top:112;" coordsize="0,817888" path="m0,817888l0,0">
+                <v:shape id="Shape 3563" style="position:absolute;width:0;height:8178;left:23507;top:112;" coordsize="0,817888" path="m0,817888l0,0">
                   <v:stroke weight="0.55398pt" endcap="square" joinstyle="round" on="true" color="#b0b0b0"/>
                   <v:fill on="false" color="#000000" opacity="0"/>
                 </v:shape>
-                <v:shape id="Shape 3565" style="position:absolute;width:0;height:410;left:23507;top:8291;" coordsize="0,41041" path="m0,41041l0,0x">
+                <v:shape id="Shape 3564" style="position:absolute;width:0;height:410;left:23507;top:8291;" coordsize="0,41041" path="m0,41041l0,0x">
                   <v:stroke weight="1.01563pt" endcap="flat" joinstyle="round" on="true" color="#000000"/>
                   <v:fill on="true" color="#000000"/>
                 </v:shape>
-                <v:shape id="Shape 3567" style="position:absolute;width:0;height:8178;left:27565;top:112;" coordsize="0,817888" path="m0,817888l0,0">
+                <v:shape id="Shape 3566" style="position:absolute;width:0;height:8178;left:27565;top:112;" coordsize="0,817888" path="m0,817888l0,0">
                   <v:stroke weight="0.55398pt" endcap="square" joinstyle="round" on="true" color="#b0b0b0"/>
                   <v:fill on="false" color="#000000" opacity="0"/>
                 </v:shape>
-                <v:shape id="Shape 3568" style="position:absolute;width:0;height:410;left:27565;top:8291;" coordsize="0,41041" path="m0,41041l0,0x">
+                <v:shape id="Shape 3567" style="position:absolute;width:0;height:410;left:27565;top:8291;" coordsize="0,41041" path="m0,41041l0,0x">
                   <v:stroke weight="1.01563pt" endcap="flat" joinstyle="round" on="true" color="#000000"/>
                   <v:fill on="true" color="#000000"/>
                 </v:shape>
-                <v:shape id="Shape 3570" style="position:absolute;width:0;height:8178;left:31622;top:112;" coordsize="0,817888" path="m0,817888l0,0">
+                <v:shape id="Shape 3569" style="position:absolute;width:0;height:8178;left:31622;top:112;" coordsize="0,817888" path="m0,817888l0,0">
                   <v:stroke weight="0.55398pt" endcap="square" joinstyle="round" on="true" color="#b0b0b0"/>
                   <v:fill on="false" color="#000000" opacity="0"/>
                 </v:shape>
-                <v:shape id="Shape 3571" style="position:absolute;width:0;height:410;left:31622;top:8291;" coordsize="0,41041" path="m0,41041l0,0x">
+                <v:shape id="Shape 3570" style="position:absolute;width:0;height:410;left:31622;top:8291;" coordsize="0,41041" path="m0,41041l0,0x">
                   <v:stroke weight="1.01563pt" endcap="flat" joinstyle="round" on="true" color="#000000"/>
                   <v:fill on="true" color="#000000"/>
                 </v:shape>
-                <v:shape id="Shape 3573" style="position:absolute;width:0;height:8178;left:35679;top:112;" coordsize="0,817888" path="m0,817888l0,0">
+                <v:shape id="Shape 3572" style="position:absolute;width:0;height:8178;left:35679;top:112;" coordsize="0,817888" path="m0,817888l0,0">
                   <v:stroke weight="0.55398pt" endcap="square" joinstyle="round" on="true" color="#b0b0b0"/>
                   <v:fill on="false" color="#000000" opacity="0"/>
                 </v:shape>
-                <v:shape id="Shape 3574" style="position:absolute;width:0;height:410;left:35679;top:8291;" coordsize="0,41041" path="m0,41041l0,0x">
+                <v:shape id="Shape 3573" style="position:absolute;width:0;height:410;left:35679;top:8291;" coordsize="0,41041" path="m0,41041l0,0x">
                   <v:stroke weight="1.01563pt" endcap="flat" joinstyle="round" on="true" color="#000000"/>
                   <v:fill on="true" color="#000000"/>
                 </v:shape>
-                <v:shape id="Shape 3576" style="position:absolute;width:0;height:234;left:24319;top:8057;" coordsize="0,23452" path="m0,23452l0,0x">
+                <v:shape id="Shape 3575" style="position:absolute;width:0;height:234;left:24319;top:8057;" coordsize="0,23452" path="m0,23452l0,0x">
                   <v:stroke weight="0.64631pt" endcap="flat" joinstyle="round" on="true" color="#000000"/>
                   <v:fill on="true" color="#000000"/>
                 </v:shape>
-                <v:shape id="Shape 3577" style="position:absolute;width:0;height:234;left:25130;top:8057;" coordsize="0,23452" path="m0,23452l0,0x">
+                <v:shape id="Shape 3576" style="position:absolute;width:0;height:234;left:25130;top:8057;" coordsize="0,23452" path="m0,23452l0,0x">
                   <v:stroke weight="0.64631pt" endcap="flat" joinstyle="round" on="true" color="#000000"/>
                   <v:fill on="true" color="#000000"/>
                 </v:shape>
-                <v:shape id="Shape 3578" style="position:absolute;width:0;height:234;left:25942;top:8057;" coordsize="0,23452" path="m0,23452l0,0x">
+                <v:shape id="Shape 3577" style="position:absolute;width:0;height:234;left:25942;top:8057;" coordsize="0,23452" path="m0,23452l0,0x">
                   <v:stroke weight="0.64631pt" endcap="flat" joinstyle="round" on="true" color="#000000"/>
                   <v:fill on="true" color="#000000"/>
                 </v:shape>
-                <v:shape id="Shape 3579" style="position:absolute;width:0;height:234;left:26753;top:8057;" coordsize="0,23452" path="m0,23452l0,0x">
+                <v:shape id="Shape 3578" style="position:absolute;width:0;height:234;left:26753;top:8057;" coordsize="0,23452" path="m0,23452l0,0x">
                   <v:stroke weight="0.64631pt" endcap="flat" joinstyle="round" on="true" color="#000000"/>
                   <v:fill on="true" color="#000000"/>
                 </v:shape>
-                <v:shape id="Shape 3580" style="position:absolute;width:0;height:234;left:28376;top:8057;" coordsize="0,23452" path="m0,23452l0,0x">
+                <v:shape id="Shape 3579" style="position:absolute;width:0;height:234;left:28376;top:8057;" coordsize="0,23452" path="m0,23452l0,0x">
                   <v:stroke weight="0.64631pt" endcap="flat" joinstyle="round" on="true" color="#000000"/>
                   <v:fill on="true" color="#000000"/>
                 </v:shape>
-                <v:shape id="Shape 3581" style="position:absolute;width:0;height:234;left:29187;top:8057;" coordsize="0,23452" path="m0,23452l0,0x">
+                <v:shape id="Shape 3580" style="position:absolute;width:0;height:234;left:29187;top:8057;" coordsize="0,23452" path="m0,23452l0,0x">
                   <v:stroke weight="0.64631pt" endcap="flat" joinstyle="round" on="true" color="#000000"/>
                   <v:fill on="true" color="#000000"/>
                 </v:shape>
-                <v:shape id="Shape 3582" style="position:absolute;width:0;height:234;left:29999;top:8057;" coordsize="0,23452" path="m0,23452l0,0x">
+                <v:shape id="Shape 3581" style="position:absolute;width:0;height:234;left:29999;top:8057;" coordsize="0,23452" path="m0,23452l0,0x">
                   <v:stroke weight="0.64631pt" endcap="flat" joinstyle="round" on="true" color="#000000"/>
                   <v:fill on="true" color="#000000"/>
                 </v:shape>
-                <v:shape id="Shape 3583" style="position:absolute;width:0;height:234;left:30810;top:8057;" coordsize="0,23452" path="m0,23452l0,0x">
+                <v:shape id="Shape 3582" style="position:absolute;width:0;height:234;left:30810;top:8057;" coordsize="0,23452" path="m0,23452l0,0x">
                   <v:stroke weight="0.64631pt" endcap="flat" joinstyle="round" on="true" color="#000000"/>
                   <v:fill on="true" color="#000000"/>
                 </v:shape>
-                <v:shape id="Shape 3584" style="position:absolute;width:0;height:234;left:32433;top:8057;" coordsize="0,23452" path="m0,23452l0,0x">
+                <v:shape id="Shape 3583" style="position:absolute;width:0;height:234;left:32433;top:8057;" coordsize="0,23452" path="m0,23452l0,0x">
                   <v:stroke weight="0.64631pt" endcap="flat" joinstyle="round" on="true" color="#000000"/>
                   <v:fill on="true" color="#000000"/>
                 </v:shape>
-                <v:shape id="Shape 3585" style="position:absolute;width:0;height:234;left:33245;top:8057;" coordsize="0,23452" path="m0,23452l0,0x">
+                <v:shape id="Shape 3584" style="position:absolute;width:0;height:234;left:33245;top:8057;" coordsize="0,23452" path="m0,23452l0,0x">
                   <v:stroke weight="0.64631pt" endcap="flat" joinstyle="round" on="true" color="#000000"/>
                   <v:fill on="true" color="#000000"/>
                 </v:shape>
-                <v:shape id="Shape 3586" style="position:absolute;width:0;height:234;left:34056;top:8057;" coordsize="0,23452" path="m0,23452l0,0x">
+                <v:shape id="Shape 3585" style="position:absolute;width:0;height:234;left:34056;top:8057;" coordsize="0,23452" path="m0,23452l0,0x">
                   <v:stroke weight="0.64631pt" endcap="flat" joinstyle="round" on="true" color="#000000"/>
                   <v:fill on="true" color="#000000"/>
                 </v:shape>
-                <v:shape id="Shape 3587" style="position:absolute;width:0;height:234;left:34867;top:8057;" coordsize="0,23452" path="m0,23452l0,0x">
+                <v:shape id="Shape 3586" style="position:absolute;width:0;height:234;left:34867;top:8057;" coordsize="0,23452" path="m0,23452l0,0x">
                   <v:stroke weight="0.64631pt" endcap="flat" joinstyle="round" on="true" color="#000000"/>
                   <v:fill on="true" color="#000000"/>
                 </v:shape>
-                <v:shape id="Shape 3588" style="position:absolute;width:0;height:234;left:36490;top:8057;" coordsize="0,23452" path="m0,23452l0,0x">
+                <v:shape id="Shape 3587" style="position:absolute;width:0;height:234;left:36490;top:8057;" coordsize="0,23452" path="m0,23452l0,0x">
                   <v:stroke weight="0.64631pt" endcap="flat" joinstyle="round" on="true" color="#000000"/>
                   <v:fill on="true" color="#000000"/>
                 </v:shape>
-                <v:shape id="Shape 3589" style="position:absolute;width:0;height:234;left:37302;top:8057;" coordsize="0,23452" path="m0,23452l0,0x">
+                <v:shape id="Shape 3588" style="position:absolute;width:0;height:234;left:37302;top:8057;" coordsize="0,23452" path="m0,23452l0,0x">
                   <v:stroke weight="0.64631pt" endcap="flat" joinstyle="round" on="true" color="#000000"/>
                   <v:fill on="true" color="#000000"/>
                 </v:shape>
-                <v:shape id="Shape 3590" style="position:absolute;width:0;height:234;left:38113;top:8057;" coordsize="0,23452" path="m0,23452l0,0x">
+                <v:shape id="Shape 3589" style="position:absolute;width:0;height:234;left:38113;top:8057;" coordsize="0,23452" path="m0,23452l0,0x">
                   <v:stroke weight="0.64631pt" endcap="flat" joinstyle="round" on="true" color="#000000"/>
                   <v:fill on="true" color="#000000"/>
                 </v:shape>
-                <v:shape id="Shape 3592" style="position:absolute;width:15287;height:0;left:23034;top:794;" coordsize="1528731,0" path="m0,0l1528731,0">
+                <v:shape id="Shape 3591" style="position:absolute;width:15287;height:0;left:23034;top:794;" coordsize="1528731,0" path="m0,0l1528731,0">
                   <v:stroke weight="0.55398pt" endcap="square" joinstyle="round" on="true" color="#b0b0b0"/>
                   <v:fill on="false" color="#000000" opacity="0"/>
                 </v:shape>
-                <v:shape id="Shape 3593" style="position:absolute;width:410;height:0;left:22623;top:794;" coordsize="41041,0" path="m41041,0l0,0x">
+                <v:shape id="Shape 3592" style="position:absolute;width:410;height:0;left:22623;top:794;" coordsize="41041,0" path="m41041,0l0,0x">
                   <v:stroke weight="1.01563pt" endcap="flat" joinstyle="round" on="true" color="#000000"/>
                   <v:fill on="true" color="#000000"/>
                 </v:shape>
-                <v:shape id="Shape 3595" style="position:absolute;width:15287;height:0;left:23034;top:1930;" coordsize="1528731,0" path="m0,0l1528731,0">
+                <v:shape id="Shape 3594" style="position:absolute;width:15287;height:0;left:23034;top:1930;" coordsize="1528731,0" path="m0,0l1528731,0">
                   <v:stroke weight="0.55398pt" endcap="square" joinstyle="round" on="true" color="#b0b0b0"/>
                   <v:fill on="false" color="#000000" opacity="0"/>
                 </v:shape>
-                <v:shape id="Shape 3596" style="position:absolute;width:410;height:0;left:22623;top:1930;" coordsize="41041,0" path="m41041,0l0,0x">
+                <v:shape id="Shape 3595" style="position:absolute;width:410;height:0;left:22623;top:1930;" coordsize="41041,0" path="m41041,0l0,0x">
                   <v:stroke weight="1.01563pt" endcap="flat" joinstyle="round" on="true" color="#000000"/>
                   <v:fill on="true" color="#000000"/>
                 </v:shape>
-                <v:shape id="Shape 3598" style="position:absolute;width:15287;height:0;left:23034;top:3066;" coordsize="1528731,0" path="m0,0l1528731,0">
+                <v:shape id="Shape 3597" style="position:absolute;width:15287;height:0;left:23034;top:3066;" coordsize="1528731,0" path="m0,0l1528731,0">
                   <v:stroke weight="0.55398pt" endcap="square" joinstyle="round" on="true" color="#b0b0b0"/>
                   <v:fill on="false" color="#000000" opacity="0"/>
                 </v:shape>
-                <v:shape id="Shape 3599" style="position:absolute;width:410;height:0;left:22623;top:3066;" coordsize="41041,0" path="m41041,0l0,0x">
+                <v:shape id="Shape 3598" style="position:absolute;width:410;height:0;left:22623;top:3066;" coordsize="41041,0" path="m41041,0l0,0x">
                   <v:stroke weight="1.01563pt" endcap="flat" joinstyle="round" on="true" color="#000000"/>
                   <v:fill on="true" color="#000000"/>
                 </v:shape>
-                <v:shape id="Shape 3601" style="position:absolute;width:15287;height:0;left:23034;top:4202;" coordsize="1528731,0" path="m0,0l1528731,0">
+                <v:shape id="Shape 3600" style="position:absolute;width:15287;height:0;left:23034;top:4202;" coordsize="1528731,0" path="m0,0l1528731,0">
                   <v:stroke weight="0.55398pt" endcap="square" joinstyle="round" on="true" color="#b0b0b0"/>
                   <v:fill on="false" color="#000000" opacity="0"/>
                 </v:shape>
-                <v:shape id="Shape 3602" style="position:absolute;width:410;height:0;left:22623;top:4202;" coordsize="41041,0" path="m41041,0l0,0x">
+                <v:shape id="Shape 3601" style="position:absolute;width:410;height:0;left:22623;top:4202;" coordsize="41041,0" path="m41041,0l0,0x">
                   <v:stroke weight="1.01563pt" endcap="flat" joinstyle="round" on="true" color="#000000"/>
                   <v:fill on="true" color="#000000"/>
                 </v:shape>
-                <v:shape id="Shape 3604" style="position:absolute;width:15287;height:0;left:23034;top:5338;" coordsize="1528731,0" path="m0,0l1528731,0">
+                <v:shape id="Shape 3603" style="position:absolute;width:15287;height:0;left:23034;top:5338;" coordsize="1528731,0" path="m0,0l1528731,0">
                   <v:stroke weight="0.55398pt" endcap="square" joinstyle="round" on="true" color="#b0b0b0"/>
                   <v:fill on="false" color="#000000" opacity="0"/>
                 </v:shape>
-                <v:shape id="Shape 3605" style="position:absolute;width:410;height:0;left:22623;top:5338;" coordsize="41041,0" path="m41041,0l0,0x">
+                <v:shape id="Shape 3604" style="position:absolute;width:410;height:0;left:22623;top:5338;" coordsize="41041,0" path="m41041,0l0,0x">
                   <v:stroke weight="1.01563pt" endcap="flat" joinstyle="round" on="true" color="#000000"/>
                   <v:fill on="true" color="#000000"/>
                 </v:shape>
-                <v:shape id="Shape 3607" style="position:absolute;width:15287;height:0;left:23034;top:6474;" coordsize="1528731,0" path="m0,0l1528731,0">
+                <v:shape id="Shape 3606" style="position:absolute;width:15287;height:0;left:23034;top:6474;" coordsize="1528731,0" path="m0,0l1528731,0">
                   <v:stroke weight="0.55398pt" endcap="square" joinstyle="round" on="true" color="#b0b0b0"/>
                   <v:fill on="false" color="#000000" opacity="0"/>
                 </v:shape>
-                <v:shape id="Shape 3608" style="position:absolute;width:410;height:0;left:22623;top:6474;" coordsize="41041,0" path="m41041,0l0,0x">
+                <v:shape id="Shape 3607" style="position:absolute;width:410;height:0;left:22623;top:6474;" coordsize="41041,0" path="m41041,0l0,0x">
                   <v:stroke weight="1.01563pt" endcap="flat" joinstyle="round" on="true" color="#000000"/>
                   <v:fill on="true" color="#000000"/>
                 </v:shape>
-                <v:shape id="Shape 3610" style="position:absolute;width:15287;height:0;left:23034;top:7610;" coordsize="1528731,0" path="m0,0l1528731,0">
+                <v:shape id="Shape 3609" style="position:absolute;width:15287;height:0;left:23034;top:7610;" coordsize="1528731,0" path="m0,0l1528731,0">
                   <v:stroke weight="0.55398pt" endcap="square" joinstyle="round" on="true" color="#b0b0b0"/>
                   <v:fill on="false" color="#000000" opacity="0"/>
                 </v:shape>
-                <v:shape id="Shape 3611" style="position:absolute;width:410;height:0;left:22623;top:7610;" coordsize="41041,0" path="m41041,0l0,0x">
+                <v:shape id="Shape 3610" style="position:absolute;width:410;height:0;left:22623;top:7610;" coordsize="41041,0" path="m41041,0l0,0x">
                   <v:stroke weight="1.01563pt" endcap="flat" joinstyle="round" on="true" color="#000000"/>
                   <v:fill on="true" color="#000000"/>
                 </v:shape>
-                <v:shape id="Shape 3613" style="position:absolute;width:234;height:0;left:23034;top:8291;" coordsize="23451,0" path="m23451,0l0,0x">
+                <v:shape id="Shape 3612" style="position:absolute;width:234;height:0;left:23034;top:8291;" coordsize="23451,0" path="m23451,0l0,0x">
                   <v:stroke weight="0.64631pt" endcap="flat" joinstyle="round" on="true" color="#000000"/>
                   <v:fill on="true" color="#000000"/>
                 </v:shape>
-                <v:shape id="Shape 3614" style="position:absolute;width:234;height:0;left:23034;top:8064;" coordsize="23451,0" path="m23451,0l0,0x">
+                <v:shape id="Shape 3613" style="position:absolute;width:234;height:0;left:23034;top:8064;" coordsize="23451,0" path="m23451,0l0,0x">
                   <v:stroke weight="0.64631pt" endcap="flat" joinstyle="round" on="true" color="#000000"/>
                   <v:fill on="true" color="#000000"/>
                 </v:shape>
-                <v:shape id="Shape 3615" style="position:absolute;width:234;height:0;left:23034;top:7837;" coordsize="23451,0" path="m23451,0l0,0x">
+                <v:shape id="Shape 3614" style="position:absolute;width:234;height:0;left:23034;top:7837;" coordsize="23451,0" path="m23451,0l0,0x">
                   <v:stroke weight="0.64631pt" endcap="flat" joinstyle="round" on="true" color="#000000"/>
                   <v:fill on="true" color="#000000"/>
                 </v:shape>
-                <v:shape id="Shape 3616" style="position:absolute;width:234;height:0;left:23034;top:7382;" coordsize="23451,0" path="m23451,0l0,0x">
+                <v:shape id="Shape 3615" style="position:absolute;width:234;height:0;left:23034;top:7382;" coordsize="23451,0" path="m23451,0l0,0x">
                   <v:stroke weight="0.64631pt" endcap="flat" joinstyle="round" on="true" color="#000000"/>
                   <v:fill on="true" color="#000000"/>
                 </v:shape>
-                <v:shape id="Shape 3617" style="position:absolute;width:234;height:0;left:23034;top:7155;" coordsize="23451,0" path="m23451,0l0,0x">
+                <v:shape id="Shape 3616" style="position:absolute;width:234;height:0;left:23034;top:7155;" coordsize="23451,0" path="m23451,0l0,0x">
                   <v:stroke weight="0.64631pt" endcap="flat" joinstyle="round" on="true" color="#000000"/>
                   <v:fill on="true" color="#000000"/>
                 </v:shape>
-                <v:shape id="Shape 3618" style="position:absolute;width:234;height:0;left:23034;top:6928;" coordsize="23451,0" path="m23451,0l0,0x">
+                <v:shape id="Shape 3617" style="position:absolute;width:234;height:0;left:23034;top:6928;" coordsize="23451,0" path="m23451,0l0,0x">
                   <v:stroke weight="0.64631pt" endcap="flat" joinstyle="round" on="true" color="#000000"/>
                   <v:fill on="true" color="#000000"/>
                 </v:shape>
-                <v:shape id="Shape 3619" style="position:absolute;width:234;height:0;left:23034;top:6701;" coordsize="23451,0" path="m23451,0l0,0x">
+                <v:shape id="Shape 3618" style="position:absolute;width:234;height:0;left:23034;top:6701;" coordsize="23451,0" path="m23451,0l0,0x">
                   <v:stroke weight="0.64631pt" endcap="flat" joinstyle="round" on="true" color="#000000"/>
                   <v:fill on="true" color="#000000"/>
                 </v:shape>
-                <v:shape id="Shape 3620" style="position:absolute;width:234;height:0;left:23034;top:6247;" coordsize="23451,0" path="m23451,0l0,0x">
+                <v:shape id="Shape 3619" style="position:absolute;width:234;height:0;left:23034;top:6247;" coordsize="23451,0" path="m23451,0l0,0x">
                   <v:stroke weight="0.64631pt" endcap="flat" joinstyle="round" on="true" color="#000000"/>
                   <v:fill on="true" color="#000000"/>
                 </v:shape>
-                <v:shape id="Shape 3621" style="position:absolute;width:234;height:0;left:23034;top:6019;" coordsize="23451,0" path="m23451,0l0,0x">
+                <v:shape id="Shape 3620" style="position:absolute;width:234;height:0;left:23034;top:6019;" coordsize="23451,0" path="m23451,0l0,0x">
                   <v:stroke weight="0.64631pt" endcap="flat" joinstyle="round" on="true" color="#000000"/>
                   <v:fill on="true" color="#000000"/>
                 </v:shape>
-                <v:shape id="Shape 3622" style="position:absolute;width:234;height:0;left:23034;top:5792;" coordsize="23451,0" path="m23451,0l0,0x">
+                <v:shape id="Shape 3621" style="position:absolute;width:234;height:0;left:23034;top:5792;" coordsize="23451,0" path="m23451,0l0,0x">
                   <v:stroke weight="0.64631pt" endcap="flat" joinstyle="round" on="true" color="#000000"/>
                   <v:fill on="true" color="#000000"/>
                 </v:shape>
-                <v:shape id="Shape 3623" style="position:absolute;width:234;height:0;left:23034;top:5565;" coordsize="23451,0" path="m23451,0l0,0x">
+                <v:shape id="Shape 3622" style="position:absolute;width:234;height:0;left:23034;top:5565;" coordsize="23451,0" path="m23451,0l0,0x">
                   <v:stroke weight="0.64631pt" endcap="flat" joinstyle="round" on="true" color="#000000"/>
                   <v:fill on="true" color="#000000"/>
                 </v:shape>
-                <v:shape id="Shape 3624" style="position:absolute;width:234;height:0;left:23034;top:5111;" coordsize="23451,0" path="m23451,0l0,0x">
+                <v:shape id="Shape 3623" style="position:absolute;width:234;height:0;left:23034;top:5111;" coordsize="23451,0" path="m23451,0l0,0x">
                   <v:stroke weight="0.64631pt" endcap="flat" joinstyle="round" on="true" color="#000000"/>
                   <v:fill on="true" color="#000000"/>
                 </v:shape>
-                <v:shape id="Shape 3625" style="position:absolute;width:234;height:0;left:23034;top:4883;" coordsize="23451,0" path="m23451,0l0,0x">
+                <v:shape id="Shape 3624" style="position:absolute;width:234;height:0;left:23034;top:4883;" coordsize="23451,0" path="m23451,0l0,0x">
                   <v:stroke weight="0.64631pt" endcap="flat" joinstyle="round" on="true" color="#000000"/>
                   <v:fill on="true" color="#000000"/>
                 </v:shape>
-                <v:shape id="Shape 3626" style="position:absolute;width:234;height:0;left:23034;top:4656;" coordsize="23451,0" path="m23451,0l0,0x">
+                <v:shape id="Shape 3625" style="position:absolute;width:234;height:0;left:23034;top:4656;" coordsize="23451,0" path="m23451,0l0,0x">
                   <v:stroke weight="0.64631pt" endcap="flat" joinstyle="round" on="true" color="#000000"/>
                   <v:fill on="true" color="#000000"/>
                 </v:shape>
-                <v:shape id="Shape 3627" style="position:absolute;width:234;height:0;left:23034;top:4429;" coordsize="23451,0" path="m23451,0l0,0x">
+                <v:shape id="Shape 3626" style="position:absolute;width:234;height:0;left:23034;top:4429;" coordsize="23451,0" path="m23451,0l0,0x">
                   <v:stroke weight="0.64631pt" endcap="flat" joinstyle="round" on="true" color="#000000"/>
                   <v:fill on="true" color="#000000"/>
                 </v:shape>
-                <v:shape id="Shape 3628" style="position:absolute;width:234;height:0;left:23034;top:3975;" coordsize="23451,0" path="m23451,0l0,0x">
+                <v:shape id="Shape 3627" style="position:absolute;width:234;height:0;left:23034;top:3975;" coordsize="23451,0" path="m23451,0l0,0x">
                   <v:stroke weight="0.64631pt" endcap="flat" joinstyle="round" on="true" color="#000000"/>
                   <v:fill on="true" color="#000000"/>
                 </v:shape>
-                <v:shape id="Shape 3629" style="position:absolute;width:234;height:0;left:23034;top:3747;" coordsize="23451,0" path="m23451,0l0,0x">
+                <v:shape id="Shape 3628" style="position:absolute;width:234;height:0;left:23034;top:3747;" coordsize="23451,0" path="m23451,0l0,0x">
                   <v:stroke weight="0.64631pt" endcap="flat" joinstyle="round" on="true" color="#000000"/>
                   <v:fill on="true" color="#000000"/>
                 </v:shape>
-                <v:shape id="Shape 3630" style="position:absolute;width:234;height:0;left:23034;top:3520;" coordsize="23451,0" path="m23451,0l0,0x">
+                <v:shape id="Shape 3629" style="position:absolute;width:234;height:0;left:23034;top:3520;" coordsize="23451,0" path="m23451,0l0,0x">
                   <v:stroke weight="0.64631pt" endcap="flat" joinstyle="round" on="true" color="#000000"/>
                   <v:fill on="true" color="#000000"/>
                 </v:shape>
-                <v:shape id="Shape 3631" style="position:absolute;width:234;height:0;left:23034;top:3293;" coordsize="23451,0" path="m23451,0l0,0x">
+                <v:shape id="Shape 3630" style="position:absolute;width:234;height:0;left:23034;top:3293;" coordsize="23451,0" path="m23451,0l0,0x">
                   <v:stroke weight="0.64631pt" endcap="flat" joinstyle="round" on="true" color="#000000"/>
                   <v:fill on="true" color="#000000"/>
                 </v:shape>
-                <v:shape id="Shape 3632" style="position:absolute;width:234;height:0;left:23034;top:2839;" coordsize="23451,0" path="m23451,0l0,0x">
+                <v:shape id="Shape 3631" style="position:absolute;width:234;height:0;left:23034;top:2839;" coordsize="23451,0" path="m23451,0l0,0x">
                   <v:stroke weight="0.64631pt" endcap="flat" joinstyle="round" on="true" color="#000000"/>
                   <v:fill on="true" color="#000000"/>
                 </v:shape>
-                <v:shape id="Shape 3633" style="position:absolute;width:234;height:0;left:23034;top:2611;" coordsize="23451,0" path="m23451,0l0,0x">
+                <v:shape id="Shape 3632" style="position:absolute;width:234;height:0;left:23034;top:2611;" coordsize="23451,0" path="m23451,0l0,0x">
                   <v:stroke weight="0.64631pt" endcap="flat" joinstyle="round" on="true" color="#000000"/>
                   <v:fill on="true" color="#000000"/>
                 </v:shape>
-                <v:shape id="Shape 3634" style="position:absolute;width:234;height:0;left:23034;top:2384;" coordsize="23451,0" path="m23451,0l0,0x">
+                <v:shape id="Shape 3633" style="position:absolute;width:234;height:0;left:23034;top:2384;" coordsize="23451,0" path="m23451,0l0,0x">
                   <v:stroke weight="0.64631pt" endcap="flat" joinstyle="round" on="true" color="#000000"/>
                   <v:fill on="true" color="#000000"/>
                 </v:shape>
-                <v:shape id="Shape 3635" style="position:absolute;width:234;height:0;left:23034;top:2157;" coordsize="23451,0" path="m23451,0l0,0x">
+                <v:shape id="Shape 3634" style="position:absolute;width:234;height:0;left:23034;top:2157;" coordsize="23451,0" path="m23451,0l0,0x">
                   <v:stroke weight="0.64631pt" endcap="flat" joinstyle="round" on="true" color="#000000"/>
                   <v:fill on="true" color="#000000"/>
                 </v:shape>
-                <v:shape id="Shape 3636" style="position:absolute;width:234;height:0;left:23034;top:1703;" coordsize="23451,0" path="m23451,0l0,0x">
+                <v:shape id="Shape 3635" style="position:absolute;width:234;height:0;left:23034;top:1703;" coordsize="23451,0" path="m23451,0l0,0x">
                   <v:stroke weight="0.64631pt" endcap="flat" joinstyle="round" on="true" color="#000000"/>
                   <v:fill on="true" color="#000000"/>
                 </v:shape>
-                <v:shape id="Shape 3637" style="position:absolute;width:234;height:0;left:23034;top:1476;" coordsize="23451,0" path="m23451,0l0,0x">
+                <v:shape id="Shape 3636" style="position:absolute;width:234;height:0;left:23034;top:1476;" coordsize="23451,0" path="m23451,0l0,0x">
                   <v:stroke weight="0.64631pt" endcap="flat" joinstyle="round" on="true" color="#000000"/>
                   <v:fill on="true" color="#000000"/>
                 </v:shape>
-                <v:shape id="Shape 3638" style="position:absolute;width:234;height:0;left:23034;top:1248;" coordsize="23451,0" path="m23451,0l0,0x">
+                <v:shape id="Shape 3637" style="position:absolute;width:234;height:0;left:23034;top:1248;" coordsize="23451,0" path="m23451,0l0,0x">
                   <v:stroke weight="0.64631pt" endcap="flat" joinstyle="round" on="true" color="#000000"/>
                   <v:fill on="true" color="#000000"/>
                 </v:shape>
-                <v:shape id="Shape 3639" style="position:absolute;width:234;height:0;left:23034;top:1021;" coordsize="23451,0" path="m23451,0l0,0x">
+                <v:shape id="Shape 3638" style="position:absolute;width:234;height:0;left:23034;top:1021;" coordsize="23451,0" path="m23451,0l0,0x">
                   <v:stroke weight="0.64631pt" endcap="flat" joinstyle="round" on="true" color="#000000"/>
                   <v:fill on="true" color="#000000"/>
                 </v:shape>
-                <v:shape id="Shape 3640" style="position:absolute;width:234;height:0;left:23034;top:567;" coordsize="23451,0" path="m23451,0l0,0x">
+                <v:shape id="Shape 3639" style="position:absolute;width:234;height:0;left:23034;top:567;" coordsize="23451,0" path="m23451,0l0,0x">
                   <v:stroke weight="0.64631pt" endcap="flat" joinstyle="round" on="true" color="#000000"/>
                   <v:fill on="true" color="#000000"/>
                 </v:shape>
-                <v:shape id="Shape 3641" style="position:absolute;width:234;height:0;left:23034;top:340;" coordsize="23451,0" path="m23451,0l0,0x">
+                <v:shape id="Shape 3640" style="position:absolute;width:234;height:0;left:23034;top:340;" coordsize="23451,0" path="m23451,0l0,0x">
                   <v:stroke weight="0.64631pt" endcap="flat" joinstyle="round" on="true" color="#000000"/>
                   <v:fill on="true" color="#000000"/>
                 </v:shape>
-                <v:shape id="Shape 3642" style="position:absolute;width:234;height:0;left:23034;top:112;" coordsize="23451,0" path="m23451,0l0,0x">
+                <v:shape id="Shape 3641" style="position:absolute;width:234;height:0;left:23034;top:112;" coordsize="23451,0" path="m23451,0l0,0x">
                   <v:stroke weight="0.64631pt" endcap="flat" joinstyle="round" on="true" color="#000000"/>
                   <v:fill on="true" color="#000000"/>
                 </v:shape>
-                <v:shape id="Shape 3643" style="position:absolute;width:5990;height:0;left:23729;top:794;" coordsize="599029,0" path="m0,0l599029,0">
+                <v:shape id="Shape 3642" style="position:absolute;width:5990;height:0;left:23729;top:794;" coordsize="599029,0" path="m0,0l599029,0">
                   <v:stroke weight="0.660159pt" endcap="flat" joinstyle="round" on="true" color="#1c6b73"/>
                   <v:fill on="false" color="#000000" opacity="0"/>
                 </v:shape>
-                <v:shape id="Shape 3644" style="position:absolute;width:6369;height:0;left:24725;top:1930;" coordsize="636963,0" path="m0,0l636963,0">
+                <v:shape id="Shape 3643" style="position:absolute;width:6369;height:0;left:24725;top:1930;" coordsize="636963,0" path="m0,0l636963,0">
                   <v:stroke weight="0.660159pt" endcap="flat" joinstyle="round" on="true" color="#1c6b73"/>
                   <v:fill on="false" color="#000000" opacity="0"/>
                 </v:shape>
-                <v:shape id="Shape 3645" style="position:absolute;width:5923;height:0;left:25333;top:3066;" coordsize="592334,0" path="m0,0l592334,0">
+                <v:shape id="Shape 3644" style="position:absolute;width:5923;height:0;left:25333;top:3066;" coordsize="592334,0" path="m0,0l592334,0">
                   <v:stroke weight="0.660159pt" endcap="flat" joinstyle="round" on="true" color="#1c6b73"/>
                   <v:fill on="false" color="#000000" opacity="0"/>
                 </v:shape>
-                <v:shape id="Shape 3646" style="position:absolute;width:5761;height:0;left:25982;top:4202;" coordsize="576107,0" path="m0,0l576107,0">
+                <v:shape id="Shape 3645" style="position:absolute;width:5761;height:0;left:25982;top:4202;" coordsize="576107,0" path="m0,0l576107,0">
                   <v:stroke weight="0.660159pt" endcap="flat" joinstyle="round" on="true" color="#1c6b73"/>
                   <v:fill on="false" color="#000000" opacity="0"/>
                 </v:shape>
-                <v:shape id="Shape 3647" style="position:absolute;width:6450;height:0;left:26429;top:5338;" coordsize="645077,0" path="m0,0l645077,0">
+                <v:shape id="Shape 3646" style="position:absolute;width:6450;height:0;left:26429;top:5338;" coordsize="645077,0" path="m0,0l645077,0">
                   <v:stroke weight="0.660159pt" endcap="flat" joinstyle="round" on="true" color="#1c6b73"/>
                   <v:fill on="false" color="#000000" opacity="0"/>
                 </v:shape>
-                <v:shape id="Shape 3648" style="position:absolute;width:6856;height:0;left:27199;top:6474;" coordsize="685648,0" path="m0,0l685648,0">
+                <v:shape id="Shape 3647" style="position:absolute;width:6856;height:0;left:27199;top:6474;" coordsize="685648,0" path="m0,0l685648,0">
                   <v:stroke weight="0.660159pt" endcap="flat" joinstyle="round" on="true" color="#1c6b73"/>
                   <v:fill on="false" color="#000000" opacity="0"/>
                 </v:shape>
-                <v:shape id="Shape 3649" style="position:absolute;width:9915;height:0;left:27711;top:7610;" coordsize="991552,0" path="m0,0l991552,0">
+                <v:shape id="Shape 3648" style="position:absolute;width:9915;height:0;left:27711;top:7610;" coordsize="991552,0" path="m0,0l991552,0">
                   <v:stroke weight="0.660159pt" endcap="flat" joinstyle="round" on="true" color="#1c6b73"/>
                   <v:fill on="false" color="#000000" opacity="0"/>
                 </v:shape>
-                <v:shape id="Shape 3650" style="position:absolute;width:0;height:8178;left:23034;top:112;" coordsize="0,817888" path="m0,817888l0,0">
+                <v:shape id="Shape 3649" style="position:absolute;width:0;height:8178;left:23034;top:112;" coordsize="0,817888" path="m0,817888l0,0">
                   <v:stroke weight="1.01563pt" endcap="square" joinstyle="miter" miterlimit="10" on="true" color="#000000"/>
                   <v:fill on="false" color="#000000" opacity="0"/>
                 </v:shape>
-                <v:shape id="Shape 3651" style="position:absolute;width:15287;height:0;left:23034;top:8291;" coordsize="1528731,0" path="m0,0l1528731,0">
+                <v:shape id="Shape 3650" style="position:absolute;width:15287;height:0;left:23034;top:8291;" coordsize="1528731,0" path="m0,0l1528731,0">
                   <v:stroke weight="1.01563pt" endcap="square" joinstyle="miter" miterlimit="10" on="true" color="#000000"/>
                   <v:fill on="false" color="#000000" opacity="0"/>
                 </v:shape>
-                <v:shape id="Shape 3652" style="position:absolute;width:2596;height:0;left:25333;top:794;" coordsize="259653,0" path="m0,0l259653,0">
+                <v:shape id="Shape 3651" style="position:absolute;width:2596;height:0;left:25333;top:794;" coordsize="259653,0" path="m0,0l259653,0">
                   <v:stroke weight="3.12075pt" endcap="flat" joinstyle="round" on="true" color="#1c6b73" opacity="0.45098"/>
                   <v:fill on="false" color="#000000" opacity="0"/>
                 </v:shape>
-                <v:shape id="Shape 3653" style="position:absolute;width:2799;height:0;left:26266;top:1930;" coordsize="279939,0" path="m0,0l279939,0">
+                <v:shape id="Shape 3652" style="position:absolute;width:2799;height:0;left:26266;top:1930;" coordsize="279939,0" path="m0,0l279939,0">
                   <v:stroke weight="3.12075pt" endcap="flat" joinstyle="round" on="true" color="#1c6b73" opacity="0.45098"/>
                   <v:fill on="false" color="#000000" opacity="0"/>
                 </v:shape>
-                <v:shape id="Shape 3654" style="position:absolute;width:2718;height:0;left:26591;top:3066;" coordsize="271825,0" path="m0,0l271825,0">
+                <v:shape id="Shape 3653" style="position:absolute;width:2718;height:0;left:26591;top:3066;" coordsize="271825,0" path="m0,0l271825,0">
                   <v:stroke weight="3.12075pt" endcap="flat" joinstyle="round" on="true" color="#1c6b73" opacity="0.45098"/>
                   <v:fill on="false" color="#000000" opacity="0"/>
                 </v:shape>
-                <v:shape id="Shape 3655" style="position:absolute;width:2718;height:0;left:27118;top:4202;" coordsize="271825,0" path="m0,0l271825,0">
+                <v:shape id="Shape 3654" style="position:absolute;width:2718;height:0;left:27118;top:4202;" coordsize="271825,0" path="m0,0l271825,0">
                   <v:stroke weight="3.12075pt" endcap="flat" joinstyle="round" on="true" color="#1c6b73" opacity="0.45098"/>
                   <v:fill on="false" color="#000000" opacity="0"/>
                 </v:shape>
-                <v:shape id="Shape 3656" style="position:absolute;width:3042;height:0;left:27889;top:5338;" coordsize="304282,0" path="m0,0l304282,0">
+                <v:shape id="Shape 3655" style="position:absolute;width:3042;height:0;left:27889;top:5338;" coordsize="304282,0" path="m0,0l304282,0">
                   <v:stroke weight="3.12075pt" endcap="flat" joinstyle="round" on="true" color="#1c6b73" opacity="0.45098"/>
                   <v:fill on="false" color="#000000" opacity="0"/>
                 </v:shape>
-                <v:shape id="Shape 3657" style="position:absolute;width:2799;height:0;left:29066;top:6474;" coordsize="279939,0" path="m0,0l279939,0">
+                <v:shape id="Shape 3656" style="position:absolute;width:2799;height:0;left:29066;top:6474;" coordsize="279939,0" path="m0,0l279939,0">
                   <v:stroke weight="3.12075pt" endcap="flat" joinstyle="round" on="true" color="#1c6b73" opacity="0.45098"/>
                   <v:fill on="false" color="#000000" opacity="0"/>
                 </v:shape>
-                <v:shape id="Shape 3658" style="position:absolute;width:3854;height:0;left:30202;top:7610;" coordsize="385423,0" path="m0,0l385423,0">
+                <v:shape id="Shape 3657" style="position:absolute;width:3854;height:0;left:30202;top:7610;" coordsize="385423,0" path="m0,0l385423,0">
                   <v:stroke weight="3.12075pt" endcap="flat" joinstyle="round" on="true" color="#1c6b73" opacity="0.45098"/>
                   <v:fill on="false" color="#000000" opacity="0"/>
                 </v:shape>
-                <v:rect id="Rectangle 3659" style="position:absolute;width:476;height:1170;left:37167;top:306;" filled="f" stroked="f">
+                <v:rect id="Rectangle 3658" style="position:absolute;width:476;height:1170;left:37167;top:306;" filled="f" stroked="f">
                   <v:textbox inset="0,0,0,0">
                     <w:txbxContent>
                       <w:p>
@@ -14434,7 +14425,7 @@
                     </w:txbxContent>
                   </v:textbox>
                 </v:rect>
-                <v:rect id="Rectangle 3660" style="position:absolute;width:476;height:1170;left:37167;top:1441;" filled="f" stroked="f">
+                <v:rect id="Rectangle 3659" style="position:absolute;width:476;height:1170;left:37167;top:1441;" filled="f" stroked="f">
                   <v:textbox inset="0,0,0,0">
                     <w:txbxContent>
                       <w:p>
@@ -14455,7 +14446,7 @@
                     </w:txbxContent>
                   </v:textbox>
                 </v:rect>
-                <v:rect id="Rectangle 3661" style="position:absolute;width:476;height:1170;left:37167;top:2577;" filled="f" stroked="f">
+                <v:rect id="Rectangle 3660" style="position:absolute;width:476;height:1170;left:37167;top:2577;" filled="f" stroked="f">
                   <v:textbox inset="0,0,0,0">
                     <w:txbxContent>
                       <w:p>
@@ -14476,7 +14467,7 @@
                     </w:txbxContent>
                   </v:textbox>
                 </v:rect>
-                <v:rect id="Rectangle 3662" style="position:absolute;width:476;height:1170;left:37167;top:3713;" filled="f" stroked="f">
+                <v:rect id="Rectangle 3661" style="position:absolute;width:476;height:1170;left:37167;top:3713;" filled="f" stroked="f">
                   <v:textbox inset="0,0,0,0">
                     <w:txbxContent>
                       <w:p>
@@ -14497,7 +14488,7 @@
                     </w:txbxContent>
                   </v:textbox>
                 </v:rect>
-                <v:rect id="Rectangle 3663" style="position:absolute;width:1430;height:1170;left:37167;top:4849;" filled="f" stroked="f">
+                <v:rect id="Rectangle 3662" style="position:absolute;width:1430;height:1170;left:37167;top:4849;" filled="f" stroked="f">
                   <v:textbox inset="0,0,0,0">
                     <w:txbxContent>
                       <w:p>
@@ -14518,7 +14509,7 @@
                     </w:txbxContent>
                   </v:textbox>
                 </v:rect>
-                <v:rect id="Rectangle 3664" style="position:absolute;width:1430;height:1170;left:37167;top:5985;" filled="f" stroked="f">
+                <v:rect id="Rectangle 3663" style="position:absolute;width:1430;height:1170;left:37167;top:5985;" filled="f" stroked="f">
                   <v:textbox inset="0,0,0,0">
                     <w:txbxContent>
                       <w:p>
@@ -14539,7 +14530,7 @@
                     </w:txbxContent>
                   </v:textbox>
                 </v:rect>
-                <v:rect id="Rectangle 3665" style="position:absolute;width:476;height:1170;left:37167;top:7121;" filled="f" stroked="f">
+                <v:rect id="Rectangle 3664" style="position:absolute;width:476;height:1170;left:37167;top:7121;" filled="f" stroked="f">
                   <v:textbox inset="0,0,0,0">
                     <w:txbxContent>
                       <w:p>
@@ -14560,31 +14551,31 @@
                     </w:txbxContent>
                   </v:textbox>
                 </v:rect>
-                <v:shape id="Shape 3667" style="position:absolute;width:398;height:398;left:26392;top:595;" coordsize="39868,39868" path="m19934,0c25221,0,30291,2100,34030,5838c37767,9577,39868,14647,39868,19934c39868,25221,37767,30291,34030,34030c30291,37768,25221,39868,19934,39868c14647,39868,9577,37768,5838,34030c2101,30291,0,25221,0,19934c0,14647,2101,9577,5838,5838c9577,2100,14647,0,19934,0x">
+                <v:shape id="Shape 3666" style="position:absolute;width:398;height:398;left:26392;top:595;" coordsize="39868,39868" path="m19934,0c25221,0,30291,2100,34030,5838c37767,9577,39868,14647,39868,19934c39868,25221,37767,30291,34030,34030c30291,37768,25221,39868,19934,39868c14647,39868,9577,37768,5838,34030c2101,30291,0,25221,0,19934c0,14647,2101,9577,5838,5838c9577,2100,14647,0,19934,0x">
                   <v:stroke weight="0.83097pt" endcap="flat" joinstyle="round" on="true" color="#1c6b73"/>
                   <v:fill on="true" color="#ffffff"/>
                 </v:shape>
-                <v:shape id="Shape 3668" style="position:absolute;width:398;height:398;left:27325;top:1731;" coordsize="39868,39868" path="m19934,0c25221,0,30292,2100,34030,5839c37768,9577,39868,14648,39868,19934c39868,25221,37768,30291,34030,34030c30292,37768,25221,39868,19934,39868c14648,39868,9577,37768,5839,34030c2101,30291,0,25221,0,19934c0,14648,2101,9577,5839,5839c9577,2100,14648,0,19934,0x">
+                <v:shape id="Shape 3667" style="position:absolute;width:398;height:398;left:27325;top:1731;" coordsize="39868,39868" path="m19934,0c25221,0,30292,2100,34030,5839c37768,9577,39868,14648,39868,19934c39868,25221,37768,30291,34030,34030c30292,37768,25221,39868,19934,39868c14648,39868,9577,37768,5839,34030c2101,30291,0,25221,0,19934c0,14648,2101,9577,5839,5839c9577,2100,14648,0,19934,0x">
                   <v:stroke weight="0.83097pt" endcap="flat" joinstyle="round" on="true" color="#1c6b73"/>
                   <v:fill on="true" color="#ffffff"/>
                 </v:shape>
-                <v:shape id="Shape 3669" style="position:absolute;width:398;height:398;left:27649;top:2866;" coordsize="39868,39868" path="m19934,0c25221,0,30291,2100,34029,5839c37767,9577,39868,14648,39868,19934c39868,25221,37767,30292,34029,34030c30291,37768,25221,39868,19934,39868c14647,39868,9577,37768,5838,34030c2101,30292,0,25221,0,19934c0,14648,2101,9577,5838,5839c9577,2100,14647,0,19934,0x">
+                <v:shape id="Shape 3668" style="position:absolute;width:398;height:398;left:27649;top:2866;" coordsize="39868,39868" path="m19934,0c25221,0,30291,2100,34029,5839c37767,9577,39868,14648,39868,19934c39868,25221,37767,30292,34029,34030c30291,37768,25221,39868,19934,39868c14647,39868,9577,37768,5838,34030c2101,30292,0,25221,0,19934c0,14648,2101,9577,5838,5839c9577,2100,14647,0,19934,0x">
                   <v:stroke weight="0.83097pt" endcap="flat" joinstyle="round" on="true" color="#1c6b73"/>
                   <v:fill on="true" color="#ffffff"/>
                 </v:shape>
-                <v:shape id="Shape 3670" style="position:absolute;width:398;height:398;left:28258;top:4002;" coordsize="39868,39868" path="m19934,0c25221,0,30292,2100,34030,5838c37768,9577,39868,14647,39868,19934c39868,25221,37768,30291,34030,34030c30292,37768,25221,39868,19934,39868c14648,39868,9577,37768,5839,34030c2101,30291,0,25221,0,19934c0,14647,2101,9577,5839,5838c9577,2100,14648,0,19934,0x">
+                <v:shape id="Shape 3669" style="position:absolute;width:398;height:398;left:28258;top:4002;" coordsize="39868,39868" path="m19934,0c25221,0,30292,2100,34030,5838c37768,9577,39868,14647,39868,19934c39868,25221,37768,30291,34030,34030c30292,37768,25221,39868,19934,39868c14648,39868,9577,37768,5839,34030c2101,30291,0,25221,0,19934c0,14647,2101,9577,5839,5838c9577,2100,14648,0,19934,0x">
                   <v:stroke weight="0.83097pt" endcap="flat" joinstyle="round" on="true" color="#1c6b73"/>
                   <v:fill on="true" color="#ffffff"/>
                 </v:shape>
-                <v:shape id="Shape 3671" style="position:absolute;width:398;height:398;left:29029;top:5138;" coordsize="39868,39868" path="m19934,0c25221,0,30291,2100,34029,5839c37767,9577,39868,14648,39868,19934c39868,25221,37767,30291,34029,34030c30291,37768,25221,39868,19934,39868c14647,39868,9577,37768,5838,34030c2100,30291,0,25221,0,19934c0,14648,2100,9577,5838,5839c9577,2100,14647,0,19934,0x">
+                <v:shape id="Shape 3670" style="position:absolute;width:398;height:398;left:29029;top:5138;" coordsize="39868,39868" path="m19934,0c25221,0,30291,2100,34029,5839c37767,9577,39868,14648,39868,19934c39868,25221,37767,30291,34029,34030c30291,37768,25221,39868,19934,39868c14647,39868,9577,37768,5838,34030c2100,30291,0,25221,0,19934c0,14648,2100,9577,5838,5839c9577,2100,14647,0,19934,0x">
                   <v:stroke weight="0.83097pt" endcap="flat" joinstyle="round" on="true" color="#1c6b73"/>
                   <v:fill on="true" color="#ffffff"/>
                 </v:shape>
-                <v:shape id="Shape 3672" style="position:absolute;width:398;height:398;left:30205;top:6274;" coordsize="39868,39868" path="m19934,0c25221,0,30291,2100,34029,5839c37767,9577,39868,14648,39868,19934c39868,25221,37767,30292,34029,34030c30291,37768,25221,39868,19934,39868c14647,39868,9577,37768,5838,34030c2100,30292,0,25221,0,19934c0,14648,2100,9577,5838,5839c9577,2100,14647,0,19934,0x">
+                <v:shape id="Shape 3671" style="position:absolute;width:398;height:398;left:30205;top:6274;" coordsize="39868,39868" path="m19934,0c25221,0,30291,2100,34029,5839c37767,9577,39868,14648,39868,19934c39868,25221,37767,30292,34029,34030c30291,37768,25221,39868,19934,39868c14647,39868,9577,37768,5838,34030c2100,30292,0,25221,0,19934c0,14648,2100,9577,5838,5839c9577,2100,14647,0,19934,0x">
                   <v:stroke weight="0.83097pt" endcap="flat" joinstyle="round" on="true" color="#1c6b73"/>
                   <v:fill on="true" color="#ffffff"/>
                 </v:shape>
-                <v:shape id="Shape 3673" style="position:absolute;width:398;height:398;left:31828;top:7410;" coordsize="39868,39868" path="m19934,0c25221,0,30291,2100,34030,5839c37768,9577,39868,14647,39868,19934c39868,25221,37768,30291,34030,34030c30291,37768,25221,39868,19934,39868c14648,39868,9577,37768,5839,34030c2101,30291,0,25221,0,19934c0,14647,2101,9577,5839,5839c9577,2100,14648,0,19934,0x">
+                <v:shape id="Shape 3672" style="position:absolute;width:398;height:398;left:31828;top:7410;" coordsize="39868,39868" path="m19934,0c25221,0,30291,2100,34030,5839c37768,9577,39868,14647,39868,19934c39868,25221,37768,30291,34030,34030c30291,37768,25221,39868,19934,39868c14648,39868,9577,37768,5839,34030c2101,30291,0,25221,0,19934c0,14647,2101,9577,5839,5839c9577,2100,14648,0,19934,0x">
                   <v:stroke weight="0.83097pt" endcap="flat" joinstyle="round" on="true" color="#1c6b73"/>
                   <v:fill on="true" color="#ffffff"/>
                 </v:shape>
@@ -14692,16 +14683,16 @@
           <w:noProof/>
         </w:rPr>
         <w:drawing>
-          <wp:inline distT="0" distB="0" distL="0" distR="0" wp14:anchorId="652287BC" wp14:editId="78BE23CA">
+          <wp:inline distT="0" distB="0" distL="0" distR="0" wp14:anchorId="39A1E44E" wp14:editId="12C0448D">
             <wp:extent cx="3840480" cy="1228344"/>
             <wp:effectExtent l="0" t="0" r="0" b="0"/>
-            <wp:docPr id="35861" name="Picture 35861"/>
+            <wp:docPr id="35816" name="Picture 35816"/>
             <wp:cNvGraphicFramePr/>
             <a:graphic xmlns:a="http://schemas.openxmlformats.org/drawingml/2006/main">
               <a:graphicData uri="http://schemas.openxmlformats.org/drawingml/2006/picture">
                 <pic:pic xmlns:pic="http://schemas.openxmlformats.org/drawingml/2006/picture">
                   <pic:nvPicPr>
-                    <pic:cNvPr id="35861" name="Picture 35861"/>
+                    <pic:cNvPr id="35816" name="Picture 35816"/>
                     <pic:cNvPicPr/>
                   </pic:nvPicPr>
                   <pic:blipFill>
@@ -14762,16 +14753,16 @@
           <w:noProof/>
         </w:rPr>
         <w:drawing>
-          <wp:inline distT="0" distB="0" distL="0" distR="0" wp14:anchorId="316FFD30" wp14:editId="3050D735">
+          <wp:inline distT="0" distB="0" distL="0" distR="0" wp14:anchorId="7512A23F" wp14:editId="66E74099">
             <wp:extent cx="1773936" cy="871728"/>
             <wp:effectExtent l="0" t="0" r="0" b="0"/>
-            <wp:docPr id="35859" name="Picture 35859"/>
+            <wp:docPr id="35814" name="Picture 35814"/>
             <wp:cNvGraphicFramePr/>
             <a:graphic xmlns:a="http://schemas.openxmlformats.org/drawingml/2006/main">
               <a:graphicData uri="http://schemas.openxmlformats.org/drawingml/2006/picture">
                 <pic:pic xmlns:pic="http://schemas.openxmlformats.org/drawingml/2006/picture">
                   <pic:nvPicPr>
-                    <pic:cNvPr id="35859" name="Picture 35859"/>
+                    <pic:cNvPr id="35814" name="Picture 35814"/>
                     <pic:cNvPicPr/>
                   </pic:nvPicPr>
                   <pic:blipFill>
@@ -14883,16 +14874,16 @@
           <w:noProof/>
         </w:rPr>
         <w:drawing>
-          <wp:inline distT="0" distB="0" distL="0" distR="0" wp14:anchorId="285CCBA5" wp14:editId="0AFD460C">
+          <wp:inline distT="0" distB="0" distL="0" distR="0" wp14:anchorId="50A61535" wp14:editId="0E88741D">
             <wp:extent cx="1773936" cy="871728"/>
             <wp:effectExtent l="0" t="0" r="0" b="0"/>
-            <wp:docPr id="35863" name="Picture 35863"/>
+            <wp:docPr id="35818" name="Picture 35818"/>
             <wp:cNvGraphicFramePr/>
             <a:graphic xmlns:a="http://schemas.openxmlformats.org/drawingml/2006/main">
               <a:graphicData uri="http://schemas.openxmlformats.org/drawingml/2006/picture">
                 <pic:pic xmlns:pic="http://schemas.openxmlformats.org/drawingml/2006/picture">
                   <pic:nvPicPr>
-                    <pic:cNvPr id="35863" name="Picture 35863"/>
+                    <pic:cNvPr id="35818" name="Picture 35818"/>
                     <pic:cNvPicPr/>
                   </pic:nvPicPr>
                   <pic:blipFill>
@@ -15157,10 +15148,10 @@
         <mc:AlternateContent>
           <mc:Choice Requires="wpg">
             <w:drawing>
-              <wp:inline distT="0" distB="0" distL="0" distR="0" wp14:anchorId="3174EA51" wp14:editId="6D4DE27D">
+              <wp:inline distT="0" distB="0" distL="0" distR="0" wp14:anchorId="23DB388E" wp14:editId="2C156605">
                 <wp:extent cx="5911765" cy="1399032"/>
                 <wp:effectExtent l="0" t="0" r="0" b="0"/>
-                <wp:docPr id="35910" name="Group 35910"/>
+                <wp:docPr id="35865" name="Group 35865"/>
                 <wp:cNvGraphicFramePr/>
                 <a:graphic xmlns:a="http://schemas.openxmlformats.org/drawingml/2006/main">
                   <a:graphicData uri="http://schemas.microsoft.com/office/word/2010/wordprocessingGroup">
@@ -15176,7 +15167,7 @@
                       </wpg:grpSpPr>
                       <pic:pic xmlns:pic="http://schemas.openxmlformats.org/drawingml/2006/picture">
                         <pic:nvPicPr>
-                          <pic:cNvPr id="35865" name="Picture 35865"/>
+                          <pic:cNvPr id="35820" name="Picture 35820"/>
                           <pic:cNvPicPr/>
                         </pic:nvPicPr>
                         <pic:blipFill>
@@ -15196,7 +15187,7 @@
                         </pic:spPr>
                       </pic:pic>
                       <wps:wsp>
-                        <wps:cNvPr id="4273" name="Rectangle 4273"/>
+                        <wps:cNvPr id="4272" name="Rectangle 4272"/>
                         <wps:cNvSpPr/>
                         <wps:spPr>
                           <a:xfrm rot="-5399999">
@@ -15240,11 +15231,11 @@
           </mc:Choice>
           <mc:Fallback xmlns:a="http://schemas.openxmlformats.org/drawingml/2006/main">
             <w:pict>
-              <v:group id="Group 35910" style="width:465.493pt;height:110.16pt;mso-position-horizontal-relative:char;mso-position-vertical-relative:line" coordsize="59117,13990">
-                <v:shape id="Picture 35865" style="position:absolute;width:51785;height:13990;left:7332;top:0;" filled="f">
+              <v:group id="Group 35865" style="width:465.493pt;height:110.16pt;mso-position-horizontal-relative:char;mso-position-vertical-relative:line" coordsize="59117,13990">
+                <v:shape id="Picture 35820" style="position:absolute;width:51785;height:13990;left:7332;top:0;" filled="f">
                   <v:imagedata r:id="rId36"/>
                 </v:shape>
-                <v:rect id="Rectangle 4273" style="position:absolute;width:13454;height:3554;left:-4949;top:2076;rotation:270;" filled="f" stroked="f">
+                <v:rect id="Rectangle 4272" style="position:absolute;width:13454;height:3554;left:-4949;top:2076;rotation:270;" filled="f" stroked="f">
                   <v:textbox inset="0,0,0,0" style="layout-flow:vertical;mso-layout-flow-alt:bottom-to-top">
                     <w:txbxContent>
                       <w:p>

</xml_diff>

<commit_message>
Sathyagopal Siddapureddy: full given name in the byline, title page, Zenodo metadata and drafts
Co-Authored-By: Claude Fable 5.1 <noreply@anthropic.com>
</commit_message>
<xml_diff>
--- a/paper/mpda/CTSpinoPelvic1K_coauthor_draft.docx
+++ b/paper/mpda/CTSpinoPelvic1K_coauthor_draft.docx
@@ -76,19 +76,6 @@
     </w:p>
     <w:p>
       <w:pPr>
-        <w:spacing w:after="0" w:line="344" w:lineRule="auto"/>
-        <w:ind w:left="260" w:right="420" w:firstLine="0"/>
-        <w:jc w:val="center"/>
-      </w:pPr>
-      <w:r>
-        <w:rPr>
-          <w:rFonts w:ascii="Calibri" w:eastAsia="Calibri" w:hAnsi="Calibri" w:cs="Calibri"/>
-        </w:rPr>
-        <w:t>Ashley Schehr, Annika Tekumulla, Margret Khoushi, Ryan Christian, Dane Hubers, Faris Mahjoub, Hassan Saad, Mia Sooch, Sathya Siddapureddy, Michael McLellan, and Jerick</w:t>
-      </w:r>
-    </w:p>
-    <w:p>
-      <w:pPr>
         <w:spacing w:after="103" w:line="259" w:lineRule="auto"/>
         <w:ind w:left="715"/>
         <w:jc w:val="left"/>
@@ -97,7 +84,33 @@
         <w:rPr>
           <w:rFonts w:ascii="Calibri" w:eastAsia="Calibri" w:hAnsi="Calibri" w:cs="Calibri"/>
         </w:rPr>
-        <w:t>Kim</w:t>
+        <w:t>Ashley Schehr, Annika Tekumulla, Margret Khoushi, Ryan Christian, Dane Hubers, Faris</w:t>
+      </w:r>
+    </w:p>
+    <w:p>
+      <w:pPr>
+        <w:spacing w:after="103" w:line="259" w:lineRule="auto"/>
+        <w:ind w:left="715"/>
+        <w:jc w:val="left"/>
+      </w:pPr>
+      <w:r>
+        <w:rPr>
+          <w:rFonts w:ascii="Calibri" w:eastAsia="Calibri" w:hAnsi="Calibri" w:cs="Calibri"/>
+        </w:rPr>
+        <w:t>Mahjoub, Hassan Saad, Mia Sooch, Sathyagopal Siddapureddy, Michael McLellan, and</w:t>
+      </w:r>
+    </w:p>
+    <w:p>
+      <w:pPr>
+        <w:spacing w:after="103" w:line="259" w:lineRule="auto"/>
+        <w:ind w:left="715"/>
+        <w:jc w:val="left"/>
+      </w:pPr>
+      <w:r>
+        <w:rPr>
+          <w:rFonts w:ascii="Calibri" w:eastAsia="Calibri" w:hAnsi="Calibri" w:cs="Calibri"/>
+        </w:rPr>
+        <w:t>Jerick Kim</w:t>
       </w:r>
     </w:p>
     <w:p>
@@ -810,10 +823,10 @@
         <mc:AlternateContent>
           <mc:Choice Requires="wpg">
             <w:drawing>
-              <wp:inline distT="0" distB="0" distL="0" distR="0" wp14:anchorId="5F45AB5E" wp14:editId="0ECC2851">
+              <wp:inline distT="0" distB="0" distL="0" distR="0" wp14:anchorId="4A474756" wp14:editId="2B8889A8">
                 <wp:extent cx="5921401" cy="2047825"/>
                 <wp:effectExtent l="0" t="0" r="0" b="0"/>
-                <wp:docPr id="31202" name="Group 31202"/>
+                <wp:docPr id="31450" name="Group 31450"/>
                 <wp:cNvGraphicFramePr/>
                 <a:graphic xmlns:a="http://schemas.openxmlformats.org/drawingml/2006/main">
                   <a:graphicData uri="http://schemas.microsoft.com/office/word/2010/wordprocessingGroup">
@@ -918,7 +931,7 @@
                         <wps:bodyPr/>
                       </wps:wsp>
                       <wps:wsp>
-                        <wps:cNvPr id="5060" name="Rectangle 5060"/>
+                        <wps:cNvPr id="4896" name="Rectangle 4896"/>
                         <wps:cNvSpPr/>
                         <wps:spPr>
                           <a:xfrm>
@@ -954,7 +967,7 @@
                         </wps:bodyPr>
                       </wps:wsp>
                       <wps:wsp>
-                        <wps:cNvPr id="5059" name="Rectangle 5059"/>
+                        <wps:cNvPr id="4895" name="Rectangle 4895"/>
                         <wps:cNvSpPr/>
                         <wps:spPr>
                           <a:xfrm>
@@ -990,7 +1003,7 @@
                         </wps:bodyPr>
                       </wps:wsp>
                       <wps:wsp>
-                        <wps:cNvPr id="5058" name="Rectangle 5058"/>
+                        <wps:cNvPr id="4894" name="Rectangle 4894"/>
                         <wps:cNvSpPr/>
                         <wps:spPr>
                           <a:xfrm>
@@ -1026,7 +1039,7 @@
                         </wps:bodyPr>
                       </wps:wsp>
                       <wps:wsp>
-                        <wps:cNvPr id="5057" name="Rectangle 5057"/>
+                        <wps:cNvPr id="4893" name="Rectangle 4893"/>
                         <wps:cNvSpPr/>
                         <wps:spPr>
                           <a:xfrm>
@@ -1062,7 +1075,7 @@
                         </wps:bodyPr>
                       </wps:wsp>
                       <wps:wsp>
-                        <wps:cNvPr id="5055" name="Rectangle 5055"/>
+                        <wps:cNvPr id="4891" name="Rectangle 4891"/>
                         <wps:cNvSpPr/>
                         <wps:spPr>
                           <a:xfrm>
@@ -1098,7 +1111,7 @@
                         </wps:bodyPr>
                       </wps:wsp>
                       <wps:wsp>
-                        <wps:cNvPr id="5054" name="Rectangle 5054"/>
+                        <wps:cNvPr id="4890" name="Rectangle 4890"/>
                         <wps:cNvSpPr/>
                         <wps:spPr>
                           <a:xfrm>
@@ -1134,7 +1147,7 @@
                         </wps:bodyPr>
                       </wps:wsp>
                       <wps:wsp>
-                        <wps:cNvPr id="5053" name="Rectangle 5053"/>
+                        <wps:cNvPr id="4889" name="Rectangle 4889"/>
                         <wps:cNvSpPr/>
                         <wps:spPr>
                           <a:xfrm>
@@ -1170,7 +1183,7 @@
                         </wps:bodyPr>
                       </wps:wsp>
                       <wps:wsp>
-                        <wps:cNvPr id="5056" name="Rectangle 5056"/>
+                        <wps:cNvPr id="4892" name="Rectangle 4892"/>
                         <wps:cNvSpPr/>
                         <wps:spPr>
                           <a:xfrm>
@@ -1206,7 +1219,7 @@
                         </wps:bodyPr>
                       </wps:wsp>
                       <wps:wsp>
-                        <wps:cNvPr id="5052" name="Rectangle 5052"/>
+                        <wps:cNvPr id="4887" name="Rectangle 4887"/>
                         <wps:cNvSpPr/>
                         <wps:spPr>
                           <a:xfrm>
@@ -1396,7 +1409,7 @@
                         </wps:bodyPr>
                       </wps:wsp>
                       <wps:wsp>
-                        <wps:cNvPr id="36392" name="Shape 36392"/>
+                        <wps:cNvPr id="36397" name="Shape 36397"/>
                         <wps:cNvSpPr/>
                         <wps:spPr>
                           <a:xfrm>
@@ -1450,7 +1463,7 @@
                         <wps:bodyPr/>
                       </wps:wsp>
                       <wps:wsp>
-                        <wps:cNvPr id="36393" name="Shape 36393"/>
+                        <wps:cNvPr id="36398" name="Shape 36398"/>
                         <wps:cNvSpPr/>
                         <wps:spPr>
                           <a:xfrm>
@@ -1613,7 +1626,7 @@
                         </wps:bodyPr>
                       </wps:wsp>
                       <wps:wsp>
-                        <wps:cNvPr id="36394" name="Shape 36394"/>
+                        <wps:cNvPr id="36399" name="Shape 36399"/>
                         <wps:cNvSpPr/>
                         <wps:spPr>
                           <a:xfrm>
@@ -1667,7 +1680,7 @@
                         <wps:bodyPr/>
                       </wps:wsp>
                       <wps:wsp>
-                        <wps:cNvPr id="36395" name="Shape 36395"/>
+                        <wps:cNvPr id="36400" name="Shape 36400"/>
                         <wps:cNvSpPr/>
                         <wps:spPr>
                           <a:xfrm>
@@ -1830,7 +1843,7 @@
                         </wps:bodyPr>
                       </wps:wsp>
                       <wps:wsp>
-                        <wps:cNvPr id="36396" name="Shape 36396"/>
+                        <wps:cNvPr id="36401" name="Shape 36401"/>
                         <wps:cNvSpPr/>
                         <wps:spPr>
                           <a:xfrm>
@@ -1884,7 +1897,7 @@
                         <wps:bodyPr/>
                       </wps:wsp>
                       <wps:wsp>
-                        <wps:cNvPr id="36397" name="Shape 36397"/>
+                        <wps:cNvPr id="36402" name="Shape 36402"/>
                         <wps:cNvSpPr/>
                         <wps:spPr>
                           <a:xfrm>
@@ -2227,7 +2240,7 @@
                         </wps:bodyPr>
                       </wps:wsp>
                       <wps:wsp>
-                        <wps:cNvPr id="36398" name="Shape 36398"/>
+                        <wps:cNvPr id="36403" name="Shape 36403"/>
                         <wps:cNvSpPr/>
                         <wps:spPr>
                           <a:xfrm>
@@ -2390,7 +2403,7 @@
                         </wps:bodyPr>
                       </wps:wsp>
                       <wps:wsp>
-                        <wps:cNvPr id="36399" name="Shape 36399"/>
+                        <wps:cNvPr id="36404" name="Shape 36404"/>
                         <wps:cNvSpPr/>
                         <wps:spPr>
                           <a:xfrm>
@@ -2444,7 +2457,7 @@
                         <wps:bodyPr/>
                       </wps:wsp>
                       <wps:wsp>
-                        <wps:cNvPr id="36400" name="Shape 36400"/>
+                        <wps:cNvPr id="36405" name="Shape 36405"/>
                         <wps:cNvSpPr/>
                         <wps:spPr>
                           <a:xfrm>
@@ -2498,7 +2511,7 @@
                         <wps:bodyPr/>
                       </wps:wsp>
                       <wps:wsp>
-                        <wps:cNvPr id="36401" name="Shape 36401"/>
+                        <wps:cNvPr id="36406" name="Shape 36406"/>
                         <wps:cNvSpPr/>
                         <wps:spPr>
                           <a:xfrm>
@@ -2552,7 +2565,7 @@
                         <wps:bodyPr/>
                       </wps:wsp>
                       <wps:wsp>
-                        <wps:cNvPr id="36402" name="Shape 36402"/>
+                        <wps:cNvPr id="36407" name="Shape 36407"/>
                         <wps:cNvSpPr/>
                         <wps:spPr>
                           <a:xfrm>
@@ -2606,7 +2619,7 @@
                         <wps:bodyPr/>
                       </wps:wsp>
                       <wps:wsp>
-                        <wps:cNvPr id="36403" name="Shape 36403"/>
+                        <wps:cNvPr id="36408" name="Shape 36408"/>
                         <wps:cNvSpPr/>
                         <wps:spPr>
                           <a:xfrm>
@@ -2660,7 +2673,7 @@
                         <wps:bodyPr/>
                       </wps:wsp>
                       <wps:wsp>
-                        <wps:cNvPr id="36404" name="Shape 36404"/>
+                        <wps:cNvPr id="36409" name="Shape 36409"/>
                         <wps:cNvSpPr/>
                         <wps:spPr>
                           <a:xfrm>
@@ -2787,7 +2800,7 @@
                         </wps:bodyPr>
                       </wps:wsp>
                       <wps:wsp>
-                        <wps:cNvPr id="36405" name="Shape 36405"/>
+                        <wps:cNvPr id="36410" name="Shape 36410"/>
                         <wps:cNvSpPr/>
                         <wps:spPr>
                           <a:xfrm>
@@ -2810,276 +2823,6 @@
                                 </a:lnTo>
                                 <a:lnTo>
                                   <a:pt x="457937" y="184925"/>
-                                </a:lnTo>
-                                <a:lnTo>
-                                  <a:pt x="0" y="184925"/>
-                                </a:lnTo>
-                                <a:lnTo>
-                                  <a:pt x="0" y="0"/>
-                                </a:lnTo>
-                              </a:path>
-                            </a:pathLst>
-                          </a:custGeom>
-                          <a:ln w="0" cap="flat">
-                            <a:miter lim="127000"/>
-                          </a:ln>
-                        </wps:spPr>
-                        <wps:style>
-                          <a:lnRef idx="0">
-                            <a:srgbClr val="000000">
-                              <a:alpha val="0"/>
-                            </a:srgbClr>
-                          </a:lnRef>
-                          <a:fillRef idx="1">
-                            <a:srgbClr val="000000"/>
-                          </a:fillRef>
-                          <a:effectRef idx="0">
-                            <a:scrgbClr r="0" g="0" b="0"/>
-                          </a:effectRef>
-                          <a:fontRef idx="none"/>
-                        </wps:style>
-                        <wps:bodyPr/>
-                      </wps:wsp>
-                      <wps:wsp>
-                        <wps:cNvPr id="36406" name="Shape 36406"/>
-                        <wps:cNvSpPr/>
-                        <wps:spPr>
-                          <a:xfrm>
-                            <a:off x="2257933" y="1775816"/>
-                            <a:ext cx="457937" cy="184925"/>
-                          </a:xfrm>
-                          <a:custGeom>
-                            <a:avLst/>
-                            <a:gdLst/>
-                            <a:ahLst/>
-                            <a:cxnLst/>
-                            <a:rect l="0" t="0" r="0" b="0"/>
-                            <a:pathLst>
-                              <a:path w="457937" h="184925">
-                                <a:moveTo>
-                                  <a:pt x="0" y="0"/>
-                                </a:moveTo>
-                                <a:lnTo>
-                                  <a:pt x="457937" y="0"/>
-                                </a:lnTo>
-                                <a:lnTo>
-                                  <a:pt x="457937" y="184925"/>
-                                </a:lnTo>
-                                <a:lnTo>
-                                  <a:pt x="0" y="184925"/>
-                                </a:lnTo>
-                                <a:lnTo>
-                                  <a:pt x="0" y="0"/>
-                                </a:lnTo>
-                              </a:path>
-                            </a:pathLst>
-                          </a:custGeom>
-                          <a:ln w="0" cap="flat">
-                            <a:miter lim="127000"/>
-                          </a:ln>
-                        </wps:spPr>
-                        <wps:style>
-                          <a:lnRef idx="0">
-                            <a:srgbClr val="000000">
-                              <a:alpha val="0"/>
-                            </a:srgbClr>
-                          </a:lnRef>
-                          <a:fillRef idx="1">
-                            <a:srgbClr val="000000"/>
-                          </a:fillRef>
-                          <a:effectRef idx="0">
-                            <a:scrgbClr r="0" g="0" b="0"/>
-                          </a:effectRef>
-                          <a:fontRef idx="none"/>
-                        </wps:style>
-                        <wps:bodyPr/>
-                      </wps:wsp>
-                      <wps:wsp>
-                        <wps:cNvPr id="36407" name="Shape 36407"/>
-                        <wps:cNvSpPr/>
-                        <wps:spPr>
-                          <a:xfrm>
-                            <a:off x="2715870" y="1775816"/>
-                            <a:ext cx="457937" cy="184925"/>
-                          </a:xfrm>
-                          <a:custGeom>
-                            <a:avLst/>
-                            <a:gdLst/>
-                            <a:ahLst/>
-                            <a:cxnLst/>
-                            <a:rect l="0" t="0" r="0" b="0"/>
-                            <a:pathLst>
-                              <a:path w="457937" h="184925">
-                                <a:moveTo>
-                                  <a:pt x="0" y="0"/>
-                                </a:moveTo>
-                                <a:lnTo>
-                                  <a:pt x="457937" y="0"/>
-                                </a:lnTo>
-                                <a:lnTo>
-                                  <a:pt x="457937" y="184925"/>
-                                </a:lnTo>
-                                <a:lnTo>
-                                  <a:pt x="0" y="184925"/>
-                                </a:lnTo>
-                                <a:lnTo>
-                                  <a:pt x="0" y="0"/>
-                                </a:lnTo>
-                              </a:path>
-                            </a:pathLst>
-                          </a:custGeom>
-                          <a:ln w="0" cap="flat">
-                            <a:miter lim="127000"/>
-                          </a:ln>
-                        </wps:spPr>
-                        <wps:style>
-                          <a:lnRef idx="0">
-                            <a:srgbClr val="000000">
-                              <a:alpha val="0"/>
-                            </a:srgbClr>
-                          </a:lnRef>
-                          <a:fillRef idx="1">
-                            <a:srgbClr val="000000"/>
-                          </a:fillRef>
-                          <a:effectRef idx="0">
-                            <a:scrgbClr r="0" g="0" b="0"/>
-                          </a:effectRef>
-                          <a:fontRef idx="none"/>
-                        </wps:style>
-                        <wps:bodyPr/>
-                      </wps:wsp>
-                      <wps:wsp>
-                        <wps:cNvPr id="36408" name="Shape 36408"/>
-                        <wps:cNvSpPr/>
-                        <wps:spPr>
-                          <a:xfrm>
-                            <a:off x="3173794" y="1775816"/>
-                            <a:ext cx="457937" cy="184925"/>
-                          </a:xfrm>
-                          <a:custGeom>
-                            <a:avLst/>
-                            <a:gdLst/>
-                            <a:ahLst/>
-                            <a:cxnLst/>
-                            <a:rect l="0" t="0" r="0" b="0"/>
-                            <a:pathLst>
-                              <a:path w="457937" h="184925">
-                                <a:moveTo>
-                                  <a:pt x="0" y="0"/>
-                                </a:moveTo>
-                                <a:lnTo>
-                                  <a:pt x="457937" y="0"/>
-                                </a:lnTo>
-                                <a:lnTo>
-                                  <a:pt x="457937" y="184925"/>
-                                </a:lnTo>
-                                <a:lnTo>
-                                  <a:pt x="0" y="184925"/>
-                                </a:lnTo>
-                                <a:lnTo>
-                                  <a:pt x="0" y="0"/>
-                                </a:lnTo>
-                              </a:path>
-                            </a:pathLst>
-                          </a:custGeom>
-                          <a:ln w="0" cap="flat">
-                            <a:miter lim="127000"/>
-                          </a:ln>
-                        </wps:spPr>
-                        <wps:style>
-                          <a:lnRef idx="0">
-                            <a:srgbClr val="000000">
-                              <a:alpha val="0"/>
-                            </a:srgbClr>
-                          </a:lnRef>
-                          <a:fillRef idx="1">
-                            <a:srgbClr val="000000"/>
-                          </a:fillRef>
-                          <a:effectRef idx="0">
-                            <a:scrgbClr r="0" g="0" b="0"/>
-                          </a:effectRef>
-                          <a:fontRef idx="none"/>
-                        </wps:style>
-                        <wps:bodyPr/>
-                      </wps:wsp>
-                      <wps:wsp>
-                        <wps:cNvPr id="36409" name="Shape 36409"/>
-                        <wps:cNvSpPr/>
-                        <wps:spPr>
-                          <a:xfrm>
-                            <a:off x="3631730" y="1775816"/>
-                            <a:ext cx="457936" cy="184925"/>
-                          </a:xfrm>
-                          <a:custGeom>
-                            <a:avLst/>
-                            <a:gdLst/>
-                            <a:ahLst/>
-                            <a:cxnLst/>
-                            <a:rect l="0" t="0" r="0" b="0"/>
-                            <a:pathLst>
-                              <a:path w="457936" h="184925">
-                                <a:moveTo>
-                                  <a:pt x="0" y="0"/>
-                                </a:moveTo>
-                                <a:lnTo>
-                                  <a:pt x="457936" y="0"/>
-                                </a:lnTo>
-                                <a:lnTo>
-                                  <a:pt x="457936" y="184925"/>
-                                </a:lnTo>
-                                <a:lnTo>
-                                  <a:pt x="0" y="184925"/>
-                                </a:lnTo>
-                                <a:lnTo>
-                                  <a:pt x="0" y="0"/>
-                                </a:lnTo>
-                              </a:path>
-                            </a:pathLst>
-                          </a:custGeom>
-                          <a:ln w="0" cap="flat">
-                            <a:miter lim="127000"/>
-                          </a:ln>
-                        </wps:spPr>
-                        <wps:style>
-                          <a:lnRef idx="0">
-                            <a:srgbClr val="000000">
-                              <a:alpha val="0"/>
-                            </a:srgbClr>
-                          </a:lnRef>
-                          <a:fillRef idx="1">
-                            <a:srgbClr val="000000"/>
-                          </a:fillRef>
-                          <a:effectRef idx="0">
-                            <a:scrgbClr r="0" g="0" b="0"/>
-                          </a:effectRef>
-                          <a:fontRef idx="none"/>
-                        </wps:style>
-                        <wps:bodyPr/>
-                      </wps:wsp>
-                      <wps:wsp>
-                        <wps:cNvPr id="36410" name="Shape 36410"/>
-                        <wps:cNvSpPr/>
-                        <wps:spPr>
-                          <a:xfrm>
-                            <a:off x="4089667" y="1775816"/>
-                            <a:ext cx="457936" cy="184925"/>
-                          </a:xfrm>
-                          <a:custGeom>
-                            <a:avLst/>
-                            <a:gdLst/>
-                            <a:ahLst/>
-                            <a:cxnLst/>
-                            <a:rect l="0" t="0" r="0" b="0"/>
-                            <a:pathLst>
-                              <a:path w="457936" h="184925">
-                                <a:moveTo>
-                                  <a:pt x="0" y="0"/>
-                                </a:moveTo>
-                                <a:lnTo>
-                                  <a:pt x="457936" y="0"/>
-                                </a:lnTo>
-                                <a:lnTo>
-                                  <a:pt x="457936" y="184925"/>
                                 </a:lnTo>
                                 <a:lnTo>
                                   <a:pt x="0" y="184925"/>
@@ -3115,8 +2858,8 @@
                         <wps:cNvSpPr/>
                         <wps:spPr>
                           <a:xfrm>
-                            <a:off x="4547591" y="1775816"/>
-                            <a:ext cx="457936" cy="184925"/>
+                            <a:off x="2257933" y="1775816"/>
+                            <a:ext cx="457937" cy="184925"/>
                           </a:xfrm>
                           <a:custGeom>
                             <a:avLst/>
@@ -3125,15 +2868,15 @@
                             <a:cxnLst/>
                             <a:rect l="0" t="0" r="0" b="0"/>
                             <a:pathLst>
-                              <a:path w="457936" h="184925">
+                              <a:path w="457937" h="184925">
                                 <a:moveTo>
                                   <a:pt x="0" y="0"/>
                                 </a:moveTo>
                                 <a:lnTo>
-                                  <a:pt x="457936" y="0"/>
-                                </a:lnTo>
-                                <a:lnTo>
-                                  <a:pt x="457936" y="184925"/>
+                                  <a:pt x="457937" y="0"/>
+                                </a:lnTo>
+                                <a:lnTo>
+                                  <a:pt x="457937" y="184925"/>
                                 </a:lnTo>
                                 <a:lnTo>
                                   <a:pt x="0" y="184925"/>
@@ -3169,8 +2912,8 @@
                         <wps:cNvSpPr/>
                         <wps:spPr>
                           <a:xfrm>
-                            <a:off x="5005527" y="1775816"/>
-                            <a:ext cx="457936" cy="184925"/>
+                            <a:off x="2715870" y="1775816"/>
+                            <a:ext cx="457937" cy="184925"/>
                           </a:xfrm>
                           <a:custGeom>
                             <a:avLst/>
@@ -3179,15 +2922,15 @@
                             <a:cxnLst/>
                             <a:rect l="0" t="0" r="0" b="0"/>
                             <a:pathLst>
-                              <a:path w="457936" h="184925">
+                              <a:path w="457937" h="184925">
                                 <a:moveTo>
                                   <a:pt x="0" y="0"/>
                                 </a:moveTo>
                                 <a:lnTo>
-                                  <a:pt x="457936" y="0"/>
-                                </a:lnTo>
-                                <a:lnTo>
-                                  <a:pt x="457936" y="184925"/>
+                                  <a:pt x="457937" y="0"/>
+                                </a:lnTo>
+                                <a:lnTo>
+                                  <a:pt x="457937" y="184925"/>
                                 </a:lnTo>
                                 <a:lnTo>
                                   <a:pt x="0" y="184925"/>
@@ -3220,6 +2963,276 @@
                       </wps:wsp>
                       <wps:wsp>
                         <wps:cNvPr id="36413" name="Shape 36413"/>
+                        <wps:cNvSpPr/>
+                        <wps:spPr>
+                          <a:xfrm>
+                            <a:off x="3173794" y="1775816"/>
+                            <a:ext cx="457937" cy="184925"/>
+                          </a:xfrm>
+                          <a:custGeom>
+                            <a:avLst/>
+                            <a:gdLst/>
+                            <a:ahLst/>
+                            <a:cxnLst/>
+                            <a:rect l="0" t="0" r="0" b="0"/>
+                            <a:pathLst>
+                              <a:path w="457937" h="184925">
+                                <a:moveTo>
+                                  <a:pt x="0" y="0"/>
+                                </a:moveTo>
+                                <a:lnTo>
+                                  <a:pt x="457937" y="0"/>
+                                </a:lnTo>
+                                <a:lnTo>
+                                  <a:pt x="457937" y="184925"/>
+                                </a:lnTo>
+                                <a:lnTo>
+                                  <a:pt x="0" y="184925"/>
+                                </a:lnTo>
+                                <a:lnTo>
+                                  <a:pt x="0" y="0"/>
+                                </a:lnTo>
+                              </a:path>
+                            </a:pathLst>
+                          </a:custGeom>
+                          <a:ln w="0" cap="flat">
+                            <a:miter lim="127000"/>
+                          </a:ln>
+                        </wps:spPr>
+                        <wps:style>
+                          <a:lnRef idx="0">
+                            <a:srgbClr val="000000">
+                              <a:alpha val="0"/>
+                            </a:srgbClr>
+                          </a:lnRef>
+                          <a:fillRef idx="1">
+                            <a:srgbClr val="000000"/>
+                          </a:fillRef>
+                          <a:effectRef idx="0">
+                            <a:scrgbClr r="0" g="0" b="0"/>
+                          </a:effectRef>
+                          <a:fontRef idx="none"/>
+                        </wps:style>
+                        <wps:bodyPr/>
+                      </wps:wsp>
+                      <wps:wsp>
+                        <wps:cNvPr id="36414" name="Shape 36414"/>
+                        <wps:cNvSpPr/>
+                        <wps:spPr>
+                          <a:xfrm>
+                            <a:off x="3631730" y="1775816"/>
+                            <a:ext cx="457936" cy="184925"/>
+                          </a:xfrm>
+                          <a:custGeom>
+                            <a:avLst/>
+                            <a:gdLst/>
+                            <a:ahLst/>
+                            <a:cxnLst/>
+                            <a:rect l="0" t="0" r="0" b="0"/>
+                            <a:pathLst>
+                              <a:path w="457936" h="184925">
+                                <a:moveTo>
+                                  <a:pt x="0" y="0"/>
+                                </a:moveTo>
+                                <a:lnTo>
+                                  <a:pt x="457936" y="0"/>
+                                </a:lnTo>
+                                <a:lnTo>
+                                  <a:pt x="457936" y="184925"/>
+                                </a:lnTo>
+                                <a:lnTo>
+                                  <a:pt x="0" y="184925"/>
+                                </a:lnTo>
+                                <a:lnTo>
+                                  <a:pt x="0" y="0"/>
+                                </a:lnTo>
+                              </a:path>
+                            </a:pathLst>
+                          </a:custGeom>
+                          <a:ln w="0" cap="flat">
+                            <a:miter lim="127000"/>
+                          </a:ln>
+                        </wps:spPr>
+                        <wps:style>
+                          <a:lnRef idx="0">
+                            <a:srgbClr val="000000">
+                              <a:alpha val="0"/>
+                            </a:srgbClr>
+                          </a:lnRef>
+                          <a:fillRef idx="1">
+                            <a:srgbClr val="000000"/>
+                          </a:fillRef>
+                          <a:effectRef idx="0">
+                            <a:scrgbClr r="0" g="0" b="0"/>
+                          </a:effectRef>
+                          <a:fontRef idx="none"/>
+                        </wps:style>
+                        <wps:bodyPr/>
+                      </wps:wsp>
+                      <wps:wsp>
+                        <wps:cNvPr id="36415" name="Shape 36415"/>
+                        <wps:cNvSpPr/>
+                        <wps:spPr>
+                          <a:xfrm>
+                            <a:off x="4089667" y="1775816"/>
+                            <a:ext cx="457936" cy="184925"/>
+                          </a:xfrm>
+                          <a:custGeom>
+                            <a:avLst/>
+                            <a:gdLst/>
+                            <a:ahLst/>
+                            <a:cxnLst/>
+                            <a:rect l="0" t="0" r="0" b="0"/>
+                            <a:pathLst>
+                              <a:path w="457936" h="184925">
+                                <a:moveTo>
+                                  <a:pt x="0" y="0"/>
+                                </a:moveTo>
+                                <a:lnTo>
+                                  <a:pt x="457936" y="0"/>
+                                </a:lnTo>
+                                <a:lnTo>
+                                  <a:pt x="457936" y="184925"/>
+                                </a:lnTo>
+                                <a:lnTo>
+                                  <a:pt x="0" y="184925"/>
+                                </a:lnTo>
+                                <a:lnTo>
+                                  <a:pt x="0" y="0"/>
+                                </a:lnTo>
+                              </a:path>
+                            </a:pathLst>
+                          </a:custGeom>
+                          <a:ln w="0" cap="flat">
+                            <a:miter lim="127000"/>
+                          </a:ln>
+                        </wps:spPr>
+                        <wps:style>
+                          <a:lnRef idx="0">
+                            <a:srgbClr val="000000">
+                              <a:alpha val="0"/>
+                            </a:srgbClr>
+                          </a:lnRef>
+                          <a:fillRef idx="1">
+                            <a:srgbClr val="000000"/>
+                          </a:fillRef>
+                          <a:effectRef idx="0">
+                            <a:scrgbClr r="0" g="0" b="0"/>
+                          </a:effectRef>
+                          <a:fontRef idx="none"/>
+                        </wps:style>
+                        <wps:bodyPr/>
+                      </wps:wsp>
+                      <wps:wsp>
+                        <wps:cNvPr id="36416" name="Shape 36416"/>
+                        <wps:cNvSpPr/>
+                        <wps:spPr>
+                          <a:xfrm>
+                            <a:off x="4547591" y="1775816"/>
+                            <a:ext cx="457936" cy="184925"/>
+                          </a:xfrm>
+                          <a:custGeom>
+                            <a:avLst/>
+                            <a:gdLst/>
+                            <a:ahLst/>
+                            <a:cxnLst/>
+                            <a:rect l="0" t="0" r="0" b="0"/>
+                            <a:pathLst>
+                              <a:path w="457936" h="184925">
+                                <a:moveTo>
+                                  <a:pt x="0" y="0"/>
+                                </a:moveTo>
+                                <a:lnTo>
+                                  <a:pt x="457936" y="0"/>
+                                </a:lnTo>
+                                <a:lnTo>
+                                  <a:pt x="457936" y="184925"/>
+                                </a:lnTo>
+                                <a:lnTo>
+                                  <a:pt x="0" y="184925"/>
+                                </a:lnTo>
+                                <a:lnTo>
+                                  <a:pt x="0" y="0"/>
+                                </a:lnTo>
+                              </a:path>
+                            </a:pathLst>
+                          </a:custGeom>
+                          <a:ln w="0" cap="flat">
+                            <a:miter lim="127000"/>
+                          </a:ln>
+                        </wps:spPr>
+                        <wps:style>
+                          <a:lnRef idx="0">
+                            <a:srgbClr val="000000">
+                              <a:alpha val="0"/>
+                            </a:srgbClr>
+                          </a:lnRef>
+                          <a:fillRef idx="1">
+                            <a:srgbClr val="000000"/>
+                          </a:fillRef>
+                          <a:effectRef idx="0">
+                            <a:scrgbClr r="0" g="0" b="0"/>
+                          </a:effectRef>
+                          <a:fontRef idx="none"/>
+                        </wps:style>
+                        <wps:bodyPr/>
+                      </wps:wsp>
+                      <wps:wsp>
+                        <wps:cNvPr id="36417" name="Shape 36417"/>
+                        <wps:cNvSpPr/>
+                        <wps:spPr>
+                          <a:xfrm>
+                            <a:off x="5005527" y="1775816"/>
+                            <a:ext cx="457936" cy="184925"/>
+                          </a:xfrm>
+                          <a:custGeom>
+                            <a:avLst/>
+                            <a:gdLst/>
+                            <a:ahLst/>
+                            <a:cxnLst/>
+                            <a:rect l="0" t="0" r="0" b="0"/>
+                            <a:pathLst>
+                              <a:path w="457936" h="184925">
+                                <a:moveTo>
+                                  <a:pt x="0" y="0"/>
+                                </a:moveTo>
+                                <a:lnTo>
+                                  <a:pt x="457936" y="0"/>
+                                </a:lnTo>
+                                <a:lnTo>
+                                  <a:pt x="457936" y="184925"/>
+                                </a:lnTo>
+                                <a:lnTo>
+                                  <a:pt x="0" y="184925"/>
+                                </a:lnTo>
+                                <a:lnTo>
+                                  <a:pt x="0" y="0"/>
+                                </a:lnTo>
+                              </a:path>
+                            </a:pathLst>
+                          </a:custGeom>
+                          <a:ln w="0" cap="flat">
+                            <a:miter lim="127000"/>
+                          </a:ln>
+                        </wps:spPr>
+                        <wps:style>
+                          <a:lnRef idx="0">
+                            <a:srgbClr val="000000">
+                              <a:alpha val="0"/>
+                            </a:srgbClr>
+                          </a:lnRef>
+                          <a:fillRef idx="1">
+                            <a:srgbClr val="000000"/>
+                          </a:fillRef>
+                          <a:effectRef idx="0">
+                            <a:scrgbClr r="0" g="0" b="0"/>
+                          </a:effectRef>
+                          <a:fontRef idx="none"/>
+                        </wps:style>
+                        <wps:bodyPr/>
+                      </wps:wsp>
+                      <wps:wsp>
+                        <wps:cNvPr id="36418" name="Shape 36418"/>
                         <wps:cNvSpPr/>
                         <wps:spPr>
                           <a:xfrm>
@@ -3370,7 +3383,7 @@
           </mc:Choice>
           <mc:Fallback xmlns:a="http://schemas.openxmlformats.org/drawingml/2006/main">
             <w:pict>
-              <v:group id="Group 31202" style="width:466.252pt;height:161.246pt;mso-position-horizontal-relative:char;mso-position-vertical-relative:line" coordsize="59214,20478">
+              <v:group id="Group 31450" style="width:466.252pt;height:161.246pt;mso-position-horizontal-relative:char;mso-position-vertical-relative:line" coordsize="59214,20478">
                 <v:shape id="Shape 287" style="position:absolute;width:59214;height:0;left:0;top:0;" coordsize="5921401,0" path="m0,0l5921401,0">
                   <v:stroke weight="0.398pt" endcap="flat" joinstyle="miter" miterlimit="10" on="true" color="#000000"/>
                   <v:fill on="false" color="#000000" opacity="0"/>
@@ -3379,7 +3392,7 @@
                   <v:stroke weight="0.398pt" endcap="flat" joinstyle="miter" miterlimit="10" on="true" color="#000000"/>
                   <v:fill on="false" color="#000000" opacity="0"/>
                 </v:shape>
-                <v:rect id="Rectangle 5060" style="position:absolute;width:16761;height:1636;left:46175;top:1546;" filled="f" stroked="f">
+                <v:rect id="Rectangle 4896" style="position:absolute;width:16761;height:1636;left:46175;top:1546;" filled="f" stroked="f">
                   <v:textbox inset="0,0,0,0">
                     <w:txbxContent>
                       <w:p>
@@ -3399,7 +3412,7 @@
                     </w:txbxContent>
                   </v:textbox>
                 </v:rect>
-                <v:rect id="Rectangle 5059" style="position:absolute;width:3618;height:1636;left:41825;top:1546;" filled="f" stroked="f">
+                <v:rect id="Rectangle 4895" style="position:absolute;width:3618;height:1636;left:41825;top:1546;" filled="f" stroked="f">
                   <v:textbox inset="0,0,0,0">
                     <w:txbxContent>
                       <w:p>
@@ -3419,7 +3432,7 @@
                     </w:txbxContent>
                   </v:textbox>
                 </v:rect>
-                <v:rect id="Rectangle 5058" style="position:absolute;width:4744;height:1636;left:36823;top:1546;" filled="f" stroked="f">
+                <v:rect id="Rectangle 4894" style="position:absolute;width:4744;height:1636;left:36823;top:1546;" filled="f" stroked="f">
                   <v:textbox inset="0,0,0,0">
                     <w:txbxContent>
                       <w:p>
@@ -3439,7 +3452,7 @@
                     </w:txbxContent>
                   </v:textbox>
                 </v:rect>
-                <v:rect id="Rectangle 5057" style="position:absolute;width:1945;height:1636;left:33296;top:1546;" filled="f" stroked="f">
+                <v:rect id="Rectangle 4893" style="position:absolute;width:1945;height:1636;left:33296;top:1546;" filled="f" stroked="f">
                   <v:textbox inset="0,0,0,0">
                     <w:txbxContent>
                       <w:p>
@@ -3459,7 +3472,7 @@
                     </w:txbxContent>
                   </v:textbox>
                 </v:rect>
-                <v:rect id="Rectangle 5055" style="position:absolute;width:2072;height:1636;left:24089;top:1546;" filled="f" stroked="f">
+                <v:rect id="Rectangle 4891" style="position:absolute;width:2072;height:1636;left:24089;top:1546;" filled="f" stroked="f">
                   <v:textbox inset="0,0,0,0">
                     <w:txbxContent>
                       <w:p>
@@ -3479,7 +3492,7 @@
                     </w:txbxContent>
                   </v:textbox>
                 </v:rect>
-                <v:rect id="Rectangle 5054" style="position:absolute;width:4964;height:1636;left:18423;top:1546;" filled="f" stroked="f">
+                <v:rect id="Rectangle 4890" style="position:absolute;width:4964;height:1636;left:18423;top:1546;" filled="f" stroked="f">
                   <v:textbox inset="0,0,0,0">
                     <w:txbxContent>
                       <w:p>
@@ -3499,7 +3512,7 @@
                     </w:txbxContent>
                   </v:textbox>
                 </v:rect>
-                <v:rect id="Rectangle 5053" style="position:absolute;width:4514;height:1636;left:12787;top:1546;" filled="f" stroked="f">
+                <v:rect id="Rectangle 4889" style="position:absolute;width:4514;height:1636;left:12787;top:1546;" filled="f" stroked="f">
                   <v:textbox inset="0,0,0,0">
                     <w:txbxContent>
                       <w:p>
@@ -3519,7 +3532,7 @@
                     </w:txbxContent>
                   </v:textbox>
                 </v:rect>
-                <v:rect id="Rectangle 5056" style="position:absolute;width:6045;height:1636;left:27175;top:1546;" filled="f" stroked="f">
+                <v:rect id="Rectangle 4892" style="position:absolute;width:6045;height:1636;left:27175;top:1546;" filled="f" stroked="f">
                   <v:textbox inset="0,0,0,0">
                     <w:txbxContent>
                       <w:p>
@@ -3539,7 +3552,7 @@
                     </w:txbxContent>
                   </v:textbox>
                 </v:rect>
-                <v:rect id="Rectangle 5052" style="position:absolute;width:8087;height:1636;left:0;top:1546;" filled="f" stroked="f">
+                <v:rect id="Rectangle 4887" style="position:absolute;width:8087;height:1636;left:0;top:1546;" filled="f" stroked="f">
                   <v:textbox inset="0,0,0,0">
                     <w:txbxContent>
                       <w:p>
@@ -3624,11 +3637,11 @@
                     </w:txbxContent>
                   </v:textbox>
                 </v:rect>
-                <v:shape id="Shape 36414" style="position:absolute;width:4579;height:1849;left:17999;top:3998;" coordsize="457937,184925" path="m0,0l457937,0l457937,184925l0,184925l0,0">
+                <v:shape id="Shape 36419" style="position:absolute;width:4579;height:1849;left:17999;top:3998;" coordsize="457937,184925" path="m0,0l457937,0l457937,184925l0,184925l0,0">
                   <v:stroke weight="0pt" endcap="flat" joinstyle="miter" miterlimit="10" on="false" color="#000000" opacity="0"/>
                   <v:fill on="true" color="#000000"/>
                 </v:shape>
-                <v:shape id="Shape 36415" style="position:absolute;width:4579;height:1849;left:22579;top:3998;" coordsize="457937,184925" path="m0,0l457937,0l457937,184925l0,184925l0,0">
+                <v:shape id="Shape 36420" style="position:absolute;width:4579;height:1849;left:22579;top:3998;" coordsize="457937,184925" path="m0,0l457937,0l457937,184925l0,184925l0,0">
                   <v:stroke weight="0pt" endcap="flat" joinstyle="miter" miterlimit="10" on="false" color="#000000" opacity="0"/>
                   <v:fill on="true" color="#000000"/>
                 </v:shape>
@@ -3693,11 +3706,11 @@
                     </w:txbxContent>
                   </v:textbox>
                 </v:rect>
-                <v:shape id="Shape 36416" style="position:absolute;width:4579;height:1849;left:27158;top:6750;" coordsize="457937,184925" path="m0,0l457937,0l457937,184925l0,184925l0,0">
+                <v:shape id="Shape 36421" style="position:absolute;width:4579;height:1849;left:27158;top:6750;" coordsize="457937,184925" path="m0,0l457937,0l457937,184925l0,184925l0,0">
                   <v:stroke weight="0pt" endcap="flat" joinstyle="miter" miterlimit="10" on="false" color="#000000" opacity="0"/>
                   <v:fill on="true" color="#000000"/>
                 </v:shape>
-                <v:shape id="Shape 36417" style="position:absolute;width:4579;height:1849;left:36317;top:6750;" coordsize="457936,184925" path="m0,0l457936,0l457936,184925l0,184925l0,0">
+                <v:shape id="Shape 36422" style="position:absolute;width:4579;height:1849;left:36317;top:6750;" coordsize="457936,184925" path="m0,0l457936,0l457936,184925l0,184925l0,0">
                   <v:stroke weight="0pt" endcap="flat" joinstyle="miter" miterlimit="10" on="false" color="#000000" opacity="0"/>
                   <v:fill on="true" color="#000000"/>
                 </v:shape>
@@ -3762,11 +3775,11 @@
                     </w:txbxContent>
                   </v:textbox>
                 </v:rect>
-                <v:shape id="Shape 36418" style="position:absolute;width:4579;height:1849;left:17999;top:9502;" coordsize="457937,184925" path="m0,0l457937,0l457937,184925l0,184925l0,0">
+                <v:shape id="Shape 36423" style="position:absolute;width:4579;height:1849;left:17999;top:9502;" coordsize="457937,184925" path="m0,0l457937,0l457937,184925l0,184925l0,0">
                   <v:stroke weight="0pt" endcap="flat" joinstyle="miter" miterlimit="10" on="false" color="#000000" opacity="0"/>
                   <v:fill on="true" color="#000000"/>
                 </v:shape>
-                <v:shape id="Shape 36419" style="position:absolute;width:4579;height:1849;left:22579;top:9502;" coordsize="457937,184925" path="m0,0l457937,0l457937,184925l0,184925l0,0">
+                <v:shape id="Shape 36424" style="position:absolute;width:4579;height:1849;left:22579;top:9502;" coordsize="457937,184925" path="m0,0l457937,0l457937,184925l0,184925l0,0">
                   <v:stroke weight="0pt" endcap="flat" joinstyle="miter" miterlimit="10" on="false" color="#000000" opacity="0"/>
                   <v:fill on="true" color="#000000"/>
                 </v:shape>
@@ -3847,7 +3860,7 @@
                     </w:txbxContent>
                   </v:textbox>
                 </v:rect>
-                <v:shape id="Shape 36420" style="position:absolute;width:4579;height:1849;left:40896;top:12254;" coordsize="457936,184925" path="m0,0l457936,0l457936,184925l0,184925l0,0">
+                <v:shape id="Shape 36425" style="position:absolute;width:4579;height:1849;left:40896;top:12254;" coordsize="457936,184925" path="m0,0l457936,0l457936,184925l0,184925l0,0">
                   <v:stroke weight="0pt" endcap="flat" joinstyle="miter" miterlimit="10" on="false" color="#000000" opacity="0"/>
                   <v:fill on="true" color="#000000"/>
                 </v:shape>
@@ -3912,27 +3925,27 @@
                     </w:txbxContent>
                   </v:textbox>
                 </v:rect>
-                <v:shape id="Shape 36421" style="position:absolute;width:4579;height:1849;left:17999;top:15006;" coordsize="457937,184925" path="m0,0l457937,0l457937,184925l0,184925l0,0">
+                <v:shape id="Shape 36426" style="position:absolute;width:4579;height:1849;left:17999;top:15006;" coordsize="457937,184925" path="m0,0l457937,0l457937,184925l0,184925l0,0">
                   <v:stroke weight="0pt" endcap="flat" joinstyle="miter" miterlimit="10" on="false" color="#000000" opacity="0"/>
                   <v:fill on="true" color="#000000"/>
                 </v:shape>
-                <v:shape id="Shape 36422" style="position:absolute;width:4579;height:1849;left:27158;top:15006;" coordsize="457937,184925" path="m0,0l457937,0l457937,184925l0,184925l0,0">
+                <v:shape id="Shape 36427" style="position:absolute;width:4579;height:1849;left:27158;top:15006;" coordsize="457937,184925" path="m0,0l457937,0l457937,184925l0,184925l0,0">
                   <v:stroke weight="0pt" endcap="flat" joinstyle="miter" miterlimit="10" on="false" color="#000000" opacity="0"/>
                   <v:fill on="true" color="#000000"/>
                 </v:shape>
-                <v:shape id="Shape 36423" style="position:absolute;width:4579;height:1849;left:31737;top:15006;" coordsize="457937,184925" path="m0,0l457937,0l457937,184925l0,184925l0,0">
+                <v:shape id="Shape 36428" style="position:absolute;width:4579;height:1849;left:31737;top:15006;" coordsize="457937,184925" path="m0,0l457937,0l457937,184925l0,184925l0,0">
                   <v:stroke weight="0pt" endcap="flat" joinstyle="miter" miterlimit="10" on="false" color="#000000" opacity="0"/>
                   <v:fill on="true" color="#000000"/>
                 </v:shape>
-                <v:shape id="Shape 36424" style="position:absolute;width:4579;height:1849;left:36317;top:15006;" coordsize="457936,184925" path="m0,0l457936,0l457936,184925l0,184925l0,0">
+                <v:shape id="Shape 36429" style="position:absolute;width:4579;height:1849;left:36317;top:15006;" coordsize="457936,184925" path="m0,0l457936,0l457936,184925l0,184925l0,0">
                   <v:stroke weight="0pt" endcap="flat" joinstyle="miter" miterlimit="10" on="false" color="#000000" opacity="0"/>
                   <v:fill on="true" color="#000000"/>
                 </v:shape>
-                <v:shape id="Shape 36425" style="position:absolute;width:4579;height:1849;left:40896;top:15006;" coordsize="457936,184925" path="m0,0l457936,0l457936,184925l0,184925l0,0">
+                <v:shape id="Shape 36430" style="position:absolute;width:4579;height:1849;left:40896;top:15006;" coordsize="457936,184925" path="m0,0l457936,0l457936,184925l0,184925l0,0">
                   <v:stroke weight="0pt" endcap="flat" joinstyle="miter" miterlimit="10" on="false" color="#000000" opacity="0"/>
                   <v:fill on="true" color="#000000"/>
                 </v:shape>
-                <v:shape id="Shape 36426" style="position:absolute;width:4579;height:1849;left:50055;top:15006;" coordsize="457936,184925" path="m0,0l457936,0l457936,184925l0,184925l0,0">
+                <v:shape id="Shape 36431" style="position:absolute;width:4579;height:1849;left:50055;top:15006;" coordsize="457936,184925" path="m0,0l457936,0l457936,184925l0,184925l0,0">
                   <v:stroke weight="0pt" endcap="flat" joinstyle="miter" miterlimit="10" on="false" color="#000000" opacity="0"/>
                   <v:fill on="true" color="#000000"/>
                 </v:shape>
@@ -3977,39 +3990,39 @@
                     </w:txbxContent>
                   </v:textbox>
                 </v:rect>
-                <v:shape id="Shape 36427" style="position:absolute;width:4579;height:1849;left:17999;top:17758;" coordsize="457937,184925" path="m0,0l457937,0l457937,184925l0,184925l0,0">
+                <v:shape id="Shape 36432" style="position:absolute;width:4579;height:1849;left:17999;top:17758;" coordsize="457937,184925" path="m0,0l457937,0l457937,184925l0,184925l0,0">
                   <v:stroke weight="0pt" endcap="flat" joinstyle="miter" miterlimit="10" on="false" color="#000000" opacity="0"/>
                   <v:fill on="true" color="#000000"/>
                 </v:shape>
-                <v:shape id="Shape 36428" style="position:absolute;width:4579;height:1849;left:22579;top:17758;" coordsize="457937,184925" path="m0,0l457937,0l457937,184925l0,184925l0,0">
+                <v:shape id="Shape 36433" style="position:absolute;width:4579;height:1849;left:22579;top:17758;" coordsize="457937,184925" path="m0,0l457937,0l457937,184925l0,184925l0,0">
                   <v:stroke weight="0pt" endcap="flat" joinstyle="miter" miterlimit="10" on="false" color="#000000" opacity="0"/>
                   <v:fill on="true" color="#000000"/>
                 </v:shape>
-                <v:shape id="Shape 36429" style="position:absolute;width:4579;height:1849;left:27158;top:17758;" coordsize="457937,184925" path="m0,0l457937,0l457937,184925l0,184925l0,0">
+                <v:shape id="Shape 36434" style="position:absolute;width:4579;height:1849;left:27158;top:17758;" coordsize="457937,184925" path="m0,0l457937,0l457937,184925l0,184925l0,0">
                   <v:stroke weight="0pt" endcap="flat" joinstyle="miter" miterlimit="10" on="false" color="#000000" opacity="0"/>
                   <v:fill on="true" color="#000000"/>
                 </v:shape>
-                <v:shape id="Shape 36430" style="position:absolute;width:4579;height:1849;left:31737;top:17758;" coordsize="457937,184925" path="m0,0l457937,0l457937,184925l0,184925l0,0">
+                <v:shape id="Shape 36435" style="position:absolute;width:4579;height:1849;left:31737;top:17758;" coordsize="457937,184925" path="m0,0l457937,0l457937,184925l0,184925l0,0">
                   <v:stroke weight="0pt" endcap="flat" joinstyle="miter" miterlimit="10" on="false" color="#000000" opacity="0"/>
                   <v:fill on="true" color="#000000"/>
                 </v:shape>
-                <v:shape id="Shape 36431" style="position:absolute;width:4579;height:1849;left:36317;top:17758;" coordsize="457936,184925" path="m0,0l457936,0l457936,184925l0,184925l0,0">
+                <v:shape id="Shape 36436" style="position:absolute;width:4579;height:1849;left:36317;top:17758;" coordsize="457936,184925" path="m0,0l457936,0l457936,184925l0,184925l0,0">
                   <v:stroke weight="0pt" endcap="flat" joinstyle="miter" miterlimit="10" on="false" color="#000000" opacity="0"/>
                   <v:fill on="true" color="#000000"/>
                 </v:shape>
-                <v:shape id="Shape 36432" style="position:absolute;width:4579;height:1849;left:40896;top:17758;" coordsize="457936,184925" path="m0,0l457936,0l457936,184925l0,184925l0,0">
+                <v:shape id="Shape 36437" style="position:absolute;width:4579;height:1849;left:40896;top:17758;" coordsize="457936,184925" path="m0,0l457936,0l457936,184925l0,184925l0,0">
                   <v:stroke weight="0pt" endcap="flat" joinstyle="miter" miterlimit="10" on="false" color="#000000" opacity="0"/>
                   <v:fill on="true" color="#000000"/>
                 </v:shape>
-                <v:shape id="Shape 36433" style="position:absolute;width:4579;height:1849;left:45475;top:17758;" coordsize="457936,184925" path="m0,0l457936,0l457936,184925l0,184925l0,0">
+                <v:shape id="Shape 36438" style="position:absolute;width:4579;height:1849;left:45475;top:17758;" coordsize="457936,184925" path="m0,0l457936,0l457936,184925l0,184925l0,0">
                   <v:stroke weight="0pt" endcap="flat" joinstyle="miter" miterlimit="10" on="false" color="#000000" opacity="0"/>
                   <v:fill on="true" color="#000000"/>
                 </v:shape>
-                <v:shape id="Shape 36434" style="position:absolute;width:4579;height:1849;left:50055;top:17758;" coordsize="457936,184925" path="m0,0l457936,0l457936,184925l0,184925l0,0">
+                <v:shape id="Shape 36439" style="position:absolute;width:4579;height:1849;left:50055;top:17758;" coordsize="457936,184925" path="m0,0l457936,0l457936,184925l0,184925l0,0">
                   <v:stroke weight="0pt" endcap="flat" joinstyle="miter" miterlimit="10" on="false" color="#000000" opacity="0"/>
                   <v:fill on="true" color="#000000"/>
                 </v:shape>
-                <v:shape id="Shape 36435" style="position:absolute;width:4579;height:1849;left:54634;top:17758;" coordsize="457937,184925" path="m0,0l457937,0l457937,184925l0,184925l0,0">
+                <v:shape id="Shape 36440" style="position:absolute;width:4579;height:1849;left:54634;top:17758;" coordsize="457937,184925" path="m0,0l457937,0l457937,184925l0,184925l0,0">
                   <v:stroke weight="0pt" endcap="flat" joinstyle="miter" miterlimit="10" on="false" color="#000000" opacity="0"/>
                   <v:fill on="true" color="#000000"/>
                 </v:shape>
@@ -4171,16 +4184,16 @@
           <w:noProof/>
         </w:rPr>
         <w:drawing>
-          <wp:inline distT="0" distB="0" distL="0" distR="0" wp14:anchorId="493365DF" wp14:editId="53D7E990">
+          <wp:inline distT="0" distB="0" distL="0" distR="0" wp14:anchorId="3015BC96" wp14:editId="4CF09611">
             <wp:extent cx="2880360" cy="5105401"/>
             <wp:effectExtent l="0" t="0" r="0" b="0"/>
-            <wp:docPr id="35799" name="Picture 35799"/>
+            <wp:docPr id="35801" name="Picture 35801"/>
             <wp:cNvGraphicFramePr/>
             <a:graphic xmlns:a="http://schemas.openxmlformats.org/drawingml/2006/main">
               <a:graphicData uri="http://schemas.openxmlformats.org/drawingml/2006/picture">
                 <pic:pic xmlns:pic="http://schemas.openxmlformats.org/drawingml/2006/picture">
                   <pic:nvPicPr>
-                    <pic:cNvPr id="35799" name="Picture 35799"/>
+                    <pic:cNvPr id="35801" name="Picture 35801"/>
                     <pic:cNvPicPr/>
                   </pic:nvPicPr>
                   <pic:blipFill>
@@ -4898,10 +4911,10 @@
         <mc:AlternateContent>
           <mc:Choice Requires="wpg">
             <w:drawing>
-              <wp:inline distT="0" distB="0" distL="0" distR="0" wp14:anchorId="1D281314" wp14:editId="2570B0F9">
+              <wp:inline distT="0" distB="0" distL="0" distR="0" wp14:anchorId="44B9E045" wp14:editId="29DD8598">
                 <wp:extent cx="1357466" cy="1270317"/>
                 <wp:effectExtent l="0" t="0" r="0" b="0"/>
-                <wp:docPr id="31188" name="Group 31188"/>
+                <wp:docPr id="30939" name="Group 30939"/>
                 <wp:cNvGraphicFramePr/>
                 <a:graphic xmlns:a="http://schemas.openxmlformats.org/drawingml/2006/main">
                   <a:graphicData uri="http://schemas.microsoft.com/office/word/2010/wordprocessingGroup">
@@ -4917,7 +4930,7 @@
                       </wpg:grpSpPr>
                       <pic:pic xmlns:pic="http://schemas.openxmlformats.org/drawingml/2006/picture">
                         <pic:nvPicPr>
-                          <pic:cNvPr id="35801" name="Picture 35801"/>
+                          <pic:cNvPr id="35803" name="Picture 35803"/>
                           <pic:cNvPicPr/>
                         </pic:nvPicPr>
                         <pic:blipFill>
@@ -4937,7 +4950,7 @@
                         </pic:spPr>
                       </pic:pic>
                       <wps:wsp>
-                        <wps:cNvPr id="36436" name="Shape 36436"/>
+                        <wps:cNvPr id="36441" name="Shape 36441"/>
                         <wps:cNvSpPr/>
                         <wps:spPr>
                           <a:xfrm>
@@ -4989,7 +5002,7 @@
                         <wps:bodyPr/>
                       </wps:wsp>
                       <wps:wsp>
-                        <wps:cNvPr id="4999" name="Rectangle 4999"/>
+                        <wps:cNvPr id="4978" name="Rectangle 4978"/>
                         <wps:cNvSpPr/>
                         <wps:spPr>
                           <a:xfrm>
@@ -5026,7 +5039,7 @@
                         </wps:bodyPr>
                       </wps:wsp>
                       <wps:wsp>
-                        <wps:cNvPr id="5001" name="Rectangle 5001"/>
+                        <wps:cNvPr id="4979" name="Rectangle 4979"/>
                         <wps:cNvSpPr/>
                         <wps:spPr>
                           <a:xfrm>
@@ -5063,7 +5076,7 @@
                         </wps:bodyPr>
                       </wps:wsp>
                       <wps:wsp>
-                        <wps:cNvPr id="30166" name="Rectangle 30166"/>
+                        <wps:cNvPr id="30083" name="Rectangle 30083"/>
                         <wps:cNvSpPr/>
                         <wps:spPr>
                           <a:xfrm>
@@ -5100,7 +5113,7 @@
                         </wps:bodyPr>
                       </wps:wsp>
                       <wps:wsp>
-                        <wps:cNvPr id="30167" name="Rectangle 30167"/>
+                        <wps:cNvPr id="30084" name="Rectangle 30084"/>
                         <wps:cNvSpPr/>
                         <wps:spPr>
                           <a:xfrm>
@@ -5137,7 +5150,7 @@
                         </wps:bodyPr>
                       </wps:wsp>
                       <wps:wsp>
-                        <wps:cNvPr id="5005" name="Rectangle 5005"/>
+                        <wps:cNvPr id="4981" name="Rectangle 4981"/>
                         <wps:cNvSpPr/>
                         <wps:spPr>
                           <a:xfrm>
@@ -5174,7 +5187,7 @@
                         </wps:bodyPr>
                       </wps:wsp>
                       <wps:wsp>
-                        <wps:cNvPr id="5007" name="Rectangle 5007"/>
+                        <wps:cNvPr id="4982" name="Rectangle 4982"/>
                         <wps:cNvSpPr/>
                         <wps:spPr>
                           <a:xfrm>
@@ -5218,15 +5231,15 @@
           </mc:Choice>
           <mc:Fallback xmlns:a="http://schemas.openxmlformats.org/drawingml/2006/main">
             <w:pict>
-              <v:group id="Group 31188" style="width:106.887pt;height:100.025pt;mso-position-horizontal-relative:char;mso-position-vertical-relative:line" coordsize="13574,12703">
-                <v:shape id="Picture 35801" style="position:absolute;width:9357;height:10942;left:4204;top:-20;" filled="f">
+              <v:group id="Group 30939" style="width:106.887pt;height:100.025pt;mso-position-horizontal-relative:char;mso-position-vertical-relative:line" coordsize="13574,12703">
+                <v:shape id="Picture 35803" style="position:absolute;width:9357;height:10942;left:4204;top:-20;" filled="f">
                   <v:imagedata r:id="rId11"/>
                 </v:shape>
-                <v:shape id="Shape 36437" style="position:absolute;width:1525;height:533;left:0;top:11921;" coordsize="152509,53378" path="m0,0l152509,0l152509,53378l0,53378l0,0">
+                <v:shape id="Shape 36442" style="position:absolute;width:1525;height:533;left:0;top:11921;" coordsize="152509,53378" path="m0,0l152509,0l152509,53378l0,53378l0,0">
                   <v:stroke weight="0.79004pt" endcap="flat" joinstyle="miter" miterlimit="10" on="true" color="#d64541"/>
                   <v:fill on="true" color="#d64541"/>
                 </v:shape>
-                <v:rect id="Rectangle 4999" style="position:absolute;width:225;height:1384;left:4084;top:11662;" filled="f" stroked="f">
+                <v:rect id="Rectangle 4978" style="position:absolute;width:225;height:1384;left:4084;top:11662;" filled="f" stroked="f">
                   <v:textbox inset="0,0,0,0">
                     <w:txbxContent>
                       <w:p>
@@ -5246,7 +5259,7 @@
                     </w:txbxContent>
                   </v:textbox>
                 </v:rect>
-                <v:rect id="Rectangle 5001" style="position:absolute;width:563;height:1384;left:5694;top:11662;" filled="f" stroked="f">
+                <v:rect id="Rectangle 4979" style="position:absolute;width:563;height:1384;left:5694;top:11662;" filled="f" stroked="f">
                   <v:textbox inset="0,0,0,0">
                     <w:txbxContent>
                       <w:p>
@@ -5266,7 +5279,7 @@
                     </w:txbxContent>
                   </v:textbox>
                 </v:rect>
-                <v:rect id="Rectangle 30166" style="position:absolute;width:281;height:1384;left:6796;top:11662;" filled="f" stroked="f">
+                <v:rect id="Rectangle 30083" style="position:absolute;width:281;height:1384;left:6796;top:11662;" filled="f" stroked="f">
                   <v:textbox inset="0,0,0,0">
                     <w:txbxContent>
                       <w:p>
@@ -5286,7 +5299,7 @@
                     </w:txbxContent>
                   </v:textbox>
                 </v:rect>
-                <v:rect id="Rectangle 30167" style="position:absolute;width:1521;height:1384;left:7220;top:11662;" filled="f" stroked="f">
+                <v:rect id="Rectangle 30084" style="position:absolute;width:1521;height:1384;left:7220;top:11662;" filled="f" stroked="f">
                   <v:textbox inset="0,0,0,0">
                     <w:txbxContent>
                       <w:p>
@@ -5306,7 +5319,7 @@
                     </w:txbxContent>
                   </v:textbox>
                 </v:rect>
-                <v:rect id="Rectangle 5005" style="position:absolute;width:225;height:1384;left:9847;top:11662;" filled="f" stroked="f">
+                <v:rect id="Rectangle 4981" style="position:absolute;width:225;height:1384;left:9847;top:11662;" filled="f" stroked="f">
                   <v:textbox inset="0,0,0,0">
                     <w:txbxContent>
                       <w:p>
@@ -5326,7 +5339,7 @@
                     </w:txbxContent>
                   </v:textbox>
                 </v:rect>
-                <v:rect id="Rectangle 5007" style="position:absolute;width:1352;height:1384;left:12220;top:11662;" filled="f" stroked="f">
+                <v:rect id="Rectangle 4982" style="position:absolute;width:1352;height:1384;left:12220;top:11662;" filled="f" stroked="f">
                   <v:textbox inset="0,0,0,0">
                     <w:txbxContent>
                       <w:p>
@@ -5368,10 +5381,10 @@
         <mc:AlternateContent>
           <mc:Choice Requires="wpg">
             <w:drawing>
-              <wp:inline distT="0" distB="0" distL="0" distR="0" wp14:anchorId="6F41F79A" wp14:editId="50C4C329">
+              <wp:inline distT="0" distB="0" distL="0" distR="0" wp14:anchorId="325AD97C" wp14:editId="6256258A">
                 <wp:extent cx="935000" cy="1270317"/>
                 <wp:effectExtent l="0" t="0" r="0" b="0"/>
-                <wp:docPr id="31189" name="Group 31189"/>
+                <wp:docPr id="30940" name="Group 30940"/>
                 <wp:cNvGraphicFramePr/>
                 <a:graphic xmlns:a="http://schemas.openxmlformats.org/drawingml/2006/main">
                   <a:graphicData uri="http://schemas.microsoft.com/office/word/2010/wordprocessingGroup">
@@ -5387,7 +5400,7 @@
                       </wpg:grpSpPr>
                       <pic:pic xmlns:pic="http://schemas.openxmlformats.org/drawingml/2006/picture">
                         <pic:nvPicPr>
-                          <pic:cNvPr id="35802" name="Picture 35802"/>
+                          <pic:cNvPr id="35804" name="Picture 35804"/>
                           <pic:cNvPicPr/>
                         </pic:nvPicPr>
                         <pic:blipFill>
@@ -5407,7 +5420,7 @@
                         </pic:spPr>
                       </pic:pic>
                       <wps:wsp>
-                        <wps:cNvPr id="5009" name="Rectangle 5009"/>
+                        <wps:cNvPr id="4984" name="Rectangle 4984"/>
                         <wps:cNvSpPr/>
                         <wps:spPr>
                           <a:xfrm>
@@ -5444,7 +5457,7 @@
                         </wps:bodyPr>
                       </wps:wsp>
                       <wps:wsp>
-                        <wps:cNvPr id="36438" name="Shape 36438"/>
+                        <wps:cNvPr id="36443" name="Shape 36443"/>
                         <wps:cNvSpPr/>
                         <wps:spPr>
                           <a:xfrm>
@@ -5496,7 +5509,7 @@
                         <wps:bodyPr/>
                       </wps:wsp>
                       <wps:wsp>
-                        <wps:cNvPr id="5010" name="Rectangle 5010"/>
+                        <wps:cNvPr id="4985" name="Rectangle 4985"/>
                         <wps:cNvSpPr/>
                         <wps:spPr>
                           <a:xfrm>
@@ -5533,7 +5546,7 @@
                         </wps:bodyPr>
                       </wps:wsp>
                       <wps:wsp>
-                        <wps:cNvPr id="5011" name="Rectangle 5011"/>
+                        <wps:cNvPr id="4986" name="Rectangle 4986"/>
                         <wps:cNvSpPr/>
                         <wps:spPr>
                           <a:xfrm>
@@ -5577,11 +5590,11 @@
           </mc:Choice>
           <mc:Fallback xmlns:a="http://schemas.openxmlformats.org/drawingml/2006/main">
             <w:pict>
-              <v:group id="Group 31189" style="width:73.622pt;height:100.025pt;mso-position-horizontal-relative:char;mso-position-vertical-relative:line" coordsize="9350,12703">
-                <v:shape id="Picture 35802" style="position:absolute;width:9387;height:10942;left:-34;top:-20;" filled="f">
+              <v:group id="Group 30940" style="width:73.622pt;height:100.025pt;mso-position-horizontal-relative:char;mso-position-vertical-relative:line" coordsize="9350,12703">
+                <v:shape id="Picture 35804" style="position:absolute;width:9387;height:10942;left:-34;top:-20;" filled="f">
                   <v:imagedata r:id="rId13"/>
                 </v:shape>
-                <v:rect id="Rectangle 5009" style="position:absolute;width:225;height:1384;left:2121;top:11662;" filled="f" stroked="f">
+                <v:rect id="Rectangle 4984" style="position:absolute;width:225;height:1384;left:2121;top:11662;" filled="f" stroked="f">
                   <v:textbox inset="0,0,0,0">
                     <w:txbxContent>
                       <w:p>
@@ -5601,11 +5614,11 @@
                     </w:txbxContent>
                   </v:textbox>
                 </v:rect>
-                <v:shape id="Shape 36439" style="position:absolute;width:1525;height:533;left:4298;top:11921;" coordsize="152509,53378" path="m0,0l152509,0l152509,53378l0,53378l0,0">
+                <v:shape id="Shape 36444" style="position:absolute;width:1525;height:533;left:4298;top:11921;" coordsize="152509,53378" path="m0,0l152509,0l152509,53378l0,53378l0,0">
                   <v:stroke weight="0.79004pt" endcap="flat" joinstyle="miter" miterlimit="10" on="true" color="#e8b044"/>
                   <v:fill on="true" color="#e8b044"/>
                 </v:shape>
-                <v:rect id="Rectangle 5010" style="position:absolute;width:563;height:1384;left:6645;top:11662;" filled="f" stroked="f">
+                <v:rect id="Rectangle 4985" style="position:absolute;width:563;height:1384;left:6645;top:11662;" filled="f" stroked="f">
                   <v:textbox inset="0,0,0,0">
                     <w:txbxContent>
                       <w:p>
@@ -5625,7 +5638,7 @@
                     </w:txbxContent>
                   </v:textbox>
                 </v:rect>
-                <v:rect id="Rectangle 5011" style="position:absolute;width:225;height:1384;left:7959;top:11662;" filled="f" stroked="f">
+                <v:rect id="Rectangle 4986" style="position:absolute;width:225;height:1384;left:7959;top:11662;" filled="f" stroked="f">
                   <v:textbox inset="0,0,0,0">
                     <w:txbxContent>
                       <w:p>
@@ -5666,10 +5679,10 @@
         <mc:AlternateContent>
           <mc:Choice Requires="wpg">
             <w:drawing>
-              <wp:inline distT="0" distB="0" distL="0" distR="0" wp14:anchorId="277FCB3F" wp14:editId="6CA4F112">
+              <wp:inline distT="0" distB="0" distL="0" distR="0" wp14:anchorId="1DEB0184" wp14:editId="5BA5EB62">
                 <wp:extent cx="2247082" cy="1270317"/>
                 <wp:effectExtent l="0" t="0" r="0" b="0"/>
-                <wp:docPr id="31190" name="Group 31190"/>
+                <wp:docPr id="30941" name="Group 30941"/>
                 <wp:cNvGraphicFramePr/>
                 <a:graphic xmlns:a="http://schemas.openxmlformats.org/drawingml/2006/main">
                   <a:graphicData uri="http://schemas.microsoft.com/office/word/2010/wordprocessingGroup">
@@ -5685,7 +5698,7 @@
                       </wpg:grpSpPr>
                       <pic:pic xmlns:pic="http://schemas.openxmlformats.org/drawingml/2006/picture">
                         <pic:nvPicPr>
-                          <pic:cNvPr id="35803" name="Picture 35803"/>
+                          <pic:cNvPr id="35805" name="Picture 35805"/>
                           <pic:cNvPicPr/>
                         </pic:nvPicPr>
                         <pic:blipFill>
@@ -5706,7 +5719,7 @@
                       </pic:pic>
                       <pic:pic xmlns:pic="http://schemas.openxmlformats.org/drawingml/2006/picture">
                         <pic:nvPicPr>
-                          <pic:cNvPr id="35804" name="Picture 35804"/>
+                          <pic:cNvPr id="35806" name="Picture 35806"/>
                           <pic:cNvPicPr/>
                         </pic:nvPicPr>
                         <pic:blipFill>
@@ -5726,7 +5739,7 @@
                         </pic:spPr>
                       </pic:pic>
                       <wps:wsp>
-                        <wps:cNvPr id="5012" name="Rectangle 5012"/>
+                        <wps:cNvPr id="4987" name="Rectangle 4987"/>
                         <wps:cNvSpPr/>
                         <wps:spPr>
                           <a:xfrm>
@@ -5763,7 +5776,7 @@
                         </wps:bodyPr>
                       </wps:wsp>
                       <wps:wsp>
-                        <wps:cNvPr id="5013" name="Rectangle 5013"/>
+                        <wps:cNvPr id="4988" name="Rectangle 4988"/>
                         <wps:cNvSpPr/>
                         <wps:spPr>
                           <a:xfrm>
@@ -5800,7 +5813,7 @@
                         </wps:bodyPr>
                       </wps:wsp>
                       <wps:wsp>
-                        <wps:cNvPr id="36440" name="Shape 36440"/>
+                        <wps:cNvPr id="36445" name="Shape 36445"/>
                         <wps:cNvSpPr/>
                         <wps:spPr>
                           <a:xfrm>
@@ -5852,7 +5865,7 @@
                         <wps:bodyPr/>
                       </wps:wsp>
                       <wps:wsp>
-                        <wps:cNvPr id="5014" name="Rectangle 5014"/>
+                        <wps:cNvPr id="4999" name="Rectangle 4999"/>
                         <wps:cNvSpPr/>
                         <wps:spPr>
                           <a:xfrm>
@@ -5889,7 +5902,7 @@
                         </wps:bodyPr>
                       </wps:wsp>
                       <wps:wsp>
-                        <wps:cNvPr id="5015" name="Rectangle 5015"/>
+                        <wps:cNvPr id="5002" name="Rectangle 5002"/>
                         <wps:cNvSpPr/>
                         <wps:spPr>
                           <a:xfrm>
@@ -5926,7 +5939,7 @@
                         </wps:bodyPr>
                       </wps:wsp>
                       <wps:wsp>
-                        <wps:cNvPr id="5016" name="Rectangle 5016"/>
+                        <wps:cNvPr id="5005" name="Rectangle 5005"/>
                         <wps:cNvSpPr/>
                         <wps:spPr>
                           <a:xfrm>
@@ -5963,7 +5976,7 @@
                         </wps:bodyPr>
                       </wps:wsp>
                       <wps:wsp>
-                        <wps:cNvPr id="5018" name="Rectangle 5018"/>
+                        <wps:cNvPr id="5006" name="Rectangle 5006"/>
                         <wps:cNvSpPr/>
                         <wps:spPr>
                           <a:xfrm>
@@ -6007,14 +6020,14 @@
           </mc:Choice>
           <mc:Fallback xmlns:a="http://schemas.openxmlformats.org/drawingml/2006/main">
             <w:pict>
-              <v:group id="Group 31190" style="width:176.936pt;height:100.025pt;mso-position-horizontal-relative:char;mso-position-vertical-relative:line" coordsize="22470,12703">
-                <v:shape id="Picture 35803" style="position:absolute;width:9387;height:10942;left:-38;top:-20;" filled="f">
+              <v:group id="Group 30941" style="width:176.936pt;height:100.025pt;mso-position-horizontal-relative:char;mso-position-vertical-relative:line" coordsize="22470,12703">
+                <v:shape id="Picture 35805" style="position:absolute;width:9387;height:10942;left:-38;top:-20;" filled="f">
                   <v:imagedata r:id="rId16"/>
                 </v:shape>
-                <v:shape id="Picture 35804" style="position:absolute;width:9387;height:10942;left:13078;top:-20;" filled="f">
+                <v:shape id="Picture 35806" style="position:absolute;width:9387;height:10942;left:13078;top:-20;" filled="f">
                   <v:imagedata r:id="rId17"/>
                 </v:shape>
-                <v:rect id="Rectangle 5012" style="position:absolute;width:732;height:1384;left:4629;top:11662;" filled="f" stroked="f">
+                <v:rect id="Rectangle 4987" style="position:absolute;width:732;height:1384;left:4629;top:11662;" filled="f" stroked="f">
                   <v:textbox inset="0,0,0,0">
                     <w:txbxContent>
                       <w:p>
@@ -6034,7 +6047,7 @@
                     </w:txbxContent>
                   </v:textbox>
                 </v:rect>
-                <v:rect id="Rectangle 5013" style="position:absolute;width:563;height:1384;left:6875;top:11662;" filled="f" stroked="f">
+                <v:rect id="Rectangle 4988" style="position:absolute;width:563;height:1384;left:6875;top:11662;" filled="f" stroked="f">
                   <v:textbox inset="0,0,0,0">
                     <w:txbxContent>
                       <w:p>
@@ -6054,11 +6067,11 @@
                     </w:txbxContent>
                   </v:textbox>
                 </v:rect>
-                <v:shape id="Shape 36441" style="position:absolute;width:1525;height:533;left:9931;top:11921;" coordsize="152509,53378" path="m0,0l152509,0l152509,53378l0,53378l0,0">
+                <v:shape id="Shape 36446" style="position:absolute;width:1525;height:533;left:9931;top:11921;" coordsize="152509,53378" path="m0,0l152509,0l152509,53378l0,53378l0,0">
                   <v:stroke weight="0.79004pt" endcap="flat" joinstyle="miter" miterlimit="10" on="true" color="#306ebe"/>
                   <v:fill on="true" color="#306ebe"/>
                 </v:shape>
-                <v:rect id="Rectangle 5014" style="position:absolute;width:225;height:1384;left:14144;top:11662;" filled="f" stroked="f">
+                <v:rect id="Rectangle 4999" style="position:absolute;width:225;height:1384;left:14144;top:11662;" filled="f" stroked="f">
                   <v:textbox inset="0,0,0,0">
                     <w:txbxContent>
                       <w:p>
@@ -6078,7 +6091,7 @@
                     </w:txbxContent>
                   </v:textbox>
                 </v:rect>
-                <v:rect id="Rectangle 5015" style="position:absolute;width:563;height:1384;left:15754;top:11662;" filled="f" stroked="f">
+                <v:rect id="Rectangle 5002" style="position:absolute;width:563;height:1384;left:15754;top:11662;" filled="f" stroked="f">
                   <v:textbox inset="0,0,0,0">
                     <w:txbxContent>
                       <w:p>
@@ -6098,7 +6111,7 @@
                     </w:txbxContent>
                   </v:textbox>
                 </v:rect>
-                <v:rect id="Rectangle 5016" style="position:absolute;width:281;height:1384;left:16856;top:11662;" filled="f" stroked="f">
+                <v:rect id="Rectangle 5005" style="position:absolute;width:281;height:1384;left:16856;top:11662;" filled="f" stroked="f">
                   <v:textbox inset="0,0,0,0">
                     <w:txbxContent>
                       <w:p>
@@ -6118,7 +6131,7 @@
                     </w:txbxContent>
                   </v:textbox>
                 </v:rect>
-                <v:rect id="Rectangle 5018" style="position:absolute;width:281;height:1384;left:18213;top:11662;" filled="f" stroked="f">
+                <v:rect id="Rectangle 5006" style="position:absolute;width:281;height:1384;left:18213;top:11662;" filled="f" stroked="f">
                   <v:textbox inset="0,0,0,0">
                     <w:txbxContent>
                       <w:p>
@@ -6229,10 +6242,10 @@
         <mc:AlternateContent>
           <mc:Choice Requires="wpg">
             <w:drawing>
-              <wp:inline distT="0" distB="0" distL="0" distR="0" wp14:anchorId="0EC140CB" wp14:editId="26DF6BF6">
+              <wp:inline distT="0" distB="0" distL="0" distR="0" wp14:anchorId="074404EB" wp14:editId="577D5794">
                 <wp:extent cx="46876" cy="5055"/>
                 <wp:effectExtent l="0" t="0" r="0" b="0"/>
-                <wp:docPr id="31191" name="Group 31191"/>
+                <wp:docPr id="30942" name="Group 30942"/>
                 <wp:cNvGraphicFramePr/>
                 <a:graphic xmlns:a="http://schemas.openxmlformats.org/drawingml/2006/main">
                   <a:graphicData uri="http://schemas.microsoft.com/office/word/2010/wordprocessingGroup">
@@ -6299,7 +6312,7 @@
           </mc:Choice>
           <mc:Fallback xmlns:a="http://schemas.openxmlformats.org/drawingml/2006/main">
             <w:pict>
-              <v:group id="Group 31191" style="width:3.69101pt;height:0.398pt;mso-position-horizontal-relative:char;mso-position-vertical-relative:line" coordsize="468,50">
+              <v:group id="Group 30942" style="width:3.69101pt;height:0.398pt;mso-position-horizontal-relative:char;mso-position-vertical-relative:line" coordsize="468,50">
                 <v:shape id="Shape 755" style="position:absolute;width:468;height:0;left:0;top:0;" coordsize="46876,0" path="m0,0l46876,0">
                   <v:stroke weight="0.398pt" endcap="flat" joinstyle="miter" miterlimit="10" on="true" color="#000000"/>
                   <v:fill on="false" color="#000000" opacity="0"/>
@@ -6324,10 +6337,10 @@
         <mc:AlternateContent>
           <mc:Choice Requires="wpg">
             <w:drawing>
-              <wp:inline distT="0" distB="0" distL="0" distR="0" wp14:anchorId="643D8964" wp14:editId="27CCB70B">
+              <wp:inline distT="0" distB="0" distL="0" distR="0" wp14:anchorId="7E95A90C" wp14:editId="4E831ADC">
                 <wp:extent cx="46875" cy="5055"/>
                 <wp:effectExtent l="0" t="0" r="0" b="0"/>
-                <wp:docPr id="31192" name="Group 31192"/>
+                <wp:docPr id="30943" name="Group 30943"/>
                 <wp:cNvGraphicFramePr/>
                 <a:graphic xmlns:a="http://schemas.openxmlformats.org/drawingml/2006/main">
                   <a:graphicData uri="http://schemas.microsoft.com/office/word/2010/wordprocessingGroup">
@@ -6394,7 +6407,7 @@
           </mc:Choice>
           <mc:Fallback xmlns:a="http://schemas.openxmlformats.org/drawingml/2006/main">
             <w:pict>
-              <v:group id="Group 31192" style="width:3.69098pt;height:0.398pt;mso-position-horizontal-relative:char;mso-position-vertical-relative:line" coordsize="468,50">
+              <v:group id="Group 30943" style="width:3.69098pt;height:0.398pt;mso-position-horizontal-relative:char;mso-position-vertical-relative:line" coordsize="468,50">
                 <v:shape id="Shape 757" style="position:absolute;width:468;height:0;left:0;top:0;" coordsize="46875,0" path="m0,0l46875,0">
                   <v:stroke weight="0.398pt" endcap="flat" joinstyle="miter" miterlimit="10" on="true" color="#000000"/>
                   <v:fill on="false" color="#000000" opacity="0"/>
@@ -6642,10 +6655,10 @@
         <mc:AlternateContent>
           <mc:Choice Requires="wpg">
             <w:drawing>
-              <wp:inline distT="0" distB="0" distL="0" distR="0" wp14:anchorId="7396E22E" wp14:editId="7E6FFFF5">
+              <wp:inline distT="0" distB="0" distL="0" distR="0" wp14:anchorId="16AA3A2C" wp14:editId="1B867211">
                 <wp:extent cx="46876" cy="5055"/>
                 <wp:effectExtent l="0" t="0" r="0" b="0"/>
-                <wp:docPr id="30164" name="Group 30164"/>
+                <wp:docPr id="30286" name="Group 30286"/>
                 <wp:cNvGraphicFramePr/>
                 <a:graphic xmlns:a="http://schemas.openxmlformats.org/drawingml/2006/main">
                   <a:graphicData uri="http://schemas.microsoft.com/office/word/2010/wordprocessingGroup">
@@ -6712,7 +6725,7 @@
           </mc:Choice>
           <mc:Fallback xmlns:a="http://schemas.openxmlformats.org/drawingml/2006/main">
             <w:pict>
-              <v:group id="Group 30164" style="width:3.69099pt;height:0.398pt;mso-position-horizontal-relative:char;mso-position-vertical-relative:line" coordsize="468,50">
+              <v:group id="Group 30286" style="width:3.69099pt;height:0.398pt;mso-position-horizontal-relative:char;mso-position-vertical-relative:line" coordsize="468,50">
                 <v:shape id="Shape 839" style="position:absolute;width:468;height:0;left:0;top:0;" coordsize="46876,0" path="m0,0l46876,0">
                   <v:stroke weight="0.398pt" endcap="flat" joinstyle="miter" miterlimit="10" on="true" color="#000000"/>
                   <v:fill on="false" color="#000000" opacity="0"/>
@@ -7167,16 +7180,16 @@
                 <w:noProof/>
               </w:rPr>
               <w:drawing>
-                <wp:inline distT="0" distB="0" distL="0" distR="0" wp14:anchorId="29BB66F2" wp14:editId="15691F05">
+                <wp:inline distT="0" distB="0" distL="0" distR="0" wp14:anchorId="0FD2C5FA" wp14:editId="2401CC75">
                   <wp:extent cx="48768" cy="320040"/>
                   <wp:effectExtent l="0" t="0" r="0" b="0"/>
-                  <wp:docPr id="35805" name="Picture 35805"/>
+                  <wp:docPr id="35807" name="Picture 35807"/>
                   <wp:cNvGraphicFramePr/>
                   <a:graphic xmlns:a="http://schemas.openxmlformats.org/drawingml/2006/main">
                     <a:graphicData uri="http://schemas.openxmlformats.org/drawingml/2006/picture">
                       <pic:pic xmlns:pic="http://schemas.openxmlformats.org/drawingml/2006/picture">
                         <pic:nvPicPr>
-                          <pic:cNvPr id="35805" name="Picture 35805"/>
+                          <pic:cNvPr id="35807" name="Picture 35807"/>
                           <pic:cNvPicPr/>
                         </pic:nvPicPr>
                         <pic:blipFill>
@@ -7587,16 +7600,16 @@
           <w:noProof/>
         </w:rPr>
         <w:drawing>
-          <wp:inline distT="0" distB="0" distL="0" distR="0" wp14:anchorId="7CD7B2C4" wp14:editId="79F212FE">
+          <wp:inline distT="0" distB="0" distL="0" distR="0" wp14:anchorId="740D66AA" wp14:editId="41287082">
             <wp:extent cx="5751576" cy="954024"/>
             <wp:effectExtent l="0" t="0" r="0" b="0"/>
-            <wp:docPr id="35806" name="Picture 35806"/>
+            <wp:docPr id="35808" name="Picture 35808"/>
             <wp:cNvGraphicFramePr/>
             <a:graphic xmlns:a="http://schemas.openxmlformats.org/drawingml/2006/main">
               <a:graphicData uri="http://schemas.openxmlformats.org/drawingml/2006/picture">
                 <pic:pic xmlns:pic="http://schemas.openxmlformats.org/drawingml/2006/picture">
                   <pic:nvPicPr>
-                    <pic:cNvPr id="35806" name="Picture 35806"/>
+                    <pic:cNvPr id="35808" name="Picture 35808"/>
                     <pic:cNvPicPr/>
                   </pic:nvPicPr>
                   <pic:blipFill>
@@ -9028,16 +9041,16 @@
           <w:noProof/>
         </w:rPr>
         <w:drawing>
-          <wp:inline distT="0" distB="0" distL="0" distR="0" wp14:anchorId="56CF9BF9" wp14:editId="759F897A">
+          <wp:inline distT="0" distB="0" distL="0" distR="0" wp14:anchorId="477102AB" wp14:editId="558032FC">
             <wp:extent cx="5535169" cy="1453896"/>
             <wp:effectExtent l="0" t="0" r="0" b="0"/>
-            <wp:docPr id="35808" name="Picture 35808"/>
+            <wp:docPr id="35810" name="Picture 35810"/>
             <wp:cNvGraphicFramePr/>
             <a:graphic xmlns:a="http://schemas.openxmlformats.org/drawingml/2006/main">
               <a:graphicData uri="http://schemas.openxmlformats.org/drawingml/2006/picture">
                 <pic:pic xmlns:pic="http://schemas.openxmlformats.org/drawingml/2006/picture">
                   <pic:nvPicPr>
-                    <pic:cNvPr id="35808" name="Picture 35808"/>
+                    <pic:cNvPr id="35810" name="Picture 35810"/>
                     <pic:cNvPicPr/>
                   </pic:nvPicPr>
                   <pic:blipFill>
@@ -9244,16 +9257,16 @@
           <w:noProof/>
         </w:rPr>
         <w:drawing>
-          <wp:inline distT="0" distB="0" distL="0" distR="0" wp14:anchorId="046A0E5A" wp14:editId="73B53E13">
+          <wp:inline distT="0" distB="0" distL="0" distR="0" wp14:anchorId="3230D7B9" wp14:editId="16D09672">
             <wp:extent cx="5812537" cy="1173480"/>
             <wp:effectExtent l="0" t="0" r="0" b="0"/>
-            <wp:docPr id="35810" name="Picture 35810"/>
+            <wp:docPr id="35812" name="Picture 35812"/>
             <wp:cNvGraphicFramePr/>
             <a:graphic xmlns:a="http://schemas.openxmlformats.org/drawingml/2006/main">
               <a:graphicData uri="http://schemas.openxmlformats.org/drawingml/2006/picture">
                 <pic:pic xmlns:pic="http://schemas.openxmlformats.org/drawingml/2006/picture">
                   <pic:nvPicPr>
-                    <pic:cNvPr id="35810" name="Picture 35810"/>
+                    <pic:cNvPr id="35812" name="Picture 35812"/>
                     <pic:cNvPicPr/>
                   </pic:nvPicPr>
                   <pic:blipFill>
@@ -9496,10 +9509,10 @@
         <mc:AlternateContent>
           <mc:Choice Requires="wpg">
             <w:drawing>
-              <wp:inline distT="0" distB="0" distL="0" distR="0" wp14:anchorId="0B1B65A1" wp14:editId="35167561">
+              <wp:inline distT="0" distB="0" distL="0" distR="0" wp14:anchorId="5B285CC4" wp14:editId="367BC4BD">
                 <wp:extent cx="3832153" cy="871728"/>
                 <wp:effectExtent l="0" t="0" r="0" b="0"/>
-                <wp:docPr id="35856" name="Group 35856"/>
+                <wp:docPr id="35858" name="Group 35858"/>
                 <wp:cNvGraphicFramePr/>
                 <a:graphic xmlns:a="http://schemas.openxmlformats.org/drawingml/2006/main">
                   <a:graphicData uri="http://schemas.microsoft.com/office/word/2010/wordprocessingGroup">
@@ -9515,7 +9528,7 @@
                       </wpg:grpSpPr>
                       <pic:pic xmlns:pic="http://schemas.openxmlformats.org/drawingml/2006/picture">
                         <pic:nvPicPr>
-                          <pic:cNvPr id="35812" name="Picture 35812"/>
+                          <pic:cNvPr id="35814" name="Picture 35814"/>
                           <pic:cNvPicPr/>
                         </pic:nvPicPr>
                         <pic:blipFill>
@@ -14068,8 +14081,8 @@
           </mc:Choice>
           <mc:Fallback xmlns:a="http://schemas.openxmlformats.org/drawingml/2006/main">
             <w:pict>
-              <v:group id="Group 35856" style="width:301.744pt;height:68.64pt;mso-position-horizontal-relative:char;mso-position-vertical-relative:line" coordsize="38321,8717">
-                <v:shape id="Picture 35812" style="position:absolute;width:20817;height:8717;left:0;top:0;" filled="f">
+              <v:group id="Group 35858" style="width:301.744pt;height:68.64pt;mso-position-horizontal-relative:char;mso-position-vertical-relative:line" coordsize="38321,8717">
+                <v:shape id="Picture 35814" style="position:absolute;width:20817;height:8717;left:0;top:0;" filled="f">
                   <v:imagedata r:id="rId31"/>
                 </v:shape>
                 <v:shape id="Shape 3563" style="position:absolute;width:0;height:8178;left:23507;top:112;" coordsize="0,817888" path="m0,817888l0,0">
@@ -14683,16 +14696,16 @@
           <w:noProof/>
         </w:rPr>
         <w:drawing>
-          <wp:inline distT="0" distB="0" distL="0" distR="0" wp14:anchorId="39A1E44E" wp14:editId="12C0448D">
+          <wp:inline distT="0" distB="0" distL="0" distR="0" wp14:anchorId="453751F7" wp14:editId="76503942">
             <wp:extent cx="3840480" cy="1228344"/>
             <wp:effectExtent l="0" t="0" r="0" b="0"/>
-            <wp:docPr id="35816" name="Picture 35816"/>
+            <wp:docPr id="35818" name="Picture 35818"/>
             <wp:cNvGraphicFramePr/>
             <a:graphic xmlns:a="http://schemas.openxmlformats.org/drawingml/2006/main">
               <a:graphicData uri="http://schemas.openxmlformats.org/drawingml/2006/picture">
                 <pic:pic xmlns:pic="http://schemas.openxmlformats.org/drawingml/2006/picture">
                   <pic:nvPicPr>
-                    <pic:cNvPr id="35816" name="Picture 35816"/>
+                    <pic:cNvPr id="35818" name="Picture 35818"/>
                     <pic:cNvPicPr/>
                   </pic:nvPicPr>
                   <pic:blipFill>
@@ -14753,16 +14766,16 @@
           <w:noProof/>
         </w:rPr>
         <w:drawing>
-          <wp:inline distT="0" distB="0" distL="0" distR="0" wp14:anchorId="7512A23F" wp14:editId="66E74099">
+          <wp:inline distT="0" distB="0" distL="0" distR="0" wp14:anchorId="7EB19295" wp14:editId="7D5156D6">
             <wp:extent cx="1773936" cy="871728"/>
             <wp:effectExtent l="0" t="0" r="0" b="0"/>
-            <wp:docPr id="35814" name="Picture 35814"/>
+            <wp:docPr id="35816" name="Picture 35816"/>
             <wp:cNvGraphicFramePr/>
             <a:graphic xmlns:a="http://schemas.openxmlformats.org/drawingml/2006/main">
               <a:graphicData uri="http://schemas.openxmlformats.org/drawingml/2006/picture">
                 <pic:pic xmlns:pic="http://schemas.openxmlformats.org/drawingml/2006/picture">
                   <pic:nvPicPr>
-                    <pic:cNvPr id="35814" name="Picture 35814"/>
+                    <pic:cNvPr id="35816" name="Picture 35816"/>
                     <pic:cNvPicPr/>
                   </pic:nvPicPr>
                   <pic:blipFill>
@@ -14874,16 +14887,16 @@
           <w:noProof/>
         </w:rPr>
         <w:drawing>
-          <wp:inline distT="0" distB="0" distL="0" distR="0" wp14:anchorId="50A61535" wp14:editId="0E88741D">
+          <wp:inline distT="0" distB="0" distL="0" distR="0" wp14:anchorId="347D418F" wp14:editId="4448E17E">
             <wp:extent cx="1773936" cy="871728"/>
             <wp:effectExtent l="0" t="0" r="0" b="0"/>
-            <wp:docPr id="35818" name="Picture 35818"/>
+            <wp:docPr id="35820" name="Picture 35820"/>
             <wp:cNvGraphicFramePr/>
             <a:graphic xmlns:a="http://schemas.openxmlformats.org/drawingml/2006/main">
               <a:graphicData uri="http://schemas.openxmlformats.org/drawingml/2006/picture">
                 <pic:pic xmlns:pic="http://schemas.openxmlformats.org/drawingml/2006/picture">
                   <pic:nvPicPr>
-                    <pic:cNvPr id="35818" name="Picture 35818"/>
+                    <pic:cNvPr id="35820" name="Picture 35820"/>
                     <pic:cNvPicPr/>
                   </pic:nvPicPr>
                   <pic:blipFill>
@@ -15148,10 +15161,10 @@
         <mc:AlternateContent>
           <mc:Choice Requires="wpg">
             <w:drawing>
-              <wp:inline distT="0" distB="0" distL="0" distR="0" wp14:anchorId="23DB388E" wp14:editId="2C156605">
+              <wp:inline distT="0" distB="0" distL="0" distR="0" wp14:anchorId="3AFF70BF" wp14:editId="74951E49">
                 <wp:extent cx="5911765" cy="1399032"/>
                 <wp:effectExtent l="0" t="0" r="0" b="0"/>
-                <wp:docPr id="35865" name="Group 35865"/>
+                <wp:docPr id="35867" name="Group 35867"/>
                 <wp:cNvGraphicFramePr/>
                 <a:graphic xmlns:a="http://schemas.openxmlformats.org/drawingml/2006/main">
                   <a:graphicData uri="http://schemas.microsoft.com/office/word/2010/wordprocessingGroup">
@@ -15167,7 +15180,7 @@
                       </wpg:grpSpPr>
                       <pic:pic xmlns:pic="http://schemas.openxmlformats.org/drawingml/2006/picture">
                         <pic:nvPicPr>
-                          <pic:cNvPr id="35820" name="Picture 35820"/>
+                          <pic:cNvPr id="35822" name="Picture 35822"/>
                           <pic:cNvPicPr/>
                         </pic:nvPicPr>
                         <pic:blipFill>
@@ -15231,8 +15244,8 @@
           </mc:Choice>
           <mc:Fallback xmlns:a="http://schemas.openxmlformats.org/drawingml/2006/main">
             <w:pict>
-              <v:group id="Group 35865" style="width:465.493pt;height:110.16pt;mso-position-horizontal-relative:char;mso-position-vertical-relative:line" coordsize="59117,13990">
-                <v:shape id="Picture 35820" style="position:absolute;width:51785;height:13990;left:7332;top:0;" filled="f">
+              <v:group id="Group 35867" style="width:465.493pt;height:110.16pt;mso-position-horizontal-relative:char;mso-position-vertical-relative:line" coordsize="59117,13990">
+                <v:shape id="Picture 35822" style="position:absolute;width:51785;height:13990;left:7332;top:0;" filled="f">
                   <v:imagedata r:id="rId36"/>
                 </v:shape>
                 <v:rect id="Rectangle 4272" style="position:absolute;width:13454;height:3554;left:-4949;top:2076;rotation:270;" filled="f" stroked="f">

</xml_diff>

<commit_message>
Title page names the training repository and commit of the pseudolabel ensemble (spinesurg-ct-nnunet 50b209f) and the build archive DOI; the un-redacted copy carries the same in the checkpoints sentence; upload job for the archive
Co-Authored-By: Claude Fable 5.1 <noreply@anthropic.com>
</commit_message>
<xml_diff>
--- a/paper/mpda/CTSpinoPelvic1K_coauthor_draft.docx
+++ b/paper/mpda/CTSpinoPelvic1K_coauthor_draft.docx
@@ -367,7 +367,7 @@
     </w:p>
     <w:p>
       <w:pPr>
-        <w:spacing w:after="61"/>
+        <w:spacing w:after="62"/>
         <w:ind w:left="-15" w:right="865" w:firstLine="299"/>
       </w:pPr>
       <w:r>
@@ -422,7 +422,7 @@
     </w:p>
     <w:p>
       <w:pPr>
-        <w:spacing w:after="91"/>
+        <w:spacing w:after="92"/>
         <w:ind w:left="-15" w:right="865" w:firstLine="299"/>
       </w:pPr>
       <w:r>
@@ -465,7 +465,11 @@
         <w:t>I</w:t>
       </w:r>
       <w:r>
-        <w:t>). Spine datasets omit the pelvis; pelvic datasets do not number the vertebrae; TotalSegmentator, the whole-body scheme, has no class for a sixth lumbar vertebra or for a rib on a lumbar vertebra; and VerSe, the one collection with an L6 class, stops at the sacrum and carries no ribs. No public collection can therefore record a six-lumbar spine together with both of its borders, however good the segmentation, and a segmenter trained on them inherits the gap, so that, faced with an enumeration anomaly, it mu</w:t>
+        <w:t xml:space="preserve">). Spine datasets omit the pelvis; pelvic datasets do not number the vertebrae; TotalSegmentator, the whole-body scheme, has no class for a sixth lumbar vertebra or for a rib on a lumbar vertebra; and VerSe, the one collection with an L6 class, stops at the sacrum and carries no ribs. No public collection can therefore record a six-lumbar spine together with both of its borders, however good the segmentation, and a segmenter trained on them inherits the gap, so that, </w:t>
+      </w:r>
+      <w:r>
+        <w:lastRenderedPageBreak/>
+        <w:t>faced with an enumeration anomaly, it mu</w:t>
       </w:r>
       <w:r>
         <w:t xml:space="preserve">st shift the whole column by a level </w:t>
@@ -554,7 +558,7 @@
     </w:p>
     <w:p>
       <w:pPr>
-        <w:spacing w:after="28"/>
+        <w:spacing w:after="29"/>
         <w:ind w:left="-15" w:right="865" w:firstLine="299"/>
       </w:pPr>
       <w:r>
@@ -648,6 +652,7 @@
         <w:ind w:left="-15" w:right="865" w:firstLine="299"/>
       </w:pPr>
       <w:r>
+        <w:lastRenderedPageBreak/>
         <w:t>The gap was in plain sight. CTPelvic1K</w:t>
       </w:r>
       <w:r>
@@ -772,7 +777,11 @@
         <w:t xml:space="preserve">What the release does in addition. </w:t>
       </w:r>
       <w:r>
-        <w:t>Every vertebra carries the identifier its radiologistsourced annotation assigned, corrected where the source was wrong; those labels are the ground truth. Alongside them, every released measurement is also expressed against the two landmarks present in essentially every abdominal scan, the sacrum below and the lowest rib-bearing vertebra above, so that the measurement is positional rather than nominal, a vertebra by how many rib-free vertebrae separate it from the sacrum, a lowest rib by its</w:t>
+        <w:t xml:space="preserve">Every vertebra carries the identifier its radiologistsourced annotation assigned, corrected where the source was wrong; those labels are the ground truth. Alongside them, every released measurement is also expressed against </w:t>
+      </w:r>
+      <w:r>
+        <w:lastRenderedPageBreak/>
+        <w:t>the two landmarks present in essentially every abdominal scan, the sacrum below and the lowest rib-bearing vertebra above, so that the measurement is positional rather than nominal, a vertebra by how many rib-free vertebrae separate it from the sacrum, a lowest rib by its</w:t>
       </w:r>
     </w:p>
     <w:p>
@@ -823,10 +832,10 @@
         <mc:AlternateContent>
           <mc:Choice Requires="wpg">
             <w:drawing>
-              <wp:inline distT="0" distB="0" distL="0" distR="0" wp14:anchorId="4A474756" wp14:editId="2B8889A8">
+              <wp:inline distT="0" distB="0" distL="0" distR="0" wp14:anchorId="05B7D783" wp14:editId="78D3826B">
                 <wp:extent cx="5921401" cy="2047825"/>
                 <wp:effectExtent l="0" t="0" r="0" b="0"/>
-                <wp:docPr id="31450" name="Group 31450"/>
+                <wp:docPr id="31080" name="Group 31080"/>
                 <wp:cNvGraphicFramePr/>
                 <a:graphic xmlns:a="http://schemas.openxmlformats.org/drawingml/2006/main">
                   <a:graphicData uri="http://schemas.microsoft.com/office/word/2010/wordprocessingGroup">
@@ -931,7 +940,7 @@
                         <wps:bodyPr/>
                       </wps:wsp>
                       <wps:wsp>
-                        <wps:cNvPr id="4896" name="Rectangle 4896"/>
+                        <wps:cNvPr id="4818" name="Rectangle 4818"/>
                         <wps:cNvSpPr/>
                         <wps:spPr>
                           <a:xfrm>
@@ -967,7 +976,7 @@
                         </wps:bodyPr>
                       </wps:wsp>
                       <wps:wsp>
-                        <wps:cNvPr id="4895" name="Rectangle 4895"/>
+                        <wps:cNvPr id="4817" name="Rectangle 4817"/>
                         <wps:cNvSpPr/>
                         <wps:spPr>
                           <a:xfrm>
@@ -1003,7 +1012,7 @@
                         </wps:bodyPr>
                       </wps:wsp>
                       <wps:wsp>
-                        <wps:cNvPr id="4894" name="Rectangle 4894"/>
+                        <wps:cNvPr id="4816" name="Rectangle 4816"/>
                         <wps:cNvSpPr/>
                         <wps:spPr>
                           <a:xfrm>
@@ -1039,7 +1048,7 @@
                         </wps:bodyPr>
                       </wps:wsp>
                       <wps:wsp>
-                        <wps:cNvPr id="4893" name="Rectangle 4893"/>
+                        <wps:cNvPr id="4815" name="Rectangle 4815"/>
                         <wps:cNvSpPr/>
                         <wps:spPr>
                           <a:xfrm>
@@ -1075,7 +1084,7 @@
                         </wps:bodyPr>
                       </wps:wsp>
                       <wps:wsp>
-                        <wps:cNvPr id="4891" name="Rectangle 4891"/>
+                        <wps:cNvPr id="4813" name="Rectangle 4813"/>
                         <wps:cNvSpPr/>
                         <wps:spPr>
                           <a:xfrm>
@@ -1111,7 +1120,7 @@
                         </wps:bodyPr>
                       </wps:wsp>
                       <wps:wsp>
-                        <wps:cNvPr id="4890" name="Rectangle 4890"/>
+                        <wps:cNvPr id="4812" name="Rectangle 4812"/>
                         <wps:cNvSpPr/>
                         <wps:spPr>
                           <a:xfrm>
@@ -1147,7 +1156,7 @@
                         </wps:bodyPr>
                       </wps:wsp>
                       <wps:wsp>
-                        <wps:cNvPr id="4889" name="Rectangle 4889"/>
+                        <wps:cNvPr id="4811" name="Rectangle 4811"/>
                         <wps:cNvSpPr/>
                         <wps:spPr>
                           <a:xfrm>
@@ -1183,7 +1192,7 @@
                         </wps:bodyPr>
                       </wps:wsp>
                       <wps:wsp>
-                        <wps:cNvPr id="4892" name="Rectangle 4892"/>
+                        <wps:cNvPr id="4814" name="Rectangle 4814"/>
                         <wps:cNvSpPr/>
                         <wps:spPr>
                           <a:xfrm>
@@ -1219,7 +1228,7 @@
                         </wps:bodyPr>
                       </wps:wsp>
                       <wps:wsp>
-                        <wps:cNvPr id="4887" name="Rectangle 4887"/>
+                        <wps:cNvPr id="4810" name="Rectangle 4810"/>
                         <wps:cNvSpPr/>
                         <wps:spPr>
                           <a:xfrm>
@@ -1409,7 +1418,7 @@
                         </wps:bodyPr>
                       </wps:wsp>
                       <wps:wsp>
-                        <wps:cNvPr id="36397" name="Shape 36397"/>
+                        <wps:cNvPr id="36394" name="Shape 36394"/>
                         <wps:cNvSpPr/>
                         <wps:spPr>
                           <a:xfrm>
@@ -1463,7 +1472,7 @@
                         <wps:bodyPr/>
                       </wps:wsp>
                       <wps:wsp>
-                        <wps:cNvPr id="36398" name="Shape 36398"/>
+                        <wps:cNvPr id="36395" name="Shape 36395"/>
                         <wps:cNvSpPr/>
                         <wps:spPr>
                           <a:xfrm>
@@ -1626,7 +1635,7 @@
                         </wps:bodyPr>
                       </wps:wsp>
                       <wps:wsp>
-                        <wps:cNvPr id="36399" name="Shape 36399"/>
+                        <wps:cNvPr id="36396" name="Shape 36396"/>
                         <wps:cNvSpPr/>
                         <wps:spPr>
                           <a:xfrm>
@@ -1680,7 +1689,7 @@
                         <wps:bodyPr/>
                       </wps:wsp>
                       <wps:wsp>
-                        <wps:cNvPr id="36400" name="Shape 36400"/>
+                        <wps:cNvPr id="36397" name="Shape 36397"/>
                         <wps:cNvSpPr/>
                         <wps:spPr>
                           <a:xfrm>
@@ -1843,7 +1852,7 @@
                         </wps:bodyPr>
                       </wps:wsp>
                       <wps:wsp>
-                        <wps:cNvPr id="36401" name="Shape 36401"/>
+                        <wps:cNvPr id="36398" name="Shape 36398"/>
                         <wps:cNvSpPr/>
                         <wps:spPr>
                           <a:xfrm>
@@ -1897,7 +1906,7 @@
                         <wps:bodyPr/>
                       </wps:wsp>
                       <wps:wsp>
-                        <wps:cNvPr id="36402" name="Shape 36402"/>
+                        <wps:cNvPr id="36399" name="Shape 36399"/>
                         <wps:cNvSpPr/>
                         <wps:spPr>
                           <a:xfrm>
@@ -2240,7 +2249,7 @@
                         </wps:bodyPr>
                       </wps:wsp>
                       <wps:wsp>
-                        <wps:cNvPr id="36403" name="Shape 36403"/>
+                        <wps:cNvPr id="36400" name="Shape 36400"/>
                         <wps:cNvSpPr/>
                         <wps:spPr>
                           <a:xfrm>
@@ -2403,7 +2412,7 @@
                         </wps:bodyPr>
                       </wps:wsp>
                       <wps:wsp>
-                        <wps:cNvPr id="36404" name="Shape 36404"/>
+                        <wps:cNvPr id="36401" name="Shape 36401"/>
                         <wps:cNvSpPr/>
                         <wps:spPr>
                           <a:xfrm>
@@ -2426,6 +2435,168 @@
                                 </a:lnTo>
                                 <a:lnTo>
                                   <a:pt x="457937" y="184925"/>
+                                </a:lnTo>
+                                <a:lnTo>
+                                  <a:pt x="0" y="184925"/>
+                                </a:lnTo>
+                                <a:lnTo>
+                                  <a:pt x="0" y="0"/>
+                                </a:lnTo>
+                              </a:path>
+                            </a:pathLst>
+                          </a:custGeom>
+                          <a:ln w="0" cap="flat">
+                            <a:miter lim="127000"/>
+                          </a:ln>
+                        </wps:spPr>
+                        <wps:style>
+                          <a:lnRef idx="0">
+                            <a:srgbClr val="000000">
+                              <a:alpha val="0"/>
+                            </a:srgbClr>
+                          </a:lnRef>
+                          <a:fillRef idx="1">
+                            <a:srgbClr val="000000"/>
+                          </a:fillRef>
+                          <a:effectRef idx="0">
+                            <a:scrgbClr r="0" g="0" b="0"/>
+                          </a:effectRef>
+                          <a:fontRef idx="none"/>
+                        </wps:style>
+                        <wps:bodyPr/>
+                      </wps:wsp>
+                      <wps:wsp>
+                        <wps:cNvPr id="36402" name="Shape 36402"/>
+                        <wps:cNvSpPr/>
+                        <wps:spPr>
+                          <a:xfrm>
+                            <a:off x="2715870" y="1500632"/>
+                            <a:ext cx="457937" cy="184925"/>
+                          </a:xfrm>
+                          <a:custGeom>
+                            <a:avLst/>
+                            <a:gdLst/>
+                            <a:ahLst/>
+                            <a:cxnLst/>
+                            <a:rect l="0" t="0" r="0" b="0"/>
+                            <a:pathLst>
+                              <a:path w="457937" h="184925">
+                                <a:moveTo>
+                                  <a:pt x="0" y="0"/>
+                                </a:moveTo>
+                                <a:lnTo>
+                                  <a:pt x="457937" y="0"/>
+                                </a:lnTo>
+                                <a:lnTo>
+                                  <a:pt x="457937" y="184925"/>
+                                </a:lnTo>
+                                <a:lnTo>
+                                  <a:pt x="0" y="184925"/>
+                                </a:lnTo>
+                                <a:lnTo>
+                                  <a:pt x="0" y="0"/>
+                                </a:lnTo>
+                              </a:path>
+                            </a:pathLst>
+                          </a:custGeom>
+                          <a:ln w="0" cap="flat">
+                            <a:miter lim="127000"/>
+                          </a:ln>
+                        </wps:spPr>
+                        <wps:style>
+                          <a:lnRef idx="0">
+                            <a:srgbClr val="000000">
+                              <a:alpha val="0"/>
+                            </a:srgbClr>
+                          </a:lnRef>
+                          <a:fillRef idx="1">
+                            <a:srgbClr val="000000"/>
+                          </a:fillRef>
+                          <a:effectRef idx="0">
+                            <a:scrgbClr r="0" g="0" b="0"/>
+                          </a:effectRef>
+                          <a:fontRef idx="none"/>
+                        </wps:style>
+                        <wps:bodyPr/>
+                      </wps:wsp>
+                      <wps:wsp>
+                        <wps:cNvPr id="36403" name="Shape 36403"/>
+                        <wps:cNvSpPr/>
+                        <wps:spPr>
+                          <a:xfrm>
+                            <a:off x="3173794" y="1500632"/>
+                            <a:ext cx="457937" cy="184925"/>
+                          </a:xfrm>
+                          <a:custGeom>
+                            <a:avLst/>
+                            <a:gdLst/>
+                            <a:ahLst/>
+                            <a:cxnLst/>
+                            <a:rect l="0" t="0" r="0" b="0"/>
+                            <a:pathLst>
+                              <a:path w="457937" h="184925">
+                                <a:moveTo>
+                                  <a:pt x="0" y="0"/>
+                                </a:moveTo>
+                                <a:lnTo>
+                                  <a:pt x="457937" y="0"/>
+                                </a:lnTo>
+                                <a:lnTo>
+                                  <a:pt x="457937" y="184925"/>
+                                </a:lnTo>
+                                <a:lnTo>
+                                  <a:pt x="0" y="184925"/>
+                                </a:lnTo>
+                                <a:lnTo>
+                                  <a:pt x="0" y="0"/>
+                                </a:lnTo>
+                              </a:path>
+                            </a:pathLst>
+                          </a:custGeom>
+                          <a:ln w="0" cap="flat">
+                            <a:miter lim="127000"/>
+                          </a:ln>
+                        </wps:spPr>
+                        <wps:style>
+                          <a:lnRef idx="0">
+                            <a:srgbClr val="000000">
+                              <a:alpha val="0"/>
+                            </a:srgbClr>
+                          </a:lnRef>
+                          <a:fillRef idx="1">
+                            <a:srgbClr val="000000"/>
+                          </a:fillRef>
+                          <a:effectRef idx="0">
+                            <a:scrgbClr r="0" g="0" b="0"/>
+                          </a:effectRef>
+                          <a:fontRef idx="none"/>
+                        </wps:style>
+                        <wps:bodyPr/>
+                      </wps:wsp>
+                      <wps:wsp>
+                        <wps:cNvPr id="36404" name="Shape 36404"/>
+                        <wps:cNvSpPr/>
+                        <wps:spPr>
+                          <a:xfrm>
+                            <a:off x="3631730" y="1500632"/>
+                            <a:ext cx="457936" cy="184925"/>
+                          </a:xfrm>
+                          <a:custGeom>
+                            <a:avLst/>
+                            <a:gdLst/>
+                            <a:ahLst/>
+                            <a:cxnLst/>
+                            <a:rect l="0" t="0" r="0" b="0"/>
+                            <a:pathLst>
+                              <a:path w="457936" h="184925">
+                                <a:moveTo>
+                                  <a:pt x="0" y="0"/>
+                                </a:moveTo>
+                                <a:lnTo>
+                                  <a:pt x="457936" y="0"/>
+                                </a:lnTo>
+                                <a:lnTo>
+                                  <a:pt x="457936" y="184925"/>
                                 </a:lnTo>
                                 <a:lnTo>
                                   <a:pt x="0" y="184925"/>
@@ -2461,8 +2632,8 @@
                         <wps:cNvSpPr/>
                         <wps:spPr>
                           <a:xfrm>
-                            <a:off x="2715870" y="1500632"/>
-                            <a:ext cx="457937" cy="184925"/>
+                            <a:off x="4089667" y="1500632"/>
+                            <a:ext cx="457936" cy="184925"/>
                           </a:xfrm>
                           <a:custGeom>
                             <a:avLst/>
@@ -2471,15 +2642,15 @@
                             <a:cxnLst/>
                             <a:rect l="0" t="0" r="0" b="0"/>
                             <a:pathLst>
-                              <a:path w="457937" h="184925">
+                              <a:path w="457936" h="184925">
                                 <a:moveTo>
                                   <a:pt x="0" y="0"/>
                                 </a:moveTo>
                                 <a:lnTo>
-                                  <a:pt x="457937" y="0"/>
-                                </a:lnTo>
-                                <a:lnTo>
-                                  <a:pt x="457937" y="184925"/>
+                                  <a:pt x="457936" y="0"/>
+                                </a:lnTo>
+                                <a:lnTo>
+                                  <a:pt x="457936" y="184925"/>
                                 </a:lnTo>
                                 <a:lnTo>
                                   <a:pt x="0" y="184925"/>
@@ -2512,168 +2683,6 @@
                       </wps:wsp>
                       <wps:wsp>
                         <wps:cNvPr id="36406" name="Shape 36406"/>
-                        <wps:cNvSpPr/>
-                        <wps:spPr>
-                          <a:xfrm>
-                            <a:off x="3173794" y="1500632"/>
-                            <a:ext cx="457937" cy="184925"/>
-                          </a:xfrm>
-                          <a:custGeom>
-                            <a:avLst/>
-                            <a:gdLst/>
-                            <a:ahLst/>
-                            <a:cxnLst/>
-                            <a:rect l="0" t="0" r="0" b="0"/>
-                            <a:pathLst>
-                              <a:path w="457937" h="184925">
-                                <a:moveTo>
-                                  <a:pt x="0" y="0"/>
-                                </a:moveTo>
-                                <a:lnTo>
-                                  <a:pt x="457937" y="0"/>
-                                </a:lnTo>
-                                <a:lnTo>
-                                  <a:pt x="457937" y="184925"/>
-                                </a:lnTo>
-                                <a:lnTo>
-                                  <a:pt x="0" y="184925"/>
-                                </a:lnTo>
-                                <a:lnTo>
-                                  <a:pt x="0" y="0"/>
-                                </a:lnTo>
-                              </a:path>
-                            </a:pathLst>
-                          </a:custGeom>
-                          <a:ln w="0" cap="flat">
-                            <a:miter lim="127000"/>
-                          </a:ln>
-                        </wps:spPr>
-                        <wps:style>
-                          <a:lnRef idx="0">
-                            <a:srgbClr val="000000">
-                              <a:alpha val="0"/>
-                            </a:srgbClr>
-                          </a:lnRef>
-                          <a:fillRef idx="1">
-                            <a:srgbClr val="000000"/>
-                          </a:fillRef>
-                          <a:effectRef idx="0">
-                            <a:scrgbClr r="0" g="0" b="0"/>
-                          </a:effectRef>
-                          <a:fontRef idx="none"/>
-                        </wps:style>
-                        <wps:bodyPr/>
-                      </wps:wsp>
-                      <wps:wsp>
-                        <wps:cNvPr id="36407" name="Shape 36407"/>
-                        <wps:cNvSpPr/>
-                        <wps:spPr>
-                          <a:xfrm>
-                            <a:off x="3631730" y="1500632"/>
-                            <a:ext cx="457936" cy="184925"/>
-                          </a:xfrm>
-                          <a:custGeom>
-                            <a:avLst/>
-                            <a:gdLst/>
-                            <a:ahLst/>
-                            <a:cxnLst/>
-                            <a:rect l="0" t="0" r="0" b="0"/>
-                            <a:pathLst>
-                              <a:path w="457936" h="184925">
-                                <a:moveTo>
-                                  <a:pt x="0" y="0"/>
-                                </a:moveTo>
-                                <a:lnTo>
-                                  <a:pt x="457936" y="0"/>
-                                </a:lnTo>
-                                <a:lnTo>
-                                  <a:pt x="457936" y="184925"/>
-                                </a:lnTo>
-                                <a:lnTo>
-                                  <a:pt x="0" y="184925"/>
-                                </a:lnTo>
-                                <a:lnTo>
-                                  <a:pt x="0" y="0"/>
-                                </a:lnTo>
-                              </a:path>
-                            </a:pathLst>
-                          </a:custGeom>
-                          <a:ln w="0" cap="flat">
-                            <a:miter lim="127000"/>
-                          </a:ln>
-                        </wps:spPr>
-                        <wps:style>
-                          <a:lnRef idx="0">
-                            <a:srgbClr val="000000">
-                              <a:alpha val="0"/>
-                            </a:srgbClr>
-                          </a:lnRef>
-                          <a:fillRef idx="1">
-                            <a:srgbClr val="000000"/>
-                          </a:fillRef>
-                          <a:effectRef idx="0">
-                            <a:scrgbClr r="0" g="0" b="0"/>
-                          </a:effectRef>
-                          <a:fontRef idx="none"/>
-                        </wps:style>
-                        <wps:bodyPr/>
-                      </wps:wsp>
-                      <wps:wsp>
-                        <wps:cNvPr id="36408" name="Shape 36408"/>
-                        <wps:cNvSpPr/>
-                        <wps:spPr>
-                          <a:xfrm>
-                            <a:off x="4089667" y="1500632"/>
-                            <a:ext cx="457936" cy="184925"/>
-                          </a:xfrm>
-                          <a:custGeom>
-                            <a:avLst/>
-                            <a:gdLst/>
-                            <a:ahLst/>
-                            <a:cxnLst/>
-                            <a:rect l="0" t="0" r="0" b="0"/>
-                            <a:pathLst>
-                              <a:path w="457936" h="184925">
-                                <a:moveTo>
-                                  <a:pt x="0" y="0"/>
-                                </a:moveTo>
-                                <a:lnTo>
-                                  <a:pt x="457936" y="0"/>
-                                </a:lnTo>
-                                <a:lnTo>
-                                  <a:pt x="457936" y="184925"/>
-                                </a:lnTo>
-                                <a:lnTo>
-                                  <a:pt x="0" y="184925"/>
-                                </a:lnTo>
-                                <a:lnTo>
-                                  <a:pt x="0" y="0"/>
-                                </a:lnTo>
-                              </a:path>
-                            </a:pathLst>
-                          </a:custGeom>
-                          <a:ln w="0" cap="flat">
-                            <a:miter lim="127000"/>
-                          </a:ln>
-                        </wps:spPr>
-                        <wps:style>
-                          <a:lnRef idx="0">
-                            <a:srgbClr val="000000">
-                              <a:alpha val="0"/>
-                            </a:srgbClr>
-                          </a:lnRef>
-                          <a:fillRef idx="1">
-                            <a:srgbClr val="000000"/>
-                          </a:fillRef>
-                          <a:effectRef idx="0">
-                            <a:scrgbClr r="0" g="0" b="0"/>
-                          </a:effectRef>
-                          <a:fontRef idx="none"/>
-                        </wps:style>
-                        <wps:bodyPr/>
-                      </wps:wsp>
-                      <wps:wsp>
-                        <wps:cNvPr id="36409" name="Shape 36409"/>
                         <wps:cNvSpPr/>
                         <wps:spPr>
                           <a:xfrm>
@@ -2800,11 +2809,173 @@
                         </wps:bodyPr>
                       </wps:wsp>
                       <wps:wsp>
+                        <wps:cNvPr id="36407" name="Shape 36407"/>
+                        <wps:cNvSpPr/>
+                        <wps:spPr>
+                          <a:xfrm>
+                            <a:off x="1799996" y="1775816"/>
+                            <a:ext cx="457937" cy="184925"/>
+                          </a:xfrm>
+                          <a:custGeom>
+                            <a:avLst/>
+                            <a:gdLst/>
+                            <a:ahLst/>
+                            <a:cxnLst/>
+                            <a:rect l="0" t="0" r="0" b="0"/>
+                            <a:pathLst>
+                              <a:path w="457937" h="184925">
+                                <a:moveTo>
+                                  <a:pt x="0" y="0"/>
+                                </a:moveTo>
+                                <a:lnTo>
+                                  <a:pt x="457937" y="0"/>
+                                </a:lnTo>
+                                <a:lnTo>
+                                  <a:pt x="457937" y="184925"/>
+                                </a:lnTo>
+                                <a:lnTo>
+                                  <a:pt x="0" y="184925"/>
+                                </a:lnTo>
+                                <a:lnTo>
+                                  <a:pt x="0" y="0"/>
+                                </a:lnTo>
+                              </a:path>
+                            </a:pathLst>
+                          </a:custGeom>
+                          <a:ln w="0" cap="flat">
+                            <a:miter lim="127000"/>
+                          </a:ln>
+                        </wps:spPr>
+                        <wps:style>
+                          <a:lnRef idx="0">
+                            <a:srgbClr val="000000">
+                              <a:alpha val="0"/>
+                            </a:srgbClr>
+                          </a:lnRef>
+                          <a:fillRef idx="1">
+                            <a:srgbClr val="000000"/>
+                          </a:fillRef>
+                          <a:effectRef idx="0">
+                            <a:scrgbClr r="0" g="0" b="0"/>
+                          </a:effectRef>
+                          <a:fontRef idx="none"/>
+                        </wps:style>
+                        <wps:bodyPr/>
+                      </wps:wsp>
+                      <wps:wsp>
+                        <wps:cNvPr id="36408" name="Shape 36408"/>
+                        <wps:cNvSpPr/>
+                        <wps:spPr>
+                          <a:xfrm>
+                            <a:off x="2257933" y="1775816"/>
+                            <a:ext cx="457937" cy="184925"/>
+                          </a:xfrm>
+                          <a:custGeom>
+                            <a:avLst/>
+                            <a:gdLst/>
+                            <a:ahLst/>
+                            <a:cxnLst/>
+                            <a:rect l="0" t="0" r="0" b="0"/>
+                            <a:pathLst>
+                              <a:path w="457937" h="184925">
+                                <a:moveTo>
+                                  <a:pt x="0" y="0"/>
+                                </a:moveTo>
+                                <a:lnTo>
+                                  <a:pt x="457937" y="0"/>
+                                </a:lnTo>
+                                <a:lnTo>
+                                  <a:pt x="457937" y="184925"/>
+                                </a:lnTo>
+                                <a:lnTo>
+                                  <a:pt x="0" y="184925"/>
+                                </a:lnTo>
+                                <a:lnTo>
+                                  <a:pt x="0" y="0"/>
+                                </a:lnTo>
+                              </a:path>
+                            </a:pathLst>
+                          </a:custGeom>
+                          <a:ln w="0" cap="flat">
+                            <a:miter lim="127000"/>
+                          </a:ln>
+                        </wps:spPr>
+                        <wps:style>
+                          <a:lnRef idx="0">
+                            <a:srgbClr val="000000">
+                              <a:alpha val="0"/>
+                            </a:srgbClr>
+                          </a:lnRef>
+                          <a:fillRef idx="1">
+                            <a:srgbClr val="000000"/>
+                          </a:fillRef>
+                          <a:effectRef idx="0">
+                            <a:scrgbClr r="0" g="0" b="0"/>
+                          </a:effectRef>
+                          <a:fontRef idx="none"/>
+                        </wps:style>
+                        <wps:bodyPr/>
+                      </wps:wsp>
+                      <wps:wsp>
+                        <wps:cNvPr id="36409" name="Shape 36409"/>
+                        <wps:cNvSpPr/>
+                        <wps:spPr>
+                          <a:xfrm>
+                            <a:off x="2715870" y="1775816"/>
+                            <a:ext cx="457937" cy="184925"/>
+                          </a:xfrm>
+                          <a:custGeom>
+                            <a:avLst/>
+                            <a:gdLst/>
+                            <a:ahLst/>
+                            <a:cxnLst/>
+                            <a:rect l="0" t="0" r="0" b="0"/>
+                            <a:pathLst>
+                              <a:path w="457937" h="184925">
+                                <a:moveTo>
+                                  <a:pt x="0" y="0"/>
+                                </a:moveTo>
+                                <a:lnTo>
+                                  <a:pt x="457937" y="0"/>
+                                </a:lnTo>
+                                <a:lnTo>
+                                  <a:pt x="457937" y="184925"/>
+                                </a:lnTo>
+                                <a:lnTo>
+                                  <a:pt x="0" y="184925"/>
+                                </a:lnTo>
+                                <a:lnTo>
+                                  <a:pt x="0" y="0"/>
+                                </a:lnTo>
+                              </a:path>
+                            </a:pathLst>
+                          </a:custGeom>
+                          <a:ln w="0" cap="flat">
+                            <a:miter lim="127000"/>
+                          </a:ln>
+                        </wps:spPr>
+                        <wps:style>
+                          <a:lnRef idx="0">
+                            <a:srgbClr val="000000">
+                              <a:alpha val="0"/>
+                            </a:srgbClr>
+                          </a:lnRef>
+                          <a:fillRef idx="1">
+                            <a:srgbClr val="000000"/>
+                          </a:fillRef>
+                          <a:effectRef idx="0">
+                            <a:scrgbClr r="0" g="0" b="0"/>
+                          </a:effectRef>
+                          <a:fontRef idx="none"/>
+                        </wps:style>
+                        <wps:bodyPr/>
+                      </wps:wsp>
+                      <wps:wsp>
                         <wps:cNvPr id="36410" name="Shape 36410"/>
                         <wps:cNvSpPr/>
                         <wps:spPr>
                           <a:xfrm>
-                            <a:off x="1799996" y="1775816"/>
+                            <a:off x="3173794" y="1775816"/>
                             <a:ext cx="457937" cy="184925"/>
                           </a:xfrm>
                           <a:custGeom>
@@ -2858,8 +3029,8 @@
                         <wps:cNvSpPr/>
                         <wps:spPr>
                           <a:xfrm>
-                            <a:off x="2257933" y="1775816"/>
-                            <a:ext cx="457937" cy="184925"/>
+                            <a:off x="3631730" y="1775816"/>
+                            <a:ext cx="457936" cy="184925"/>
                           </a:xfrm>
                           <a:custGeom>
                             <a:avLst/>
@@ -2868,15 +3039,15 @@
                             <a:cxnLst/>
                             <a:rect l="0" t="0" r="0" b="0"/>
                             <a:pathLst>
-                              <a:path w="457937" h="184925">
+                              <a:path w="457936" h="184925">
                                 <a:moveTo>
                                   <a:pt x="0" y="0"/>
                                 </a:moveTo>
                                 <a:lnTo>
-                                  <a:pt x="457937" y="0"/>
-                                </a:lnTo>
-                                <a:lnTo>
-                                  <a:pt x="457937" y="184925"/>
+                                  <a:pt x="457936" y="0"/>
+                                </a:lnTo>
+                                <a:lnTo>
+                                  <a:pt x="457936" y="184925"/>
                                 </a:lnTo>
                                 <a:lnTo>
                                   <a:pt x="0" y="184925"/>
@@ -2912,8 +3083,8 @@
                         <wps:cNvSpPr/>
                         <wps:spPr>
                           <a:xfrm>
-                            <a:off x="2715870" y="1775816"/>
-                            <a:ext cx="457937" cy="184925"/>
+                            <a:off x="4089667" y="1775816"/>
+                            <a:ext cx="457936" cy="184925"/>
                           </a:xfrm>
                           <a:custGeom>
                             <a:avLst/>
@@ -2922,15 +3093,15 @@
                             <a:cxnLst/>
                             <a:rect l="0" t="0" r="0" b="0"/>
                             <a:pathLst>
-                              <a:path w="457937" h="184925">
+                              <a:path w="457936" h="184925">
                                 <a:moveTo>
                                   <a:pt x="0" y="0"/>
                                 </a:moveTo>
                                 <a:lnTo>
-                                  <a:pt x="457937" y="0"/>
-                                </a:lnTo>
-                                <a:lnTo>
-                                  <a:pt x="457937" y="184925"/>
+                                  <a:pt x="457936" y="0"/>
+                                </a:lnTo>
+                                <a:lnTo>
+                                  <a:pt x="457936" y="184925"/>
                                 </a:lnTo>
                                 <a:lnTo>
                                   <a:pt x="0" y="184925"/>
@@ -2966,8 +3137,8 @@
                         <wps:cNvSpPr/>
                         <wps:spPr>
                           <a:xfrm>
-                            <a:off x="3173794" y="1775816"/>
-                            <a:ext cx="457937" cy="184925"/>
+                            <a:off x="4547591" y="1775816"/>
+                            <a:ext cx="457936" cy="184925"/>
                           </a:xfrm>
                           <a:custGeom>
                             <a:avLst/>
@@ -2976,15 +3147,15 @@
                             <a:cxnLst/>
                             <a:rect l="0" t="0" r="0" b="0"/>
                             <a:pathLst>
-                              <a:path w="457937" h="184925">
+                              <a:path w="457936" h="184925">
                                 <a:moveTo>
                                   <a:pt x="0" y="0"/>
                                 </a:moveTo>
                                 <a:lnTo>
-                                  <a:pt x="457937" y="0"/>
-                                </a:lnTo>
-                                <a:lnTo>
-                                  <a:pt x="457937" y="184925"/>
+                                  <a:pt x="457936" y="0"/>
+                                </a:lnTo>
+                                <a:lnTo>
+                                  <a:pt x="457936" y="184925"/>
                                 </a:lnTo>
                                 <a:lnTo>
                                   <a:pt x="0" y="184925"/>
@@ -3020,7 +3191,7 @@
                         <wps:cNvSpPr/>
                         <wps:spPr>
                           <a:xfrm>
-                            <a:off x="3631730" y="1775816"/>
+                            <a:off x="5005527" y="1775816"/>
                             <a:ext cx="457936" cy="184925"/>
                           </a:xfrm>
                           <a:custGeom>
@@ -3071,168 +3242,6 @@
                       </wps:wsp>
                       <wps:wsp>
                         <wps:cNvPr id="36415" name="Shape 36415"/>
-                        <wps:cNvSpPr/>
-                        <wps:spPr>
-                          <a:xfrm>
-                            <a:off x="4089667" y="1775816"/>
-                            <a:ext cx="457936" cy="184925"/>
-                          </a:xfrm>
-                          <a:custGeom>
-                            <a:avLst/>
-                            <a:gdLst/>
-                            <a:ahLst/>
-                            <a:cxnLst/>
-                            <a:rect l="0" t="0" r="0" b="0"/>
-                            <a:pathLst>
-                              <a:path w="457936" h="184925">
-                                <a:moveTo>
-                                  <a:pt x="0" y="0"/>
-                                </a:moveTo>
-                                <a:lnTo>
-                                  <a:pt x="457936" y="0"/>
-                                </a:lnTo>
-                                <a:lnTo>
-                                  <a:pt x="457936" y="184925"/>
-                                </a:lnTo>
-                                <a:lnTo>
-                                  <a:pt x="0" y="184925"/>
-                                </a:lnTo>
-                                <a:lnTo>
-                                  <a:pt x="0" y="0"/>
-                                </a:lnTo>
-                              </a:path>
-                            </a:pathLst>
-                          </a:custGeom>
-                          <a:ln w="0" cap="flat">
-                            <a:miter lim="127000"/>
-                          </a:ln>
-                        </wps:spPr>
-                        <wps:style>
-                          <a:lnRef idx="0">
-                            <a:srgbClr val="000000">
-                              <a:alpha val="0"/>
-                            </a:srgbClr>
-                          </a:lnRef>
-                          <a:fillRef idx="1">
-                            <a:srgbClr val="000000"/>
-                          </a:fillRef>
-                          <a:effectRef idx="0">
-                            <a:scrgbClr r="0" g="0" b="0"/>
-                          </a:effectRef>
-                          <a:fontRef idx="none"/>
-                        </wps:style>
-                        <wps:bodyPr/>
-                      </wps:wsp>
-                      <wps:wsp>
-                        <wps:cNvPr id="36416" name="Shape 36416"/>
-                        <wps:cNvSpPr/>
-                        <wps:spPr>
-                          <a:xfrm>
-                            <a:off x="4547591" y="1775816"/>
-                            <a:ext cx="457936" cy="184925"/>
-                          </a:xfrm>
-                          <a:custGeom>
-                            <a:avLst/>
-                            <a:gdLst/>
-                            <a:ahLst/>
-                            <a:cxnLst/>
-                            <a:rect l="0" t="0" r="0" b="0"/>
-                            <a:pathLst>
-                              <a:path w="457936" h="184925">
-                                <a:moveTo>
-                                  <a:pt x="0" y="0"/>
-                                </a:moveTo>
-                                <a:lnTo>
-                                  <a:pt x="457936" y="0"/>
-                                </a:lnTo>
-                                <a:lnTo>
-                                  <a:pt x="457936" y="184925"/>
-                                </a:lnTo>
-                                <a:lnTo>
-                                  <a:pt x="0" y="184925"/>
-                                </a:lnTo>
-                                <a:lnTo>
-                                  <a:pt x="0" y="0"/>
-                                </a:lnTo>
-                              </a:path>
-                            </a:pathLst>
-                          </a:custGeom>
-                          <a:ln w="0" cap="flat">
-                            <a:miter lim="127000"/>
-                          </a:ln>
-                        </wps:spPr>
-                        <wps:style>
-                          <a:lnRef idx="0">
-                            <a:srgbClr val="000000">
-                              <a:alpha val="0"/>
-                            </a:srgbClr>
-                          </a:lnRef>
-                          <a:fillRef idx="1">
-                            <a:srgbClr val="000000"/>
-                          </a:fillRef>
-                          <a:effectRef idx="0">
-                            <a:scrgbClr r="0" g="0" b="0"/>
-                          </a:effectRef>
-                          <a:fontRef idx="none"/>
-                        </wps:style>
-                        <wps:bodyPr/>
-                      </wps:wsp>
-                      <wps:wsp>
-                        <wps:cNvPr id="36417" name="Shape 36417"/>
-                        <wps:cNvSpPr/>
-                        <wps:spPr>
-                          <a:xfrm>
-                            <a:off x="5005527" y="1775816"/>
-                            <a:ext cx="457936" cy="184925"/>
-                          </a:xfrm>
-                          <a:custGeom>
-                            <a:avLst/>
-                            <a:gdLst/>
-                            <a:ahLst/>
-                            <a:cxnLst/>
-                            <a:rect l="0" t="0" r="0" b="0"/>
-                            <a:pathLst>
-                              <a:path w="457936" h="184925">
-                                <a:moveTo>
-                                  <a:pt x="0" y="0"/>
-                                </a:moveTo>
-                                <a:lnTo>
-                                  <a:pt x="457936" y="0"/>
-                                </a:lnTo>
-                                <a:lnTo>
-                                  <a:pt x="457936" y="184925"/>
-                                </a:lnTo>
-                                <a:lnTo>
-                                  <a:pt x="0" y="184925"/>
-                                </a:lnTo>
-                                <a:lnTo>
-                                  <a:pt x="0" y="0"/>
-                                </a:lnTo>
-                              </a:path>
-                            </a:pathLst>
-                          </a:custGeom>
-                          <a:ln w="0" cap="flat">
-                            <a:miter lim="127000"/>
-                          </a:ln>
-                        </wps:spPr>
-                        <wps:style>
-                          <a:lnRef idx="0">
-                            <a:srgbClr val="000000">
-                              <a:alpha val="0"/>
-                            </a:srgbClr>
-                          </a:lnRef>
-                          <a:fillRef idx="1">
-                            <a:srgbClr val="000000"/>
-                          </a:fillRef>
-                          <a:effectRef idx="0">
-                            <a:scrgbClr r="0" g="0" b="0"/>
-                          </a:effectRef>
-                          <a:fontRef idx="none"/>
-                        </wps:style>
-                        <wps:bodyPr/>
-                      </wps:wsp>
-                      <wps:wsp>
-                        <wps:cNvPr id="36418" name="Shape 36418"/>
                         <wps:cNvSpPr/>
                         <wps:spPr>
                           <a:xfrm>
@@ -3383,7 +3392,7 @@
           </mc:Choice>
           <mc:Fallback xmlns:a="http://schemas.openxmlformats.org/drawingml/2006/main">
             <w:pict>
-              <v:group id="Group 31450" style="width:466.252pt;height:161.246pt;mso-position-horizontal-relative:char;mso-position-vertical-relative:line" coordsize="59214,20478">
+              <v:group id="Group 31080" style="width:466.252pt;height:161.246pt;mso-position-horizontal-relative:char;mso-position-vertical-relative:line" coordsize="59214,20478">
                 <v:shape id="Shape 287" style="position:absolute;width:59214;height:0;left:0;top:0;" coordsize="5921401,0" path="m0,0l5921401,0">
                   <v:stroke weight="0.398pt" endcap="flat" joinstyle="miter" miterlimit="10" on="true" color="#000000"/>
                   <v:fill on="false" color="#000000" opacity="0"/>
@@ -3392,7 +3401,7 @@
                   <v:stroke weight="0.398pt" endcap="flat" joinstyle="miter" miterlimit="10" on="true" color="#000000"/>
                   <v:fill on="false" color="#000000" opacity="0"/>
                 </v:shape>
-                <v:rect id="Rectangle 4896" style="position:absolute;width:16761;height:1636;left:46175;top:1546;" filled="f" stroked="f">
+                <v:rect id="Rectangle 4818" style="position:absolute;width:16761;height:1636;left:46175;top:1546;" filled="f" stroked="f">
                   <v:textbox inset="0,0,0,0">
                     <w:txbxContent>
                       <w:p>
@@ -3412,7 +3421,7 @@
                     </w:txbxContent>
                   </v:textbox>
                 </v:rect>
-                <v:rect id="Rectangle 4895" style="position:absolute;width:3618;height:1636;left:41825;top:1546;" filled="f" stroked="f">
+                <v:rect id="Rectangle 4817" style="position:absolute;width:3618;height:1636;left:41825;top:1546;" filled="f" stroked="f">
                   <v:textbox inset="0,0,0,0">
                     <w:txbxContent>
                       <w:p>
@@ -3432,7 +3441,7 @@
                     </w:txbxContent>
                   </v:textbox>
                 </v:rect>
-                <v:rect id="Rectangle 4894" style="position:absolute;width:4744;height:1636;left:36823;top:1546;" filled="f" stroked="f">
+                <v:rect id="Rectangle 4816" style="position:absolute;width:4744;height:1636;left:36823;top:1546;" filled="f" stroked="f">
                   <v:textbox inset="0,0,0,0">
                     <w:txbxContent>
                       <w:p>
@@ -3452,7 +3461,7 @@
                     </w:txbxContent>
                   </v:textbox>
                 </v:rect>
-                <v:rect id="Rectangle 4893" style="position:absolute;width:1945;height:1636;left:33296;top:1546;" filled="f" stroked="f">
+                <v:rect id="Rectangle 4815" style="position:absolute;width:1945;height:1636;left:33296;top:1546;" filled="f" stroked="f">
                   <v:textbox inset="0,0,0,0">
                     <w:txbxContent>
                       <w:p>
@@ -3472,7 +3481,7 @@
                     </w:txbxContent>
                   </v:textbox>
                 </v:rect>
-                <v:rect id="Rectangle 4891" style="position:absolute;width:2072;height:1636;left:24089;top:1546;" filled="f" stroked="f">
+                <v:rect id="Rectangle 4813" style="position:absolute;width:2072;height:1636;left:24089;top:1546;" filled="f" stroked="f">
                   <v:textbox inset="0,0,0,0">
                     <w:txbxContent>
                       <w:p>
@@ -3492,7 +3501,7 @@
                     </w:txbxContent>
                   </v:textbox>
                 </v:rect>
-                <v:rect id="Rectangle 4890" style="position:absolute;width:4964;height:1636;left:18423;top:1546;" filled="f" stroked="f">
+                <v:rect id="Rectangle 4812" style="position:absolute;width:4964;height:1636;left:18423;top:1546;" filled="f" stroked="f">
                   <v:textbox inset="0,0,0,0">
                     <w:txbxContent>
                       <w:p>
@@ -3512,7 +3521,7 @@
                     </w:txbxContent>
                   </v:textbox>
                 </v:rect>
-                <v:rect id="Rectangle 4889" style="position:absolute;width:4514;height:1636;left:12787;top:1546;" filled="f" stroked="f">
+                <v:rect id="Rectangle 4811" style="position:absolute;width:4514;height:1636;left:12787;top:1546;" filled="f" stroked="f">
                   <v:textbox inset="0,0,0,0">
                     <w:txbxContent>
                       <w:p>
@@ -3532,7 +3541,7 @@
                     </w:txbxContent>
                   </v:textbox>
                 </v:rect>
-                <v:rect id="Rectangle 4892" style="position:absolute;width:6045;height:1636;left:27175;top:1546;" filled="f" stroked="f">
+                <v:rect id="Rectangle 4814" style="position:absolute;width:6045;height:1636;left:27175;top:1546;" filled="f" stroked="f">
                   <v:textbox inset="0,0,0,0">
                     <w:txbxContent>
                       <w:p>
@@ -3552,7 +3561,7 @@
                     </w:txbxContent>
                   </v:textbox>
                 </v:rect>
-                <v:rect id="Rectangle 4887" style="position:absolute;width:8087;height:1636;left:0;top:1546;" filled="f" stroked="f">
+                <v:rect id="Rectangle 4810" style="position:absolute;width:8087;height:1636;left:0;top:1546;" filled="f" stroked="f">
                   <v:textbox inset="0,0,0,0">
                     <w:txbxContent>
                       <w:p>
@@ -3637,11 +3646,11 @@
                     </w:txbxContent>
                   </v:textbox>
                 </v:rect>
-                <v:shape id="Shape 36419" style="position:absolute;width:4579;height:1849;left:17999;top:3998;" coordsize="457937,184925" path="m0,0l457937,0l457937,184925l0,184925l0,0">
+                <v:shape id="Shape 36416" style="position:absolute;width:4579;height:1849;left:17999;top:3998;" coordsize="457937,184925" path="m0,0l457937,0l457937,184925l0,184925l0,0">
                   <v:stroke weight="0pt" endcap="flat" joinstyle="miter" miterlimit="10" on="false" color="#000000" opacity="0"/>
                   <v:fill on="true" color="#000000"/>
                 </v:shape>
-                <v:shape id="Shape 36420" style="position:absolute;width:4579;height:1849;left:22579;top:3998;" coordsize="457937,184925" path="m0,0l457937,0l457937,184925l0,184925l0,0">
+                <v:shape id="Shape 36417" style="position:absolute;width:4579;height:1849;left:22579;top:3998;" coordsize="457937,184925" path="m0,0l457937,0l457937,184925l0,184925l0,0">
                   <v:stroke weight="0pt" endcap="flat" joinstyle="miter" miterlimit="10" on="false" color="#000000" opacity="0"/>
                   <v:fill on="true" color="#000000"/>
                 </v:shape>
@@ -3706,11 +3715,11 @@
                     </w:txbxContent>
                   </v:textbox>
                 </v:rect>
-                <v:shape id="Shape 36421" style="position:absolute;width:4579;height:1849;left:27158;top:6750;" coordsize="457937,184925" path="m0,0l457937,0l457937,184925l0,184925l0,0">
+                <v:shape id="Shape 36418" style="position:absolute;width:4579;height:1849;left:27158;top:6750;" coordsize="457937,184925" path="m0,0l457937,0l457937,184925l0,184925l0,0">
                   <v:stroke weight="0pt" endcap="flat" joinstyle="miter" miterlimit="10" on="false" color="#000000" opacity="0"/>
                   <v:fill on="true" color="#000000"/>
                 </v:shape>
-                <v:shape id="Shape 36422" style="position:absolute;width:4579;height:1849;left:36317;top:6750;" coordsize="457936,184925" path="m0,0l457936,0l457936,184925l0,184925l0,0">
+                <v:shape id="Shape 36419" style="position:absolute;width:4579;height:1849;left:36317;top:6750;" coordsize="457936,184925" path="m0,0l457936,0l457936,184925l0,184925l0,0">
                   <v:stroke weight="0pt" endcap="flat" joinstyle="miter" miterlimit="10" on="false" color="#000000" opacity="0"/>
                   <v:fill on="true" color="#000000"/>
                 </v:shape>
@@ -3775,11 +3784,11 @@
                     </w:txbxContent>
                   </v:textbox>
                 </v:rect>
-                <v:shape id="Shape 36423" style="position:absolute;width:4579;height:1849;left:17999;top:9502;" coordsize="457937,184925" path="m0,0l457937,0l457937,184925l0,184925l0,0">
+                <v:shape id="Shape 36420" style="position:absolute;width:4579;height:1849;left:17999;top:9502;" coordsize="457937,184925" path="m0,0l457937,0l457937,184925l0,184925l0,0">
                   <v:stroke weight="0pt" endcap="flat" joinstyle="miter" miterlimit="10" on="false" color="#000000" opacity="0"/>
                   <v:fill on="true" color="#000000"/>
                 </v:shape>
-                <v:shape id="Shape 36424" style="position:absolute;width:4579;height:1849;left:22579;top:9502;" coordsize="457937,184925" path="m0,0l457937,0l457937,184925l0,184925l0,0">
+                <v:shape id="Shape 36421" style="position:absolute;width:4579;height:1849;left:22579;top:9502;" coordsize="457937,184925" path="m0,0l457937,0l457937,184925l0,184925l0,0">
                   <v:stroke weight="0pt" endcap="flat" joinstyle="miter" miterlimit="10" on="false" color="#000000" opacity="0"/>
                   <v:fill on="true" color="#000000"/>
                 </v:shape>
@@ -3860,7 +3869,7 @@
                     </w:txbxContent>
                   </v:textbox>
                 </v:rect>
-                <v:shape id="Shape 36425" style="position:absolute;width:4579;height:1849;left:40896;top:12254;" coordsize="457936,184925" path="m0,0l457936,0l457936,184925l0,184925l0,0">
+                <v:shape id="Shape 36422" style="position:absolute;width:4579;height:1849;left:40896;top:12254;" coordsize="457936,184925" path="m0,0l457936,0l457936,184925l0,184925l0,0">
                   <v:stroke weight="0pt" endcap="flat" joinstyle="miter" miterlimit="10" on="false" color="#000000" opacity="0"/>
                   <v:fill on="true" color="#000000"/>
                 </v:shape>
@@ -3925,27 +3934,27 @@
                     </w:txbxContent>
                   </v:textbox>
                 </v:rect>
-                <v:shape id="Shape 36426" style="position:absolute;width:4579;height:1849;left:17999;top:15006;" coordsize="457937,184925" path="m0,0l457937,0l457937,184925l0,184925l0,0">
+                <v:shape id="Shape 36423" style="position:absolute;width:4579;height:1849;left:17999;top:15006;" coordsize="457937,184925" path="m0,0l457937,0l457937,184925l0,184925l0,0">
                   <v:stroke weight="0pt" endcap="flat" joinstyle="miter" miterlimit="10" on="false" color="#000000" opacity="0"/>
                   <v:fill on="true" color="#000000"/>
                 </v:shape>
-                <v:shape id="Shape 36427" style="position:absolute;width:4579;height:1849;left:27158;top:15006;" coordsize="457937,184925" path="m0,0l457937,0l457937,184925l0,184925l0,0">
+                <v:shape id="Shape 36424" style="position:absolute;width:4579;height:1849;left:27158;top:15006;" coordsize="457937,184925" path="m0,0l457937,0l457937,184925l0,184925l0,0">
                   <v:stroke weight="0pt" endcap="flat" joinstyle="miter" miterlimit="10" on="false" color="#000000" opacity="0"/>
                   <v:fill on="true" color="#000000"/>
                 </v:shape>
-                <v:shape id="Shape 36428" style="position:absolute;width:4579;height:1849;left:31737;top:15006;" coordsize="457937,184925" path="m0,0l457937,0l457937,184925l0,184925l0,0">
+                <v:shape id="Shape 36425" style="position:absolute;width:4579;height:1849;left:31737;top:15006;" coordsize="457937,184925" path="m0,0l457937,0l457937,184925l0,184925l0,0">
                   <v:stroke weight="0pt" endcap="flat" joinstyle="miter" miterlimit="10" on="false" color="#000000" opacity="0"/>
                   <v:fill on="true" color="#000000"/>
                 </v:shape>
-                <v:shape id="Shape 36429" style="position:absolute;width:4579;height:1849;left:36317;top:15006;" coordsize="457936,184925" path="m0,0l457936,0l457936,184925l0,184925l0,0">
+                <v:shape id="Shape 36426" style="position:absolute;width:4579;height:1849;left:36317;top:15006;" coordsize="457936,184925" path="m0,0l457936,0l457936,184925l0,184925l0,0">
                   <v:stroke weight="0pt" endcap="flat" joinstyle="miter" miterlimit="10" on="false" color="#000000" opacity="0"/>
                   <v:fill on="true" color="#000000"/>
                 </v:shape>
-                <v:shape id="Shape 36430" style="position:absolute;width:4579;height:1849;left:40896;top:15006;" coordsize="457936,184925" path="m0,0l457936,0l457936,184925l0,184925l0,0">
+                <v:shape id="Shape 36427" style="position:absolute;width:4579;height:1849;left:40896;top:15006;" coordsize="457936,184925" path="m0,0l457936,0l457936,184925l0,184925l0,0">
                   <v:stroke weight="0pt" endcap="flat" joinstyle="miter" miterlimit="10" on="false" color="#000000" opacity="0"/>
                   <v:fill on="true" color="#000000"/>
                 </v:shape>
-                <v:shape id="Shape 36431" style="position:absolute;width:4579;height:1849;left:50055;top:15006;" coordsize="457936,184925" path="m0,0l457936,0l457936,184925l0,184925l0,0">
+                <v:shape id="Shape 36428" style="position:absolute;width:4579;height:1849;left:50055;top:15006;" coordsize="457936,184925" path="m0,0l457936,0l457936,184925l0,184925l0,0">
                   <v:stroke weight="0pt" endcap="flat" joinstyle="miter" miterlimit="10" on="false" color="#000000" opacity="0"/>
                   <v:fill on="true" color="#000000"/>
                 </v:shape>
@@ -3990,39 +3999,39 @@
                     </w:txbxContent>
                   </v:textbox>
                 </v:rect>
-                <v:shape id="Shape 36432" style="position:absolute;width:4579;height:1849;left:17999;top:17758;" coordsize="457937,184925" path="m0,0l457937,0l457937,184925l0,184925l0,0">
+                <v:shape id="Shape 36429" style="position:absolute;width:4579;height:1849;left:17999;top:17758;" coordsize="457937,184925" path="m0,0l457937,0l457937,184925l0,184925l0,0">
                   <v:stroke weight="0pt" endcap="flat" joinstyle="miter" miterlimit="10" on="false" color="#000000" opacity="0"/>
                   <v:fill on="true" color="#000000"/>
                 </v:shape>
-                <v:shape id="Shape 36433" style="position:absolute;width:4579;height:1849;left:22579;top:17758;" coordsize="457937,184925" path="m0,0l457937,0l457937,184925l0,184925l0,0">
+                <v:shape id="Shape 36430" style="position:absolute;width:4579;height:1849;left:22579;top:17758;" coordsize="457937,184925" path="m0,0l457937,0l457937,184925l0,184925l0,0">
                   <v:stroke weight="0pt" endcap="flat" joinstyle="miter" miterlimit="10" on="false" color="#000000" opacity="0"/>
                   <v:fill on="true" color="#000000"/>
                 </v:shape>
-                <v:shape id="Shape 36434" style="position:absolute;width:4579;height:1849;left:27158;top:17758;" coordsize="457937,184925" path="m0,0l457937,0l457937,184925l0,184925l0,0">
+                <v:shape id="Shape 36431" style="position:absolute;width:4579;height:1849;left:27158;top:17758;" coordsize="457937,184925" path="m0,0l457937,0l457937,184925l0,184925l0,0">
                   <v:stroke weight="0pt" endcap="flat" joinstyle="miter" miterlimit="10" on="false" color="#000000" opacity="0"/>
                   <v:fill on="true" color="#000000"/>
                 </v:shape>
-                <v:shape id="Shape 36435" style="position:absolute;width:4579;height:1849;left:31737;top:17758;" coordsize="457937,184925" path="m0,0l457937,0l457937,184925l0,184925l0,0">
+                <v:shape id="Shape 36432" style="position:absolute;width:4579;height:1849;left:31737;top:17758;" coordsize="457937,184925" path="m0,0l457937,0l457937,184925l0,184925l0,0">
                   <v:stroke weight="0pt" endcap="flat" joinstyle="miter" miterlimit="10" on="false" color="#000000" opacity="0"/>
                   <v:fill on="true" color="#000000"/>
                 </v:shape>
-                <v:shape id="Shape 36436" style="position:absolute;width:4579;height:1849;left:36317;top:17758;" coordsize="457936,184925" path="m0,0l457936,0l457936,184925l0,184925l0,0">
+                <v:shape id="Shape 36433" style="position:absolute;width:4579;height:1849;left:36317;top:17758;" coordsize="457936,184925" path="m0,0l457936,0l457936,184925l0,184925l0,0">
                   <v:stroke weight="0pt" endcap="flat" joinstyle="miter" miterlimit="10" on="false" color="#000000" opacity="0"/>
                   <v:fill on="true" color="#000000"/>
                 </v:shape>
-                <v:shape id="Shape 36437" style="position:absolute;width:4579;height:1849;left:40896;top:17758;" coordsize="457936,184925" path="m0,0l457936,0l457936,184925l0,184925l0,0">
+                <v:shape id="Shape 36434" style="position:absolute;width:4579;height:1849;left:40896;top:17758;" coordsize="457936,184925" path="m0,0l457936,0l457936,184925l0,184925l0,0">
                   <v:stroke weight="0pt" endcap="flat" joinstyle="miter" miterlimit="10" on="false" color="#000000" opacity="0"/>
                   <v:fill on="true" color="#000000"/>
                 </v:shape>
-                <v:shape id="Shape 36438" style="position:absolute;width:4579;height:1849;left:45475;top:17758;" coordsize="457936,184925" path="m0,0l457936,0l457936,184925l0,184925l0,0">
+                <v:shape id="Shape 36435" style="position:absolute;width:4579;height:1849;left:45475;top:17758;" coordsize="457936,184925" path="m0,0l457936,0l457936,184925l0,184925l0,0">
                   <v:stroke weight="0pt" endcap="flat" joinstyle="miter" miterlimit="10" on="false" color="#000000" opacity="0"/>
                   <v:fill on="true" color="#000000"/>
                 </v:shape>
-                <v:shape id="Shape 36439" style="position:absolute;width:4579;height:1849;left:50055;top:17758;" coordsize="457936,184925" path="m0,0l457936,0l457936,184925l0,184925l0,0">
+                <v:shape id="Shape 36436" style="position:absolute;width:4579;height:1849;left:50055;top:17758;" coordsize="457936,184925" path="m0,0l457936,0l457936,184925l0,184925l0,0">
                   <v:stroke weight="0pt" endcap="flat" joinstyle="miter" miterlimit="10" on="false" color="#000000" opacity="0"/>
                   <v:fill on="true" color="#000000"/>
                 </v:shape>
-                <v:shape id="Shape 36440" style="position:absolute;width:4579;height:1849;left:54634;top:17758;" coordsize="457937,184925" path="m0,0l457937,0l457937,184925l0,184925l0,0">
+                <v:shape id="Shape 36437" style="position:absolute;width:4579;height:1849;left:54634;top:17758;" coordsize="457937,184925" path="m0,0l457937,0l457937,184925l0,184925l0,0">
                   <v:stroke weight="0pt" endcap="flat" joinstyle="miter" miterlimit="10" on="false" color="#000000" opacity="0"/>
                   <v:fill on="true" color="#000000"/>
                 </v:shape>
@@ -4042,7 +4051,7 @@
     </w:p>
     <w:p>
       <w:pPr>
-        <w:spacing w:after="33"/>
+        <w:spacing w:after="34"/>
         <w:ind w:left="-5" w:right="865"/>
       </w:pPr>
       <w:r>
@@ -4051,7 +4060,7 @@
     </w:p>
     <w:p>
       <w:pPr>
-        <w:spacing w:after="533"/>
+        <w:spacing w:after="534"/>
         <w:ind w:left="-15" w:right="865" w:firstLine="299"/>
       </w:pPr>
       <w:r>
@@ -4139,6 +4148,7 @@
         <w:ind w:left="-5"/>
       </w:pPr>
       <w:r>
+        <w:lastRenderedPageBreak/>
         <w:t>II.A. Sources, and why a crosswalk was necessary</w:t>
       </w:r>
     </w:p>
@@ -4184,16 +4194,16 @@
           <w:noProof/>
         </w:rPr>
         <w:drawing>
-          <wp:inline distT="0" distB="0" distL="0" distR="0" wp14:anchorId="3015BC96" wp14:editId="4CF09611">
+          <wp:inline distT="0" distB="0" distL="0" distR="0" wp14:anchorId="653F4E29" wp14:editId="48A66E82">
             <wp:extent cx="2880360" cy="5105401"/>
             <wp:effectExtent l="0" t="0" r="0" b="0"/>
-            <wp:docPr id="35801" name="Picture 35801"/>
+            <wp:docPr id="35796" name="Picture 35796"/>
             <wp:cNvGraphicFramePr/>
             <a:graphic xmlns:a="http://schemas.openxmlformats.org/drawingml/2006/main">
               <a:graphicData uri="http://schemas.openxmlformats.org/drawingml/2006/picture">
                 <pic:pic xmlns:pic="http://schemas.openxmlformats.org/drawingml/2006/picture">
                   <pic:nvPicPr>
-                    <pic:cNvPr id="35801" name="Picture 35801"/>
+                    <pic:cNvPr id="35796" name="Picture 35796"/>
                     <pic:cNvPicPr/>
                   </pic:nvPicPr>
                   <pic:blipFill>
@@ -4253,7 +4263,7 @@
     </w:p>
     <w:p>
       <w:pPr>
-        <w:spacing w:after="154"/>
+        <w:spacing w:after="155"/>
         <w:ind w:left="-5" w:right="865"/>
       </w:pPr>
       <w:r>
@@ -4278,6 +4288,7 @@
         <w:rPr>
           <w:i/>
         </w:rPr>
+        <w:lastRenderedPageBreak/>
         <w:t>twice</w:t>
       </w:r>
       <w:r>
@@ -4339,7 +4350,7 @@
     </w:p>
     <w:p>
       <w:pPr>
-        <w:spacing w:after="444"/>
+        <w:spacing w:after="445"/>
         <w:ind w:left="-5" w:right="865"/>
       </w:pPr>
       <w:r>
@@ -4383,7 +4394,7 @@
     </w:p>
     <w:p>
       <w:pPr>
-        <w:spacing w:after="461"/>
+        <w:spacing w:after="462"/>
         <w:ind w:left="-5" w:right="865"/>
       </w:pPr>
       <w:r>
@@ -4396,6 +4407,7 @@
         <w:ind w:left="-5"/>
       </w:pPr>
       <w:r>
+        <w:lastRenderedPageBreak/>
         <w:t>II.D. Ribs</w:t>
       </w:r>
     </w:p>
@@ -4522,6 +4534,7 @@
         <w:ind w:left="-5"/>
       </w:pPr>
       <w:r>
+        <w:lastRenderedPageBreak/>
         <w:t>II.E. Label scheme and counting anchors</w:t>
       </w:r>
     </w:p>
@@ -4648,7 +4661,11 @@
         <w:t>, and this is the one class here with no published counterpart. A lumbar rib and a stump rib are the same object under two counts, so assigning it a number would commit the label to one reading of an enumeration anomaly. A scheme that numbers every rib 1–12 has nowhere to put a thirteenth, so the annotator must either call it rib 12, asserting the vertebra beneath it is thoracic, the very question at issue, or discard it. TotalSegmentator carries ribs 1–12 per side and no such class, and VerSe’s T13 is a ve</w:t>
       </w:r>
       <w:r>
-        <w:t>rtebra rather than a rib. This scheme can record both, VerSe’s T13 (28) with its rib pair (46, 59) for a thoracic-type thirteenth vertebra, and 60/61 for a lumbar-type body bearing a rudimentary rib, so either reading is recorded as itself. No record here carries a T13; the sixteen lumbar-rib cases were read as lumbar-type bodies. Where a border vertebra could not be settled by its readers the label stands as read, and reclassifying those records with a classifier trained on local vertebral morphology (Sec.</w:t>
+        <w:t xml:space="preserve">rtebra rather than a rib. This scheme can record both, VerSe’s T13 (28) with its rib pair (46, 59) for a thoracic-type thirteenth vertebra, and 60/61 for a lumbar-type body </w:t>
+      </w:r>
+      <w:r>
+        <w:lastRenderedPageBreak/>
+        <w:t>bearing a rudimentary rib, so either reading is recorded as itself. No record here carries a T13; the sixteen lumbar-rib cases were read as lumbar-type bodies. Where a border vertebra could not be settled by its readers the label stands as read, and reclassifying those records with a classifier trained on local vertebral morphology (Sec.</w:t>
       </w:r>
       <w:r>
         <w:t xml:space="preserve"> </w:t>
@@ -4911,10 +4928,10 @@
         <mc:AlternateContent>
           <mc:Choice Requires="wpg">
             <w:drawing>
-              <wp:inline distT="0" distB="0" distL="0" distR="0" wp14:anchorId="44B9E045" wp14:editId="29DD8598">
+              <wp:inline distT="0" distB="0" distL="0" distR="0" wp14:anchorId="33EA557B" wp14:editId="3FDE2ADF">
                 <wp:extent cx="1357466" cy="1270317"/>
                 <wp:effectExtent l="0" t="0" r="0" b="0"/>
-                <wp:docPr id="30939" name="Group 30939"/>
+                <wp:docPr id="32426" name="Group 32426"/>
                 <wp:cNvGraphicFramePr/>
                 <a:graphic xmlns:a="http://schemas.openxmlformats.org/drawingml/2006/main">
                   <a:graphicData uri="http://schemas.microsoft.com/office/word/2010/wordprocessingGroup">
@@ -4930,7 +4947,7 @@
                       </wpg:grpSpPr>
                       <pic:pic xmlns:pic="http://schemas.openxmlformats.org/drawingml/2006/picture">
                         <pic:nvPicPr>
-                          <pic:cNvPr id="35803" name="Picture 35803"/>
+                          <pic:cNvPr id="35798" name="Picture 35798"/>
                           <pic:cNvPicPr/>
                         </pic:nvPicPr>
                         <pic:blipFill>
@@ -4950,7 +4967,7 @@
                         </pic:spPr>
                       </pic:pic>
                       <wps:wsp>
-                        <wps:cNvPr id="36441" name="Shape 36441"/>
+                        <wps:cNvPr id="36438" name="Shape 36438"/>
                         <wps:cNvSpPr/>
                         <wps:spPr>
                           <a:xfrm>
@@ -5002,7 +5019,7 @@
                         <wps:bodyPr/>
                       </wps:wsp>
                       <wps:wsp>
-                        <wps:cNvPr id="4978" name="Rectangle 4978"/>
+                        <wps:cNvPr id="4975" name="Rectangle 4975"/>
                         <wps:cNvSpPr/>
                         <wps:spPr>
                           <a:xfrm>
@@ -5076,7 +5093,7 @@
                         </wps:bodyPr>
                       </wps:wsp>
                       <wps:wsp>
-                        <wps:cNvPr id="30083" name="Rectangle 30083"/>
+                        <wps:cNvPr id="31976" name="Rectangle 31976"/>
                         <wps:cNvSpPr/>
                         <wps:spPr>
                           <a:xfrm>
@@ -5113,7 +5130,7 @@
                         </wps:bodyPr>
                       </wps:wsp>
                       <wps:wsp>
-                        <wps:cNvPr id="30084" name="Rectangle 30084"/>
+                        <wps:cNvPr id="31978" name="Rectangle 31978"/>
                         <wps:cNvSpPr/>
                         <wps:spPr>
                           <a:xfrm>
@@ -5150,7 +5167,7 @@
                         </wps:bodyPr>
                       </wps:wsp>
                       <wps:wsp>
-                        <wps:cNvPr id="4981" name="Rectangle 4981"/>
+                        <wps:cNvPr id="4986" name="Rectangle 4986"/>
                         <wps:cNvSpPr/>
                         <wps:spPr>
                           <a:xfrm>
@@ -5187,7 +5204,7 @@
                         </wps:bodyPr>
                       </wps:wsp>
                       <wps:wsp>
-                        <wps:cNvPr id="4982" name="Rectangle 4982"/>
+                        <wps:cNvPr id="4988" name="Rectangle 4988"/>
                         <wps:cNvSpPr/>
                         <wps:spPr>
                           <a:xfrm>
@@ -5231,15 +5248,15 @@
           </mc:Choice>
           <mc:Fallback xmlns:a="http://schemas.openxmlformats.org/drawingml/2006/main">
             <w:pict>
-              <v:group id="Group 30939" style="width:106.887pt;height:100.025pt;mso-position-horizontal-relative:char;mso-position-vertical-relative:line" coordsize="13574,12703">
-                <v:shape id="Picture 35803" style="position:absolute;width:9357;height:10942;left:4204;top:-20;" filled="f">
+              <v:group id="Group 32426" style="width:106.887pt;height:100.025pt;mso-position-horizontal-relative:char;mso-position-vertical-relative:line" coordsize="13574,12703">
+                <v:shape id="Picture 35798" style="position:absolute;width:9357;height:10942;left:4204;top:-20;" filled="f">
                   <v:imagedata r:id="rId11"/>
                 </v:shape>
-                <v:shape id="Shape 36442" style="position:absolute;width:1525;height:533;left:0;top:11921;" coordsize="152509,53378" path="m0,0l152509,0l152509,53378l0,53378l0,0">
+                <v:shape id="Shape 36439" style="position:absolute;width:1525;height:533;left:0;top:11921;" coordsize="152509,53378" path="m0,0l152509,0l152509,53378l0,53378l0,0">
                   <v:stroke weight="0.79004pt" endcap="flat" joinstyle="miter" miterlimit="10" on="true" color="#d64541"/>
                   <v:fill on="true" color="#d64541"/>
                 </v:shape>
-                <v:rect id="Rectangle 4978" style="position:absolute;width:225;height:1384;left:4084;top:11662;" filled="f" stroked="f">
+                <v:rect id="Rectangle 4975" style="position:absolute;width:225;height:1384;left:4084;top:11662;" filled="f" stroked="f">
                   <v:textbox inset="0,0,0,0">
                     <w:txbxContent>
                       <w:p>
@@ -5279,7 +5296,7 @@
                     </w:txbxContent>
                   </v:textbox>
                 </v:rect>
-                <v:rect id="Rectangle 30083" style="position:absolute;width:281;height:1384;left:6796;top:11662;" filled="f" stroked="f">
+                <v:rect id="Rectangle 31976" style="position:absolute;width:281;height:1384;left:6796;top:11662;" filled="f" stroked="f">
                   <v:textbox inset="0,0,0,0">
                     <w:txbxContent>
                       <w:p>
@@ -5299,7 +5316,7 @@
                     </w:txbxContent>
                   </v:textbox>
                 </v:rect>
-                <v:rect id="Rectangle 30084" style="position:absolute;width:1521;height:1384;left:7220;top:11662;" filled="f" stroked="f">
+                <v:rect id="Rectangle 31978" style="position:absolute;width:1521;height:1384;left:7220;top:11662;" filled="f" stroked="f">
                   <v:textbox inset="0,0,0,0">
                     <w:txbxContent>
                       <w:p>
@@ -5319,7 +5336,7 @@
                     </w:txbxContent>
                   </v:textbox>
                 </v:rect>
-                <v:rect id="Rectangle 4981" style="position:absolute;width:225;height:1384;left:9847;top:11662;" filled="f" stroked="f">
+                <v:rect id="Rectangle 4986" style="position:absolute;width:225;height:1384;left:9847;top:11662;" filled="f" stroked="f">
                   <v:textbox inset="0,0,0,0">
                     <w:txbxContent>
                       <w:p>
@@ -5339,7 +5356,7 @@
                     </w:txbxContent>
                   </v:textbox>
                 </v:rect>
-                <v:rect id="Rectangle 4982" style="position:absolute;width:1352;height:1384;left:12220;top:11662;" filled="f" stroked="f">
+                <v:rect id="Rectangle 4988" style="position:absolute;width:1352;height:1384;left:12220;top:11662;" filled="f" stroked="f">
                   <v:textbox inset="0,0,0,0">
                     <w:txbxContent>
                       <w:p>
@@ -5381,10 +5398,10 @@
         <mc:AlternateContent>
           <mc:Choice Requires="wpg">
             <w:drawing>
-              <wp:inline distT="0" distB="0" distL="0" distR="0" wp14:anchorId="325AD97C" wp14:editId="6256258A">
+              <wp:inline distT="0" distB="0" distL="0" distR="0" wp14:anchorId="491F8906" wp14:editId="59D8871E">
                 <wp:extent cx="935000" cy="1270317"/>
                 <wp:effectExtent l="0" t="0" r="0" b="0"/>
-                <wp:docPr id="30940" name="Group 30940"/>
+                <wp:docPr id="32427" name="Group 32427"/>
                 <wp:cNvGraphicFramePr/>
                 <a:graphic xmlns:a="http://schemas.openxmlformats.org/drawingml/2006/main">
                   <a:graphicData uri="http://schemas.microsoft.com/office/word/2010/wordprocessingGroup">
@@ -5400,7 +5417,7 @@
                       </wpg:grpSpPr>
                       <pic:pic xmlns:pic="http://schemas.openxmlformats.org/drawingml/2006/picture">
                         <pic:nvPicPr>
-                          <pic:cNvPr id="35804" name="Picture 35804"/>
+                          <pic:cNvPr id="35799" name="Picture 35799"/>
                           <pic:cNvPicPr/>
                         </pic:nvPicPr>
                         <pic:blipFill>
@@ -5420,7 +5437,7 @@
                         </pic:spPr>
                       </pic:pic>
                       <wps:wsp>
-                        <wps:cNvPr id="4984" name="Rectangle 4984"/>
+                        <wps:cNvPr id="5000" name="Rectangle 5000"/>
                         <wps:cNvSpPr/>
                         <wps:spPr>
                           <a:xfrm>
@@ -5457,7 +5474,7 @@
                         </wps:bodyPr>
                       </wps:wsp>
                       <wps:wsp>
-                        <wps:cNvPr id="36443" name="Shape 36443"/>
+                        <wps:cNvPr id="36440" name="Shape 36440"/>
                         <wps:cNvSpPr/>
                         <wps:spPr>
                           <a:xfrm>
@@ -5509,7 +5526,7 @@
                         <wps:bodyPr/>
                       </wps:wsp>
                       <wps:wsp>
-                        <wps:cNvPr id="4985" name="Rectangle 4985"/>
+                        <wps:cNvPr id="5001" name="Rectangle 5001"/>
                         <wps:cNvSpPr/>
                         <wps:spPr>
                           <a:xfrm>
@@ -5546,7 +5563,7 @@
                         </wps:bodyPr>
                       </wps:wsp>
                       <wps:wsp>
-                        <wps:cNvPr id="4986" name="Rectangle 4986"/>
+                        <wps:cNvPr id="5002" name="Rectangle 5002"/>
                         <wps:cNvSpPr/>
                         <wps:spPr>
                           <a:xfrm>
@@ -5590,11 +5607,11 @@
           </mc:Choice>
           <mc:Fallback xmlns:a="http://schemas.openxmlformats.org/drawingml/2006/main">
             <w:pict>
-              <v:group id="Group 30940" style="width:73.622pt;height:100.025pt;mso-position-horizontal-relative:char;mso-position-vertical-relative:line" coordsize="9350,12703">
-                <v:shape id="Picture 35804" style="position:absolute;width:9387;height:10942;left:-34;top:-20;" filled="f">
+              <v:group id="Group 32427" style="width:73.622pt;height:100.025pt;mso-position-horizontal-relative:char;mso-position-vertical-relative:line" coordsize="9350,12703">
+                <v:shape id="Picture 35799" style="position:absolute;width:9387;height:10942;left:-34;top:-20;" filled="f">
                   <v:imagedata r:id="rId13"/>
                 </v:shape>
-                <v:rect id="Rectangle 4984" style="position:absolute;width:225;height:1384;left:2121;top:11662;" filled="f" stroked="f">
+                <v:rect id="Rectangle 5000" style="position:absolute;width:225;height:1384;left:2121;top:11662;" filled="f" stroked="f">
                   <v:textbox inset="0,0,0,0">
                     <w:txbxContent>
                       <w:p>
@@ -5614,11 +5631,11 @@
                     </w:txbxContent>
                   </v:textbox>
                 </v:rect>
-                <v:shape id="Shape 36444" style="position:absolute;width:1525;height:533;left:4298;top:11921;" coordsize="152509,53378" path="m0,0l152509,0l152509,53378l0,53378l0,0">
+                <v:shape id="Shape 36441" style="position:absolute;width:1525;height:533;left:4298;top:11921;" coordsize="152509,53378" path="m0,0l152509,0l152509,53378l0,53378l0,0">
                   <v:stroke weight="0.79004pt" endcap="flat" joinstyle="miter" miterlimit="10" on="true" color="#e8b044"/>
                   <v:fill on="true" color="#e8b044"/>
                 </v:shape>
-                <v:rect id="Rectangle 4985" style="position:absolute;width:563;height:1384;left:6645;top:11662;" filled="f" stroked="f">
+                <v:rect id="Rectangle 5001" style="position:absolute;width:563;height:1384;left:6645;top:11662;" filled="f" stroked="f">
                   <v:textbox inset="0,0,0,0">
                     <w:txbxContent>
                       <w:p>
@@ -5638,7 +5655,7 @@
                     </w:txbxContent>
                   </v:textbox>
                 </v:rect>
-                <v:rect id="Rectangle 4986" style="position:absolute;width:225;height:1384;left:7959;top:11662;" filled="f" stroked="f">
+                <v:rect id="Rectangle 5002" style="position:absolute;width:225;height:1384;left:7959;top:11662;" filled="f" stroked="f">
                   <v:textbox inset="0,0,0,0">
                     <w:txbxContent>
                       <w:p>
@@ -5679,10 +5696,10 @@
         <mc:AlternateContent>
           <mc:Choice Requires="wpg">
             <w:drawing>
-              <wp:inline distT="0" distB="0" distL="0" distR="0" wp14:anchorId="1DEB0184" wp14:editId="5BA5EB62">
+              <wp:inline distT="0" distB="0" distL="0" distR="0" wp14:anchorId="62C45EDE" wp14:editId="227843BE">
                 <wp:extent cx="2247082" cy="1270317"/>
                 <wp:effectExtent l="0" t="0" r="0" b="0"/>
-                <wp:docPr id="30941" name="Group 30941"/>
+                <wp:docPr id="32428" name="Group 32428"/>
                 <wp:cNvGraphicFramePr/>
                 <a:graphic xmlns:a="http://schemas.openxmlformats.org/drawingml/2006/main">
                   <a:graphicData uri="http://schemas.microsoft.com/office/word/2010/wordprocessingGroup">
@@ -5698,7 +5715,7 @@
                       </wpg:grpSpPr>
                       <pic:pic xmlns:pic="http://schemas.openxmlformats.org/drawingml/2006/picture">
                         <pic:nvPicPr>
-                          <pic:cNvPr id="35805" name="Picture 35805"/>
+                          <pic:cNvPr id="35800" name="Picture 35800"/>
                           <pic:cNvPicPr/>
                         </pic:nvPicPr>
                         <pic:blipFill>
@@ -5719,7 +5736,7 @@
                       </pic:pic>
                       <pic:pic xmlns:pic="http://schemas.openxmlformats.org/drawingml/2006/picture">
                         <pic:nvPicPr>
-                          <pic:cNvPr id="35806" name="Picture 35806"/>
+                          <pic:cNvPr id="35801" name="Picture 35801"/>
                           <pic:cNvPicPr/>
                         </pic:nvPicPr>
                         <pic:blipFill>
@@ -5739,7 +5756,7 @@
                         </pic:spPr>
                       </pic:pic>
                       <wps:wsp>
-                        <wps:cNvPr id="4987" name="Rectangle 4987"/>
+                        <wps:cNvPr id="5003" name="Rectangle 5003"/>
                         <wps:cNvSpPr/>
                         <wps:spPr>
                           <a:xfrm>
@@ -5776,7 +5793,7 @@
                         </wps:bodyPr>
                       </wps:wsp>
                       <wps:wsp>
-                        <wps:cNvPr id="4988" name="Rectangle 4988"/>
+                        <wps:cNvPr id="5004" name="Rectangle 5004"/>
                         <wps:cNvSpPr/>
                         <wps:spPr>
                           <a:xfrm>
@@ -5813,7 +5830,7 @@
                         </wps:bodyPr>
                       </wps:wsp>
                       <wps:wsp>
-                        <wps:cNvPr id="36445" name="Shape 36445"/>
+                        <wps:cNvPr id="36442" name="Shape 36442"/>
                         <wps:cNvSpPr/>
                         <wps:spPr>
                           <a:xfrm>
@@ -5865,7 +5882,7 @@
                         <wps:bodyPr/>
                       </wps:wsp>
                       <wps:wsp>
-                        <wps:cNvPr id="4999" name="Rectangle 4999"/>
+                        <wps:cNvPr id="5005" name="Rectangle 5005"/>
                         <wps:cNvSpPr/>
                         <wps:spPr>
                           <a:xfrm>
@@ -5902,7 +5919,7 @@
                         </wps:bodyPr>
                       </wps:wsp>
                       <wps:wsp>
-                        <wps:cNvPr id="5002" name="Rectangle 5002"/>
+                        <wps:cNvPr id="5006" name="Rectangle 5006"/>
                         <wps:cNvSpPr/>
                         <wps:spPr>
                           <a:xfrm>
@@ -5939,7 +5956,7 @@
                         </wps:bodyPr>
                       </wps:wsp>
                       <wps:wsp>
-                        <wps:cNvPr id="5005" name="Rectangle 5005"/>
+                        <wps:cNvPr id="5007" name="Rectangle 5007"/>
                         <wps:cNvSpPr/>
                         <wps:spPr>
                           <a:xfrm>
@@ -5976,7 +5993,7 @@
                         </wps:bodyPr>
                       </wps:wsp>
                       <wps:wsp>
-                        <wps:cNvPr id="5006" name="Rectangle 5006"/>
+                        <wps:cNvPr id="5008" name="Rectangle 5008"/>
                         <wps:cNvSpPr/>
                         <wps:spPr>
                           <a:xfrm>
@@ -6020,14 +6037,14 @@
           </mc:Choice>
           <mc:Fallback xmlns:a="http://schemas.openxmlformats.org/drawingml/2006/main">
             <w:pict>
-              <v:group id="Group 30941" style="width:176.936pt;height:100.025pt;mso-position-horizontal-relative:char;mso-position-vertical-relative:line" coordsize="22470,12703">
-                <v:shape id="Picture 35805" style="position:absolute;width:9387;height:10942;left:-38;top:-20;" filled="f">
+              <v:group id="Group 32428" style="width:176.936pt;height:100.025pt;mso-position-horizontal-relative:char;mso-position-vertical-relative:line" coordsize="22470,12703">
+                <v:shape id="Picture 35800" style="position:absolute;width:9387;height:10942;left:-38;top:-20;" filled="f">
                   <v:imagedata r:id="rId16"/>
                 </v:shape>
-                <v:shape id="Picture 35806" style="position:absolute;width:9387;height:10942;left:13078;top:-20;" filled="f">
+                <v:shape id="Picture 35801" style="position:absolute;width:9387;height:10942;left:13078;top:-20;" filled="f">
                   <v:imagedata r:id="rId17"/>
                 </v:shape>
-                <v:rect id="Rectangle 4987" style="position:absolute;width:732;height:1384;left:4629;top:11662;" filled="f" stroked="f">
+                <v:rect id="Rectangle 5003" style="position:absolute;width:732;height:1384;left:4629;top:11662;" filled="f" stroked="f">
                   <v:textbox inset="0,0,0,0">
                     <w:txbxContent>
                       <w:p>
@@ -6047,7 +6064,7 @@
                     </w:txbxContent>
                   </v:textbox>
                 </v:rect>
-                <v:rect id="Rectangle 4988" style="position:absolute;width:563;height:1384;left:6875;top:11662;" filled="f" stroked="f">
+                <v:rect id="Rectangle 5004" style="position:absolute;width:563;height:1384;left:6875;top:11662;" filled="f" stroked="f">
                   <v:textbox inset="0,0,0,0">
                     <w:txbxContent>
                       <w:p>
@@ -6067,11 +6084,11 @@
                     </w:txbxContent>
                   </v:textbox>
                 </v:rect>
-                <v:shape id="Shape 36446" style="position:absolute;width:1525;height:533;left:9931;top:11921;" coordsize="152509,53378" path="m0,0l152509,0l152509,53378l0,53378l0,0">
+                <v:shape id="Shape 36443" style="position:absolute;width:1525;height:533;left:9931;top:11921;" coordsize="152509,53378" path="m0,0l152509,0l152509,53378l0,53378l0,0">
                   <v:stroke weight="0.79004pt" endcap="flat" joinstyle="miter" miterlimit="10" on="true" color="#306ebe"/>
                   <v:fill on="true" color="#306ebe"/>
                 </v:shape>
-                <v:rect id="Rectangle 4999" style="position:absolute;width:225;height:1384;left:14144;top:11662;" filled="f" stroked="f">
+                <v:rect id="Rectangle 5005" style="position:absolute;width:225;height:1384;left:14144;top:11662;" filled="f" stroked="f">
                   <v:textbox inset="0,0,0,0">
                     <w:txbxContent>
                       <w:p>
@@ -6091,7 +6108,7 @@
                     </w:txbxContent>
                   </v:textbox>
                 </v:rect>
-                <v:rect id="Rectangle 5002" style="position:absolute;width:563;height:1384;left:15754;top:11662;" filled="f" stroked="f">
+                <v:rect id="Rectangle 5006" style="position:absolute;width:563;height:1384;left:15754;top:11662;" filled="f" stroked="f">
                   <v:textbox inset="0,0,0,0">
                     <w:txbxContent>
                       <w:p>
@@ -6111,7 +6128,7 @@
                     </w:txbxContent>
                   </v:textbox>
                 </v:rect>
-                <v:rect id="Rectangle 5005" style="position:absolute;width:281;height:1384;left:16856;top:11662;" filled="f" stroked="f">
+                <v:rect id="Rectangle 5007" style="position:absolute;width:281;height:1384;left:16856;top:11662;" filled="f" stroked="f">
                   <v:textbox inset="0,0,0,0">
                     <w:txbxContent>
                       <w:p>
@@ -6131,7 +6148,7 @@
                     </w:txbxContent>
                   </v:textbox>
                 </v:rect>
-                <v:rect id="Rectangle 5006" style="position:absolute;width:281;height:1384;left:18213;top:11662;" filled="f" stroked="f">
+                <v:rect id="Rectangle 5008" style="position:absolute;width:281;height:1384;left:18213;top:11662;" filled="f" stroked="f">
                   <v:textbox inset="0,0,0,0">
                     <w:txbxContent>
                       <w:p>
@@ -6203,10 +6220,11 @@
     </w:p>
     <w:p>
       <w:pPr>
-        <w:spacing w:after="496"/>
+        <w:spacing w:after="497"/>
         <w:ind w:left="-15" w:firstLine="299"/>
       </w:pPr>
       <w:r>
+        <w:lastRenderedPageBreak/>
         <w:t>Both counts, and the manifest fields that report them (</w:t>
       </w:r>
       <w:r>
@@ -6242,10 +6260,10 @@
         <mc:AlternateContent>
           <mc:Choice Requires="wpg">
             <w:drawing>
-              <wp:inline distT="0" distB="0" distL="0" distR="0" wp14:anchorId="074404EB" wp14:editId="577D5794">
+              <wp:inline distT="0" distB="0" distL="0" distR="0" wp14:anchorId="7ACB825F" wp14:editId="6C55791C">
                 <wp:extent cx="46876" cy="5055"/>
                 <wp:effectExtent l="0" t="0" r="0" b="0"/>
-                <wp:docPr id="30942" name="Group 30942"/>
+                <wp:docPr id="32429" name="Group 32429"/>
                 <wp:cNvGraphicFramePr/>
                 <a:graphic xmlns:a="http://schemas.openxmlformats.org/drawingml/2006/main">
                   <a:graphicData uri="http://schemas.microsoft.com/office/word/2010/wordprocessingGroup">
@@ -6312,7 +6330,7 @@
           </mc:Choice>
           <mc:Fallback xmlns:a="http://schemas.openxmlformats.org/drawingml/2006/main">
             <w:pict>
-              <v:group id="Group 30942" style="width:3.69101pt;height:0.398pt;mso-position-horizontal-relative:char;mso-position-vertical-relative:line" coordsize="468,50">
+              <v:group id="Group 32429" style="width:3.69101pt;height:0.398pt;mso-position-horizontal-relative:char;mso-position-vertical-relative:line" coordsize="468,50">
                 <v:shape id="Shape 755" style="position:absolute;width:468;height:0;left:0;top:0;" coordsize="46876,0" path="m0,0l46876,0">
                   <v:stroke weight="0.398pt" endcap="flat" joinstyle="miter" miterlimit="10" on="true" color="#000000"/>
                   <v:fill on="false" color="#000000" opacity="0"/>
@@ -6337,10 +6355,10 @@
         <mc:AlternateContent>
           <mc:Choice Requires="wpg">
             <w:drawing>
-              <wp:inline distT="0" distB="0" distL="0" distR="0" wp14:anchorId="7E95A90C" wp14:editId="4E831ADC">
+              <wp:inline distT="0" distB="0" distL="0" distR="0" wp14:anchorId="26141817" wp14:editId="6BECFA00">
                 <wp:extent cx="46875" cy="5055"/>
                 <wp:effectExtent l="0" t="0" r="0" b="0"/>
-                <wp:docPr id="30943" name="Group 30943"/>
+                <wp:docPr id="32430" name="Group 32430"/>
                 <wp:cNvGraphicFramePr/>
                 <a:graphic xmlns:a="http://schemas.openxmlformats.org/drawingml/2006/main">
                   <a:graphicData uri="http://schemas.microsoft.com/office/word/2010/wordprocessingGroup">
@@ -6407,7 +6425,7 @@
           </mc:Choice>
           <mc:Fallback xmlns:a="http://schemas.openxmlformats.org/drawingml/2006/main">
             <w:pict>
-              <v:group id="Group 30943" style="width:3.69098pt;height:0.398pt;mso-position-horizontal-relative:char;mso-position-vertical-relative:line" coordsize="468,50">
+              <v:group id="Group 32430" style="width:3.69098pt;height:0.398pt;mso-position-horizontal-relative:char;mso-position-vertical-relative:line" coordsize="468,50">
                 <v:shape id="Shape 757" style="position:absolute;width:468;height:0;left:0;top:0;" coordsize="46875,0" path="m0,0l46875,0">
                   <v:stroke weight="0.398pt" endcap="flat" joinstyle="miter" miterlimit="10" on="true" color="#000000"/>
                   <v:fill on="false" color="#000000" opacity="0"/>
@@ -6471,7 +6489,6 @@
     </w:p>
     <w:p>
       <w:pPr>
-        <w:spacing w:after="125"/>
         <w:ind w:left="-15" w:right="865" w:firstLine="299"/>
       </w:pPr>
       <w:r>
@@ -6500,7 +6517,7 @@
         <w:t xml:space="preserve">total </w:t>
       </w:r>
       <w:r>
-        <w:t>task, release 2.x) on a single graphics processing unit. The binary rib network is Mo¨ller’s</w:t>
+        <w:t>task, release 2.x) on a single graphics processing unit. The binary rib network is M¨oller’s</w:t>
       </w:r>
       <w:r>
         <w:rPr>
@@ -6528,25 +6545,35 @@
             <w:rFonts w:ascii="Calibri" w:eastAsia="Calibri" w:hAnsi="Calibri" w:cs="Calibri"/>
             <w:color w:val="0000FF"/>
           </w:rPr>
-          <w:t xml:space="preserve">https://huggingface.co/OpenSpineConsortium/ </w:t>
+          <w:t>https://huggingface.co/OpenSpineConsortium/spinopelvic-seg-checkpoints</w:t>
         </w:r>
       </w:hyperlink>
       <w:hyperlink r:id="rId19">
+        <w:r>
+          <w:t xml:space="preserve">, </w:t>
+        </w:r>
+      </w:hyperlink>
+      <w:r>
+        <w:t xml:space="preserve">trained with </w:t>
+      </w:r>
+      <w:hyperlink r:id="rId20">
         <w:r>
           <w:rPr>
             <w:rFonts w:ascii="Calibri" w:eastAsia="Calibri" w:hAnsi="Calibri" w:cs="Calibri"/>
             <w:color w:val="0000FF"/>
           </w:rPr>
-          <w:t>spinopelvic-seg-checkpoints</w:t>
+          <w:t>https://github.com/Gregory-Schwing-MD-PhD/spinesurg-ct-nnunet</w:t>
         </w:r>
       </w:hyperlink>
-      <w:hyperlink r:id="rId20">
-        <w:r>
-          <w:t>)</w:t>
-        </w:r>
-      </w:hyperlink>
-      <w:r>
-        <w:t>. Image handling throughout used NiBabel and SciPy; no image is resampled or reoriented when a label is written, so every label shares its image’s</w:t>
+      <w:r>
+        <w:rPr>
+          <w:rFonts w:ascii="Calibri" w:eastAsia="Calibri" w:hAnsi="Calibri" w:cs="Calibri"/>
+          <w:color w:val="0000FF"/>
+        </w:rPr>
+        <w:t xml:space="preserve"> </w:t>
+      </w:r>
+      <w:r>
+        <w:t>at commit 50b209f). Image handling throughout used NiBabel and SciPy; no image is resampled or reoriented when a label is written, so every label shares its image’s grid and</w:t>
       </w:r>
     </w:p>
     <w:p>
@@ -6555,12 +6582,12 @@
         <w:ind w:left="-5" w:right="865"/>
       </w:pPr>
       <w:r>
-        <w:t>grid and affine exactly.</w:t>
-      </w:r>
-    </w:p>
-    <w:p>
-      <w:pPr>
-        <w:spacing w:after="537"/>
+        <w:t>affine exactly.</w:t>
+      </w:r>
+    </w:p>
+    <w:p>
+      <w:pPr>
+        <w:spacing w:after="538"/>
         <w:ind w:left="-15" w:right="865" w:firstLine="299"/>
       </w:pPr>
       <w:r>
@@ -6609,6 +6636,7 @@
         <w:rPr>
           <w:i/>
         </w:rPr>
+        <w:lastRenderedPageBreak/>
         <w:t xml:space="preserve">Geometric invariants. </w:t>
       </w:r>
       <w:r>
@@ -6655,10 +6683,10 @@
         <mc:AlternateContent>
           <mc:Choice Requires="wpg">
             <w:drawing>
-              <wp:inline distT="0" distB="0" distL="0" distR="0" wp14:anchorId="16AA3A2C" wp14:editId="1B867211">
+              <wp:inline distT="0" distB="0" distL="0" distR="0" wp14:anchorId="7D3FD56C" wp14:editId="14EB8127">
                 <wp:extent cx="46876" cy="5055"/>
                 <wp:effectExtent l="0" t="0" r="0" b="0"/>
-                <wp:docPr id="30286" name="Group 30286"/>
+                <wp:docPr id="31672" name="Group 31672"/>
                 <wp:cNvGraphicFramePr/>
                 <a:graphic xmlns:a="http://schemas.openxmlformats.org/drawingml/2006/main">
                   <a:graphicData uri="http://schemas.microsoft.com/office/word/2010/wordprocessingGroup">
@@ -6673,7 +6701,7 @@
                         </a:xfrm>
                       </wpg:grpSpPr>
                       <wps:wsp>
-                        <wps:cNvPr id="839" name="Shape 839"/>
+                        <wps:cNvPr id="840" name="Shape 840"/>
                         <wps:cNvSpPr/>
                         <wps:spPr>
                           <a:xfrm>
@@ -6725,8 +6753,8 @@
           </mc:Choice>
           <mc:Fallback xmlns:a="http://schemas.openxmlformats.org/drawingml/2006/main">
             <w:pict>
-              <v:group id="Group 30286" style="width:3.69099pt;height:0.398pt;mso-position-horizontal-relative:char;mso-position-vertical-relative:line" coordsize="468,50">
-                <v:shape id="Shape 839" style="position:absolute;width:468;height:0;left:0;top:0;" coordsize="46876,0" path="m0,0l46876,0">
+              <v:group id="Group 31672" style="width:3.69099pt;height:0.398pt;mso-position-horizontal-relative:char;mso-position-vertical-relative:line" coordsize="468,50">
+                <v:shape id="Shape 840" style="position:absolute;width:468;height:0;left:0;top:0;" coordsize="46876,0" path="m0,0l46876,0">
                   <v:stroke weight="0.398pt" endcap="flat" joinstyle="miter" miterlimit="10" on="true" color="#000000"/>
                   <v:fill on="false" color="#000000" opacity="0"/>
                 </v:shape>
@@ -6756,7 +6784,7 @@
     </w:p>
     <w:p>
       <w:pPr>
-        <w:spacing w:after="28"/>
+        <w:spacing w:after="29"/>
         <w:ind w:left="-15" w:right="865" w:firstLine="299"/>
       </w:pPr>
       <w:r>
@@ -6810,7 +6838,7 @@
         <w:t xml:space="preserve">zero </w:t>
       </w:r>
       <w:r>
-        <w:t>are assigned to a lumbar vertebra, not because no lumbar ribs exist, since 16 records carry one, but because such a rib takes class 60 or 61 and never enters the numbered set the test examines. A numbered rib landing on a lumbar vertebra would be a counting</w:t>
+        <w:t>are assigned to a lumbar vertebra, not because no lumbar ribs exist, since 16 records carry one, but because such a rib takes class 60 or 61 and never enters the numbered</w:t>
       </w:r>
     </w:p>
     <w:p>
@@ -7180,16 +7208,16 @@
                 <w:noProof/>
               </w:rPr>
               <w:drawing>
-                <wp:inline distT="0" distB="0" distL="0" distR="0" wp14:anchorId="0FD2C5FA" wp14:editId="2401CC75">
+                <wp:inline distT="0" distB="0" distL="0" distR="0" wp14:anchorId="29C684D2" wp14:editId="3FE222FD">
                   <wp:extent cx="48768" cy="320040"/>
                   <wp:effectExtent l="0" t="0" r="0" b="0"/>
-                  <wp:docPr id="35807" name="Picture 35807"/>
+                  <wp:docPr id="35802" name="Picture 35802"/>
                   <wp:cNvGraphicFramePr/>
                   <a:graphic xmlns:a="http://schemas.openxmlformats.org/drawingml/2006/main">
                     <a:graphicData uri="http://schemas.openxmlformats.org/drawingml/2006/picture">
                       <pic:pic xmlns:pic="http://schemas.openxmlformats.org/drawingml/2006/picture">
                         <pic:nvPicPr>
-                          <pic:cNvPr id="35807" name="Picture 35807"/>
+                          <pic:cNvPr id="35802" name="Picture 35802"/>
                           <pic:cNvPicPr/>
                         </pic:nvPicPr>
                         <pic:blipFill>
@@ -7413,22 +7441,32 @@
     </w:tbl>
     <w:p>
       <w:pPr>
-        <w:spacing w:after="173" w:line="259" w:lineRule="auto"/>
+        <w:spacing w:after="114" w:line="259" w:lineRule="auto"/>
         <w:ind w:left="-5" w:right="865"/>
       </w:pPr>
       <w:r>
+        <w:t>set the test examines. A numbered rib landing on a lumbar vertebra would be a counting</w:t>
+      </w:r>
+    </w:p>
+    <w:p>
+      <w:pPr>
+        <w:spacing w:after="151" w:line="259" w:lineRule="auto"/>
+        <w:ind w:left="-5" w:right="865"/>
+      </w:pPr>
+      <w:r>
         <w:t>error of exactly the kind this dataset exists to expose.</w:t>
       </w:r>
     </w:p>
     <w:p>
       <w:pPr>
-        <w:spacing w:after="627"/>
+        <w:spacing w:after="487"/>
         <w:ind w:left="-15" w:right="865" w:firstLine="299"/>
       </w:pPr>
       <w:r>
         <w:rPr>
           <w:i/>
         </w:rPr>
+        <w:lastRenderedPageBreak/>
         <w:t xml:space="preserve">Agreement with published values. </w:t>
       </w:r>
       <w:r>
@@ -7463,7 +7501,6 @@
     <w:p>
       <w:pPr>
         <w:pStyle w:val="Heading1"/>
-        <w:spacing w:after="429"/>
         <w:ind w:left="-5"/>
       </w:pPr>
       <w:r>
@@ -7472,6 +7509,7 @@
     </w:p>
     <w:p>
       <w:pPr>
+        <w:spacing w:after="25"/>
         <w:ind w:left="-15" w:right="865" w:firstLine="299"/>
       </w:pPr>
       <w:r>
@@ -7525,7 +7563,7 @@
     </w:p>
     <w:p>
       <w:pPr>
-        <w:spacing w:after="627"/>
+        <w:spacing w:after="487"/>
         <w:ind w:left="-5" w:right="865"/>
       </w:pPr>
       <w:r>
@@ -7544,7 +7582,7 @@
     </w:p>
     <w:p>
       <w:pPr>
-        <w:spacing w:after="422" w:line="265" w:lineRule="auto"/>
+        <w:spacing w:after="396" w:line="265" w:lineRule="auto"/>
         <w:ind w:left="-5"/>
         <w:jc w:val="left"/>
       </w:pPr>
@@ -7600,16 +7638,16 @@
           <w:noProof/>
         </w:rPr>
         <w:drawing>
-          <wp:inline distT="0" distB="0" distL="0" distR="0" wp14:anchorId="740D66AA" wp14:editId="41287082">
+          <wp:inline distT="0" distB="0" distL="0" distR="0" wp14:anchorId="61650E50" wp14:editId="7CE2FB0F">
             <wp:extent cx="5751576" cy="954024"/>
             <wp:effectExtent l="0" t="0" r="0" b="0"/>
-            <wp:docPr id="35808" name="Picture 35808"/>
+            <wp:docPr id="35803" name="Picture 35803"/>
             <wp:cNvGraphicFramePr/>
             <a:graphic xmlns:a="http://schemas.openxmlformats.org/drawingml/2006/main">
               <a:graphicData uri="http://schemas.openxmlformats.org/drawingml/2006/picture">
                 <pic:pic xmlns:pic="http://schemas.openxmlformats.org/drawingml/2006/picture">
                   <pic:nvPicPr>
-                    <pic:cNvPr id="35808" name="Picture 35808"/>
+                    <pic:cNvPr id="35803" name="Picture 35803"/>
                     <pic:cNvPicPr/>
                   </pic:nvPicPr>
                   <pic:blipFill>
@@ -7707,13 +7745,14 @@
     </w:p>
     <w:p>
       <w:pPr>
-        <w:spacing w:after="82"/>
+        <w:spacing w:after="83"/>
         <w:ind w:left="-15" w:right="865" w:firstLine="299"/>
       </w:pPr>
       <w:r>
         <w:rPr>
           <w:i/>
         </w:rPr>
+        <w:lastRenderedPageBreak/>
         <w:t xml:space="preserve">II.I.0.a. Detection over-calls by a factor of five. </w:t>
       </w:r>
       <w:r>
@@ -7799,7 +7838,7 @@
     </w:p>
     <w:p>
       <w:pPr>
-        <w:spacing w:after="619"/>
+        <w:spacing w:after="620"/>
         <w:ind w:left="-15" w:right="865" w:firstLine="299"/>
       </w:pPr>
       <w:r>
@@ -8316,6 +8355,7 @@
               <w:rPr>
                 <w:sz w:val="22"/>
               </w:rPr>
+              <w:lastRenderedPageBreak/>
               <w:t>Instrumentation and partial-annotation flags</w:t>
             </w:r>
           </w:p>
@@ -8934,7 +8974,7 @@
     </w:tbl>
     <w:p>
       <w:pPr>
-        <w:spacing w:after="375"/>
+        <w:spacing w:after="376"/>
         <w:ind w:left="-5" w:right="865"/>
       </w:pPr>
       <w:r>
@@ -8961,7 +9001,7 @@
     </w:p>
     <w:p>
       <w:pPr>
-        <w:spacing w:after="408"/>
+        <w:spacing w:after="409"/>
         <w:ind w:left="-15" w:right="865" w:firstLine="299"/>
       </w:pPr>
       <w:r>
@@ -8989,7 +9029,7 @@
     </w:p>
     <w:p>
       <w:pPr>
-        <w:spacing w:after="407"/>
+        <w:spacing w:after="408"/>
         <w:ind w:left="-5" w:right="865"/>
       </w:pPr>
       <w:r>
@@ -9041,16 +9081,16 @@
           <w:noProof/>
         </w:rPr>
         <w:drawing>
-          <wp:inline distT="0" distB="0" distL="0" distR="0" wp14:anchorId="477102AB" wp14:editId="558032FC">
+          <wp:inline distT="0" distB="0" distL="0" distR="0" wp14:anchorId="2AC67326" wp14:editId="1A3C46A8">
             <wp:extent cx="5535169" cy="1453896"/>
             <wp:effectExtent l="0" t="0" r="0" b="0"/>
-            <wp:docPr id="35810" name="Picture 35810"/>
+            <wp:docPr id="35805" name="Picture 35805"/>
             <wp:cNvGraphicFramePr/>
             <a:graphic xmlns:a="http://schemas.openxmlformats.org/drawingml/2006/main">
               <a:graphicData uri="http://schemas.openxmlformats.org/drawingml/2006/picture">
                 <pic:pic xmlns:pic="http://schemas.openxmlformats.org/drawingml/2006/picture">
                   <pic:nvPicPr>
-                    <pic:cNvPr id="35810" name="Picture 35810"/>
+                    <pic:cNvPr id="35805" name="Picture 35805"/>
                     <pic:cNvPicPr/>
                   </pic:nvPicPr>
                   <pic:blipFill>
@@ -9085,6 +9125,7 @@
           <w:rFonts w:ascii="Calibri" w:eastAsia="Calibri" w:hAnsi="Calibri" w:cs="Calibri"/>
           <w:sz w:val="22"/>
         </w:rPr>
+        <w:lastRenderedPageBreak/>
         <w:t xml:space="preserve">Fig. </w:t>
       </w:r>
       <w:r>
@@ -9155,7 +9196,7 @@
     </w:p>
     <w:p>
       <w:pPr>
-        <w:spacing w:after="213"/>
+        <w:spacing w:after="214"/>
         <w:ind w:left="-5" w:right="865"/>
       </w:pPr>
       <w:r>
@@ -9257,16 +9298,16 @@
           <w:noProof/>
         </w:rPr>
         <w:drawing>
-          <wp:inline distT="0" distB="0" distL="0" distR="0" wp14:anchorId="3230D7B9" wp14:editId="16D09672">
+          <wp:inline distT="0" distB="0" distL="0" distR="0" wp14:anchorId="156F6A4F" wp14:editId="6E4E12EA">
             <wp:extent cx="5812537" cy="1173480"/>
             <wp:effectExtent l="0" t="0" r="0" b="0"/>
-            <wp:docPr id="35812" name="Picture 35812"/>
+            <wp:docPr id="35807" name="Picture 35807"/>
             <wp:cNvGraphicFramePr/>
             <a:graphic xmlns:a="http://schemas.openxmlformats.org/drawingml/2006/main">
               <a:graphicData uri="http://schemas.openxmlformats.org/drawingml/2006/picture">
                 <pic:pic xmlns:pic="http://schemas.openxmlformats.org/drawingml/2006/picture">
                   <pic:nvPicPr>
-                    <pic:cNvPr id="35812" name="Picture 35812"/>
+                    <pic:cNvPr id="35807" name="Picture 35807"/>
                     <pic:cNvPicPr/>
                   </pic:nvPicPr>
                   <pic:blipFill>
@@ -9302,6 +9343,7 @@
           <w:rFonts w:ascii="Calibri" w:eastAsia="Calibri" w:hAnsi="Calibri" w:cs="Calibri"/>
           <w:sz w:val="22"/>
         </w:rPr>
+        <w:lastRenderedPageBreak/>
         <w:t xml:space="preserve">Fig. </w:t>
       </w:r>
       <w:r>
@@ -9362,7 +9404,7 @@
     </w:p>
     <w:p>
       <w:pPr>
-        <w:spacing w:after="434"/>
+        <w:spacing w:after="435"/>
         <w:ind w:left="-15" w:right="865" w:firstLine="299"/>
       </w:pPr>
       <w:r>
@@ -9428,7 +9470,7 @@
           <w:footerReference w:type="default" r:id="rId28"/>
           <w:footerReference w:type="first" r:id="rId29"/>
           <w:pgSz w:w="12240" w:h="15840"/>
-          <w:pgMar w:top="1434" w:right="595" w:bottom="1091" w:left="1440" w:header="720" w:footer="496" w:gutter="0"/>
+          <w:pgMar w:top="1434" w:right="595" w:bottom="1088" w:left="1440" w:header="720" w:footer="496" w:gutter="0"/>
           <w:cols w:space="720"/>
         </w:sectPr>
       </w:pPr>
@@ -9509,10 +9551,10 @@
         <mc:AlternateContent>
           <mc:Choice Requires="wpg">
             <w:drawing>
-              <wp:inline distT="0" distB="0" distL="0" distR="0" wp14:anchorId="5B285CC4" wp14:editId="367BC4BD">
+              <wp:inline distT="0" distB="0" distL="0" distR="0" wp14:anchorId="4438A061" wp14:editId="4B6D8F5D">
                 <wp:extent cx="3832153" cy="871728"/>
                 <wp:effectExtent l="0" t="0" r="0" b="0"/>
-                <wp:docPr id="35858" name="Group 35858"/>
+                <wp:docPr id="35853" name="Group 35853"/>
                 <wp:cNvGraphicFramePr/>
                 <a:graphic xmlns:a="http://schemas.openxmlformats.org/drawingml/2006/main">
                   <a:graphicData uri="http://schemas.microsoft.com/office/word/2010/wordprocessingGroup">
@@ -9528,7 +9570,7 @@
                       </wpg:grpSpPr>
                       <pic:pic xmlns:pic="http://schemas.openxmlformats.org/drawingml/2006/picture">
                         <pic:nvPicPr>
-                          <pic:cNvPr id="35814" name="Picture 35814"/>
+                          <pic:cNvPr id="35809" name="Picture 35809"/>
                           <pic:cNvPicPr/>
                         </pic:nvPicPr>
                         <pic:blipFill>
@@ -9548,7 +9590,7 @@
                         </pic:spPr>
                       </pic:pic>
                       <wps:wsp>
-                        <wps:cNvPr id="3563" name="Shape 3563"/>
+                        <wps:cNvPr id="3564" name="Shape 3564"/>
                         <wps:cNvSpPr/>
                         <wps:spPr>
                           <a:xfrm>
@@ -9593,7 +9635,7 @@
                         <wps:bodyPr/>
                       </wps:wsp>
                       <wps:wsp>
-                        <wps:cNvPr id="3564" name="Shape 3564"/>
+                        <wps:cNvPr id="3565" name="Shape 3565"/>
                         <wps:cNvSpPr/>
                         <wps:spPr>
                           <a:xfrm>
@@ -9637,7 +9679,7 @@
                         <wps:bodyPr/>
                       </wps:wsp>
                       <wps:wsp>
-                        <wps:cNvPr id="3566" name="Shape 3566"/>
+                        <wps:cNvPr id="3567" name="Shape 3567"/>
                         <wps:cNvSpPr/>
                         <wps:spPr>
                           <a:xfrm>
@@ -9682,7 +9724,7 @@
                         <wps:bodyPr/>
                       </wps:wsp>
                       <wps:wsp>
-                        <wps:cNvPr id="3567" name="Shape 3567"/>
+                        <wps:cNvPr id="3568" name="Shape 3568"/>
                         <wps:cNvSpPr/>
                         <wps:spPr>
                           <a:xfrm>
@@ -9726,7 +9768,7 @@
                         <wps:bodyPr/>
                       </wps:wsp>
                       <wps:wsp>
-                        <wps:cNvPr id="3569" name="Shape 3569"/>
+                        <wps:cNvPr id="3570" name="Shape 3570"/>
                         <wps:cNvSpPr/>
                         <wps:spPr>
                           <a:xfrm>
@@ -9771,7 +9813,7 @@
                         <wps:bodyPr/>
                       </wps:wsp>
                       <wps:wsp>
-                        <wps:cNvPr id="3570" name="Shape 3570"/>
+                        <wps:cNvPr id="3571" name="Shape 3571"/>
                         <wps:cNvSpPr/>
                         <wps:spPr>
                           <a:xfrm>
@@ -9815,7 +9857,7 @@
                         <wps:bodyPr/>
                       </wps:wsp>
                       <wps:wsp>
-                        <wps:cNvPr id="3572" name="Shape 3572"/>
+                        <wps:cNvPr id="3573" name="Shape 3573"/>
                         <wps:cNvSpPr/>
                         <wps:spPr>
                           <a:xfrm>
@@ -9860,7 +9902,7 @@
                         <wps:bodyPr/>
                       </wps:wsp>
                       <wps:wsp>
-                        <wps:cNvPr id="3573" name="Shape 3573"/>
+                        <wps:cNvPr id="3574" name="Shape 3574"/>
                         <wps:cNvSpPr/>
                         <wps:spPr>
                           <a:xfrm>
@@ -9904,55 +9946,11 @@
                         <wps:bodyPr/>
                       </wps:wsp>
                       <wps:wsp>
-                        <wps:cNvPr id="3575" name="Shape 3575"/>
-                        <wps:cNvSpPr/>
-                        <wps:spPr>
-                          <a:xfrm>
-                            <a:off x="2431940" y="805721"/>
-                            <a:ext cx="0" cy="23452"/>
-                          </a:xfrm>
-                          <a:custGeom>
-                            <a:avLst/>
-                            <a:gdLst/>
-                            <a:ahLst/>
-                            <a:cxnLst/>
-                            <a:rect l="0" t="0" r="0" b="0"/>
-                            <a:pathLst>
-                              <a:path h="23452">
-                                <a:moveTo>
-                                  <a:pt x="0" y="23452"/>
-                                </a:moveTo>
-                                <a:lnTo>
-                                  <a:pt x="0" y="0"/>
-                                </a:lnTo>
-                                <a:close/>
-                              </a:path>
-                            </a:pathLst>
-                          </a:custGeom>
-                          <a:ln w="8208" cap="flat">
-                            <a:round/>
-                          </a:ln>
-                        </wps:spPr>
-                        <wps:style>
-                          <a:lnRef idx="1">
-                            <a:srgbClr val="000000"/>
-                          </a:lnRef>
-                          <a:fillRef idx="1">
-                            <a:srgbClr val="000000"/>
-                          </a:fillRef>
-                          <a:effectRef idx="0">
-                            <a:scrgbClr r="0" g="0" b="0"/>
-                          </a:effectRef>
-                          <a:fontRef idx="none"/>
-                        </wps:style>
-                        <wps:bodyPr/>
-                      </wps:wsp>
-                      <wps:wsp>
                         <wps:cNvPr id="3576" name="Shape 3576"/>
                         <wps:cNvSpPr/>
                         <wps:spPr>
                           <a:xfrm>
-                            <a:off x="2513082" y="805721"/>
+                            <a:off x="2431940" y="805721"/>
                             <a:ext cx="0" cy="23452"/>
                           </a:xfrm>
                           <a:custGeom>
@@ -9996,7 +9994,7 @@
                         <wps:cNvSpPr/>
                         <wps:spPr>
                           <a:xfrm>
-                            <a:off x="2594224" y="805721"/>
+                            <a:off x="2513082" y="805721"/>
                             <a:ext cx="0" cy="23452"/>
                           </a:xfrm>
                           <a:custGeom>
@@ -10040,7 +10038,7 @@
                         <wps:cNvSpPr/>
                         <wps:spPr>
                           <a:xfrm>
-                            <a:off x="2675366" y="805721"/>
+                            <a:off x="2594224" y="805721"/>
                             <a:ext cx="0" cy="23452"/>
                           </a:xfrm>
                           <a:custGeom>
@@ -10084,7 +10082,7 @@
                         <wps:cNvSpPr/>
                         <wps:spPr>
                           <a:xfrm>
-                            <a:off x="2837649" y="805721"/>
+                            <a:off x="2675366" y="805721"/>
                             <a:ext cx="0" cy="23452"/>
                           </a:xfrm>
                           <a:custGeom>
@@ -10128,7 +10126,7 @@
                         <wps:cNvSpPr/>
                         <wps:spPr>
                           <a:xfrm>
-                            <a:off x="2918791" y="805721"/>
+                            <a:off x="2837649" y="805721"/>
                             <a:ext cx="0" cy="23452"/>
                           </a:xfrm>
                           <a:custGeom>
@@ -10172,7 +10170,7 @@
                         <wps:cNvSpPr/>
                         <wps:spPr>
                           <a:xfrm>
-                            <a:off x="2999933" y="805721"/>
+                            <a:off x="2918791" y="805721"/>
                             <a:ext cx="0" cy="23452"/>
                           </a:xfrm>
                           <a:custGeom>
@@ -10216,7 +10214,7 @@
                         <wps:cNvSpPr/>
                         <wps:spPr>
                           <a:xfrm>
-                            <a:off x="3081074" y="805721"/>
+                            <a:off x="2999933" y="805721"/>
                             <a:ext cx="0" cy="23452"/>
                           </a:xfrm>
                           <a:custGeom>
@@ -10260,7 +10258,7 @@
                         <wps:cNvSpPr/>
                         <wps:spPr>
                           <a:xfrm>
-                            <a:off x="3243358" y="805721"/>
+                            <a:off x="3081074" y="805721"/>
                             <a:ext cx="0" cy="23452"/>
                           </a:xfrm>
                           <a:custGeom>
@@ -10304,7 +10302,7 @@
                         <wps:cNvSpPr/>
                         <wps:spPr>
                           <a:xfrm>
-                            <a:off x="3324500" y="805721"/>
+                            <a:off x="3243358" y="805721"/>
                             <a:ext cx="0" cy="23452"/>
                           </a:xfrm>
                           <a:custGeom>
@@ -10348,7 +10346,7 @@
                         <wps:cNvSpPr/>
                         <wps:spPr>
                           <a:xfrm>
-                            <a:off x="3405642" y="805721"/>
+                            <a:off x="3324500" y="805721"/>
                             <a:ext cx="0" cy="23452"/>
                           </a:xfrm>
                           <a:custGeom>
@@ -10392,7 +10390,7 @@
                         <wps:cNvSpPr/>
                         <wps:spPr>
                           <a:xfrm>
-                            <a:off x="3486783" y="805721"/>
+                            <a:off x="3405642" y="805721"/>
                             <a:ext cx="0" cy="23452"/>
                           </a:xfrm>
                           <a:custGeom>
@@ -10436,7 +10434,7 @@
                         <wps:cNvSpPr/>
                         <wps:spPr>
                           <a:xfrm>
-                            <a:off x="3649067" y="805721"/>
+                            <a:off x="3486783" y="805721"/>
                             <a:ext cx="0" cy="23452"/>
                           </a:xfrm>
                           <a:custGeom>
@@ -10480,7 +10478,7 @@
                         <wps:cNvSpPr/>
                         <wps:spPr>
                           <a:xfrm>
-                            <a:off x="3730209" y="805721"/>
+                            <a:off x="3649067" y="805721"/>
                             <a:ext cx="0" cy="23452"/>
                           </a:xfrm>
                           <a:custGeom>
@@ -10524,7 +10522,7 @@
                         <wps:cNvSpPr/>
                         <wps:spPr>
                           <a:xfrm>
-                            <a:off x="3811350" y="805721"/>
+                            <a:off x="3730209" y="805721"/>
                             <a:ext cx="0" cy="23452"/>
                           </a:xfrm>
                           <a:custGeom>
@@ -10564,7 +10562,51 @@
                         <wps:bodyPr/>
                       </wps:wsp>
                       <wps:wsp>
-                        <wps:cNvPr id="3591" name="Shape 3591"/>
+                        <wps:cNvPr id="3590" name="Shape 3590"/>
+                        <wps:cNvSpPr/>
+                        <wps:spPr>
+                          <a:xfrm>
+                            <a:off x="3811350" y="805721"/>
+                            <a:ext cx="0" cy="23452"/>
+                          </a:xfrm>
+                          <a:custGeom>
+                            <a:avLst/>
+                            <a:gdLst/>
+                            <a:ahLst/>
+                            <a:cxnLst/>
+                            <a:rect l="0" t="0" r="0" b="0"/>
+                            <a:pathLst>
+                              <a:path h="23452">
+                                <a:moveTo>
+                                  <a:pt x="0" y="23452"/>
+                                </a:moveTo>
+                                <a:lnTo>
+                                  <a:pt x="0" y="0"/>
+                                </a:lnTo>
+                                <a:close/>
+                              </a:path>
+                            </a:pathLst>
+                          </a:custGeom>
+                          <a:ln w="8208" cap="flat">
+                            <a:round/>
+                          </a:ln>
+                        </wps:spPr>
+                        <wps:style>
+                          <a:lnRef idx="1">
+                            <a:srgbClr val="000000"/>
+                          </a:lnRef>
+                          <a:fillRef idx="1">
+                            <a:srgbClr val="000000"/>
+                          </a:fillRef>
+                          <a:effectRef idx="0">
+                            <a:scrgbClr r="0" g="0" b="0"/>
+                          </a:effectRef>
+                          <a:fontRef idx="none"/>
+                        </wps:style>
+                        <wps:bodyPr/>
+                      </wps:wsp>
+                      <wps:wsp>
+                        <wps:cNvPr id="3592" name="Shape 3592"/>
                         <wps:cNvSpPr/>
                         <wps:spPr>
                           <a:xfrm>
@@ -10609,7 +10651,7 @@
                         <wps:bodyPr/>
                       </wps:wsp>
                       <wps:wsp>
-                        <wps:cNvPr id="3592" name="Shape 3592"/>
+                        <wps:cNvPr id="3593" name="Shape 3593"/>
                         <wps:cNvSpPr/>
                         <wps:spPr>
                           <a:xfrm>
@@ -10653,7 +10695,7 @@
                         <wps:bodyPr/>
                       </wps:wsp>
                       <wps:wsp>
-                        <wps:cNvPr id="3594" name="Shape 3594"/>
+                        <wps:cNvPr id="3595" name="Shape 3595"/>
                         <wps:cNvSpPr/>
                         <wps:spPr>
                           <a:xfrm>
@@ -10698,7 +10740,7 @@
                         <wps:bodyPr/>
                       </wps:wsp>
                       <wps:wsp>
-                        <wps:cNvPr id="3595" name="Shape 3595"/>
+                        <wps:cNvPr id="3596" name="Shape 3596"/>
                         <wps:cNvSpPr/>
                         <wps:spPr>
                           <a:xfrm>
@@ -10742,7 +10784,7 @@
                         <wps:bodyPr/>
                       </wps:wsp>
                       <wps:wsp>
-                        <wps:cNvPr id="3597" name="Shape 3597"/>
+                        <wps:cNvPr id="3598" name="Shape 3598"/>
                         <wps:cNvSpPr/>
                         <wps:spPr>
                           <a:xfrm>
@@ -10787,7 +10829,7 @@
                         <wps:bodyPr/>
                       </wps:wsp>
                       <wps:wsp>
-                        <wps:cNvPr id="3598" name="Shape 3598"/>
+                        <wps:cNvPr id="3599" name="Shape 3599"/>
                         <wps:cNvSpPr/>
                         <wps:spPr>
                           <a:xfrm>
@@ -10831,7 +10873,7 @@
                         <wps:bodyPr/>
                       </wps:wsp>
                       <wps:wsp>
-                        <wps:cNvPr id="3600" name="Shape 3600"/>
+                        <wps:cNvPr id="3601" name="Shape 3601"/>
                         <wps:cNvSpPr/>
                         <wps:spPr>
                           <a:xfrm>
@@ -10876,7 +10918,7 @@
                         <wps:bodyPr/>
                       </wps:wsp>
                       <wps:wsp>
-                        <wps:cNvPr id="3601" name="Shape 3601"/>
+                        <wps:cNvPr id="3602" name="Shape 3602"/>
                         <wps:cNvSpPr/>
                         <wps:spPr>
                           <a:xfrm>
@@ -10920,7 +10962,7 @@
                         <wps:bodyPr/>
                       </wps:wsp>
                       <wps:wsp>
-                        <wps:cNvPr id="3603" name="Shape 3603"/>
+                        <wps:cNvPr id="3604" name="Shape 3604"/>
                         <wps:cNvSpPr/>
                         <wps:spPr>
                           <a:xfrm>
@@ -10965,7 +11007,7 @@
                         <wps:bodyPr/>
                       </wps:wsp>
                       <wps:wsp>
-                        <wps:cNvPr id="3604" name="Shape 3604"/>
+                        <wps:cNvPr id="3605" name="Shape 3605"/>
                         <wps:cNvSpPr/>
                         <wps:spPr>
                           <a:xfrm>
@@ -11009,7 +11051,7 @@
                         <wps:bodyPr/>
                       </wps:wsp>
                       <wps:wsp>
-                        <wps:cNvPr id="3606" name="Shape 3606"/>
+                        <wps:cNvPr id="3607" name="Shape 3607"/>
                         <wps:cNvSpPr/>
                         <wps:spPr>
                           <a:xfrm>
@@ -11054,7 +11096,7 @@
                         <wps:bodyPr/>
                       </wps:wsp>
                       <wps:wsp>
-                        <wps:cNvPr id="3607" name="Shape 3607"/>
+                        <wps:cNvPr id="3608" name="Shape 3608"/>
                         <wps:cNvSpPr/>
                         <wps:spPr>
                           <a:xfrm>
@@ -11098,7 +11140,7 @@
                         <wps:bodyPr/>
                       </wps:wsp>
                       <wps:wsp>
-                        <wps:cNvPr id="3609" name="Shape 3609"/>
+                        <wps:cNvPr id="3610" name="Shape 3610"/>
                         <wps:cNvSpPr/>
                         <wps:spPr>
                           <a:xfrm>
@@ -11143,7 +11185,7 @@
                         <wps:bodyPr/>
                       </wps:wsp>
                       <wps:wsp>
-                        <wps:cNvPr id="3610" name="Shape 3610"/>
+                        <wps:cNvPr id="3611" name="Shape 3611"/>
                         <wps:cNvSpPr/>
                         <wps:spPr>
                           <a:xfrm>
@@ -11187,55 +11229,11 @@
                         <wps:bodyPr/>
                       </wps:wsp>
                       <wps:wsp>
-                        <wps:cNvPr id="3612" name="Shape 3612"/>
-                        <wps:cNvSpPr/>
-                        <wps:spPr>
-                          <a:xfrm>
-                            <a:off x="2303422" y="829173"/>
-                            <a:ext cx="23451" cy="0"/>
-                          </a:xfrm>
-                          <a:custGeom>
-                            <a:avLst/>
-                            <a:gdLst/>
-                            <a:ahLst/>
-                            <a:cxnLst/>
-                            <a:rect l="0" t="0" r="0" b="0"/>
-                            <a:pathLst>
-                              <a:path w="23451">
-                                <a:moveTo>
-                                  <a:pt x="23451" y="0"/>
-                                </a:moveTo>
-                                <a:lnTo>
-                                  <a:pt x="0" y="0"/>
-                                </a:lnTo>
-                                <a:close/>
-                              </a:path>
-                            </a:pathLst>
-                          </a:custGeom>
-                          <a:ln w="8208" cap="flat">
-                            <a:round/>
-                          </a:ln>
-                        </wps:spPr>
-                        <wps:style>
-                          <a:lnRef idx="1">
-                            <a:srgbClr val="000000"/>
-                          </a:lnRef>
-                          <a:fillRef idx="1">
-                            <a:srgbClr val="000000"/>
-                          </a:fillRef>
-                          <a:effectRef idx="0">
-                            <a:scrgbClr r="0" g="0" b="0"/>
-                          </a:effectRef>
-                          <a:fontRef idx="none"/>
-                        </wps:style>
-                        <wps:bodyPr/>
-                      </wps:wsp>
-                      <wps:wsp>
                         <wps:cNvPr id="3613" name="Shape 3613"/>
                         <wps:cNvSpPr/>
                         <wps:spPr>
                           <a:xfrm>
-                            <a:off x="2303422" y="806454"/>
+                            <a:off x="2303422" y="829173"/>
                             <a:ext cx="23451" cy="0"/>
                           </a:xfrm>
                           <a:custGeom>
@@ -11279,7 +11277,7 @@
                         <wps:cNvSpPr/>
                         <wps:spPr>
                           <a:xfrm>
-                            <a:off x="2303422" y="783735"/>
+                            <a:off x="2303422" y="806454"/>
                             <a:ext cx="23451" cy="0"/>
                           </a:xfrm>
                           <a:custGeom>
@@ -11323,7 +11321,7 @@
                         <wps:cNvSpPr/>
                         <wps:spPr>
                           <a:xfrm>
-                            <a:off x="2303422" y="738296"/>
+                            <a:off x="2303422" y="783735"/>
                             <a:ext cx="23451" cy="0"/>
                           </a:xfrm>
                           <a:custGeom>
@@ -11367,7 +11365,7 @@
                         <wps:cNvSpPr/>
                         <wps:spPr>
                           <a:xfrm>
-                            <a:off x="2303422" y="715577"/>
+                            <a:off x="2303422" y="738296"/>
                             <a:ext cx="23451" cy="0"/>
                           </a:xfrm>
                           <a:custGeom>
@@ -11411,7 +11409,7 @@
                         <wps:cNvSpPr/>
                         <wps:spPr>
                           <a:xfrm>
-                            <a:off x="2303422" y="692858"/>
+                            <a:off x="2303422" y="715577"/>
                             <a:ext cx="23451" cy="0"/>
                           </a:xfrm>
                           <a:custGeom>
@@ -11455,7 +11453,7 @@
                         <wps:cNvSpPr/>
                         <wps:spPr>
                           <a:xfrm>
-                            <a:off x="2303422" y="670139"/>
+                            <a:off x="2303422" y="692858"/>
                             <a:ext cx="23451" cy="0"/>
                           </a:xfrm>
                           <a:custGeom>
@@ -11499,7 +11497,7 @@
                         <wps:cNvSpPr/>
                         <wps:spPr>
                           <a:xfrm>
-                            <a:off x="2303422" y="624701"/>
+                            <a:off x="2303422" y="670139"/>
                             <a:ext cx="23451" cy="0"/>
                           </a:xfrm>
                           <a:custGeom>
@@ -11543,7 +11541,7 @@
                         <wps:cNvSpPr/>
                         <wps:spPr>
                           <a:xfrm>
-                            <a:off x="2303422" y="601982"/>
+                            <a:off x="2303422" y="624701"/>
                             <a:ext cx="23451" cy="0"/>
                           </a:xfrm>
                           <a:custGeom>
@@ -11587,7 +11585,7 @@
                         <wps:cNvSpPr/>
                         <wps:spPr>
                           <a:xfrm>
-                            <a:off x="2303422" y="579263"/>
+                            <a:off x="2303422" y="601982"/>
                             <a:ext cx="23451" cy="0"/>
                           </a:xfrm>
                           <a:custGeom>
@@ -11631,7 +11629,7 @@
                         <wps:cNvSpPr/>
                         <wps:spPr>
                           <a:xfrm>
-                            <a:off x="2303422" y="556544"/>
+                            <a:off x="2303422" y="579263"/>
                             <a:ext cx="23451" cy="0"/>
                           </a:xfrm>
                           <a:custGeom>
@@ -11675,7 +11673,7 @@
                         <wps:cNvSpPr/>
                         <wps:spPr>
                           <a:xfrm>
-                            <a:off x="2303422" y="511105"/>
+                            <a:off x="2303422" y="556544"/>
                             <a:ext cx="23451" cy="0"/>
                           </a:xfrm>
                           <a:custGeom>
@@ -11719,7 +11717,7 @@
                         <wps:cNvSpPr/>
                         <wps:spPr>
                           <a:xfrm>
-                            <a:off x="2303422" y="488386"/>
+                            <a:off x="2303422" y="511105"/>
                             <a:ext cx="23451" cy="0"/>
                           </a:xfrm>
                           <a:custGeom>
@@ -11763,7 +11761,7 @@
                         <wps:cNvSpPr/>
                         <wps:spPr>
                           <a:xfrm>
-                            <a:off x="2303422" y="465667"/>
+                            <a:off x="2303422" y="488386"/>
                             <a:ext cx="23451" cy="0"/>
                           </a:xfrm>
                           <a:custGeom>
@@ -11807,7 +11805,7 @@
                         <wps:cNvSpPr/>
                         <wps:spPr>
                           <a:xfrm>
-                            <a:off x="2303422" y="442948"/>
+                            <a:off x="2303422" y="465667"/>
                             <a:ext cx="23451" cy="0"/>
                           </a:xfrm>
                           <a:custGeom>
@@ -11851,7 +11849,7 @@
                         <wps:cNvSpPr/>
                         <wps:spPr>
                           <a:xfrm>
-                            <a:off x="2303422" y="397510"/>
+                            <a:off x="2303422" y="442948"/>
                             <a:ext cx="23451" cy="0"/>
                           </a:xfrm>
                           <a:custGeom>
@@ -11895,7 +11893,7 @@
                         <wps:cNvSpPr/>
                         <wps:spPr>
                           <a:xfrm>
-                            <a:off x="2303422" y="374791"/>
+                            <a:off x="2303422" y="397510"/>
                             <a:ext cx="23451" cy="0"/>
                           </a:xfrm>
                           <a:custGeom>
@@ -11939,7 +11937,7 @@
                         <wps:cNvSpPr/>
                         <wps:spPr>
                           <a:xfrm>
-                            <a:off x="2303422" y="352072"/>
+                            <a:off x="2303422" y="374791"/>
                             <a:ext cx="23451" cy="0"/>
                           </a:xfrm>
                           <a:custGeom>
@@ -11983,7 +11981,7 @@
                         <wps:cNvSpPr/>
                         <wps:spPr>
                           <a:xfrm>
-                            <a:off x="2303422" y="329352"/>
+                            <a:off x="2303422" y="352072"/>
                             <a:ext cx="23451" cy="0"/>
                           </a:xfrm>
                           <a:custGeom>
@@ -12027,7 +12025,7 @@
                         <wps:cNvSpPr/>
                         <wps:spPr>
                           <a:xfrm>
-                            <a:off x="2303422" y="283914"/>
+                            <a:off x="2303422" y="329352"/>
                             <a:ext cx="23451" cy="0"/>
                           </a:xfrm>
                           <a:custGeom>
@@ -12071,7 +12069,7 @@
                         <wps:cNvSpPr/>
                         <wps:spPr>
                           <a:xfrm>
-                            <a:off x="2303422" y="261195"/>
+                            <a:off x="2303422" y="283914"/>
                             <a:ext cx="23451" cy="0"/>
                           </a:xfrm>
                           <a:custGeom>
@@ -12115,7 +12113,7 @@
                         <wps:cNvSpPr/>
                         <wps:spPr>
                           <a:xfrm>
-                            <a:off x="2303422" y="238476"/>
+                            <a:off x="2303422" y="261195"/>
                             <a:ext cx="23451" cy="0"/>
                           </a:xfrm>
                           <a:custGeom>
@@ -12159,7 +12157,7 @@
                         <wps:cNvSpPr/>
                         <wps:spPr>
                           <a:xfrm>
-                            <a:off x="2303422" y="215757"/>
+                            <a:off x="2303422" y="238476"/>
                             <a:ext cx="23451" cy="0"/>
                           </a:xfrm>
                           <a:custGeom>
@@ -12203,7 +12201,7 @@
                         <wps:cNvSpPr/>
                         <wps:spPr>
                           <a:xfrm>
-                            <a:off x="2303422" y="170319"/>
+                            <a:off x="2303422" y="215757"/>
                             <a:ext cx="23451" cy="0"/>
                           </a:xfrm>
                           <a:custGeom>
@@ -12247,7 +12245,7 @@
                         <wps:cNvSpPr/>
                         <wps:spPr>
                           <a:xfrm>
-                            <a:off x="2303422" y="147600"/>
+                            <a:off x="2303422" y="170319"/>
                             <a:ext cx="23451" cy="0"/>
                           </a:xfrm>
                           <a:custGeom>
@@ -12291,7 +12289,7 @@
                         <wps:cNvSpPr/>
                         <wps:spPr>
                           <a:xfrm>
-                            <a:off x="2303422" y="124881"/>
+                            <a:off x="2303422" y="147600"/>
                             <a:ext cx="23451" cy="0"/>
                           </a:xfrm>
                           <a:custGeom>
@@ -12335,7 +12333,7 @@
                         <wps:cNvSpPr/>
                         <wps:spPr>
                           <a:xfrm>
-                            <a:off x="2303422" y="102162"/>
+                            <a:off x="2303422" y="124881"/>
                             <a:ext cx="23451" cy="0"/>
                           </a:xfrm>
                           <a:custGeom>
@@ -12379,7 +12377,7 @@
                         <wps:cNvSpPr/>
                         <wps:spPr>
                           <a:xfrm>
-                            <a:off x="2303422" y="56723"/>
+                            <a:off x="2303422" y="102162"/>
                             <a:ext cx="23451" cy="0"/>
                           </a:xfrm>
                           <a:custGeom>
@@ -12423,7 +12421,7 @@
                         <wps:cNvSpPr/>
                         <wps:spPr>
                           <a:xfrm>
-                            <a:off x="2303422" y="34004"/>
+                            <a:off x="2303422" y="56723"/>
                             <a:ext cx="23451" cy="0"/>
                           </a:xfrm>
                           <a:custGeom>
@@ -12467,7 +12465,7 @@
                         <wps:cNvSpPr/>
                         <wps:spPr>
                           <a:xfrm>
-                            <a:off x="2303422" y="11285"/>
+                            <a:off x="2303422" y="34004"/>
                             <a:ext cx="23451" cy="0"/>
                           </a:xfrm>
                           <a:custGeom>
@@ -12511,8 +12509,8 @@
                         <wps:cNvSpPr/>
                         <wps:spPr>
                           <a:xfrm>
-                            <a:off x="2372910" y="79442"/>
-                            <a:ext cx="599029" cy="0"/>
+                            <a:off x="2303422" y="11285"/>
+                            <a:ext cx="23451" cy="0"/>
                           </a:xfrm>
                           <a:custGeom>
                             <a:avLst/>
@@ -12521,28 +12519,27 @@
                             <a:cxnLst/>
                             <a:rect l="0" t="0" r="0" b="0"/>
                             <a:pathLst>
-                              <a:path w="599029">
+                              <a:path w="23451">
                                 <a:moveTo>
+                                  <a:pt x="23451" y="0"/>
+                                </a:moveTo>
+                                <a:lnTo>
                                   <a:pt x="0" y="0"/>
-                                </a:moveTo>
-                                <a:lnTo>
-                                  <a:pt x="599029" y="0"/>
-                                </a:lnTo>
+                                </a:lnTo>
+                                <a:close/>
                               </a:path>
                             </a:pathLst>
                           </a:custGeom>
-                          <a:ln w="8384" cap="flat">
+                          <a:ln w="8208" cap="flat">
                             <a:round/>
                           </a:ln>
                         </wps:spPr>
                         <wps:style>
                           <a:lnRef idx="1">
-                            <a:srgbClr val="1C6B73"/>
+                            <a:srgbClr val="000000"/>
                           </a:lnRef>
-                          <a:fillRef idx="0">
-                            <a:srgbClr val="000000">
-                              <a:alpha val="0"/>
-                            </a:srgbClr>
+                          <a:fillRef idx="1">
+                            <a:srgbClr val="000000"/>
                           </a:fillRef>
                           <a:effectRef idx="0">
                             <a:scrgbClr r="0" g="0" b="0"/>
@@ -12556,8 +12553,8 @@
                         <wps:cNvSpPr/>
                         <wps:spPr>
                           <a:xfrm>
-                            <a:off x="2472511" y="193038"/>
-                            <a:ext cx="636963" cy="0"/>
+                            <a:off x="2372910" y="79442"/>
+                            <a:ext cx="599029" cy="0"/>
                           </a:xfrm>
                           <a:custGeom>
                             <a:avLst/>
@@ -12566,12 +12563,12 @@
                             <a:cxnLst/>
                             <a:rect l="0" t="0" r="0" b="0"/>
                             <a:pathLst>
-                              <a:path w="636963">
+                              <a:path w="599029">
                                 <a:moveTo>
                                   <a:pt x="0" y="0"/>
                                 </a:moveTo>
                                 <a:lnTo>
-                                  <a:pt x="636963" y="0"/>
+                                  <a:pt x="599029" y="0"/>
                                 </a:lnTo>
                               </a:path>
                             </a:pathLst>
@@ -12601,8 +12598,8 @@
                         <wps:cNvSpPr/>
                         <wps:spPr>
                           <a:xfrm>
-                            <a:off x="2533368" y="306634"/>
-                            <a:ext cx="592334" cy="0"/>
+                            <a:off x="2472511" y="193038"/>
+                            <a:ext cx="636963" cy="0"/>
                           </a:xfrm>
                           <a:custGeom>
                             <a:avLst/>
@@ -12611,12 +12608,12 @@
                             <a:cxnLst/>
                             <a:rect l="0" t="0" r="0" b="0"/>
                             <a:pathLst>
-                              <a:path w="592334">
+                              <a:path w="636963">
                                 <a:moveTo>
                                   <a:pt x="0" y="0"/>
                                 </a:moveTo>
                                 <a:lnTo>
-                                  <a:pt x="592334" y="0"/>
+                                  <a:pt x="636963" y="0"/>
                                 </a:lnTo>
                               </a:path>
                             </a:pathLst>
@@ -12646,8 +12643,8 @@
                         <wps:cNvSpPr/>
                         <wps:spPr>
                           <a:xfrm>
-                            <a:off x="2598281" y="420229"/>
-                            <a:ext cx="576107" cy="0"/>
+                            <a:off x="2533368" y="306634"/>
+                            <a:ext cx="592334" cy="0"/>
                           </a:xfrm>
                           <a:custGeom>
                             <a:avLst/>
@@ -12656,12 +12653,12 @@
                             <a:cxnLst/>
                             <a:rect l="0" t="0" r="0" b="0"/>
                             <a:pathLst>
-                              <a:path w="576107">
+                              <a:path w="592334">
                                 <a:moveTo>
                                   <a:pt x="0" y="0"/>
                                 </a:moveTo>
                                 <a:lnTo>
-                                  <a:pt x="576107" y="0"/>
+                                  <a:pt x="592334" y="0"/>
                                 </a:lnTo>
                               </a:path>
                             </a:pathLst>
@@ -12691,8 +12688,8 @@
                         <wps:cNvSpPr/>
                         <wps:spPr>
                           <a:xfrm>
-                            <a:off x="2642909" y="533824"/>
-                            <a:ext cx="645077" cy="0"/>
+                            <a:off x="2598281" y="420229"/>
+                            <a:ext cx="576107" cy="0"/>
                           </a:xfrm>
                           <a:custGeom>
                             <a:avLst/>
@@ -12701,12 +12698,12 @@
                             <a:cxnLst/>
                             <a:rect l="0" t="0" r="0" b="0"/>
                             <a:pathLst>
-                              <a:path w="645077">
+                              <a:path w="576107">
                                 <a:moveTo>
                                   <a:pt x="0" y="0"/>
                                 </a:moveTo>
                                 <a:lnTo>
-                                  <a:pt x="645077" y="0"/>
+                                  <a:pt x="576107" y="0"/>
                                 </a:lnTo>
                               </a:path>
                             </a:pathLst>
@@ -12736,8 +12733,8 @@
                         <wps:cNvSpPr/>
                         <wps:spPr>
                           <a:xfrm>
-                            <a:off x="2719994" y="647420"/>
-                            <a:ext cx="685648" cy="0"/>
+                            <a:off x="2642909" y="533824"/>
+                            <a:ext cx="645077" cy="0"/>
                           </a:xfrm>
                           <a:custGeom>
                             <a:avLst/>
@@ -12746,12 +12743,12 @@
                             <a:cxnLst/>
                             <a:rect l="0" t="0" r="0" b="0"/>
                             <a:pathLst>
-                              <a:path w="685648">
+                              <a:path w="645077">
                                 <a:moveTo>
                                   <a:pt x="0" y="0"/>
                                 </a:moveTo>
                                 <a:lnTo>
-                                  <a:pt x="685648" y="0"/>
+                                  <a:pt x="645077" y="0"/>
                                 </a:lnTo>
                               </a:path>
                             </a:pathLst>
@@ -12781,8 +12778,8 @@
                         <wps:cNvSpPr/>
                         <wps:spPr>
                           <a:xfrm>
-                            <a:off x="2771113" y="761016"/>
-                            <a:ext cx="991552" cy="0"/>
+                            <a:off x="2719994" y="647420"/>
+                            <a:ext cx="685648" cy="0"/>
                           </a:xfrm>
                           <a:custGeom>
                             <a:avLst/>
@@ -12791,12 +12788,12 @@
                             <a:cxnLst/>
                             <a:rect l="0" t="0" r="0" b="0"/>
                             <a:pathLst>
-                              <a:path w="991552">
+                              <a:path w="685648">
                                 <a:moveTo>
                                   <a:pt x="0" y="0"/>
                                 </a:moveTo>
                                 <a:lnTo>
-                                  <a:pt x="991552" y="0"/>
+                                  <a:pt x="685648" y="0"/>
                                 </a:lnTo>
                               </a:path>
                             </a:pathLst>
@@ -12826,8 +12823,8 @@
                         <wps:cNvSpPr/>
                         <wps:spPr>
                           <a:xfrm>
-                            <a:off x="2303422" y="11285"/>
-                            <a:ext cx="0" cy="817888"/>
+                            <a:off x="2771113" y="761016"/>
+                            <a:ext cx="991552" cy="0"/>
                           </a:xfrm>
                           <a:custGeom>
                             <a:avLst/>
@@ -12836,23 +12833,23 @@
                             <a:cxnLst/>
                             <a:rect l="0" t="0" r="0" b="0"/>
                             <a:pathLst>
-                              <a:path h="817888">
+                              <a:path w="991552">
                                 <a:moveTo>
-                                  <a:pt x="0" y="817888"/>
+                                  <a:pt x="0" y="0"/>
                                 </a:moveTo>
                                 <a:lnTo>
-                                  <a:pt x="0" y="0"/>
+                                  <a:pt x="991552" y="0"/>
                                 </a:lnTo>
                               </a:path>
                             </a:pathLst>
                           </a:custGeom>
-                          <a:ln w="12899" cap="sq">
-                            <a:miter lim="127000"/>
+                          <a:ln w="8384" cap="flat">
+                            <a:round/>
                           </a:ln>
                         </wps:spPr>
                         <wps:style>
                           <a:lnRef idx="1">
-                            <a:srgbClr val="000000"/>
+                            <a:srgbClr val="1C6B73"/>
                           </a:lnRef>
                           <a:fillRef idx="0">
                             <a:srgbClr val="000000">
@@ -12871,8 +12868,8 @@
                         <wps:cNvSpPr/>
                         <wps:spPr>
                           <a:xfrm>
-                            <a:off x="2303422" y="829173"/>
-                            <a:ext cx="1528731" cy="0"/>
+                            <a:off x="2303422" y="11285"/>
+                            <a:ext cx="0" cy="817888"/>
                           </a:xfrm>
                           <a:custGeom>
                             <a:avLst/>
@@ -12881,12 +12878,12 @@
                             <a:cxnLst/>
                             <a:rect l="0" t="0" r="0" b="0"/>
                             <a:pathLst>
-                              <a:path w="1528731">
+                              <a:path h="817888">
                                 <a:moveTo>
+                                  <a:pt x="0" y="817888"/>
+                                </a:moveTo>
+                                <a:lnTo>
                                   <a:pt x="0" y="0"/>
-                                </a:moveTo>
-                                <a:lnTo>
-                                  <a:pt x="1528731" y="0"/>
                                 </a:lnTo>
                               </a:path>
                             </a:pathLst>
@@ -12916,8 +12913,8 @@
                         <wps:cNvSpPr/>
                         <wps:spPr>
                           <a:xfrm>
-                            <a:off x="2533368" y="79442"/>
-                            <a:ext cx="259653" cy="0"/>
+                            <a:off x="2303422" y="829173"/>
+                            <a:ext cx="1528731" cy="0"/>
                           </a:xfrm>
                           <a:custGeom>
                             <a:avLst/>
@@ -12926,25 +12923,23 @@
                             <a:cxnLst/>
                             <a:rect l="0" t="0" r="0" b="0"/>
                             <a:pathLst>
-                              <a:path w="259653">
+                              <a:path w="1528731">
                                 <a:moveTo>
                                   <a:pt x="0" y="0"/>
                                 </a:moveTo>
                                 <a:lnTo>
-                                  <a:pt x="259653" y="0"/>
+                                  <a:pt x="1528731" y="0"/>
                                 </a:lnTo>
                               </a:path>
                             </a:pathLst>
                           </a:custGeom>
-                          <a:ln w="39634" cap="flat">
-                            <a:round/>
+                          <a:ln w="12899" cap="sq">
+                            <a:miter lim="127000"/>
                           </a:ln>
                         </wps:spPr>
                         <wps:style>
                           <a:lnRef idx="1">
-                            <a:srgbClr val="1C6B73">
-                              <a:alpha val="45098"/>
-                            </a:srgbClr>
+                            <a:srgbClr val="000000"/>
                           </a:lnRef>
                           <a:fillRef idx="0">
                             <a:srgbClr val="000000">
@@ -12963,8 +12958,8 @@
                         <wps:cNvSpPr/>
                         <wps:spPr>
                           <a:xfrm>
-                            <a:off x="2626681" y="193038"/>
-                            <a:ext cx="279939" cy="0"/>
+                            <a:off x="2533368" y="79442"/>
+                            <a:ext cx="259653" cy="0"/>
                           </a:xfrm>
                           <a:custGeom>
                             <a:avLst/>
@@ -12973,12 +12968,12 @@
                             <a:cxnLst/>
                             <a:rect l="0" t="0" r="0" b="0"/>
                             <a:pathLst>
-                              <a:path w="279939">
+                              <a:path w="259653">
                                 <a:moveTo>
                                   <a:pt x="0" y="0"/>
                                 </a:moveTo>
                                 <a:lnTo>
-                                  <a:pt x="279939" y="0"/>
+                                  <a:pt x="259653" y="0"/>
                                 </a:lnTo>
                               </a:path>
                             </a:pathLst>
@@ -13010,8 +13005,8 @@
                         <wps:cNvSpPr/>
                         <wps:spPr>
                           <a:xfrm>
-                            <a:off x="2659137" y="306634"/>
-                            <a:ext cx="271825" cy="0"/>
+                            <a:off x="2626681" y="193038"/>
+                            <a:ext cx="279939" cy="0"/>
                           </a:xfrm>
                           <a:custGeom>
                             <a:avLst/>
@@ -13020,12 +13015,12 @@
                             <a:cxnLst/>
                             <a:rect l="0" t="0" r="0" b="0"/>
                             <a:pathLst>
-                              <a:path w="271825">
+                              <a:path w="279939">
                                 <a:moveTo>
                                   <a:pt x="0" y="0"/>
                                 </a:moveTo>
                                 <a:lnTo>
-                                  <a:pt x="271825" y="0"/>
+                                  <a:pt x="279939" y="0"/>
                                 </a:lnTo>
                               </a:path>
                             </a:pathLst>
@@ -13057,7 +13052,7 @@
                         <wps:cNvSpPr/>
                         <wps:spPr>
                           <a:xfrm>
-                            <a:off x="2711880" y="420229"/>
+                            <a:off x="2659137" y="306634"/>
                             <a:ext cx="271825" cy="0"/>
                           </a:xfrm>
                           <a:custGeom>
@@ -13104,8 +13099,8 @@
                         <wps:cNvSpPr/>
                         <wps:spPr>
                           <a:xfrm>
-                            <a:off x="2788964" y="533824"/>
-                            <a:ext cx="304282" cy="0"/>
+                            <a:off x="2711880" y="420229"/>
+                            <a:ext cx="271825" cy="0"/>
                           </a:xfrm>
                           <a:custGeom>
                             <a:avLst/>
@@ -13114,12 +13109,12 @@
                             <a:cxnLst/>
                             <a:rect l="0" t="0" r="0" b="0"/>
                             <a:pathLst>
-                              <a:path w="304282">
+                              <a:path w="271825">
                                 <a:moveTo>
                                   <a:pt x="0" y="0"/>
                                 </a:moveTo>
                                 <a:lnTo>
-                                  <a:pt x="304282" y="0"/>
+                                  <a:pt x="271825" y="0"/>
                                 </a:lnTo>
                               </a:path>
                             </a:pathLst>
@@ -13151,8 +13146,8 @@
                         <wps:cNvSpPr/>
                         <wps:spPr>
                           <a:xfrm>
-                            <a:off x="2906620" y="647420"/>
-                            <a:ext cx="279939" cy="0"/>
+                            <a:off x="2788964" y="533824"/>
+                            <a:ext cx="304282" cy="0"/>
                           </a:xfrm>
                           <a:custGeom>
                             <a:avLst/>
@@ -13161,12 +13156,12 @@
                             <a:cxnLst/>
                             <a:rect l="0" t="0" r="0" b="0"/>
                             <a:pathLst>
-                              <a:path w="279939">
+                              <a:path w="304282">
                                 <a:moveTo>
                                   <a:pt x="0" y="0"/>
                                 </a:moveTo>
                                 <a:lnTo>
-                                  <a:pt x="279939" y="0"/>
+                                  <a:pt x="304282" y="0"/>
                                 </a:lnTo>
                               </a:path>
                             </a:pathLst>
@@ -13198,8 +13193,8 @@
                         <wps:cNvSpPr/>
                         <wps:spPr>
                           <a:xfrm>
-                            <a:off x="3020218" y="761016"/>
-                            <a:ext cx="385423" cy="0"/>
+                            <a:off x="2906620" y="647420"/>
+                            <a:ext cx="279939" cy="0"/>
                           </a:xfrm>
                           <a:custGeom>
                             <a:avLst/>
@@ -13208,12 +13203,12 @@
                             <a:cxnLst/>
                             <a:rect l="0" t="0" r="0" b="0"/>
                             <a:pathLst>
-                              <a:path w="385423">
+                              <a:path w="279939">
                                 <a:moveTo>
                                   <a:pt x="0" y="0"/>
                                 </a:moveTo>
                                 <a:lnTo>
-                                  <a:pt x="385423" y="0"/>
+                                  <a:pt x="279939" y="0"/>
                                 </a:lnTo>
                               </a:path>
                             </a:pathLst>
@@ -13241,50 +13236,59 @@
                         <wps:bodyPr/>
                       </wps:wsp>
                       <wps:wsp>
-                        <wps:cNvPr id="3658" name="Rectangle 3658"/>
+                        <wps:cNvPr id="3658" name="Shape 3658"/>
                         <wps:cNvSpPr/>
                         <wps:spPr>
                           <a:xfrm>
-                            <a:off x="3716778" y="30601"/>
-                            <a:ext cx="47691" cy="117082"/>
-                          </a:xfrm>
-                          <a:prstGeom prst="rect">
-                            <a:avLst/>
-                          </a:prstGeom>
-                          <a:ln>
-                            <a:noFill/>
+                            <a:off x="3020218" y="761016"/>
+                            <a:ext cx="385423" cy="0"/>
+                          </a:xfrm>
+                          <a:custGeom>
+                            <a:avLst/>
+                            <a:gdLst/>
+                            <a:ahLst/>
+                            <a:cxnLst/>
+                            <a:rect l="0" t="0" r="0" b="0"/>
+                            <a:pathLst>
+                              <a:path w="385423">
+                                <a:moveTo>
+                                  <a:pt x="0" y="0"/>
+                                </a:moveTo>
+                                <a:lnTo>
+                                  <a:pt x="385423" y="0"/>
+                                </a:lnTo>
+                              </a:path>
+                            </a:pathLst>
+                          </a:custGeom>
+                          <a:ln w="39634" cap="flat">
+                            <a:round/>
                           </a:ln>
                         </wps:spPr>
-                        <wps:txbx>
-                          <w:txbxContent>
-                            <w:p>
-                              <w:pPr>
-                                <w:spacing w:after="160" w:line="259" w:lineRule="auto"/>
-                                <w:ind w:left="0" w:firstLine="0"/>
-                                <w:jc w:val="left"/>
-                              </w:pPr>
-                              <w:r>
-                                <w:rPr>
-                                  <w:rFonts w:ascii="Arial" w:eastAsia="Arial" w:hAnsi="Arial" w:cs="Arial"/>
-                                  <w:color w:val="8C9199"/>
-                                  <w:sz w:val="10"/>
-                                </w:rPr>
-                                <w:t>7</w:t>
-                              </w:r>
-                            </w:p>
-                          </w:txbxContent>
-                        </wps:txbx>
-                        <wps:bodyPr horzOverflow="overflow" vert="horz" lIns="0" tIns="0" rIns="0" bIns="0" rtlCol="0">
-                          <a:noAutofit/>
-                        </wps:bodyPr>
+                        <wps:style>
+                          <a:lnRef idx="1">
+                            <a:srgbClr val="1C6B73">
+                              <a:alpha val="45098"/>
+                            </a:srgbClr>
+                          </a:lnRef>
+                          <a:fillRef idx="0">
+                            <a:srgbClr val="000000">
+                              <a:alpha val="0"/>
+                            </a:srgbClr>
+                          </a:fillRef>
+                          <a:effectRef idx="0">
+                            <a:scrgbClr r="0" g="0" b="0"/>
+                          </a:effectRef>
+                          <a:fontRef idx="none"/>
+                        </wps:style>
+                        <wps:bodyPr/>
                       </wps:wsp>
                       <wps:wsp>
                         <wps:cNvPr id="3659" name="Rectangle 3659"/>
                         <wps:cNvSpPr/>
                         <wps:spPr>
                           <a:xfrm>
-                            <a:off x="3716778" y="144197"/>
-                            <a:ext cx="47691" cy="117083"/>
+                            <a:off x="3716778" y="30601"/>
+                            <a:ext cx="47691" cy="117082"/>
                           </a:xfrm>
                           <a:prstGeom prst="rect">
                             <a:avLst/>
@@ -13321,7 +13325,7 @@
                         <wps:cNvSpPr/>
                         <wps:spPr>
                           <a:xfrm>
-                            <a:off x="3716778" y="257792"/>
+                            <a:off x="3716778" y="144197"/>
                             <a:ext cx="47691" cy="117083"/>
                           </a:xfrm>
                           <a:prstGeom prst="rect">
@@ -13359,7 +13363,7 @@
                         <wps:cNvSpPr/>
                         <wps:spPr>
                           <a:xfrm>
-                            <a:off x="3716778" y="371387"/>
+                            <a:off x="3716778" y="257792"/>
                             <a:ext cx="47691" cy="117083"/>
                           </a:xfrm>
                           <a:prstGeom prst="rect">
@@ -13397,6 +13401,44 @@
                         <wps:cNvSpPr/>
                         <wps:spPr>
                           <a:xfrm>
+                            <a:off x="3716778" y="371387"/>
+                            <a:ext cx="47691" cy="117083"/>
+                          </a:xfrm>
+                          <a:prstGeom prst="rect">
+                            <a:avLst/>
+                          </a:prstGeom>
+                          <a:ln>
+                            <a:noFill/>
+                          </a:ln>
+                        </wps:spPr>
+                        <wps:txbx>
+                          <w:txbxContent>
+                            <w:p>
+                              <w:pPr>
+                                <w:spacing w:after="160" w:line="259" w:lineRule="auto"/>
+                                <w:ind w:left="0" w:firstLine="0"/>
+                                <w:jc w:val="left"/>
+                              </w:pPr>
+                              <w:r>
+                                <w:rPr>
+                                  <w:rFonts w:ascii="Arial" w:eastAsia="Arial" w:hAnsi="Arial" w:cs="Arial"/>
+                                  <w:color w:val="8C9199"/>
+                                  <w:sz w:val="10"/>
+                                </w:rPr>
+                                <w:t>7</w:t>
+                              </w:r>
+                            </w:p>
+                          </w:txbxContent>
+                        </wps:txbx>
+                        <wps:bodyPr horzOverflow="overflow" vert="horz" lIns="0" tIns="0" rIns="0" bIns="0" rtlCol="0">
+                          <a:noAutofit/>
+                        </wps:bodyPr>
+                      </wps:wsp>
+                      <wps:wsp>
+                        <wps:cNvPr id="3663" name="Rectangle 3663"/>
+                        <wps:cNvSpPr/>
+                        <wps:spPr>
+                          <a:xfrm>
                             <a:off x="3716778" y="484983"/>
                             <a:ext cx="143073" cy="117082"/>
                           </a:xfrm>
@@ -13431,7 +13473,7 @@
                         </wps:bodyPr>
                       </wps:wsp>
                       <wps:wsp>
-                        <wps:cNvPr id="3663" name="Rectangle 3663"/>
+                        <wps:cNvPr id="3664" name="Rectangle 3664"/>
                         <wps:cNvSpPr/>
                         <wps:spPr>
                           <a:xfrm>
@@ -13469,7 +13511,7 @@
                         </wps:bodyPr>
                       </wps:wsp>
                       <wps:wsp>
-                        <wps:cNvPr id="3664" name="Rectangle 3664"/>
+                        <wps:cNvPr id="3665" name="Rectangle 3665"/>
                         <wps:cNvSpPr/>
                         <wps:spPr>
                           <a:xfrm>
@@ -13507,7 +13549,7 @@
                         </wps:bodyPr>
                       </wps:wsp>
                       <wps:wsp>
-                        <wps:cNvPr id="3666" name="Shape 3666"/>
+                        <wps:cNvPr id="3667" name="Shape 3667"/>
                         <wps:cNvSpPr/>
                         <wps:spPr>
                           <a:xfrm>
@@ -13588,7 +13630,7 @@
                         <wps:bodyPr/>
                       </wps:wsp>
                       <wps:wsp>
-                        <wps:cNvPr id="3667" name="Shape 3667"/>
+                        <wps:cNvPr id="3668" name="Shape 3668"/>
                         <wps:cNvSpPr/>
                         <wps:spPr>
                           <a:xfrm>
@@ -13669,7 +13711,7 @@
                         <wps:bodyPr/>
                       </wps:wsp>
                       <wps:wsp>
-                        <wps:cNvPr id="3668" name="Shape 3668"/>
+                        <wps:cNvPr id="3669" name="Shape 3669"/>
                         <wps:cNvSpPr/>
                         <wps:spPr>
                           <a:xfrm>
@@ -13750,7 +13792,7 @@
                         <wps:bodyPr/>
                       </wps:wsp>
                       <wps:wsp>
-                        <wps:cNvPr id="3669" name="Shape 3669"/>
+                        <wps:cNvPr id="3670" name="Shape 3670"/>
                         <wps:cNvSpPr/>
                         <wps:spPr>
                           <a:xfrm>
@@ -13831,7 +13873,7 @@
                         <wps:bodyPr/>
                       </wps:wsp>
                       <wps:wsp>
-                        <wps:cNvPr id="3670" name="Shape 3670"/>
+                        <wps:cNvPr id="3671" name="Shape 3671"/>
                         <wps:cNvSpPr/>
                         <wps:spPr>
                           <a:xfrm>
@@ -13912,7 +13954,7 @@
                         <wps:bodyPr/>
                       </wps:wsp>
                       <wps:wsp>
-                        <wps:cNvPr id="3671" name="Shape 3671"/>
+                        <wps:cNvPr id="3672" name="Shape 3672"/>
                         <wps:cNvSpPr/>
                         <wps:spPr>
                           <a:xfrm>
@@ -13993,7 +14035,7 @@
                         <wps:bodyPr/>
                       </wps:wsp>
                       <wps:wsp>
-                        <wps:cNvPr id="3672" name="Shape 3672"/>
+                        <wps:cNvPr id="3673" name="Shape 3673"/>
                         <wps:cNvSpPr/>
                         <wps:spPr>
                           <a:xfrm>
@@ -14081,343 +14123,343 @@
           </mc:Choice>
           <mc:Fallback xmlns:a="http://schemas.openxmlformats.org/drawingml/2006/main">
             <w:pict>
-              <v:group id="Group 35858" style="width:301.744pt;height:68.64pt;mso-position-horizontal-relative:char;mso-position-vertical-relative:line" coordsize="38321,8717">
-                <v:shape id="Picture 35814" style="position:absolute;width:20817;height:8717;left:0;top:0;" filled="f">
+              <v:group id="Group 35853" style="width:301.744pt;height:68.64pt;mso-position-horizontal-relative:char;mso-position-vertical-relative:line" coordsize="38321,8717">
+                <v:shape id="Picture 35809" style="position:absolute;width:20817;height:8717;left:0;top:0;" filled="f">
                   <v:imagedata r:id="rId31"/>
                 </v:shape>
-                <v:shape id="Shape 3563" style="position:absolute;width:0;height:8178;left:23507;top:112;" coordsize="0,817888" path="m0,817888l0,0">
+                <v:shape id="Shape 3564" style="position:absolute;width:0;height:8178;left:23507;top:112;" coordsize="0,817888" path="m0,817888l0,0">
                   <v:stroke weight="0.55398pt" endcap="square" joinstyle="round" on="true" color="#b0b0b0"/>
                   <v:fill on="false" color="#000000" opacity="0"/>
                 </v:shape>
-                <v:shape id="Shape 3564" style="position:absolute;width:0;height:410;left:23507;top:8291;" coordsize="0,41041" path="m0,41041l0,0x">
+                <v:shape id="Shape 3565" style="position:absolute;width:0;height:410;left:23507;top:8291;" coordsize="0,41041" path="m0,41041l0,0x">
                   <v:stroke weight="1.01563pt" endcap="flat" joinstyle="round" on="true" color="#000000"/>
                   <v:fill on="true" color="#000000"/>
                 </v:shape>
-                <v:shape id="Shape 3566" style="position:absolute;width:0;height:8178;left:27565;top:112;" coordsize="0,817888" path="m0,817888l0,0">
+                <v:shape id="Shape 3567" style="position:absolute;width:0;height:8178;left:27565;top:112;" coordsize="0,817888" path="m0,817888l0,0">
                   <v:stroke weight="0.55398pt" endcap="square" joinstyle="round" on="true" color="#b0b0b0"/>
                   <v:fill on="false" color="#000000" opacity="0"/>
                 </v:shape>
-                <v:shape id="Shape 3567" style="position:absolute;width:0;height:410;left:27565;top:8291;" coordsize="0,41041" path="m0,41041l0,0x">
+                <v:shape id="Shape 3568" style="position:absolute;width:0;height:410;left:27565;top:8291;" coordsize="0,41041" path="m0,41041l0,0x">
                   <v:stroke weight="1.01563pt" endcap="flat" joinstyle="round" on="true" color="#000000"/>
                   <v:fill on="true" color="#000000"/>
                 </v:shape>
-                <v:shape id="Shape 3569" style="position:absolute;width:0;height:8178;left:31622;top:112;" coordsize="0,817888" path="m0,817888l0,0">
+                <v:shape id="Shape 3570" style="position:absolute;width:0;height:8178;left:31622;top:112;" coordsize="0,817888" path="m0,817888l0,0">
                   <v:stroke weight="0.55398pt" endcap="square" joinstyle="round" on="true" color="#b0b0b0"/>
                   <v:fill on="false" color="#000000" opacity="0"/>
                 </v:shape>
-                <v:shape id="Shape 3570" style="position:absolute;width:0;height:410;left:31622;top:8291;" coordsize="0,41041" path="m0,41041l0,0x">
+                <v:shape id="Shape 3571" style="position:absolute;width:0;height:410;left:31622;top:8291;" coordsize="0,41041" path="m0,41041l0,0x">
                   <v:stroke weight="1.01563pt" endcap="flat" joinstyle="round" on="true" color="#000000"/>
                   <v:fill on="true" color="#000000"/>
                 </v:shape>
-                <v:shape id="Shape 3572" style="position:absolute;width:0;height:8178;left:35679;top:112;" coordsize="0,817888" path="m0,817888l0,0">
+                <v:shape id="Shape 3573" style="position:absolute;width:0;height:8178;left:35679;top:112;" coordsize="0,817888" path="m0,817888l0,0">
                   <v:stroke weight="0.55398pt" endcap="square" joinstyle="round" on="true" color="#b0b0b0"/>
                   <v:fill on="false" color="#000000" opacity="0"/>
                 </v:shape>
-                <v:shape id="Shape 3573" style="position:absolute;width:0;height:410;left:35679;top:8291;" coordsize="0,41041" path="m0,41041l0,0x">
+                <v:shape id="Shape 3574" style="position:absolute;width:0;height:410;left:35679;top:8291;" coordsize="0,41041" path="m0,41041l0,0x">
                   <v:stroke weight="1.01563pt" endcap="flat" joinstyle="round" on="true" color="#000000"/>
                   <v:fill on="true" color="#000000"/>
                 </v:shape>
-                <v:shape id="Shape 3575" style="position:absolute;width:0;height:234;left:24319;top:8057;" coordsize="0,23452" path="m0,23452l0,0x">
+                <v:shape id="Shape 3576" style="position:absolute;width:0;height:234;left:24319;top:8057;" coordsize="0,23452" path="m0,23452l0,0x">
                   <v:stroke weight="0.64631pt" endcap="flat" joinstyle="round" on="true" color="#000000"/>
                   <v:fill on="true" color="#000000"/>
                 </v:shape>
-                <v:shape id="Shape 3576" style="position:absolute;width:0;height:234;left:25130;top:8057;" coordsize="0,23452" path="m0,23452l0,0x">
+                <v:shape id="Shape 3577" style="position:absolute;width:0;height:234;left:25130;top:8057;" coordsize="0,23452" path="m0,23452l0,0x">
                   <v:stroke weight="0.64631pt" endcap="flat" joinstyle="round" on="true" color="#000000"/>
                   <v:fill on="true" color="#000000"/>
                 </v:shape>
-                <v:shape id="Shape 3577" style="position:absolute;width:0;height:234;left:25942;top:8057;" coordsize="0,23452" path="m0,23452l0,0x">
+                <v:shape id="Shape 3578" style="position:absolute;width:0;height:234;left:25942;top:8057;" coordsize="0,23452" path="m0,23452l0,0x">
                   <v:stroke weight="0.64631pt" endcap="flat" joinstyle="round" on="true" color="#000000"/>
                   <v:fill on="true" color="#000000"/>
                 </v:shape>
-                <v:shape id="Shape 3578" style="position:absolute;width:0;height:234;left:26753;top:8057;" coordsize="0,23452" path="m0,23452l0,0x">
+                <v:shape id="Shape 3579" style="position:absolute;width:0;height:234;left:26753;top:8057;" coordsize="0,23452" path="m0,23452l0,0x">
                   <v:stroke weight="0.64631pt" endcap="flat" joinstyle="round" on="true" color="#000000"/>
                   <v:fill on="true" color="#000000"/>
                 </v:shape>
-                <v:shape id="Shape 3579" style="position:absolute;width:0;height:234;left:28376;top:8057;" coordsize="0,23452" path="m0,23452l0,0x">
+                <v:shape id="Shape 3580" style="position:absolute;width:0;height:234;left:28376;top:8057;" coordsize="0,23452" path="m0,23452l0,0x">
                   <v:stroke weight="0.64631pt" endcap="flat" joinstyle="round" on="true" color="#000000"/>
                   <v:fill on="true" color="#000000"/>
                 </v:shape>
-                <v:shape id="Shape 3580" style="position:absolute;width:0;height:234;left:29187;top:8057;" coordsize="0,23452" path="m0,23452l0,0x">
+                <v:shape id="Shape 3581" style="position:absolute;width:0;height:234;left:29187;top:8057;" coordsize="0,23452" path="m0,23452l0,0x">
                   <v:stroke weight="0.64631pt" endcap="flat" joinstyle="round" on="true" color="#000000"/>
                   <v:fill on="true" color="#000000"/>
                 </v:shape>
-                <v:shape id="Shape 3581" style="position:absolute;width:0;height:234;left:29999;top:8057;" coordsize="0,23452" path="m0,23452l0,0x">
+                <v:shape id="Shape 3582" style="position:absolute;width:0;height:234;left:29999;top:8057;" coordsize="0,23452" path="m0,23452l0,0x">
                   <v:stroke weight="0.64631pt" endcap="flat" joinstyle="round" on="true" color="#000000"/>
                   <v:fill on="true" color="#000000"/>
                 </v:shape>
-                <v:shape id="Shape 3582" style="position:absolute;width:0;height:234;left:30810;top:8057;" coordsize="0,23452" path="m0,23452l0,0x">
+                <v:shape id="Shape 3583" style="position:absolute;width:0;height:234;left:30810;top:8057;" coordsize="0,23452" path="m0,23452l0,0x">
                   <v:stroke weight="0.64631pt" endcap="flat" joinstyle="round" on="true" color="#000000"/>
                   <v:fill on="true" color="#000000"/>
                 </v:shape>
-                <v:shape id="Shape 3583" style="position:absolute;width:0;height:234;left:32433;top:8057;" coordsize="0,23452" path="m0,23452l0,0x">
+                <v:shape id="Shape 3584" style="position:absolute;width:0;height:234;left:32433;top:8057;" coordsize="0,23452" path="m0,23452l0,0x">
                   <v:stroke weight="0.64631pt" endcap="flat" joinstyle="round" on="true" color="#000000"/>
                   <v:fill on="true" color="#000000"/>
                 </v:shape>
-                <v:shape id="Shape 3584" style="position:absolute;width:0;height:234;left:33245;top:8057;" coordsize="0,23452" path="m0,23452l0,0x">
+                <v:shape id="Shape 3585" style="position:absolute;width:0;height:234;left:33245;top:8057;" coordsize="0,23452" path="m0,23452l0,0x">
                   <v:stroke weight="0.64631pt" endcap="flat" joinstyle="round" on="true" color="#000000"/>
                   <v:fill on="true" color="#000000"/>
                 </v:shape>
-                <v:shape id="Shape 3585" style="position:absolute;width:0;height:234;left:34056;top:8057;" coordsize="0,23452" path="m0,23452l0,0x">
+                <v:shape id="Shape 3586" style="position:absolute;width:0;height:234;left:34056;top:8057;" coordsize="0,23452" path="m0,23452l0,0x">
                   <v:stroke weight="0.64631pt" endcap="flat" joinstyle="round" on="true" color="#000000"/>
                   <v:fill on="true" color="#000000"/>
                 </v:shape>
-                <v:shape id="Shape 3586" style="position:absolute;width:0;height:234;left:34867;top:8057;" coordsize="0,23452" path="m0,23452l0,0x">
+                <v:shape id="Shape 3587" style="position:absolute;width:0;height:234;left:34867;top:8057;" coordsize="0,23452" path="m0,23452l0,0x">
                   <v:stroke weight="0.64631pt" endcap="flat" joinstyle="round" on="true" color="#000000"/>
                   <v:fill on="true" color="#000000"/>
                 </v:shape>
-                <v:shape id="Shape 3587" style="position:absolute;width:0;height:234;left:36490;top:8057;" coordsize="0,23452" path="m0,23452l0,0x">
+                <v:shape id="Shape 3588" style="position:absolute;width:0;height:234;left:36490;top:8057;" coordsize="0,23452" path="m0,23452l0,0x">
                   <v:stroke weight="0.64631pt" endcap="flat" joinstyle="round" on="true" color="#000000"/>
                   <v:fill on="true" color="#000000"/>
                 </v:shape>
-                <v:shape id="Shape 3588" style="position:absolute;width:0;height:234;left:37302;top:8057;" coordsize="0,23452" path="m0,23452l0,0x">
+                <v:shape id="Shape 3589" style="position:absolute;width:0;height:234;left:37302;top:8057;" coordsize="0,23452" path="m0,23452l0,0x">
                   <v:stroke weight="0.64631pt" endcap="flat" joinstyle="round" on="true" color="#000000"/>
                   <v:fill on="true" color="#000000"/>
                 </v:shape>
-                <v:shape id="Shape 3589" style="position:absolute;width:0;height:234;left:38113;top:8057;" coordsize="0,23452" path="m0,23452l0,0x">
+                <v:shape id="Shape 3590" style="position:absolute;width:0;height:234;left:38113;top:8057;" coordsize="0,23452" path="m0,23452l0,0x">
                   <v:stroke weight="0.64631pt" endcap="flat" joinstyle="round" on="true" color="#000000"/>
                   <v:fill on="true" color="#000000"/>
                 </v:shape>
-                <v:shape id="Shape 3591" style="position:absolute;width:15287;height:0;left:23034;top:794;" coordsize="1528731,0" path="m0,0l1528731,0">
+                <v:shape id="Shape 3592" style="position:absolute;width:15287;height:0;left:23034;top:794;" coordsize="1528731,0" path="m0,0l1528731,0">
                   <v:stroke weight="0.55398pt" endcap="square" joinstyle="round" on="true" color="#b0b0b0"/>
                   <v:fill on="false" color="#000000" opacity="0"/>
                 </v:shape>
-                <v:shape id="Shape 3592" style="position:absolute;width:410;height:0;left:22623;top:794;" coordsize="41041,0" path="m41041,0l0,0x">
+                <v:shape id="Shape 3593" style="position:absolute;width:410;height:0;left:22623;top:794;" coordsize="41041,0" path="m41041,0l0,0x">
                   <v:stroke weight="1.01563pt" endcap="flat" joinstyle="round" on="true" color="#000000"/>
                   <v:fill on="true" color="#000000"/>
                 </v:shape>
-                <v:shape id="Shape 3594" style="position:absolute;width:15287;height:0;left:23034;top:1930;" coordsize="1528731,0" path="m0,0l1528731,0">
+                <v:shape id="Shape 3595" style="position:absolute;width:15287;height:0;left:23034;top:1930;" coordsize="1528731,0" path="m0,0l1528731,0">
                   <v:stroke weight="0.55398pt" endcap="square" joinstyle="round" on="true" color="#b0b0b0"/>
                   <v:fill on="false" color="#000000" opacity="0"/>
                 </v:shape>
-                <v:shape id="Shape 3595" style="position:absolute;width:410;height:0;left:22623;top:1930;" coordsize="41041,0" path="m41041,0l0,0x">
+                <v:shape id="Shape 3596" style="position:absolute;width:410;height:0;left:22623;top:1930;" coordsize="41041,0" path="m41041,0l0,0x">
                   <v:stroke weight="1.01563pt" endcap="flat" joinstyle="round" on="true" color="#000000"/>
                   <v:fill on="true" color="#000000"/>
                 </v:shape>
-                <v:shape id="Shape 3597" style="position:absolute;width:15287;height:0;left:23034;top:3066;" coordsize="1528731,0" path="m0,0l1528731,0">
+                <v:shape id="Shape 3598" style="position:absolute;width:15287;height:0;left:23034;top:3066;" coordsize="1528731,0" path="m0,0l1528731,0">
                   <v:stroke weight="0.55398pt" endcap="square" joinstyle="round" on="true" color="#b0b0b0"/>
                   <v:fill on="false" color="#000000" opacity="0"/>
                 </v:shape>
-                <v:shape id="Shape 3598" style="position:absolute;width:410;height:0;left:22623;top:3066;" coordsize="41041,0" path="m41041,0l0,0x">
+                <v:shape id="Shape 3599" style="position:absolute;width:410;height:0;left:22623;top:3066;" coordsize="41041,0" path="m41041,0l0,0x">
                   <v:stroke weight="1.01563pt" endcap="flat" joinstyle="round" on="true" color="#000000"/>
                   <v:fill on="true" color="#000000"/>
                 </v:shape>
-                <v:shape id="Shape 3600" style="position:absolute;width:15287;height:0;left:23034;top:4202;" coordsize="1528731,0" path="m0,0l1528731,0">
+                <v:shape id="Shape 3601" style="position:absolute;width:15287;height:0;left:23034;top:4202;" coordsize="1528731,0" path="m0,0l1528731,0">
                   <v:stroke weight="0.55398pt" endcap="square" joinstyle="round" on="true" color="#b0b0b0"/>
                   <v:fill on="false" color="#000000" opacity="0"/>
                 </v:shape>
-                <v:shape id="Shape 3601" style="position:absolute;width:410;height:0;left:22623;top:4202;" coordsize="41041,0" path="m41041,0l0,0x">
+                <v:shape id="Shape 3602" style="position:absolute;width:410;height:0;left:22623;top:4202;" coordsize="41041,0" path="m41041,0l0,0x">
                   <v:stroke weight="1.01563pt" endcap="flat" joinstyle="round" on="true" color="#000000"/>
                   <v:fill on="true" color="#000000"/>
                 </v:shape>
-                <v:shape id="Shape 3603" style="position:absolute;width:15287;height:0;left:23034;top:5338;" coordsize="1528731,0" path="m0,0l1528731,0">
+                <v:shape id="Shape 3604" style="position:absolute;width:15287;height:0;left:23034;top:5338;" coordsize="1528731,0" path="m0,0l1528731,0">
                   <v:stroke weight="0.55398pt" endcap="square" joinstyle="round" on="true" color="#b0b0b0"/>
                   <v:fill on="false" color="#000000" opacity="0"/>
                 </v:shape>
-                <v:shape id="Shape 3604" style="position:absolute;width:410;height:0;left:22623;top:5338;" coordsize="41041,0" path="m41041,0l0,0x">
+                <v:shape id="Shape 3605" style="position:absolute;width:410;height:0;left:22623;top:5338;" coordsize="41041,0" path="m41041,0l0,0x">
                   <v:stroke weight="1.01563pt" endcap="flat" joinstyle="round" on="true" color="#000000"/>
                   <v:fill on="true" color="#000000"/>
                 </v:shape>
-                <v:shape id="Shape 3606" style="position:absolute;width:15287;height:0;left:23034;top:6474;" coordsize="1528731,0" path="m0,0l1528731,0">
+                <v:shape id="Shape 3607" style="position:absolute;width:15287;height:0;left:23034;top:6474;" coordsize="1528731,0" path="m0,0l1528731,0">
                   <v:stroke weight="0.55398pt" endcap="square" joinstyle="round" on="true" color="#b0b0b0"/>
                   <v:fill on="false" color="#000000" opacity="0"/>
                 </v:shape>
-                <v:shape id="Shape 3607" style="position:absolute;width:410;height:0;left:22623;top:6474;" coordsize="41041,0" path="m41041,0l0,0x">
+                <v:shape id="Shape 3608" style="position:absolute;width:410;height:0;left:22623;top:6474;" coordsize="41041,0" path="m41041,0l0,0x">
                   <v:stroke weight="1.01563pt" endcap="flat" joinstyle="round" on="true" color="#000000"/>
                   <v:fill on="true" color="#000000"/>
                 </v:shape>
-                <v:shape id="Shape 3609" style="position:absolute;width:15287;height:0;left:23034;top:7610;" coordsize="1528731,0" path="m0,0l1528731,0">
+                <v:shape id="Shape 3610" style="position:absolute;width:15287;height:0;left:23034;top:7610;" coordsize="1528731,0" path="m0,0l1528731,0">
                   <v:stroke weight="0.55398pt" endcap="square" joinstyle="round" on="true" color="#b0b0b0"/>
                   <v:fill on="false" color="#000000" opacity="0"/>
                 </v:shape>
-                <v:shape id="Shape 3610" style="position:absolute;width:410;height:0;left:22623;top:7610;" coordsize="41041,0" path="m41041,0l0,0x">
+                <v:shape id="Shape 3611" style="position:absolute;width:410;height:0;left:22623;top:7610;" coordsize="41041,0" path="m41041,0l0,0x">
                   <v:stroke weight="1.01563pt" endcap="flat" joinstyle="round" on="true" color="#000000"/>
                   <v:fill on="true" color="#000000"/>
                 </v:shape>
-                <v:shape id="Shape 3612" style="position:absolute;width:234;height:0;left:23034;top:8291;" coordsize="23451,0" path="m23451,0l0,0x">
+                <v:shape id="Shape 3613" style="position:absolute;width:234;height:0;left:23034;top:8291;" coordsize="23451,0" path="m23451,0l0,0x">
                   <v:stroke weight="0.64631pt" endcap="flat" joinstyle="round" on="true" color="#000000"/>
                   <v:fill on="true" color="#000000"/>
                 </v:shape>
-                <v:shape id="Shape 3613" style="position:absolute;width:234;height:0;left:23034;top:8064;" coordsize="23451,0" path="m23451,0l0,0x">
+                <v:shape id="Shape 3614" style="position:absolute;width:234;height:0;left:23034;top:8064;" coordsize="23451,0" path="m23451,0l0,0x">
                   <v:stroke weight="0.64631pt" endcap="flat" joinstyle="round" on="true" color="#000000"/>
                   <v:fill on="true" color="#000000"/>
                 </v:shape>
-                <v:shape id="Shape 3614" style="position:absolute;width:234;height:0;left:23034;top:7837;" coordsize="23451,0" path="m23451,0l0,0x">
+                <v:shape id="Shape 3615" style="position:absolute;width:234;height:0;left:23034;top:7837;" coordsize="23451,0" path="m23451,0l0,0x">
                   <v:stroke weight="0.64631pt" endcap="flat" joinstyle="round" on="true" color="#000000"/>
                   <v:fill on="true" color="#000000"/>
                 </v:shape>
-                <v:shape id="Shape 3615" style="position:absolute;width:234;height:0;left:23034;top:7382;" coordsize="23451,0" path="m23451,0l0,0x">
+                <v:shape id="Shape 3616" style="position:absolute;width:234;height:0;left:23034;top:7382;" coordsize="23451,0" path="m23451,0l0,0x">
                   <v:stroke weight="0.64631pt" endcap="flat" joinstyle="round" on="true" color="#000000"/>
                   <v:fill on="true" color="#000000"/>
                 </v:shape>
-                <v:shape id="Shape 3616" style="position:absolute;width:234;height:0;left:23034;top:7155;" coordsize="23451,0" path="m23451,0l0,0x">
+                <v:shape id="Shape 3617" style="position:absolute;width:234;height:0;left:23034;top:7155;" coordsize="23451,0" path="m23451,0l0,0x">
                   <v:stroke weight="0.64631pt" endcap="flat" joinstyle="round" on="true" color="#000000"/>
                   <v:fill on="true" color="#000000"/>
                 </v:shape>
-                <v:shape id="Shape 3617" style="position:absolute;width:234;height:0;left:23034;top:6928;" coordsize="23451,0" path="m23451,0l0,0x">
+                <v:shape id="Shape 3618" style="position:absolute;width:234;height:0;left:23034;top:6928;" coordsize="23451,0" path="m23451,0l0,0x">
                   <v:stroke weight="0.64631pt" endcap="flat" joinstyle="round" on="true" color="#000000"/>
                   <v:fill on="true" color="#000000"/>
                 </v:shape>
-                <v:shape id="Shape 3618" style="position:absolute;width:234;height:0;left:23034;top:6701;" coordsize="23451,0" path="m23451,0l0,0x">
+                <v:shape id="Shape 3619" style="position:absolute;width:234;height:0;left:23034;top:6701;" coordsize="23451,0" path="m23451,0l0,0x">
                   <v:stroke weight="0.64631pt" endcap="flat" joinstyle="round" on="true" color="#000000"/>
                   <v:fill on="true" color="#000000"/>
                 </v:shape>
-                <v:shape id="Shape 3619" style="position:absolute;width:234;height:0;left:23034;top:6247;" coordsize="23451,0" path="m23451,0l0,0x">
+                <v:shape id="Shape 3620" style="position:absolute;width:234;height:0;left:23034;top:6247;" coordsize="23451,0" path="m23451,0l0,0x">
                   <v:stroke weight="0.64631pt" endcap="flat" joinstyle="round" on="true" color="#000000"/>
                   <v:fill on="true" color="#000000"/>
                 </v:shape>
-                <v:shape id="Shape 3620" style="position:absolute;width:234;height:0;left:23034;top:6019;" coordsize="23451,0" path="m23451,0l0,0x">
+                <v:shape id="Shape 3621" style="position:absolute;width:234;height:0;left:23034;top:6019;" coordsize="23451,0" path="m23451,0l0,0x">
                   <v:stroke weight="0.64631pt" endcap="flat" joinstyle="round" on="true" color="#000000"/>
                   <v:fill on="true" color="#000000"/>
                 </v:shape>
-                <v:shape id="Shape 3621" style="position:absolute;width:234;height:0;left:23034;top:5792;" coordsize="23451,0" path="m23451,0l0,0x">
+                <v:shape id="Shape 3622" style="position:absolute;width:234;height:0;left:23034;top:5792;" coordsize="23451,0" path="m23451,0l0,0x">
                   <v:stroke weight="0.64631pt" endcap="flat" joinstyle="round" on="true" color="#000000"/>
                   <v:fill on="true" color="#000000"/>
                 </v:shape>
-                <v:shape id="Shape 3622" style="position:absolute;width:234;height:0;left:23034;top:5565;" coordsize="23451,0" path="m23451,0l0,0x">
+                <v:shape id="Shape 3623" style="position:absolute;width:234;height:0;left:23034;top:5565;" coordsize="23451,0" path="m23451,0l0,0x">
                   <v:stroke weight="0.64631pt" endcap="flat" joinstyle="round" on="true" color="#000000"/>
                   <v:fill on="true" color="#000000"/>
                 </v:shape>
-                <v:shape id="Shape 3623" style="position:absolute;width:234;height:0;left:23034;top:5111;" coordsize="23451,0" path="m23451,0l0,0x">
+                <v:shape id="Shape 3624" style="position:absolute;width:234;height:0;left:23034;top:5111;" coordsize="23451,0" path="m23451,0l0,0x">
                   <v:stroke weight="0.64631pt" endcap="flat" joinstyle="round" on="true" color="#000000"/>
                   <v:fill on="true" color="#000000"/>
                 </v:shape>
-                <v:shape id="Shape 3624" style="position:absolute;width:234;height:0;left:23034;top:4883;" coordsize="23451,0" path="m23451,0l0,0x">
+                <v:shape id="Shape 3625" style="position:absolute;width:234;height:0;left:23034;top:4883;" coordsize="23451,0" path="m23451,0l0,0x">
                   <v:stroke weight="0.64631pt" endcap="flat" joinstyle="round" on="true" color="#000000"/>
                   <v:fill on="true" color="#000000"/>
                 </v:shape>
-                <v:shape id="Shape 3625" style="position:absolute;width:234;height:0;left:23034;top:4656;" coordsize="23451,0" path="m23451,0l0,0x">
+                <v:shape id="Shape 3626" style="position:absolute;width:234;height:0;left:23034;top:4656;" coordsize="23451,0" path="m23451,0l0,0x">
                   <v:stroke weight="0.64631pt" endcap="flat" joinstyle="round" on="true" color="#000000"/>
                   <v:fill on="true" color="#000000"/>
                 </v:shape>
-                <v:shape id="Shape 3626" style="position:absolute;width:234;height:0;left:23034;top:4429;" coordsize="23451,0" path="m23451,0l0,0x">
+                <v:shape id="Shape 3627" style="position:absolute;width:234;height:0;left:23034;top:4429;" coordsize="23451,0" path="m23451,0l0,0x">
                   <v:stroke weight="0.64631pt" endcap="flat" joinstyle="round" on="true" color="#000000"/>
                   <v:fill on="true" color="#000000"/>
                 </v:shape>
-                <v:shape id="Shape 3627" style="position:absolute;width:234;height:0;left:23034;top:3975;" coordsize="23451,0" path="m23451,0l0,0x">
+                <v:shape id="Shape 3628" style="position:absolute;width:234;height:0;left:23034;top:3975;" coordsize="23451,0" path="m23451,0l0,0x">
                   <v:stroke weight="0.64631pt" endcap="flat" joinstyle="round" on="true" color="#000000"/>
                   <v:fill on="true" color="#000000"/>
                 </v:shape>
-                <v:shape id="Shape 3628" style="position:absolute;width:234;height:0;left:23034;top:3747;" coordsize="23451,0" path="m23451,0l0,0x">
+                <v:shape id="Shape 3629" style="position:absolute;width:234;height:0;left:23034;top:3747;" coordsize="23451,0" path="m23451,0l0,0x">
                   <v:stroke weight="0.64631pt" endcap="flat" joinstyle="round" on="true" color="#000000"/>
                   <v:fill on="true" color="#000000"/>
                 </v:shape>
-                <v:shape id="Shape 3629" style="position:absolute;width:234;height:0;left:23034;top:3520;" coordsize="23451,0" path="m23451,0l0,0x">
+                <v:shape id="Shape 3630" style="position:absolute;width:234;height:0;left:23034;top:3520;" coordsize="23451,0" path="m23451,0l0,0x">
                   <v:stroke weight="0.64631pt" endcap="flat" joinstyle="round" on="true" color="#000000"/>
                   <v:fill on="true" color="#000000"/>
                 </v:shape>
-                <v:shape id="Shape 3630" style="position:absolute;width:234;height:0;left:23034;top:3293;" coordsize="23451,0" path="m23451,0l0,0x">
+                <v:shape id="Shape 3631" style="position:absolute;width:234;height:0;left:23034;top:3293;" coordsize="23451,0" path="m23451,0l0,0x">
                   <v:stroke weight="0.64631pt" endcap="flat" joinstyle="round" on="true" color="#000000"/>
                   <v:fill on="true" color="#000000"/>
                 </v:shape>
-                <v:shape id="Shape 3631" style="position:absolute;width:234;height:0;left:23034;top:2839;" coordsize="23451,0" path="m23451,0l0,0x">
+                <v:shape id="Shape 3632" style="position:absolute;width:234;height:0;left:23034;top:2839;" coordsize="23451,0" path="m23451,0l0,0x">
                   <v:stroke weight="0.64631pt" endcap="flat" joinstyle="round" on="true" color="#000000"/>
                   <v:fill on="true" color="#000000"/>
                 </v:shape>
-                <v:shape id="Shape 3632" style="position:absolute;width:234;height:0;left:23034;top:2611;" coordsize="23451,0" path="m23451,0l0,0x">
+                <v:shape id="Shape 3633" style="position:absolute;width:234;height:0;left:23034;top:2611;" coordsize="23451,0" path="m23451,0l0,0x">
                   <v:stroke weight="0.64631pt" endcap="flat" joinstyle="round" on="true" color="#000000"/>
                   <v:fill on="true" color="#000000"/>
                 </v:shape>
-                <v:shape id="Shape 3633" style="position:absolute;width:234;height:0;left:23034;top:2384;" coordsize="23451,0" path="m23451,0l0,0x">
+                <v:shape id="Shape 3634" style="position:absolute;width:234;height:0;left:23034;top:2384;" coordsize="23451,0" path="m23451,0l0,0x">
                   <v:stroke weight="0.64631pt" endcap="flat" joinstyle="round" on="true" color="#000000"/>
                   <v:fill on="true" color="#000000"/>
                 </v:shape>
-                <v:shape id="Shape 3634" style="position:absolute;width:234;height:0;left:23034;top:2157;" coordsize="23451,0" path="m23451,0l0,0x">
+                <v:shape id="Shape 3635" style="position:absolute;width:234;height:0;left:23034;top:2157;" coordsize="23451,0" path="m23451,0l0,0x">
                   <v:stroke weight="0.64631pt" endcap="flat" joinstyle="round" on="true" color="#000000"/>
                   <v:fill on="true" color="#000000"/>
                 </v:shape>
-                <v:shape id="Shape 3635" style="position:absolute;width:234;height:0;left:23034;top:1703;" coordsize="23451,0" path="m23451,0l0,0x">
+                <v:shape id="Shape 3636" style="position:absolute;width:234;height:0;left:23034;top:1703;" coordsize="23451,0" path="m23451,0l0,0x">
                   <v:stroke weight="0.64631pt" endcap="flat" joinstyle="round" on="true" color="#000000"/>
                   <v:fill on="true" color="#000000"/>
                 </v:shape>
-                <v:shape id="Shape 3636" style="position:absolute;width:234;height:0;left:23034;top:1476;" coordsize="23451,0" path="m23451,0l0,0x">
+                <v:shape id="Shape 3637" style="position:absolute;width:234;height:0;left:23034;top:1476;" coordsize="23451,0" path="m23451,0l0,0x">
                   <v:stroke weight="0.64631pt" endcap="flat" joinstyle="round" on="true" color="#000000"/>
                   <v:fill on="true" color="#000000"/>
                 </v:shape>
-                <v:shape id="Shape 3637" style="position:absolute;width:234;height:0;left:23034;top:1248;" coordsize="23451,0" path="m23451,0l0,0x">
+                <v:shape id="Shape 3638" style="position:absolute;width:234;height:0;left:23034;top:1248;" coordsize="23451,0" path="m23451,0l0,0x">
                   <v:stroke weight="0.64631pt" endcap="flat" joinstyle="round" on="true" color="#000000"/>
                   <v:fill on="true" color="#000000"/>
                 </v:shape>
-                <v:shape id="Shape 3638" style="position:absolute;width:234;height:0;left:23034;top:1021;" coordsize="23451,0" path="m23451,0l0,0x">
+                <v:shape id="Shape 3639" style="position:absolute;width:234;height:0;left:23034;top:1021;" coordsize="23451,0" path="m23451,0l0,0x">
                   <v:stroke weight="0.64631pt" endcap="flat" joinstyle="round" on="true" color="#000000"/>
                   <v:fill on="true" color="#000000"/>
                 </v:shape>
-                <v:shape id="Shape 3639" style="position:absolute;width:234;height:0;left:23034;top:567;" coordsize="23451,0" path="m23451,0l0,0x">
+                <v:shape id="Shape 3640" style="position:absolute;width:234;height:0;left:23034;top:567;" coordsize="23451,0" path="m23451,0l0,0x">
                   <v:stroke weight="0.64631pt" endcap="flat" joinstyle="round" on="true" color="#000000"/>
                   <v:fill on="true" color="#000000"/>
                 </v:shape>
-                <v:shape id="Shape 3640" style="position:absolute;width:234;height:0;left:23034;top:340;" coordsize="23451,0" path="m23451,0l0,0x">
+                <v:shape id="Shape 3641" style="position:absolute;width:234;height:0;left:23034;top:340;" coordsize="23451,0" path="m23451,0l0,0x">
                   <v:stroke weight="0.64631pt" endcap="flat" joinstyle="round" on="true" color="#000000"/>
                   <v:fill on="true" color="#000000"/>
                 </v:shape>
-                <v:shape id="Shape 3641" style="position:absolute;width:234;height:0;left:23034;top:112;" coordsize="23451,0" path="m23451,0l0,0x">
+                <v:shape id="Shape 3642" style="position:absolute;width:234;height:0;left:23034;top:112;" coordsize="23451,0" path="m23451,0l0,0x">
                   <v:stroke weight="0.64631pt" endcap="flat" joinstyle="round" on="true" color="#000000"/>
                   <v:fill on="true" color="#000000"/>
                 </v:shape>
-                <v:shape id="Shape 3642" style="position:absolute;width:5990;height:0;left:23729;top:794;" coordsize="599029,0" path="m0,0l599029,0">
+                <v:shape id="Shape 3643" style="position:absolute;width:5990;height:0;left:23729;top:794;" coordsize="599029,0" path="m0,0l599029,0">
                   <v:stroke weight="0.660159pt" endcap="flat" joinstyle="round" on="true" color="#1c6b73"/>
                   <v:fill on="false" color="#000000" opacity="0"/>
                 </v:shape>
-                <v:shape id="Shape 3643" style="position:absolute;width:6369;height:0;left:24725;top:1930;" coordsize="636963,0" path="m0,0l636963,0">
+                <v:shape id="Shape 3644" style="position:absolute;width:6369;height:0;left:24725;top:1930;" coordsize="636963,0" path="m0,0l636963,0">
                   <v:stroke weight="0.660159pt" endcap="flat" joinstyle="round" on="true" color="#1c6b73"/>
                   <v:fill on="false" color="#000000" opacity="0"/>
                 </v:shape>
-                <v:shape id="Shape 3644" style="position:absolute;width:5923;height:0;left:25333;top:3066;" coordsize="592334,0" path="m0,0l592334,0">
+                <v:shape id="Shape 3645" style="position:absolute;width:5923;height:0;left:25333;top:3066;" coordsize="592334,0" path="m0,0l592334,0">
                   <v:stroke weight="0.660159pt" endcap="flat" joinstyle="round" on="true" color="#1c6b73"/>
                   <v:fill on="false" color="#000000" opacity="0"/>
                 </v:shape>
-                <v:shape id="Shape 3645" style="position:absolute;width:5761;height:0;left:25982;top:4202;" coordsize="576107,0" path="m0,0l576107,0">
+                <v:shape id="Shape 3646" style="position:absolute;width:5761;height:0;left:25982;top:4202;" coordsize="576107,0" path="m0,0l576107,0">
                   <v:stroke weight="0.660159pt" endcap="flat" joinstyle="round" on="true" color="#1c6b73"/>
                   <v:fill on="false" color="#000000" opacity="0"/>
                 </v:shape>
-                <v:shape id="Shape 3646" style="position:absolute;width:6450;height:0;left:26429;top:5338;" coordsize="645077,0" path="m0,0l645077,0">
+                <v:shape id="Shape 3647" style="position:absolute;width:6450;height:0;left:26429;top:5338;" coordsize="645077,0" path="m0,0l645077,0">
                   <v:stroke weight="0.660159pt" endcap="flat" joinstyle="round" on="true" color="#1c6b73"/>
                   <v:fill on="false" color="#000000" opacity="0"/>
                 </v:shape>
-                <v:shape id="Shape 3647" style="position:absolute;width:6856;height:0;left:27199;top:6474;" coordsize="685648,0" path="m0,0l685648,0">
+                <v:shape id="Shape 3648" style="position:absolute;width:6856;height:0;left:27199;top:6474;" coordsize="685648,0" path="m0,0l685648,0">
                   <v:stroke weight="0.660159pt" endcap="flat" joinstyle="round" on="true" color="#1c6b73"/>
                   <v:fill on="false" color="#000000" opacity="0"/>
                 </v:shape>
-                <v:shape id="Shape 3648" style="position:absolute;width:9915;height:0;left:27711;top:7610;" coordsize="991552,0" path="m0,0l991552,0">
+                <v:shape id="Shape 3649" style="position:absolute;width:9915;height:0;left:27711;top:7610;" coordsize="991552,0" path="m0,0l991552,0">
                   <v:stroke weight="0.660159pt" endcap="flat" joinstyle="round" on="true" color="#1c6b73"/>
                   <v:fill on="false" color="#000000" opacity="0"/>
                 </v:shape>
-                <v:shape id="Shape 3649" style="position:absolute;width:0;height:8178;left:23034;top:112;" coordsize="0,817888" path="m0,817888l0,0">
+                <v:shape id="Shape 3650" style="position:absolute;width:0;height:8178;left:23034;top:112;" coordsize="0,817888" path="m0,817888l0,0">
                   <v:stroke weight="1.01563pt" endcap="square" joinstyle="miter" miterlimit="10" on="true" color="#000000"/>
                   <v:fill on="false" color="#000000" opacity="0"/>
                 </v:shape>
-                <v:shape id="Shape 3650" style="position:absolute;width:15287;height:0;left:23034;top:8291;" coordsize="1528731,0" path="m0,0l1528731,0">
+                <v:shape id="Shape 3651" style="position:absolute;width:15287;height:0;left:23034;top:8291;" coordsize="1528731,0" path="m0,0l1528731,0">
                   <v:stroke weight="1.01563pt" endcap="square" joinstyle="miter" miterlimit="10" on="true" color="#000000"/>
                   <v:fill on="false" color="#000000" opacity="0"/>
                 </v:shape>
-                <v:shape id="Shape 3651" style="position:absolute;width:2596;height:0;left:25333;top:794;" coordsize="259653,0" path="m0,0l259653,0">
+                <v:shape id="Shape 3652" style="position:absolute;width:2596;height:0;left:25333;top:794;" coordsize="259653,0" path="m0,0l259653,0">
                   <v:stroke weight="3.12075pt" endcap="flat" joinstyle="round" on="true" color="#1c6b73" opacity="0.45098"/>
                   <v:fill on="false" color="#000000" opacity="0"/>
                 </v:shape>
-                <v:shape id="Shape 3652" style="position:absolute;width:2799;height:0;left:26266;top:1930;" coordsize="279939,0" path="m0,0l279939,0">
+                <v:shape id="Shape 3653" style="position:absolute;width:2799;height:0;left:26266;top:1930;" coordsize="279939,0" path="m0,0l279939,0">
                   <v:stroke weight="3.12075pt" endcap="flat" joinstyle="round" on="true" color="#1c6b73" opacity="0.45098"/>
                   <v:fill on="false" color="#000000" opacity="0"/>
                 </v:shape>
-                <v:shape id="Shape 3653" style="position:absolute;width:2718;height:0;left:26591;top:3066;" coordsize="271825,0" path="m0,0l271825,0">
+                <v:shape id="Shape 3654" style="position:absolute;width:2718;height:0;left:26591;top:3066;" coordsize="271825,0" path="m0,0l271825,0">
                   <v:stroke weight="3.12075pt" endcap="flat" joinstyle="round" on="true" color="#1c6b73" opacity="0.45098"/>
                   <v:fill on="false" color="#000000" opacity="0"/>
                 </v:shape>
-                <v:shape id="Shape 3654" style="position:absolute;width:2718;height:0;left:27118;top:4202;" coordsize="271825,0" path="m0,0l271825,0">
+                <v:shape id="Shape 3655" style="position:absolute;width:2718;height:0;left:27118;top:4202;" coordsize="271825,0" path="m0,0l271825,0">
                   <v:stroke weight="3.12075pt" endcap="flat" joinstyle="round" on="true" color="#1c6b73" opacity="0.45098"/>
                   <v:fill on="false" color="#000000" opacity="0"/>
                 </v:shape>
-                <v:shape id="Shape 3655" style="position:absolute;width:3042;height:0;left:27889;top:5338;" coordsize="304282,0" path="m0,0l304282,0">
+                <v:shape id="Shape 3656" style="position:absolute;width:3042;height:0;left:27889;top:5338;" coordsize="304282,0" path="m0,0l304282,0">
                   <v:stroke weight="3.12075pt" endcap="flat" joinstyle="round" on="true" color="#1c6b73" opacity="0.45098"/>
                   <v:fill on="false" color="#000000" opacity="0"/>
                 </v:shape>
-                <v:shape id="Shape 3656" style="position:absolute;width:2799;height:0;left:29066;top:6474;" coordsize="279939,0" path="m0,0l279939,0">
+                <v:shape id="Shape 3657" style="position:absolute;width:2799;height:0;left:29066;top:6474;" coordsize="279939,0" path="m0,0l279939,0">
                   <v:stroke weight="3.12075pt" endcap="flat" joinstyle="round" on="true" color="#1c6b73" opacity="0.45098"/>
                   <v:fill on="false" color="#000000" opacity="0"/>
                 </v:shape>
-                <v:shape id="Shape 3657" style="position:absolute;width:3854;height:0;left:30202;top:7610;" coordsize="385423,0" path="m0,0l385423,0">
+                <v:shape id="Shape 3658" style="position:absolute;width:3854;height:0;left:30202;top:7610;" coordsize="385423,0" path="m0,0l385423,0">
                   <v:stroke weight="3.12075pt" endcap="flat" joinstyle="round" on="true" color="#1c6b73" opacity="0.45098"/>
                   <v:fill on="false" color="#000000" opacity="0"/>
                 </v:shape>
-                <v:rect id="Rectangle 3658" style="position:absolute;width:476;height:1170;left:37167;top:306;" filled="f" stroked="f">
+                <v:rect id="Rectangle 3659" style="position:absolute;width:476;height:1170;left:37167;top:306;" filled="f" stroked="f">
                   <v:textbox inset="0,0,0,0">
                     <w:txbxContent>
                       <w:p>
@@ -14438,7 +14480,7 @@
                     </w:txbxContent>
                   </v:textbox>
                 </v:rect>
-                <v:rect id="Rectangle 3659" style="position:absolute;width:476;height:1170;left:37167;top:1441;" filled="f" stroked="f">
+                <v:rect id="Rectangle 3660" style="position:absolute;width:476;height:1170;left:37167;top:1441;" filled="f" stroked="f">
                   <v:textbox inset="0,0,0,0">
                     <w:txbxContent>
                       <w:p>
@@ -14459,7 +14501,7 @@
                     </w:txbxContent>
                   </v:textbox>
                 </v:rect>
-                <v:rect id="Rectangle 3660" style="position:absolute;width:476;height:1170;left:37167;top:2577;" filled="f" stroked="f">
+                <v:rect id="Rectangle 3661" style="position:absolute;width:476;height:1170;left:37167;top:2577;" filled="f" stroked="f">
                   <v:textbox inset="0,0,0,0">
                     <w:txbxContent>
                       <w:p>
@@ -14480,7 +14522,7 @@
                     </w:txbxContent>
                   </v:textbox>
                 </v:rect>
-                <v:rect id="Rectangle 3661" style="position:absolute;width:476;height:1170;left:37167;top:3713;" filled="f" stroked="f">
+                <v:rect id="Rectangle 3662" style="position:absolute;width:476;height:1170;left:37167;top:3713;" filled="f" stroked="f">
                   <v:textbox inset="0,0,0,0">
                     <w:txbxContent>
                       <w:p>
@@ -14501,7 +14543,7 @@
                     </w:txbxContent>
                   </v:textbox>
                 </v:rect>
-                <v:rect id="Rectangle 3662" style="position:absolute;width:1430;height:1170;left:37167;top:4849;" filled="f" stroked="f">
+                <v:rect id="Rectangle 3663" style="position:absolute;width:1430;height:1170;left:37167;top:4849;" filled="f" stroked="f">
                   <v:textbox inset="0,0,0,0">
                     <w:txbxContent>
                       <w:p>
@@ -14522,7 +14564,7 @@
                     </w:txbxContent>
                   </v:textbox>
                 </v:rect>
-                <v:rect id="Rectangle 3663" style="position:absolute;width:1430;height:1170;left:37167;top:5985;" filled="f" stroked="f">
+                <v:rect id="Rectangle 3664" style="position:absolute;width:1430;height:1170;left:37167;top:5985;" filled="f" stroked="f">
                   <v:textbox inset="0,0,0,0">
                     <w:txbxContent>
                       <w:p>
@@ -14543,7 +14585,7 @@
                     </w:txbxContent>
                   </v:textbox>
                 </v:rect>
-                <v:rect id="Rectangle 3664" style="position:absolute;width:476;height:1170;left:37167;top:7121;" filled="f" stroked="f">
+                <v:rect id="Rectangle 3665" style="position:absolute;width:476;height:1170;left:37167;top:7121;" filled="f" stroked="f">
                   <v:textbox inset="0,0,0,0">
                     <w:txbxContent>
                       <w:p>
@@ -14564,31 +14606,31 @@
                     </w:txbxContent>
                   </v:textbox>
                 </v:rect>
-                <v:shape id="Shape 3666" style="position:absolute;width:398;height:398;left:26392;top:595;" coordsize="39868,39868" path="m19934,0c25221,0,30291,2100,34030,5838c37767,9577,39868,14647,39868,19934c39868,25221,37767,30291,34030,34030c30291,37768,25221,39868,19934,39868c14647,39868,9577,37768,5838,34030c2101,30291,0,25221,0,19934c0,14647,2101,9577,5838,5838c9577,2100,14647,0,19934,0x">
+                <v:shape id="Shape 3667" style="position:absolute;width:398;height:398;left:26392;top:595;" coordsize="39868,39868" path="m19934,0c25221,0,30291,2100,34030,5838c37767,9577,39868,14647,39868,19934c39868,25221,37767,30291,34030,34030c30291,37768,25221,39868,19934,39868c14647,39868,9577,37768,5838,34030c2101,30291,0,25221,0,19934c0,14647,2101,9577,5838,5838c9577,2100,14647,0,19934,0x">
                   <v:stroke weight="0.83097pt" endcap="flat" joinstyle="round" on="true" color="#1c6b73"/>
                   <v:fill on="true" color="#ffffff"/>
                 </v:shape>
-                <v:shape id="Shape 3667" style="position:absolute;width:398;height:398;left:27325;top:1731;" coordsize="39868,39868" path="m19934,0c25221,0,30292,2100,34030,5839c37768,9577,39868,14648,39868,19934c39868,25221,37768,30291,34030,34030c30292,37768,25221,39868,19934,39868c14648,39868,9577,37768,5839,34030c2101,30291,0,25221,0,19934c0,14648,2101,9577,5839,5839c9577,2100,14648,0,19934,0x">
+                <v:shape id="Shape 3668" style="position:absolute;width:398;height:398;left:27325;top:1731;" coordsize="39868,39868" path="m19934,0c25221,0,30292,2100,34030,5839c37768,9577,39868,14648,39868,19934c39868,25221,37768,30291,34030,34030c30292,37768,25221,39868,19934,39868c14648,39868,9577,37768,5839,34030c2101,30291,0,25221,0,19934c0,14648,2101,9577,5839,5839c9577,2100,14648,0,19934,0x">
                   <v:stroke weight="0.83097pt" endcap="flat" joinstyle="round" on="true" color="#1c6b73"/>
                   <v:fill on="true" color="#ffffff"/>
                 </v:shape>
-                <v:shape id="Shape 3668" style="position:absolute;width:398;height:398;left:27649;top:2866;" coordsize="39868,39868" path="m19934,0c25221,0,30291,2100,34029,5839c37767,9577,39868,14648,39868,19934c39868,25221,37767,30292,34029,34030c30291,37768,25221,39868,19934,39868c14647,39868,9577,37768,5838,34030c2101,30292,0,25221,0,19934c0,14648,2101,9577,5838,5839c9577,2100,14647,0,19934,0x">
+                <v:shape id="Shape 3669" style="position:absolute;width:398;height:398;left:27649;top:2866;" coordsize="39868,39868" path="m19934,0c25221,0,30291,2100,34029,5839c37767,9577,39868,14648,39868,19934c39868,25221,37767,30292,34029,34030c30291,37768,25221,39868,19934,39868c14647,39868,9577,37768,5838,34030c2101,30292,0,25221,0,19934c0,14648,2101,9577,5838,5839c9577,2100,14647,0,19934,0x">
                   <v:stroke weight="0.83097pt" endcap="flat" joinstyle="round" on="true" color="#1c6b73"/>
                   <v:fill on="true" color="#ffffff"/>
                 </v:shape>
-                <v:shape id="Shape 3669" style="position:absolute;width:398;height:398;left:28258;top:4002;" coordsize="39868,39868" path="m19934,0c25221,0,30292,2100,34030,5838c37768,9577,39868,14647,39868,19934c39868,25221,37768,30291,34030,34030c30292,37768,25221,39868,19934,39868c14648,39868,9577,37768,5839,34030c2101,30291,0,25221,0,19934c0,14647,2101,9577,5839,5838c9577,2100,14648,0,19934,0x">
+                <v:shape id="Shape 3670" style="position:absolute;width:398;height:398;left:28258;top:4002;" coordsize="39868,39868" path="m19934,0c25221,0,30292,2100,34030,5838c37768,9577,39868,14647,39868,19934c39868,25221,37768,30291,34030,34030c30292,37768,25221,39868,19934,39868c14648,39868,9577,37768,5839,34030c2101,30291,0,25221,0,19934c0,14647,2101,9577,5839,5838c9577,2100,14648,0,19934,0x">
                   <v:stroke weight="0.83097pt" endcap="flat" joinstyle="round" on="true" color="#1c6b73"/>
                   <v:fill on="true" color="#ffffff"/>
                 </v:shape>
-                <v:shape id="Shape 3670" style="position:absolute;width:398;height:398;left:29029;top:5138;" coordsize="39868,39868" path="m19934,0c25221,0,30291,2100,34029,5839c37767,9577,39868,14648,39868,19934c39868,25221,37767,30291,34029,34030c30291,37768,25221,39868,19934,39868c14647,39868,9577,37768,5838,34030c2100,30291,0,25221,0,19934c0,14648,2100,9577,5838,5839c9577,2100,14647,0,19934,0x">
+                <v:shape id="Shape 3671" style="position:absolute;width:398;height:398;left:29029;top:5138;" coordsize="39868,39868" path="m19934,0c25221,0,30291,2100,34029,5839c37767,9577,39868,14648,39868,19934c39868,25221,37767,30291,34029,34030c30291,37768,25221,39868,19934,39868c14647,39868,9577,37768,5838,34030c2100,30291,0,25221,0,19934c0,14648,2100,9577,5838,5839c9577,2100,14647,0,19934,0x">
                   <v:stroke weight="0.83097pt" endcap="flat" joinstyle="round" on="true" color="#1c6b73"/>
                   <v:fill on="true" color="#ffffff"/>
                 </v:shape>
-                <v:shape id="Shape 3671" style="position:absolute;width:398;height:398;left:30205;top:6274;" coordsize="39868,39868" path="m19934,0c25221,0,30291,2100,34029,5839c37767,9577,39868,14648,39868,19934c39868,25221,37767,30292,34029,34030c30291,37768,25221,39868,19934,39868c14647,39868,9577,37768,5838,34030c2100,30292,0,25221,0,19934c0,14648,2100,9577,5838,5839c9577,2100,14647,0,19934,0x">
+                <v:shape id="Shape 3672" style="position:absolute;width:398;height:398;left:30205;top:6274;" coordsize="39868,39868" path="m19934,0c25221,0,30291,2100,34029,5839c37767,9577,39868,14648,39868,19934c39868,25221,37767,30292,34029,34030c30291,37768,25221,39868,19934,39868c14647,39868,9577,37768,5838,34030c2100,30292,0,25221,0,19934c0,14648,2100,9577,5838,5839c9577,2100,14647,0,19934,0x">
                   <v:stroke weight="0.83097pt" endcap="flat" joinstyle="round" on="true" color="#1c6b73"/>
                   <v:fill on="true" color="#ffffff"/>
                 </v:shape>
-                <v:shape id="Shape 3672" style="position:absolute;width:398;height:398;left:31828;top:7410;" coordsize="39868,39868" path="m19934,0c25221,0,30291,2100,34030,5839c37768,9577,39868,14647,39868,19934c39868,25221,37768,30291,34030,34030c30291,37768,25221,39868,19934,39868c14648,39868,9577,37768,5839,34030c2101,30291,0,25221,0,19934c0,14647,2101,9577,5839,5839c9577,2100,14648,0,19934,0x">
+                <v:shape id="Shape 3673" style="position:absolute;width:398;height:398;left:31828;top:7410;" coordsize="39868,39868" path="m19934,0c25221,0,30291,2100,34030,5839c37768,9577,39868,14647,39868,19934c39868,25221,37768,30291,34030,34030c30291,37768,25221,39868,19934,39868c14648,39868,9577,37768,5839,34030c2101,30291,0,25221,0,19934c0,14647,2101,9577,5839,5839c9577,2100,14648,0,19934,0x">
                   <v:stroke weight="0.83097pt" endcap="flat" joinstyle="round" on="true" color="#1c6b73"/>
                   <v:fill on="true" color="#ffffff"/>
                 </v:shape>
@@ -14696,16 +14738,16 @@
           <w:noProof/>
         </w:rPr>
         <w:drawing>
-          <wp:inline distT="0" distB="0" distL="0" distR="0" wp14:anchorId="453751F7" wp14:editId="76503942">
+          <wp:inline distT="0" distB="0" distL="0" distR="0" wp14:anchorId="4521D2BA" wp14:editId="3D9E11A5">
             <wp:extent cx="3840480" cy="1228344"/>
             <wp:effectExtent l="0" t="0" r="0" b="0"/>
-            <wp:docPr id="35818" name="Picture 35818"/>
+            <wp:docPr id="35813" name="Picture 35813"/>
             <wp:cNvGraphicFramePr/>
             <a:graphic xmlns:a="http://schemas.openxmlformats.org/drawingml/2006/main">
               <a:graphicData uri="http://schemas.openxmlformats.org/drawingml/2006/picture">
                 <pic:pic xmlns:pic="http://schemas.openxmlformats.org/drawingml/2006/picture">
                   <pic:nvPicPr>
-                    <pic:cNvPr id="35818" name="Picture 35818"/>
+                    <pic:cNvPr id="35813" name="Picture 35813"/>
                     <pic:cNvPicPr/>
                   </pic:nvPicPr>
                   <pic:blipFill>
@@ -14766,16 +14808,16 @@
           <w:noProof/>
         </w:rPr>
         <w:drawing>
-          <wp:inline distT="0" distB="0" distL="0" distR="0" wp14:anchorId="7EB19295" wp14:editId="7D5156D6">
+          <wp:inline distT="0" distB="0" distL="0" distR="0" wp14:anchorId="7417CC3E" wp14:editId="5003568A">
             <wp:extent cx="1773936" cy="871728"/>
             <wp:effectExtent l="0" t="0" r="0" b="0"/>
-            <wp:docPr id="35816" name="Picture 35816"/>
+            <wp:docPr id="35811" name="Picture 35811"/>
             <wp:cNvGraphicFramePr/>
             <a:graphic xmlns:a="http://schemas.openxmlformats.org/drawingml/2006/main">
               <a:graphicData uri="http://schemas.openxmlformats.org/drawingml/2006/picture">
                 <pic:pic xmlns:pic="http://schemas.openxmlformats.org/drawingml/2006/picture">
                   <pic:nvPicPr>
-                    <pic:cNvPr id="35816" name="Picture 35816"/>
+                    <pic:cNvPr id="35811" name="Picture 35811"/>
                     <pic:cNvPicPr/>
                   </pic:nvPicPr>
                   <pic:blipFill>
@@ -14887,16 +14929,16 @@
           <w:noProof/>
         </w:rPr>
         <w:drawing>
-          <wp:inline distT="0" distB="0" distL="0" distR="0" wp14:anchorId="347D418F" wp14:editId="4448E17E">
+          <wp:inline distT="0" distB="0" distL="0" distR="0" wp14:anchorId="2B1BDB41" wp14:editId="66B70E66">
             <wp:extent cx="1773936" cy="871728"/>
             <wp:effectExtent l="0" t="0" r="0" b="0"/>
-            <wp:docPr id="35820" name="Picture 35820"/>
+            <wp:docPr id="35815" name="Picture 35815"/>
             <wp:cNvGraphicFramePr/>
             <a:graphic xmlns:a="http://schemas.openxmlformats.org/drawingml/2006/main">
               <a:graphicData uri="http://schemas.openxmlformats.org/drawingml/2006/picture">
                 <pic:pic xmlns:pic="http://schemas.openxmlformats.org/drawingml/2006/picture">
                   <pic:nvPicPr>
-                    <pic:cNvPr id="35820" name="Picture 35820"/>
+                    <pic:cNvPr id="35815" name="Picture 35815"/>
                     <pic:cNvPicPr/>
                   </pic:nvPicPr>
                   <pic:blipFill>
@@ -15161,10 +15203,10 @@
         <mc:AlternateContent>
           <mc:Choice Requires="wpg">
             <w:drawing>
-              <wp:inline distT="0" distB="0" distL="0" distR="0" wp14:anchorId="3AFF70BF" wp14:editId="74951E49">
+              <wp:inline distT="0" distB="0" distL="0" distR="0" wp14:anchorId="17B04B54" wp14:editId="61469B0C">
                 <wp:extent cx="5911765" cy="1399032"/>
                 <wp:effectExtent l="0" t="0" r="0" b="0"/>
-                <wp:docPr id="35867" name="Group 35867"/>
+                <wp:docPr id="35862" name="Group 35862"/>
                 <wp:cNvGraphicFramePr/>
                 <a:graphic xmlns:a="http://schemas.openxmlformats.org/drawingml/2006/main">
                   <a:graphicData uri="http://schemas.microsoft.com/office/word/2010/wordprocessingGroup">
@@ -15180,7 +15222,7 @@
                       </wpg:grpSpPr>
                       <pic:pic xmlns:pic="http://schemas.openxmlformats.org/drawingml/2006/picture">
                         <pic:nvPicPr>
-                          <pic:cNvPr id="35822" name="Picture 35822"/>
+                          <pic:cNvPr id="35817" name="Picture 35817"/>
                           <pic:cNvPicPr/>
                         </pic:nvPicPr>
                         <pic:blipFill>
@@ -15200,7 +15242,7 @@
                         </pic:spPr>
                       </pic:pic>
                       <wps:wsp>
-                        <wps:cNvPr id="4272" name="Rectangle 4272"/>
+                        <wps:cNvPr id="4273" name="Rectangle 4273"/>
                         <wps:cNvSpPr/>
                         <wps:spPr>
                           <a:xfrm rot="-5399999">
@@ -15244,11 +15286,11 @@
           </mc:Choice>
           <mc:Fallback xmlns:a="http://schemas.openxmlformats.org/drawingml/2006/main">
             <w:pict>
-              <v:group id="Group 35867" style="width:465.493pt;height:110.16pt;mso-position-horizontal-relative:char;mso-position-vertical-relative:line" coordsize="59117,13990">
-                <v:shape id="Picture 35822" style="position:absolute;width:51785;height:13990;left:7332;top:0;" filled="f">
+              <v:group id="Group 35862" style="width:465.493pt;height:110.16pt;mso-position-horizontal-relative:char;mso-position-vertical-relative:line" coordsize="59117,13990">
+                <v:shape id="Picture 35817" style="position:absolute;width:51785;height:13990;left:7332;top:0;" filled="f">
                   <v:imagedata r:id="rId36"/>
                 </v:shape>
-                <v:rect id="Rectangle 4272" style="position:absolute;width:13454;height:3554;left:-4949;top:2076;rotation:270;" filled="f" stroked="f">
+                <v:rect id="Rectangle 4273" style="position:absolute;width:13454;height:3554;left:-4949;top:2076;rotation:270;" filled="f" stroked="f">
                   <v:textbox inset="0,0,0,0" style="layout-flow:vertical;mso-layout-flow-alt:bottom-to-top">
                     <w:txbxContent>
                       <w:p>
@@ -15360,7 +15402,7 @@
     </w:p>
     <w:p>
       <w:pPr>
-        <w:spacing w:after="419"/>
+        <w:spacing w:after="420"/>
         <w:ind w:left="-5" w:right="865"/>
       </w:pPr>
       <w:r>
@@ -15394,7 +15436,7 @@
     </w:p>
     <w:p>
       <w:pPr>
-        <w:spacing w:after="448"/>
+        <w:spacing w:after="449"/>
         <w:ind w:left="-5" w:right="865"/>
       </w:pPr>
       <w:r>
@@ -15427,7 +15469,7 @@
     </w:p>
     <w:p>
       <w:pPr>
-        <w:spacing w:after="32"/>
+        <w:spacing w:after="33"/>
         <w:ind w:left="-15" w:firstLine="299"/>
       </w:pPr>
       <w:r>
@@ -15533,7 +15575,7 @@
     </w:p>
     <w:p>
       <w:pPr>
-        <w:spacing w:after="656"/>
+        <w:spacing w:after="657"/>
         <w:ind w:left="-5" w:right="865"/>
       </w:pPr>
       <w:r>
@@ -15570,7 +15612,7 @@
     </w:p>
     <w:p>
       <w:pPr>
-        <w:spacing w:after="468"/>
+        <w:spacing w:after="469"/>
         <w:ind w:left="-15" w:firstLine="299"/>
       </w:pPr>
       <w:r>
@@ -15682,7 +15724,7 @@
     </w:p>
     <w:p>
       <w:pPr>
-        <w:spacing w:after="486"/>
+        <w:spacing w:after="487"/>
         <w:ind w:left="-15" w:firstLine="299"/>
       </w:pPr>
       <w:r>
@@ -15704,7 +15746,7 @@
     </w:p>
     <w:p>
       <w:pPr>
-        <w:spacing w:after="503"/>
+        <w:spacing w:after="504"/>
         <w:ind w:left="309" w:right="865"/>
       </w:pPr>
       <w:r>
@@ -15722,7 +15764,7 @@
     </w:p>
     <w:p>
       <w:pPr>
-        <w:spacing w:after="486"/>
+        <w:spacing w:after="487"/>
         <w:ind w:left="-15" w:firstLine="299"/>
       </w:pPr>
       <w:r>
@@ -15882,7 +15924,7 @@
     </w:p>
     <w:p>
       <w:pPr>
-        <w:spacing w:after="42"/>
+        <w:spacing w:after="43"/>
         <w:ind w:left="180" w:hanging="95"/>
       </w:pPr>
       <w:r>
@@ -15915,6 +15957,7 @@
     </w:p>
     <w:p>
       <w:pPr>
+        <w:spacing w:after="25"/>
         <w:ind w:left="180" w:hanging="95"/>
       </w:pPr>
       <w:r>
@@ -16135,6 +16178,21 @@
     </w:p>
     <w:p>
       <w:pPr>
+        <w:spacing w:after="28"/>
+        <w:ind w:left="164" w:hanging="179"/>
+      </w:pPr>
+      <w:r>
+        <w:rPr>
+          <w:vertAlign w:val="superscript"/>
+        </w:rPr>
+        <w:t>13</w:t>
+      </w:r>
+      <w:r>
+        <w:t>American College of Surgeons Committee on Trauma, ACS TQIP best practices guidelines in imaging, American College of Surgeons, Chicago, 2018.</w:t>
+      </w:r>
+    </w:p>
+    <w:p>
+      <w:pPr>
         <w:spacing w:after="27"/>
         <w:ind w:left="164" w:hanging="179"/>
       </w:pPr>
@@ -16142,21 +16200,6 @@
         <w:rPr>
           <w:vertAlign w:val="superscript"/>
         </w:rPr>
-        <w:t>13</w:t>
-      </w:r>
-      <w:r>
-        <w:t>American College of Surgeons Committee on Trauma, ACS TQIP best practices guidelines in imaging, American College of Surgeons, Chicago, 2018.</w:t>
-      </w:r>
-    </w:p>
-    <w:p>
-      <w:pPr>
-        <w:spacing w:after="27"/>
-        <w:ind w:left="164" w:hanging="179"/>
-      </w:pPr>
-      <w:r>
-        <w:rPr>
-          <w:vertAlign w:val="superscript"/>
-        </w:rPr>
         <w:t>14</w:t>
       </w:r>
       <w:r>
@@ -16165,6 +16208,7 @@
     </w:p>
     <w:p>
       <w:pPr>
+        <w:spacing w:after="26"/>
         <w:ind w:left="164" w:hanging="179"/>
       </w:pPr>
       <w:r>
@@ -16235,6 +16279,7 @@
     </w:p>
     <w:p>
       <w:pPr>
+        <w:spacing w:after="26"/>
         <w:ind w:left="164" w:hanging="179"/>
       </w:pPr>
       <w:r>
@@ -16258,6 +16303,7 @@
     </w:p>
     <w:p>
       <w:pPr>
+        <w:spacing w:after="26"/>
         <w:ind w:left="164" w:hanging="179"/>
       </w:pPr>
       <w:r>
@@ -16281,7 +16327,7 @@
     </w:p>
     <w:p>
       <w:pPr>
-        <w:spacing w:after="30"/>
+        <w:spacing w:after="31"/>
         <w:ind w:left="-5"/>
       </w:pPr>
       <w:r>
@@ -16347,7 +16393,7 @@
     </w:p>
     <w:p>
       <w:pPr>
-        <w:spacing w:after="43"/>
+        <w:spacing w:after="44"/>
         <w:ind w:left="164" w:hanging="179"/>
       </w:pPr>
       <w:r>
@@ -16380,6 +16426,7 @@
     </w:p>
     <w:p>
       <w:pPr>
+        <w:spacing w:after="26"/>
         <w:ind w:left="164" w:hanging="179"/>
       </w:pPr>
       <w:r>
@@ -16406,7 +16453,7 @@
     </w:p>
     <w:p>
       <w:pPr>
-        <w:spacing w:after="37"/>
+        <w:spacing w:after="38"/>
         <w:ind w:left="164" w:hanging="179"/>
       </w:pPr>
       <w:r>
@@ -16631,6 +16678,7 @@
     </w:p>
     <w:p>
       <w:pPr>
+        <w:spacing w:after="26"/>
         <w:ind w:left="164" w:hanging="179"/>
       </w:pPr>
       <w:r>

</xml_diff>